<commit_message>
St Benedict Prayer review pause point.
</commit_message>
<xml_diff>
--- a/manuscript/volume-1/sacrae-preces-volume-1.docx
+++ b/manuscript/volume-1/sacrae-preces-volume-1.docx
@@ -4398,7 +4398,7 @@
       </w:pPr>
       <w:r>
         <w:pict w14:anchorId="249FE732">
-          <v:rect id="_x0000_i5731" style="width:0;height:1.5pt" o:hralign="center" o:hrstd="t" o:hr="t" fillcolor="#a0a0a0" stroked="f"/>
+          <v:rect id="_x0000_i16075" style="width:0;height:1.5pt" o:hralign="center" o:hrstd="t" o:hr="t" fillcolor="#a0a0a0" stroked="f"/>
         </w:pict>
       </w:r>
     </w:p>
@@ -4654,7 +4654,7 @@
       </w:pPr>
       <w:r>
         <w:pict w14:anchorId="25751FDD">
-          <v:rect id="_x0000_i5732" style="width:0;height:1.5pt" o:hralign="center" o:hrstd="t" o:hr="t" fillcolor="#a0a0a0" stroked="f"/>
+          <v:rect id="_x0000_i16076" style="width:0;height:1.5pt" o:hralign="center" o:hrstd="t" o:hr="t" fillcolor="#a0a0a0" stroked="f"/>
         </w:pict>
       </w:r>
     </w:p>
@@ -4726,7 +4726,7 @@
       </w:pPr>
       <w:r>
         <w:pict w14:anchorId="19542BB1">
-          <v:rect id="_x0000_i5733" style="width:0;height:1.5pt" o:hralign="center" o:hrstd="t" o:hr="t" fillcolor="#a0a0a0" stroked="f"/>
+          <v:rect id="_x0000_i16077" style="width:0;height:1.5pt" o:hralign="center" o:hrstd="t" o:hr="t" fillcolor="#a0a0a0" stroked="f"/>
         </w:pict>
       </w:r>
     </w:p>
@@ -4964,7 +4964,7 @@
       </w:pPr>
       <w:r>
         <w:pict w14:anchorId="68D46385">
-          <v:rect id="_x0000_i5734" style="width:0;height:1.5pt" o:hralign="center" o:hrstd="t" o:hr="t" fillcolor="#a0a0a0" stroked="f"/>
+          <v:rect id="_x0000_i16078" style="width:0;height:1.5pt" o:hralign="center" o:hrstd="t" o:hr="t" fillcolor="#a0a0a0" stroked="f"/>
         </w:pict>
       </w:r>
     </w:p>
@@ -13322,7 +13322,10 @@
         <w:t>The Angelus</w:t>
       </w:r>
       <w:r>
-        <w:t xml:space="preserve"> invites us to remember the mystery of the Incarnation.</w:t>
+        <w:t xml:space="preserve"> invites us to remember the mystery of the Incarnation</w:t>
+      </w:r>
+      <w:r>
+        <w:t xml:space="preserve"> throughout the day.</w:t>
       </w:r>
     </w:p>
     <w:p>
@@ -13447,89 +13450,103 @@
     <w:p>
       <w:pPr>
         <w:pStyle w:val="SPBodyText"/>
-      </w:pPr>
-      <w:r>
-        <w:t>Offering the Day to God</w:t>
-      </w:r>
-    </w:p>
-    <w:p>
-      <w:pPr>
-        <w:pStyle w:val="SPBodyText"/>
-      </w:pPr>
-      <w:r>
-        <w:t>The Morning Offering is a simple prayer of beginning.</w:t>
-      </w:r>
-    </w:p>
-    <w:p>
-      <w:pPr>
-        <w:pStyle w:val="SPBodyText"/>
-      </w:pPr>
-      <w:r>
-        <w:t>Before the day has fully begun, we place it in God's hands. We offer Him not only our prayers, but also our work, our joys, our difficulties, and the ordinary moments that will make up the hours ahead.</w:t>
-      </w:r>
-    </w:p>
-    <w:p>
-      <w:pPr>
-        <w:pStyle w:val="SPBodyText"/>
-      </w:pPr>
-      <w:r>
-        <w:t>The prayer asks us to unite the day with the Holy Sacrifice of the Mass offered throughout the world. In doing so, the ordinary things of our lives are brought into a greater offering: our work, our relationships, our responsibilities, our successes, and even our sufferings.</w:t>
-      </w:r>
-    </w:p>
-    <w:p>
-      <w:pPr>
-        <w:pStyle w:val="SPBodyText"/>
-      </w:pPr>
-      <w:r>
-        <w:t>Nothing needs to be extraordinary.</w:t>
-      </w:r>
-    </w:p>
-    <w:p>
-      <w:pPr>
-        <w:pStyle w:val="SPBodyText"/>
-      </w:pPr>
-    </w:p>
-    <w:p>
-      <w:pPr>
-        <w:pStyle w:val="SPBodyText"/>
-      </w:pPr>
-      <w:r>
-        <w:t>A difficult task can be offered.</w:t>
-      </w:r>
-      <w:r>
-        <w:br/>
-        <w:t>A conversation can be offered.</w:t>
-      </w:r>
-      <w:r>
-        <w:br/>
-        <w:t>A moment of patience can be offered.</w:t>
-      </w:r>
-      <w:r>
-        <w:br/>
-        <w:t>A kindness that no one notices can be offered.</w:t>
-      </w:r>
-      <w:r>
-        <w:br/>
-        <w:t>Even an ordinary day can become an offering to God.</w:t>
-      </w:r>
-    </w:p>
-    <w:p>
-      <w:pPr>
-        <w:pStyle w:val="SPBodyText"/>
-      </w:pPr>
-    </w:p>
-    <w:p>
-      <w:pPr>
-        <w:pStyle w:val="SPBodyText"/>
-      </w:pPr>
-      <w:r>
-        <w:t xml:space="preserve">The prayer places this offering </w:t>
-      </w:r>
-      <w:r>
         <w:rPr>
           <w:b/>
           <w:bCs/>
         </w:rPr>
+      </w:pPr>
+      <w:r>
+        <w:rPr>
+          <w:b/>
+          <w:bCs/>
+        </w:rPr>
+        <w:t>Offering the Day to God</w:t>
+      </w:r>
+    </w:p>
+    <w:p>
+      <w:pPr>
+        <w:pStyle w:val="SPBodyText"/>
+      </w:pPr>
+    </w:p>
+    <w:p>
+      <w:pPr>
+        <w:pStyle w:val="SPBodyText"/>
+      </w:pPr>
+      <w:r>
+        <w:t>The Morning Offering is a simple prayer of beginning.</w:t>
+      </w:r>
+    </w:p>
+    <w:p>
+      <w:pPr>
+        <w:pStyle w:val="SPBodyText"/>
+      </w:pPr>
+      <w:r>
+        <w:t>Before the day has fully begun, we place it in God's hands. We offer Him not only our prayers, but also our work, our joys, our difficulties, and the ordinary moments that will make up the hours ahead.</w:t>
+      </w:r>
+    </w:p>
+    <w:p>
+      <w:pPr>
+        <w:pStyle w:val="SPBodyText"/>
+      </w:pPr>
+      <w:r>
+        <w:t>The prayer asks us to unite the day with the Holy Sacrifice of the Mass offered throughout the world. In doing so, the ordinary things of our lives are brought into a greater offering: our work, our relationships, our responsibilities, our successes, and even our sufferings.</w:t>
+      </w:r>
+    </w:p>
+    <w:p>
+      <w:pPr>
+        <w:pStyle w:val="SPBodyText"/>
+      </w:pPr>
+      <w:r>
+        <w:t>Nothing needs to be extraordinary.</w:t>
+      </w:r>
+    </w:p>
+    <w:p>
+      <w:pPr>
+        <w:pStyle w:val="SPBodyText"/>
+      </w:pPr>
+    </w:p>
+    <w:p>
+      <w:pPr>
+        <w:pStyle w:val="SPBodyText"/>
+      </w:pPr>
+      <w:r>
+        <w:t>A difficult task can be offered.</w:t>
+      </w:r>
+      <w:r>
+        <w:br/>
+        <w:t>A conversation can be offered.</w:t>
+      </w:r>
+      <w:r>
+        <w:br/>
+        <w:t>A moment of patience can be offered.</w:t>
+      </w:r>
+      <w:r>
+        <w:br/>
+        <w:t>A kindness that no one notices can be offered.</w:t>
+      </w:r>
+      <w:r>
+        <w:br/>
+        <w:t>Even an ordinary day can become an offering to God.</w:t>
+      </w:r>
+    </w:p>
+    <w:p>
+      <w:pPr>
+        <w:pStyle w:val="SPBodyText"/>
+      </w:pPr>
+    </w:p>
+    <w:p>
+      <w:pPr>
+        <w:pStyle w:val="SPBodyText"/>
+      </w:pPr>
+      <w:r>
+        <w:lastRenderedPageBreak/>
+        <w:t xml:space="preserve">The prayer places this offering </w:t>
+      </w:r>
+      <w:r>
+        <w:rPr>
+          <w:b/>
+          <w:bCs/>
+        </w:rPr>
         <w:t>through the Immaculate Heart of Mary</w:t>
       </w:r>
       <w:r>
@@ -13551,87 +13568,100 @@
         <w:pStyle w:val="SPBodyText"/>
       </w:pPr>
       <w:r>
+        <w:t>The Morning Offering also reminds us that prayer is not something separated from the rest of the day.</w:t>
+      </w:r>
+    </w:p>
+    <w:p>
+      <w:pPr>
+        <w:pStyle w:val="SPBodyText"/>
+      </w:pPr>
+      <w:r>
+        <w:t>We do not pray and then leave prayer behind.</w:t>
+      </w:r>
+    </w:p>
+    <w:p>
+      <w:pPr>
+        <w:pStyle w:val="SPBodyText"/>
+      </w:pPr>
+    </w:p>
+    <w:p>
+      <w:pPr>
+        <w:pStyle w:val="SPBodyText"/>
+      </w:pPr>
+      <w:r>
+        <w:t>We carry our prayer into our work.</w:t>
+      </w:r>
+      <w:r>
+        <w:br/>
+        <w:t>Into our families.</w:t>
+      </w:r>
+      <w:r>
+        <w:br/>
+        <w:t>Into our responsibilities.</w:t>
+      </w:r>
+      <w:r>
+        <w:br/>
+        <w:t>Into moments of joy and moments of difficulty.</w:t>
+      </w:r>
+    </w:p>
+    <w:p>
+      <w:pPr>
+        <w:pStyle w:val="SPBodyText"/>
+      </w:pPr>
+    </w:p>
+    <w:p>
+      <w:pPr>
+        <w:pStyle w:val="SPBodyText"/>
+      </w:pPr>
+      <w:r>
+        <w:t>When the day goes differently from what we expected, the offering remains.</w:t>
+      </w:r>
+    </w:p>
+    <w:p>
+      <w:pPr>
+        <w:pStyle w:val="SPBodyText"/>
+      </w:pPr>
+    </w:p>
+    <w:p>
+      <w:pPr>
+        <w:pStyle w:val="SPBodyText"/>
+      </w:pPr>
+      <w:r>
+        <w:t>When we succeed, we can give thanks.</w:t>
+      </w:r>
+      <w:r>
+        <w:br/>
+        <w:t>When we struggle, we can offer the struggle.</w:t>
+      </w:r>
+      <w:r>
+        <w:br/>
+        <w:t>When we fall, we can begin again.</w:t>
+      </w:r>
+    </w:p>
+    <w:p>
+      <w:pPr>
+        <w:pStyle w:val="SPBodyText"/>
+      </w:pPr>
+    </w:p>
+    <w:p>
+      <w:pPr>
+        <w:pStyle w:val="SPBodyText"/>
+        <w:sectPr>
+          <w:type w:val="oddPage"/>
+          <w:pgSz w:w="7920" w:h="12240" w:code="6"/>
+          <w:pgMar w:top="1080" w:right="864" w:bottom="1080" w:left="1152" w:header="576" w:footer="576" w:gutter="0"/>
+          <w:cols w:space="720"/>
+          <w:titlePg/>
+          <w:docGrid w:linePitch="360"/>
+        </w:sectPr>
+      </w:pPr>
+    </w:p>
+    <w:p>
+      <w:pPr>
+        <w:pStyle w:val="SPBodyText"/>
+      </w:pPr>
+      <w:r>
         <w:lastRenderedPageBreak/>
-        <w:t>The Morning Offering also reminds us that prayer is not something separated from the rest of the day.</w:t>
-      </w:r>
-    </w:p>
-    <w:p>
-      <w:pPr>
-        <w:pStyle w:val="SPBodyText"/>
-      </w:pPr>
-      <w:r>
-        <w:t>We do not pray and then leave prayer behind.</w:t>
-      </w:r>
-    </w:p>
-    <w:p>
-      <w:pPr>
-        <w:pStyle w:val="SPBodyText"/>
-      </w:pPr>
-    </w:p>
-    <w:p>
-      <w:pPr>
-        <w:pStyle w:val="SPBodyText"/>
-      </w:pPr>
-      <w:r>
-        <w:t>We carry our prayer into our work.</w:t>
-      </w:r>
-      <w:r>
-        <w:br/>
-        <w:t>Into our families.</w:t>
-      </w:r>
-      <w:r>
-        <w:br/>
-        <w:t>Into our responsibilities.</w:t>
-      </w:r>
-      <w:r>
-        <w:br/>
-        <w:t>Into moments of joy and moments of difficulty.</w:t>
-      </w:r>
-    </w:p>
-    <w:p>
-      <w:pPr>
-        <w:pStyle w:val="SPBodyText"/>
-      </w:pPr>
-    </w:p>
-    <w:p>
-      <w:pPr>
-        <w:pStyle w:val="SPBodyText"/>
-      </w:pPr>
-      <w:r>
-        <w:t>When the day goes differently from what we expected, the offering remains.</w:t>
-      </w:r>
-    </w:p>
-    <w:p>
-      <w:pPr>
-        <w:pStyle w:val="SPBodyText"/>
-      </w:pPr>
-    </w:p>
-    <w:p>
-      <w:pPr>
-        <w:pStyle w:val="SPBodyText"/>
-      </w:pPr>
-      <w:r>
-        <w:t>When we succeed, we can give thanks.</w:t>
-      </w:r>
-      <w:r>
-        <w:br/>
-        <w:t>When we struggle, we can offer the struggle.</w:t>
-      </w:r>
-      <w:r>
-        <w:br/>
-        <w:t>When we fall, we can begin again.</w:t>
-      </w:r>
-    </w:p>
-    <w:p>
-      <w:pPr>
-        <w:pStyle w:val="SPBodyText"/>
-      </w:pPr>
-    </w:p>
-    <w:p>
-      <w:pPr>
-        <w:pStyle w:val="SPBodyText"/>
-      </w:pPr>
-      <w:r>
         <w:t xml:space="preserve">The Morning Offering is therefore more than a prayer said once in the morning. It is an invitation to </w:t>
       </w:r>
       <w:r>
@@ -13652,6 +13682,11 @@
       <w:r>
         <w:t>Begin the day by offering it.</w:t>
       </w:r>
+    </w:p>
+    <w:p>
+      <w:pPr>
+        <w:pStyle w:val="SPBodyText"/>
+      </w:pPr>
     </w:p>
     <w:p>
       <w:pPr>
@@ -13711,6 +13746,11 @@
       <w:pPr>
         <w:pStyle w:val="SPPrayerEnglish"/>
       </w:pPr>
+    </w:p>
+    <w:p>
+      <w:pPr>
+        <w:pStyle w:val="SPPrayerEnglish"/>
+      </w:pPr>
       <w:r>
         <w:t>O Jesus,</w:t>
       </w:r>
@@ -13838,6 +13878,11 @@
       <w:pPr>
         <w:pStyle w:val="SPPrayerLatin"/>
       </w:pPr>
+    </w:p>
+    <w:p>
+      <w:pPr>
+        <w:pStyle w:val="SPPrayerLatin"/>
+      </w:pPr>
       <w:r>
         <w:t>O Iesu,</w:t>
       </w:r>
@@ -14000,7 +14045,13 @@
         <w:pStyle w:val="SPScriptureReference"/>
       </w:pPr>
       <w:r>
-        <w:t>1 Thessalonians 5:16–18</w:t>
+        <w:t>1 Thessalonians 5:1</w:t>
+      </w:r>
+      <w:r>
+        <w:t>5</w:t>
+      </w:r>
+      <w:r>
+        <w:t>–18</w:t>
       </w:r>
     </w:p>
     <w:p>
@@ -14008,10 +14059,16 @@
         <w:pStyle w:val="SPScripture"/>
       </w:pPr>
       <w:r>
-        <w:t>See that none of you repays evil with evil</w:t>
-      </w:r>
-      <w:r>
-        <w:t>, but always seek to do good to one another, and to all. Rejoice always, pray constantly, give thanks in all circumstances; for this is the will of God in Christ Jesus for you.</w:t>
+        <w:t xml:space="preserve">See that none of you repays evil </w:t>
+      </w:r>
+      <w:r>
+        <w:t>for</w:t>
+      </w:r>
+      <w:r>
+        <w:t xml:space="preserve"> evil</w:t>
+      </w:r>
+      <w:r>
+        <w:t>, but always seek to do good to one another and to all. Rejoice always, pray constantly, give thanks in all circumstances; for this is the will of God in Christ Jesus for you.</w:t>
       </w:r>
     </w:p>
     <w:p>
@@ -14027,7 +14084,13 @@
         <w:pStyle w:val="SPScripture"/>
       </w:pPr>
       <w:r>
-        <w:t>O Lord, in the morning you hear my voice; in the morning I prepare a sacrifice for you and watch.</w:t>
+        <w:t>O Lord, in the morning you hear my voice; in the morning I prepare a sacrifice for you</w:t>
+      </w:r>
+      <w:r>
+        <w:t>,</w:t>
+      </w:r>
+      <w:r>
+        <w:t xml:space="preserve"> and watch.</w:t>
       </w:r>
     </w:p>
     <w:p>
@@ -14060,8 +14123,16 @@
     <w:p>
       <w:pPr>
         <w:pStyle w:val="SPBodyText"/>
-      </w:pPr>
-      <w:r>
+        <w:rPr>
+          <w:b/>
+          <w:bCs/>
+        </w:rPr>
+      </w:pPr>
+      <w:r>
+        <w:rPr>
+          <w:b/>
+          <w:bCs/>
+        </w:rPr>
         <w:t>A Day Given to God</w:t>
       </w:r>
     </w:p>
@@ -14208,10 +14279,6 @@
         <w:t xml:space="preserve">It is an invitation to </w:t>
       </w:r>
       <w:r>
-        <w:rPr>
-          <w:b/>
-          <w:bCs/>
-        </w:rPr>
         <w:t>return</w:t>
       </w:r>
       <w:r>
@@ -14268,24 +14335,6 @@
         <w:pStyle w:val="SPBodyText"/>
       </w:pPr>
       <w:r>
-        <w:t xml:space="preserve">Mary's </w:t>
-      </w:r>
-      <w:r>
-        <w:rPr>
-          <w:i/>
-          <w:iCs/>
-        </w:rPr>
-        <w:t>fiat</w:t>
-      </w:r>
-      <w:r>
-        <w:t xml:space="preserve"> gives us the perfect example: a simple and trusting response to God's will.</w:t>
-      </w:r>
-    </w:p>
-    <w:p>
-      <w:pPr>
-        <w:pStyle w:val="SPBodyText"/>
-      </w:pPr>
-      <w:r>
         <w:t>We may not know what tomorrow holds. We may not even know what the next hour will bring.</w:t>
       </w:r>
     </w:p>
@@ -14314,106 +14363,6 @@
       <w:pPr>
         <w:pStyle w:val="SPBodyText"/>
       </w:pPr>
-    </w:p>
-    <w:p>
-      <w:pPr>
-        <w:pStyle w:val="SPBodyText"/>
-      </w:pPr>
-      <w:r>
-        <w:lastRenderedPageBreak/>
-        <w:t>Perhaps that is what it means to make our whole life a prayer.</w:t>
-      </w:r>
-    </w:p>
-    <w:p>
-      <w:pPr>
-        <w:pStyle w:val="SPBodyText"/>
-      </w:pPr>
-      <w:r>
-        <w:t xml:space="preserve">Not that every moment is filled with religious words, but that </w:t>
-      </w:r>
-      <w:r>
-        <w:rPr>
-          <w:b/>
-          <w:bCs/>
-        </w:rPr>
-        <w:t>every moment can be turned towards God</w:t>
-      </w:r>
-      <w:r>
-        <w:t>.</w:t>
-      </w:r>
-    </w:p>
-    <w:p>
-      <w:pPr>
-        <w:pStyle w:val="SPBodyText"/>
-      </w:pPr>
-    </w:p>
-    <w:p>
-      <w:pPr>
-        <w:pStyle w:val="SPBodyText"/>
-      </w:pPr>
-      <w:r>
-        <w:t>So begin simply.</w:t>
-      </w:r>
-    </w:p>
-    <w:p>
-      <w:pPr>
-        <w:pStyle w:val="SPBodyText"/>
-      </w:pPr>
-      <w:r>
-        <w:t>Give Him the day.</w:t>
-      </w:r>
-    </w:p>
-    <w:p>
-      <w:pPr>
-        <w:pStyle w:val="SPBodyText"/>
-      </w:pPr>
-      <w:r>
-        <w:t>Give Him your work.</w:t>
-      </w:r>
-    </w:p>
-    <w:p>
-      <w:pPr>
-        <w:pStyle w:val="SPBodyText"/>
-      </w:pPr>
-      <w:r>
-        <w:t>Give Him your joys.</w:t>
-      </w:r>
-    </w:p>
-    <w:p>
-      <w:pPr>
-        <w:pStyle w:val="SPBodyText"/>
-      </w:pPr>
-      <w:r>
-        <w:t>Give Him your difficulties.</w:t>
-      </w:r>
-    </w:p>
-    <w:p>
-      <w:pPr>
-        <w:pStyle w:val="SPBodyText"/>
-      </w:pPr>
-      <w:r>
-        <w:t>Give Him yourself.</w:t>
-      </w:r>
-    </w:p>
-    <w:p>
-      <w:pPr>
-        <w:pStyle w:val="SPBodyText"/>
-      </w:pPr>
-    </w:p>
-    <w:p>
-      <w:pPr>
-        <w:pStyle w:val="SPBodyText"/>
-      </w:pPr>
-      <w:r>
-        <w:t xml:space="preserve">And when the day is over, may we be able to look back and recognise that, even imperfectly, </w:t>
-      </w:r>
-      <w:r>
-        <w:rPr>
-          <w:b/>
-          <w:bCs/>
-        </w:rPr>
-        <w:t>we walked through it with God.</w:t>
-      </w:r>
     </w:p>
     <w:p>
       <w:pPr>
@@ -14433,147 +14382,89 @@
         <w:pStyle w:val="SPBodyText"/>
       </w:pPr>
       <w:r>
-        <w:rPr>
-          <w:rFonts w:ascii="Segoe UI Symbol" w:hAnsi="Segoe UI Symbol" w:cs="Segoe UI Symbol"/>
-        </w:rPr>
         <w:lastRenderedPageBreak/>
-        <w:t>✠</w:t>
-      </w:r>
-    </w:p>
-    <w:p>
-      <w:pPr>
-        <w:pStyle w:val="SPBodyText"/>
-      </w:pPr>
-    </w:p>
-    <w:p>
-      <w:pPr>
-        <w:pStyle w:val="SPPrayerTitle"/>
-      </w:pPr>
-      <w:bookmarkStart w:id="24" w:name="_Toc238808951"/>
-      <w:r>
-        <w:t>The Angelus</w:t>
-      </w:r>
-      <w:bookmarkEnd w:id="24"/>
-    </w:p>
-    <w:p>
-      <w:pPr>
-        <w:pStyle w:val="SPBodyText"/>
-      </w:pPr>
-    </w:p>
-    <w:p>
-      <w:pPr>
-        <w:pStyle w:val="SPBodyText"/>
-      </w:pPr>
-      <w:r>
-        <w:t xml:space="preserve">The </w:t>
-      </w:r>
-      <w:r>
-        <w:t xml:space="preserve">Angelus </w:t>
-      </w:r>
-      <w:r>
-        <w:t xml:space="preserve">recalls the </w:t>
-      </w:r>
-      <w:r>
-        <w:rPr>
-          <w:b/>
-          <w:bCs/>
-        </w:rPr>
-        <w:t>Annunciation</w:t>
-      </w:r>
-      <w:r>
-        <w:t>, when the Angel Gabriel announced to Mary that she would become the Mother of the Son of God.</w:t>
-      </w:r>
-    </w:p>
-    <w:p>
-      <w:pPr>
-        <w:pStyle w:val="SPBodyText"/>
-      </w:pPr>
-      <w:r>
-        <w:t xml:space="preserve">Through three short verses and responses, the prayer leads us through the mystery of the </w:t>
-      </w:r>
-      <w:r>
-        <w:rPr>
-          <w:b/>
-          <w:bCs/>
-        </w:rPr>
-        <w:t>Incarnation</w:t>
-      </w:r>
-      <w:r>
-        <w:t>: Mary hears the message of the angel, gives her consent to God's will, and the Word becomes flesh.</w:t>
-      </w:r>
-    </w:p>
-    <w:p>
-      <w:pPr>
-        <w:pStyle w:val="SPBodyText"/>
-      </w:pPr>
-      <w:r>
-        <w:t>Traditionally, the Angelus is prayed three times each day:</w:t>
-      </w:r>
-      <w:r>
-        <w:t xml:space="preserve"> </w:t>
-      </w:r>
-      <w:r>
-        <w:t>in the morning, at noon, and in the evening.</w:t>
-      </w:r>
-    </w:p>
-    <w:p>
-      <w:pPr>
-        <w:pStyle w:val="SPBodyText"/>
-      </w:pPr>
-      <w:r>
-        <w:t>The repeated prayer invites us to pause in the midst of ordinary life and remember the mystery at the heart of our faith:</w:t>
-      </w:r>
-      <w:r>
-        <w:t xml:space="preserve"> </w:t>
-      </w:r>
-      <w:r>
-        <w:rPr>
-          <w:b/>
-          <w:bCs/>
-        </w:rPr>
-        <w:t>“And the Word was made flesh, and dwelt among us.”</w:t>
-      </w:r>
-    </w:p>
-    <w:p>
-      <w:pPr>
-        <w:pStyle w:val="SPBodyText"/>
-      </w:pPr>
-      <w:r>
-        <w:t xml:space="preserve">It is a call to remember that </w:t>
-      </w:r>
-      <w:r>
-        <w:rPr>
-          <w:b/>
-          <w:bCs/>
-        </w:rPr>
-        <w:t>God came among us</w:t>
-      </w:r>
-      <w:r>
-        <w:t xml:space="preserve">, and that Mary's </w:t>
-      </w:r>
-      <w:r>
-        <w:rPr>
-          <w:i/>
-          <w:iCs/>
-        </w:rPr>
-        <w:t>fiat</w:t>
-      </w:r>
-      <w:r>
-        <w:t xml:space="preserve"> — her “let it be done” — opened the way for the Word to take flesh.</w:t>
-      </w:r>
-    </w:p>
-    <w:p>
-      <w:pPr>
-        <w:pStyle w:val="SPBodyText"/>
-      </w:pPr>
-      <w:r>
-        <w:t>When we pray the Angelus, we join our prayer to Mary's response:</w:t>
-      </w:r>
-    </w:p>
-    <w:p>
-      <w:pPr>
-        <w:pStyle w:val="SPBodyText"/>
-      </w:pPr>
+        <w:t>Perhaps that is what it means to make our whole life a prayer.</w:t>
+      </w:r>
+    </w:p>
+    <w:p>
+      <w:pPr>
+        <w:pStyle w:val="SPBodyText"/>
+      </w:pPr>
+      <w:r>
+        <w:t xml:space="preserve">Not that every moment is filled with religious words, but that </w:t>
+      </w:r>
+      <w:r>
+        <w:t>every moment can be turned towards God.</w:t>
+      </w:r>
+    </w:p>
+    <w:p>
+      <w:pPr>
+        <w:pStyle w:val="SPBodyText"/>
+      </w:pPr>
+    </w:p>
+    <w:p>
+      <w:pPr>
+        <w:pStyle w:val="SPBodyText"/>
+      </w:pPr>
+      <w:r>
+        <w:t>So begin simply.</w:t>
+      </w:r>
+    </w:p>
+    <w:p>
+      <w:pPr>
+        <w:pStyle w:val="SPBodyText"/>
+      </w:pPr>
+      <w:r>
+        <w:t>Give Him the day.</w:t>
+      </w:r>
+    </w:p>
+    <w:p>
+      <w:pPr>
+        <w:pStyle w:val="SPBodyText"/>
+      </w:pPr>
+      <w:r>
+        <w:t>Give Him your work.</w:t>
+      </w:r>
+    </w:p>
+    <w:p>
+      <w:pPr>
+        <w:pStyle w:val="SPBodyText"/>
+      </w:pPr>
+      <w:r>
+        <w:t>Give Him your joys.</w:t>
+      </w:r>
+    </w:p>
+    <w:p>
+      <w:pPr>
+        <w:pStyle w:val="SPBodyText"/>
+      </w:pPr>
+      <w:r>
+        <w:t>Give Him your difficulties.</w:t>
+      </w:r>
+    </w:p>
+    <w:p>
+      <w:pPr>
+        <w:pStyle w:val="SPBodyText"/>
+      </w:pPr>
+      <w:r>
+        <w:t>Give Him yourself.</w:t>
+      </w:r>
+    </w:p>
+    <w:p>
+      <w:pPr>
+        <w:pStyle w:val="SPBodyText"/>
+      </w:pPr>
+    </w:p>
+    <w:p>
+      <w:pPr>
+        <w:pStyle w:val="SPBodyText"/>
+      </w:pPr>
+      <w:r>
+        <w:t xml:space="preserve">And when the day is over, may we be able to look back and recognise that, even imperfectly, </w:t>
+      </w:r>
+      <w:r>
+        <w:t>we walked through it with God.</w:t>
+      </w:r>
     </w:p>
     <w:p>
       <w:pPr>
@@ -14587,10 +14478,175 @@
           <w:docGrid w:linePitch="360"/>
         </w:sectPr>
       </w:pPr>
-      <w:r>
+    </w:p>
+    <w:p>
+      <w:pPr>
+        <w:pStyle w:val="SPBodyText"/>
+        <w:jc w:val="center"/>
+      </w:pPr>
+      <w:r>
+        <w:rPr>
+          <w:rFonts w:ascii="Segoe UI Symbol" w:hAnsi="Segoe UI Symbol" w:cs="Segoe UI Symbol"/>
+        </w:rPr>
+        <w:lastRenderedPageBreak/>
+        <w:t>✠</w:t>
+      </w:r>
+    </w:p>
+    <w:p>
+      <w:pPr>
+        <w:pStyle w:val="SPBodyText"/>
+      </w:pPr>
+    </w:p>
+    <w:p>
+      <w:pPr>
+        <w:pStyle w:val="SPPrayerTitle"/>
+      </w:pPr>
+      <w:bookmarkStart w:id="24" w:name="_Toc238808951"/>
+      <w:r>
+        <w:t>The Angelus</w:t>
+      </w:r>
+      <w:bookmarkEnd w:id="24"/>
+    </w:p>
+    <w:p>
+      <w:pPr>
+        <w:pStyle w:val="SPBodyText"/>
+      </w:pPr>
+    </w:p>
+    <w:p>
+      <w:pPr>
+        <w:pStyle w:val="SPBodyText"/>
+      </w:pPr>
+      <w:r>
+        <w:t xml:space="preserve">The </w:t>
+      </w:r>
+      <w:r>
+        <w:t xml:space="preserve">Angelus </w:t>
+      </w:r>
+      <w:r>
+        <w:t xml:space="preserve">recalls the </w:t>
+      </w:r>
+      <w:r>
+        <w:t>Annunciation</w:t>
+      </w:r>
+      <w:r>
+        <w:t>, when the Angel Gabriel announced to Mary that she would become the Mother of the Son of God.</w:t>
+      </w:r>
+    </w:p>
+    <w:p>
+      <w:pPr>
+        <w:pStyle w:val="SPBodyText"/>
+      </w:pPr>
+      <w:r>
+        <w:t xml:space="preserve">Through three short verses and responses, the prayer leads us through the mystery of the </w:t>
+      </w:r>
+      <w:r>
+        <w:t>Incarnation</w:t>
+      </w:r>
+      <w:r>
+        <w:t>: Mary hears the message of the angel, gives her consent to God's will, and the Word becomes flesh.</w:t>
+      </w:r>
+    </w:p>
+    <w:p>
+      <w:pPr>
+        <w:pStyle w:val="SPBodyText"/>
+      </w:pPr>
+      <w:r>
+        <w:t>Traditionally, the Angelus is prayed three times each day:</w:t>
+      </w:r>
+      <w:r>
+        <w:t xml:space="preserve"> </w:t>
+      </w:r>
+      <w:r>
+        <w:t>in the morning, at noon, and in the evening.</w:t>
+      </w:r>
+    </w:p>
+    <w:p>
+      <w:pPr>
+        <w:pStyle w:val="SPBodyText"/>
+        <w:rPr>
+          <w:i/>
+          <w:iCs/>
+        </w:rPr>
+      </w:pPr>
+      <w:r>
+        <w:t>The repeated prayer invites us to pause in the midst of ordinary life and remember the mystery at the heart of our faith:</w:t>
+      </w:r>
+      <w:r>
+        <w:t xml:space="preserve"> </w:t>
+      </w:r>
+      <w:r>
+        <w:rPr>
+          <w:i/>
+          <w:iCs/>
+        </w:rPr>
+        <w:t>“And the Word was made flesh, and dwelt among us.”</w:t>
+      </w:r>
+    </w:p>
+    <w:p>
+      <w:pPr>
+        <w:pStyle w:val="SPBodyText"/>
+      </w:pPr>
+      <w:r>
+        <w:t xml:space="preserve">It is a call to remember that </w:t>
+      </w:r>
+      <w:r>
+        <w:rPr>
+          <w:b/>
+          <w:bCs/>
+        </w:rPr>
+        <w:t>God came among us</w:t>
+      </w:r>
+      <w:r>
+        <w:t xml:space="preserve">, and that Mary's </w:t>
+      </w:r>
+      <w:r>
+        <w:t>response</w:t>
+      </w:r>
+      <w:r>
+        <w:t xml:space="preserve"> — her “let it be done” — opened the way for the Word to take flesh.</w:t>
+      </w:r>
+    </w:p>
+    <w:p>
+      <w:pPr>
+        <w:pStyle w:val="SPBodyText"/>
+      </w:pPr>
+      <w:r>
+        <w:t>When we pray the Angelus, we join our prayer to Mary's response:</w:t>
+      </w:r>
+    </w:p>
+    <w:p>
+      <w:pPr>
+        <w:pStyle w:val="SPBodyText"/>
+      </w:pPr>
+    </w:p>
+    <w:p>
+      <w:pPr>
+        <w:pStyle w:val="SPBodyText"/>
+        <w:rPr>
+          <w:i/>
+          <w:iCs/>
+        </w:rPr>
+        <w:sectPr>
+          <w:type w:val="oddPage"/>
+          <w:pgSz w:w="7920" w:h="12240" w:code="6"/>
+          <w:pgMar w:top="1080" w:right="864" w:bottom="1080" w:left="1152" w:header="576" w:footer="576" w:gutter="0"/>
+          <w:cols w:space="720"/>
+          <w:titlePg/>
+          <w:docGrid w:linePitch="360"/>
+        </w:sectPr>
+      </w:pPr>
+      <w:r>
+        <w:rPr>
+          <w:i/>
+          <w:iCs/>
+        </w:rPr>
         <w:t>“Behold the handmaid of the Lord;</w:t>
       </w:r>
       <w:r>
+        <w:rPr>
+          <w:i/>
+          <w:iCs/>
+        </w:rPr>
         <w:br/>
         <w:t>be it done unto me according to your word.”</w:t>
       </w:r>
@@ -15040,7 +15096,13 @@
         <w:pStyle w:val="SPScripture"/>
       </w:pPr>
       <w:r>
-        <w:t>And he came to her and said, “Hail, full of grace, the Lord is with you.”</w:t>
+        <w:t>And he came to her and said, “Hail, full of grace, the Lord is with you</w:t>
+      </w:r>
+      <w:r>
+        <w:t>!</w:t>
+      </w:r>
+      <w:r>
+        <w:t>”</w:t>
       </w:r>
     </w:p>
     <w:p>
@@ -15094,7 +15156,19 @@
         <w:pStyle w:val="SPScripture"/>
       </w:pPr>
       <w:r>
-        <w:t>And the Word became flesh and dwelt among us, full of grace and truth, we have beheld his glory, glory as the only begotten Son from the Father.</w:t>
+        <w:t>And the Word became flesh and dwelt among us, full of grace and truth</w:t>
+      </w:r>
+      <w:r>
+        <w:t>;</w:t>
+      </w:r>
+      <w:r>
+        <w:t xml:space="preserve"> we have beheld his glory, glory as the only</w:t>
+      </w:r>
+      <w:r>
+        <w:t>-</w:t>
+      </w:r>
+      <w:r>
+        <w:t>begotten Son from the Father.</w:t>
       </w:r>
     </w:p>
     <w:p>
@@ -15135,8 +15209,16 @@
     <w:p>
       <w:pPr>
         <w:pStyle w:val="SPBodyText"/>
-      </w:pPr>
-      <w:r>
+        <w:rPr>
+          <w:b/>
+          <w:bCs/>
+        </w:rPr>
+      </w:pPr>
+      <w:r>
+        <w:rPr>
+          <w:b/>
+          <w:bCs/>
+        </w:rPr>
         <w:t>The Word Became Flesh</w:t>
       </w:r>
     </w:p>
@@ -15180,171 +15262,177 @@
     <w:p>
       <w:pPr>
         <w:pStyle w:val="SPBodyText"/>
-      </w:pPr>
-      <w:r>
-        <w:t>“Behold the handmaid of the Lord.”</w:t>
-      </w:r>
-    </w:p>
-    <w:p>
-      <w:pPr>
-        <w:pStyle w:val="SPBodyText"/>
-      </w:pPr>
-    </w:p>
-    <w:p>
-      <w:pPr>
-        <w:pStyle w:val="SPBodyText"/>
-      </w:pPr>
-      <w:r>
-        <w:t>Her answer was not accompanied by certainty about everything that would follow. She did not know every sorrow she would encounter, every joy she would receive, or every mystery she would carry.</w:t>
-      </w:r>
-    </w:p>
-    <w:p>
-      <w:pPr>
-        <w:pStyle w:val="SPBodyText"/>
-      </w:pPr>
-      <w:r>
-        <w:t>She simply trusted God.</w:t>
-      </w:r>
-    </w:p>
-    <w:p>
-      <w:pPr>
-        <w:pStyle w:val="SPBodyText"/>
-      </w:pPr>
-      <w:r>
-        <w:t xml:space="preserve">And through her </w:t>
-      </w:r>
-      <w:r>
         <w:rPr>
           <w:i/>
           <w:iCs/>
         </w:rPr>
-        <w:t>Fiat</w:t>
-      </w:r>
-      <w:r>
-        <w:t>, the Word became flesh.</w:t>
-      </w:r>
-    </w:p>
-    <w:p>
-      <w:pPr>
-        <w:pStyle w:val="SPBodyText"/>
-      </w:pPr>
-    </w:p>
-    <w:p>
-      <w:pPr>
-        <w:pStyle w:val="SPBodyText"/>
-      </w:pPr>
-      <w:r>
-        <w:t>The Angelus invites us to pause throughout the day and remember this mystery.</w:t>
-      </w:r>
-    </w:p>
-    <w:p>
-      <w:pPr>
-        <w:pStyle w:val="SPBodyText"/>
-      </w:pPr>
-      <w:r>
-        <w:t>In the morning, as the day begins.</w:t>
-      </w:r>
-    </w:p>
-    <w:p>
-      <w:pPr>
-        <w:pStyle w:val="SPBodyText"/>
-      </w:pPr>
-      <w:r>
-        <w:t>At midday, when the day's work is underway.</w:t>
-      </w:r>
-    </w:p>
-    <w:p>
-      <w:pPr>
-        <w:pStyle w:val="SPBodyText"/>
-      </w:pPr>
-      <w:r>
-        <w:t>In the evening, as the day draws to its close.</w:t>
-      </w:r>
-    </w:p>
-    <w:p>
-      <w:pPr>
-        <w:pStyle w:val="SPBodyText"/>
-      </w:pPr>
-      <w:r>
-        <w:t>The hours may change.</w:t>
-      </w:r>
-    </w:p>
-    <w:p>
-      <w:pPr>
-        <w:pStyle w:val="SPBodyText"/>
-      </w:pPr>
-      <w:r>
-        <w:t>Our circumstances may change.</w:t>
-      </w:r>
-    </w:p>
-    <w:p>
-      <w:pPr>
-        <w:pStyle w:val="SPBodyText"/>
-      </w:pPr>
-      <w:r>
-        <w:lastRenderedPageBreak/>
-        <w:t>But the mystery remains.</w:t>
-      </w:r>
-    </w:p>
-    <w:p>
-      <w:pPr>
-        <w:pStyle w:val="SPBodyText"/>
-      </w:pPr>
-    </w:p>
-    <w:p>
-      <w:pPr>
-        <w:pStyle w:val="SPBodyText"/>
-      </w:pPr>
-      <w:r>
-        <w:t>God has come near.</w:t>
-      </w:r>
-    </w:p>
-    <w:p>
-      <w:pPr>
-        <w:pStyle w:val="SPBodyText"/>
-      </w:pPr>
-    </w:p>
-    <w:p>
-      <w:pPr>
-        <w:pStyle w:val="SPBodyText"/>
-      </w:pPr>
-      <w:r>
-        <w:t>The Son of God entered our humanity.</w:t>
-      </w:r>
-    </w:p>
-    <w:p>
-      <w:pPr>
-        <w:pStyle w:val="SPBodyText"/>
-      </w:pPr>
-      <w:r>
-        <w:t>He took flesh from Mary.</w:t>
-      </w:r>
-    </w:p>
-    <w:p>
-      <w:pPr>
-        <w:pStyle w:val="SPBodyText"/>
-      </w:pPr>
-      <w:r>
-        <w:t>He entered our world, not from a distance, but from within it.</w:t>
-      </w:r>
-    </w:p>
-    <w:p>
-      <w:pPr>
-        <w:pStyle w:val="SPBodyText"/>
-      </w:pPr>
-    </w:p>
-    <w:p>
-      <w:pPr>
-        <w:pStyle w:val="SPBodyText"/>
-      </w:pPr>
-      <w:r>
-        <w:t xml:space="preserve">Mary's </w:t>
-      </w:r>
+      </w:pPr>
       <w:r>
         <w:rPr>
           <w:i/>
           <w:iCs/>
         </w:rPr>
+        <w:t>“Behold the handmaid of the Lord.”</w:t>
+      </w:r>
+    </w:p>
+    <w:p>
+      <w:pPr>
+        <w:pStyle w:val="SPBodyText"/>
+      </w:pPr>
+    </w:p>
+    <w:p>
+      <w:pPr>
+        <w:pStyle w:val="SPBodyText"/>
+      </w:pPr>
+      <w:r>
+        <w:t>Her answer was not accompanied by certainty about everything that would follow. She did not know every sorrow she would encounter, every joy she would receive, or every mystery she would carry.</w:t>
+      </w:r>
+    </w:p>
+    <w:p>
+      <w:pPr>
+        <w:pStyle w:val="SPBodyText"/>
+      </w:pPr>
+      <w:r>
+        <w:t>She simply trusted God.</w:t>
+      </w:r>
+    </w:p>
+    <w:p>
+      <w:pPr>
+        <w:pStyle w:val="SPBodyText"/>
+      </w:pPr>
+      <w:r>
+        <w:t xml:space="preserve">And through her </w:t>
+      </w:r>
+      <w:r>
+        <w:t>acceptance</w:t>
+      </w:r>
+      <w:r>
+        <w:t>, the Word became flesh.</w:t>
+      </w:r>
+    </w:p>
+    <w:p>
+      <w:pPr>
+        <w:pStyle w:val="SPBodyText"/>
+      </w:pPr>
+    </w:p>
+    <w:p>
+      <w:pPr>
+        <w:pStyle w:val="SPBodyText"/>
+      </w:pPr>
+      <w:r>
+        <w:t>The Angelus invites us to pause throughout the day and remember this mystery.</w:t>
+      </w:r>
+    </w:p>
+    <w:p>
+      <w:pPr>
+        <w:pStyle w:val="SPBodyText"/>
+      </w:pPr>
+    </w:p>
+    <w:p>
+      <w:pPr>
+        <w:pStyle w:val="SPBodyText"/>
+      </w:pPr>
+      <w:r>
+        <w:t>In the morning, as the day begins.</w:t>
+      </w:r>
+    </w:p>
+    <w:p>
+      <w:pPr>
+        <w:pStyle w:val="SPBodyText"/>
+      </w:pPr>
+      <w:r>
+        <w:t>At midday, when the day's work is underway.</w:t>
+      </w:r>
+    </w:p>
+    <w:p>
+      <w:pPr>
+        <w:pStyle w:val="SPBodyText"/>
+      </w:pPr>
+      <w:r>
+        <w:t>In the evening, as the day draws to its close.</w:t>
+      </w:r>
+    </w:p>
+    <w:p>
+      <w:pPr>
+        <w:pStyle w:val="SPBodyText"/>
+      </w:pPr>
+    </w:p>
+    <w:p>
+      <w:pPr>
+        <w:pStyle w:val="SPBodyText"/>
+      </w:pPr>
+      <w:r>
+        <w:lastRenderedPageBreak/>
+        <w:t>The hours may change.</w:t>
+      </w:r>
+    </w:p>
+    <w:p>
+      <w:pPr>
+        <w:pStyle w:val="SPBodyText"/>
+      </w:pPr>
+      <w:r>
+        <w:t>Our circumstances may change.</w:t>
+      </w:r>
+    </w:p>
+    <w:p>
+      <w:pPr>
+        <w:pStyle w:val="SPBodyText"/>
+      </w:pPr>
+      <w:r>
+        <w:t>But the mystery remains.</w:t>
+      </w:r>
+    </w:p>
+    <w:p>
+      <w:pPr>
+        <w:pStyle w:val="SPBodyText"/>
+      </w:pPr>
+    </w:p>
+    <w:p>
+      <w:pPr>
+        <w:pStyle w:val="SPBodyText"/>
+      </w:pPr>
+      <w:r>
+        <w:t>God has come near.</w:t>
+      </w:r>
+    </w:p>
+    <w:p>
+      <w:pPr>
+        <w:pStyle w:val="SPBodyText"/>
+      </w:pPr>
+    </w:p>
+    <w:p>
+      <w:pPr>
+        <w:pStyle w:val="SPBodyText"/>
+      </w:pPr>
+      <w:r>
+        <w:t>The Son of God entered our humanity.</w:t>
+      </w:r>
+    </w:p>
+    <w:p>
+      <w:pPr>
+        <w:pStyle w:val="SPBodyText"/>
+      </w:pPr>
+      <w:r>
+        <w:t>He entered our world, not from a distance, but from within it.</w:t>
+      </w:r>
+    </w:p>
+    <w:p>
+      <w:pPr>
+        <w:pStyle w:val="SPBodyText"/>
+      </w:pPr>
+    </w:p>
+    <w:p>
+      <w:pPr>
+        <w:pStyle w:val="SPBodyText"/>
+      </w:pPr>
+      <w:r>
+        <w:t xml:space="preserve">Mary's </w:t>
+      </w:r>
+      <w:r>
+        <w:rPr>
+          <w:i/>
+          <w:iCs/>
+        </w:rPr>
         <w:t>Fiat</w:t>
       </w:r>
       <w:r>
@@ -15375,8 +15463,16 @@
     <w:p>
       <w:pPr>
         <w:pStyle w:val="SPBodyText"/>
-      </w:pPr>
-      <w:r>
+        <w:rPr>
+          <w:i/>
+          <w:iCs/>
+        </w:rPr>
+      </w:pPr>
+      <w:r>
+        <w:rPr>
+          <w:i/>
+          <w:iCs/>
+        </w:rPr>
         <w:t>“Let it be done to me according to your word.”</w:t>
       </w:r>
     </w:p>
@@ -15575,152 +15671,6 @@
       </w:pPr>
       <w:r>
         <w:t>And Christ dwells among us.</w:t>
-      </w:r>
-    </w:p>
-    <w:p>
-      <w:pPr>
-        <w:pStyle w:val="SPBodyText"/>
-      </w:pPr>
-    </w:p>
-    <w:p>
-      <w:pPr>
-        <w:pStyle w:val="SPBodyText"/>
-      </w:pPr>
-      <w:r>
-        <w:t>At six in the morning, we remember the beginning.</w:t>
-      </w:r>
-    </w:p>
-    <w:p>
-      <w:pPr>
-        <w:pStyle w:val="SPBodyText"/>
-      </w:pPr>
-      <w:r>
-        <w:t>At noon, we pause in the midst of our work.</w:t>
-      </w:r>
-    </w:p>
-    <w:p>
-      <w:pPr>
-        <w:pStyle w:val="SPBodyText"/>
-      </w:pPr>
-      <w:r>
-        <w:lastRenderedPageBreak/>
-        <w:t>At six in the evening, we remember again as the day comes to an end.</w:t>
-      </w:r>
-    </w:p>
-    <w:p>
-      <w:pPr>
-        <w:pStyle w:val="SPBodyText"/>
-      </w:pPr>
-    </w:p>
-    <w:p>
-      <w:pPr>
-        <w:pStyle w:val="SPBodyText"/>
-      </w:pPr>
-      <w:r>
-        <w:t>Three times a day, we return to the same mystery.</w:t>
-      </w:r>
-    </w:p>
-    <w:p>
-      <w:pPr>
-        <w:pStyle w:val="SPBodyText"/>
-      </w:pPr>
-      <w:r>
-        <w:t>Not because God has forgotten us,</w:t>
-      </w:r>
-    </w:p>
-    <w:p>
-      <w:pPr>
-        <w:pStyle w:val="SPBodyText"/>
-      </w:pPr>
-      <w:r>
-        <w:t>but because we so easily forget Him.</w:t>
-      </w:r>
-    </w:p>
-    <w:p>
-      <w:pPr>
-        <w:pStyle w:val="SPBodyText"/>
-      </w:pPr>
-    </w:p>
-    <w:p>
-      <w:pPr>
-        <w:pStyle w:val="SPBodyText"/>
-      </w:pPr>
-      <w:r>
-        <w:t>The Angelus calls us back.</w:t>
-      </w:r>
-    </w:p>
-    <w:p>
-      <w:pPr>
-        <w:pStyle w:val="SPBodyText"/>
-      </w:pPr>
-      <w:r>
-        <w:t>Back to Mary.</w:t>
-      </w:r>
-    </w:p>
-    <w:p>
-      <w:pPr>
-        <w:pStyle w:val="SPBodyText"/>
-      </w:pPr>
-      <w:r>
-        <w:t>Back to the Incarnation.</w:t>
-      </w:r>
-    </w:p>
-    <w:p>
-      <w:pPr>
-        <w:pStyle w:val="SPBodyText"/>
-      </w:pPr>
-      <w:r>
-        <w:t>Back to Christ.</w:t>
-      </w:r>
-    </w:p>
-    <w:p>
-      <w:pPr>
-        <w:pStyle w:val="SPBodyText"/>
-      </w:pPr>
-      <w:r>
-        <w:t>Back to the truth that God is near.</w:t>
-      </w:r>
-    </w:p>
-    <w:p>
-      <w:pPr>
-        <w:pStyle w:val="SPBodyText"/>
-      </w:pPr>
-    </w:p>
-    <w:p>
-      <w:pPr>
-        <w:pStyle w:val="SPBodyText"/>
-      </w:pPr>
-      <w:r>
-        <w:t>And perhaps, after saying the prayer, we can carry that truth with us into whatever remains of the day.</w:t>
-      </w:r>
-    </w:p>
-    <w:p>
-      <w:pPr>
-        <w:pStyle w:val="SPBodyText"/>
-      </w:pPr>
-    </w:p>
-    <w:p>
-      <w:pPr>
-        <w:pStyle w:val="SPBodyText"/>
-      </w:pPr>
-      <w:r>
-        <w:t>The Word became flesh.</w:t>
-      </w:r>
-    </w:p>
-    <w:p>
-      <w:pPr>
-        <w:pStyle w:val="SPBodyText"/>
-      </w:pPr>
-      <w:r>
-        <w:t>God came near.</w:t>
-      </w:r>
-    </w:p>
-    <w:p>
-      <w:pPr>
-        <w:pStyle w:val="SPBodyText"/>
-      </w:pPr>
-      <w:r>
-        <w:t>And He is still with us.</w:t>
       </w:r>
     </w:p>
     <w:p>
@@ -15740,6 +15690,166 @@
           <w:docGrid w:linePitch="360"/>
         </w:sectPr>
       </w:pPr>
+    </w:p>
+    <w:p>
+      <w:pPr>
+        <w:pStyle w:val="SPBodyText"/>
+      </w:pPr>
+      <w:r>
+        <w:lastRenderedPageBreak/>
+        <w:t>At six in the morning, we remember the beginning.</w:t>
+      </w:r>
+    </w:p>
+    <w:p>
+      <w:pPr>
+        <w:pStyle w:val="SPBodyText"/>
+      </w:pPr>
+      <w:r>
+        <w:t>At noon, we pause in the midst of our work.</w:t>
+      </w:r>
+    </w:p>
+    <w:p>
+      <w:pPr>
+        <w:pStyle w:val="SPBodyText"/>
+      </w:pPr>
+      <w:r>
+        <w:t>At six in the evening, we remember again as the day comes to an end.</w:t>
+      </w:r>
+    </w:p>
+    <w:p>
+      <w:pPr>
+        <w:pStyle w:val="SPBodyText"/>
+      </w:pPr>
+    </w:p>
+    <w:p>
+      <w:pPr>
+        <w:pStyle w:val="SPBodyText"/>
+      </w:pPr>
+      <w:r>
+        <w:t>Three times a day, we return to the same mystery.</w:t>
+      </w:r>
+    </w:p>
+    <w:p>
+      <w:pPr>
+        <w:pStyle w:val="SPBodyText"/>
+      </w:pPr>
+      <w:r>
+        <w:t>Not because God has forgotten us,</w:t>
+      </w:r>
+    </w:p>
+    <w:p>
+      <w:pPr>
+        <w:pStyle w:val="SPBodyText"/>
+      </w:pPr>
+      <w:r>
+        <w:t>but because we so easily forget Him.</w:t>
+      </w:r>
+    </w:p>
+    <w:p>
+      <w:pPr>
+        <w:pStyle w:val="SPBodyText"/>
+      </w:pPr>
+    </w:p>
+    <w:p>
+      <w:pPr>
+        <w:pStyle w:val="SPBodyText"/>
+      </w:pPr>
+      <w:r>
+        <w:t>The Angelus calls us back.</w:t>
+      </w:r>
+    </w:p>
+    <w:p>
+      <w:pPr>
+        <w:pStyle w:val="SPBodyText"/>
+      </w:pPr>
+      <w:r>
+        <w:t>Back to Mary.</w:t>
+      </w:r>
+    </w:p>
+    <w:p>
+      <w:pPr>
+        <w:pStyle w:val="SPBodyText"/>
+      </w:pPr>
+      <w:r>
+        <w:t>Back to the Incarnation.</w:t>
+      </w:r>
+    </w:p>
+    <w:p>
+      <w:pPr>
+        <w:pStyle w:val="SPBodyText"/>
+      </w:pPr>
+      <w:r>
+        <w:t>Back to Christ.</w:t>
+      </w:r>
+    </w:p>
+    <w:p>
+      <w:pPr>
+        <w:pStyle w:val="SPBodyText"/>
+      </w:pPr>
+      <w:r>
+        <w:t>Back to the truth that God is near.</w:t>
+      </w:r>
+    </w:p>
+    <w:p>
+      <w:pPr>
+        <w:pStyle w:val="SPBodyText"/>
+      </w:pPr>
+    </w:p>
+    <w:p>
+      <w:pPr>
+        <w:pStyle w:val="SPBodyText"/>
+      </w:pPr>
+      <w:r>
+        <w:t>And perhaps, after saying the prayer, we can carry that truth with us into whatever remains of the day.</w:t>
+      </w:r>
+    </w:p>
+    <w:p>
+      <w:pPr>
+        <w:pStyle w:val="SPBodyText"/>
+      </w:pPr>
+    </w:p>
+    <w:p>
+      <w:pPr>
+        <w:pStyle w:val="SPBodyText"/>
+      </w:pPr>
+      <w:r>
+        <w:t>The Word became flesh.</w:t>
+      </w:r>
+    </w:p>
+    <w:p>
+      <w:pPr>
+        <w:pStyle w:val="SPBodyText"/>
+      </w:pPr>
+      <w:r>
+        <w:t>God came near.</w:t>
+      </w:r>
+    </w:p>
+    <w:p>
+      <w:pPr>
+        <w:pStyle w:val="SPBodyText"/>
+      </w:pPr>
+      <w:r>
+        <w:t>And He is still with us.</w:t>
+      </w:r>
+    </w:p>
+    <w:p>
+      <w:pPr>
+        <w:pStyle w:val="SPBodyText"/>
+      </w:pPr>
+    </w:p>
+    <w:p>
+      <w:pPr>
+        <w:pStyle w:val="SPBodyText"/>
+        <w:jc w:val="center"/>
+        <w:sectPr>
+          <w:type w:val="evenPage"/>
+          <w:pgSz w:w="7920" w:h="12240" w:code="6"/>
+          <w:pgMar w:top="1080" w:right="864" w:bottom="1080" w:left="1152" w:header="576" w:footer="576" w:gutter="0"/>
+          <w:cols w:space="720"/>
+          <w:titlePg/>
+          <w:docGrid w:linePitch="360"/>
+        </w:sectPr>
+      </w:pPr>
       <w:r>
         <w:rPr>
           <w:rFonts w:ascii="Segoe UI Symbol" w:hAnsi="Segoe UI Symbol" w:cs="Segoe UI Symbol"/>
@@ -15750,6 +15860,7 @@
     <w:p>
       <w:pPr>
         <w:pStyle w:val="SPBodyText"/>
+        <w:jc w:val="center"/>
       </w:pPr>
       <w:r>
         <w:rPr>
@@ -15777,27 +15888,31 @@
     <w:p>
       <w:pPr>
         <w:pStyle w:val="SPBodyText"/>
-      </w:pPr>
-      <w:r>
-        <w:t>The Soul of Christ</w:t>
-      </w:r>
-    </w:p>
-    <w:p>
-      <w:pPr>
-        <w:pStyle w:val="SPBodyText"/>
-      </w:pPr>
-      <w:r>
-        <w:t xml:space="preserve">The </w:t>
-      </w:r>
-      <w:r>
         <w:rPr>
           <w:b/>
           <w:bCs/>
         </w:rPr>
-        <w:t>Anima Christi</w:t>
-      </w:r>
-      <w:r>
-        <w:t xml:space="preserve"> is an ancient Christian prayer traditionally associated with devotion to Christ and, in particular, with the Eucharist. Its origins are uncertain, but the prayer was already in use by the early sixteenth century and became especially beloved through its association with St. Ignatius of Loyola, who placed it at the beginning of his </w:t>
+      </w:pPr>
+      <w:r>
+        <w:rPr>
+          <w:b/>
+          <w:bCs/>
+        </w:rPr>
+        <w:t>The Soul of Christ</w:t>
+      </w:r>
+    </w:p>
+    <w:p>
+      <w:pPr>
+        <w:pStyle w:val="SPBodyText"/>
+      </w:pPr>
+      <w:r>
+        <w:t xml:space="preserve">The </w:t>
+      </w:r>
+      <w:r>
+        <w:t xml:space="preserve">Anima Christi </w:t>
+      </w:r>
+      <w:r>
+        <w:t xml:space="preserve">is an ancient Christian prayer traditionally associated with devotion to Christ and, in particular, with the Eucharist. Its origins are uncertain, but the prayer was already in use by the early sixteenth century and became especially beloved through its association with St. Ignatius of Loyola, who placed it at the beginning of his </w:t>
       </w:r>
       <w:r>
         <w:rPr>
@@ -15860,10 +15975,6 @@
         <w:t xml:space="preserve">The Anima Christi is therefore more than a meditation on Christ's Passion. It is a prayer of </w:t>
       </w:r>
       <w:r>
-        <w:rPr>
-          <w:b/>
-          <w:bCs/>
-        </w:rPr>
         <w:t>complete surrender</w:t>
       </w:r>
       <w:r>
@@ -16239,6 +16350,9 @@
       <w:r>
         <w:t>But one of the soldiers pierced his side with a spear, and at once there came out blood and water</w:t>
       </w:r>
+      <w:r>
+        <w:t xml:space="preserve">. </w:t>
+      </w:r>
     </w:p>
     <w:p>
       <w:pPr>
@@ -16291,8 +16405,16 @@
     <w:p>
       <w:pPr>
         <w:pStyle w:val="SPBodyText"/>
-      </w:pPr>
-      <w:r>
+        <w:rPr>
+          <w:b/>
+          <w:bCs/>
+        </w:rPr>
+      </w:pPr>
+      <w:r>
+        <w:rPr>
+          <w:b/>
+          <w:bCs/>
+        </w:rPr>
         <w:t>A Prayer of Complete Surrender</w:t>
       </w:r>
     </w:p>
@@ -16358,8 +16480,16 @@
     <w:p>
       <w:pPr>
         <w:pStyle w:val="SPBodyText"/>
-      </w:pPr>
-      <w:r>
+        <w:rPr>
+          <w:i/>
+          <w:iCs/>
+        </w:rPr>
+      </w:pPr>
+      <w:r>
+        <w:rPr>
+          <w:i/>
+          <w:iCs/>
+        </w:rPr>
         <w:t>“Sanctify me. Save me. Wash me. Strengthen me.”</w:t>
       </w:r>
     </w:p>
@@ -16426,8 +16556,16 @@
     <w:p>
       <w:pPr>
         <w:pStyle w:val="SPBodyText"/>
-      </w:pPr>
-      <w:r>
+        <w:rPr>
+          <w:i/>
+          <w:iCs/>
+        </w:rPr>
+      </w:pPr>
+      <w:r>
+        <w:rPr>
+          <w:i/>
+          <w:iCs/>
+        </w:rPr>
         <w:t>“Never permit me to be separated from You,”</w:t>
       </w:r>
     </w:p>
@@ -16494,8 +16632,16 @@
     <w:p>
       <w:pPr>
         <w:pStyle w:val="SPBodyText"/>
-      </w:pPr>
-      <w:r>
+        <w:rPr>
+          <w:i/>
+          <w:iCs/>
+        </w:rPr>
+      </w:pPr>
+      <w:r>
+        <w:rPr>
+          <w:i/>
+          <w:iCs/>
+        </w:rPr>
         <w:t>“And bid me come to You.”</w:t>
       </w:r>
     </w:p>
@@ -16523,6 +16669,7 @@
     <w:p>
       <w:pPr>
         <w:pStyle w:val="SPBodyText"/>
+        <w:jc w:val="center"/>
       </w:pPr>
       <w:r>
         <w:rPr>
@@ -16593,14 +16740,7 @@
         <w:t xml:space="preserve">The prayer we learned as children can become, with the understanding of an adult, a prayer of </w:t>
       </w:r>
       <w:r>
-        <w:rPr>
-          <w:b/>
-          <w:bCs/>
-        </w:rPr>
-        <w:t>trust</w:t>
-      </w:r>
-      <w:r>
-        <w:t>:</w:t>
+        <w:t>trust:</w:t>
       </w:r>
     </w:p>
     <w:p>
@@ -16915,11 +17055,23 @@
     <w:p>
       <w:pPr>
         <w:pStyle w:val="SPBodyText"/>
-      </w:pPr>
-      <w:r>
+        <w:rPr>
+          <w:b/>
+          <w:bCs/>
+        </w:rPr>
+      </w:pPr>
+      <w:r>
+        <w:rPr>
+          <w:b/>
+          <w:bCs/>
+        </w:rPr>
         <w:t>The Care We Cannot Always See</w:t>
       </w:r>
       <w:r>
+        <w:rPr>
+          <w:b/>
+          <w:bCs/>
+        </w:rPr>
         <w:t>.</w:t>
       </w:r>
     </w:p>
@@ -17094,14 +17246,7 @@
         <w:t xml:space="preserve">The Guardian Angel Prayer therefore becomes more than a prayer we learned as children. It becomes a prayer of </w:t>
       </w:r>
       <w:r>
-        <w:rPr>
-          <w:b/>
-          <w:bCs/>
-        </w:rPr>
-        <w:t>trust</w:t>
-      </w:r>
-      <w:r>
-        <w:t>.</w:t>
+        <w:t>trust.</w:t>
       </w:r>
     </w:p>
     <w:p>
@@ -17203,12 +17348,19 @@
       </w:r>
       <w:r>
         <w:br/>
-        <w:t>And we never walk toward Him alone.</w:t>
-      </w:r>
-    </w:p>
-    <w:p>
-      <w:pPr>
-        <w:pStyle w:val="SPBodyText"/>
+        <w:t xml:space="preserve">And we never walk </w:t>
+      </w:r>
+      <w:r>
+        <w:t>this life</w:t>
+      </w:r>
+      <w:r>
+        <w:t xml:space="preserve"> alone.</w:t>
+      </w:r>
+    </w:p>
+    <w:p>
+      <w:pPr>
+        <w:pStyle w:val="SPBodyText"/>
+        <w:jc w:val="center"/>
       </w:pPr>
       <w:r>
         <w:rPr>
@@ -17583,12 +17735,17 @@
     <w:p>
       <w:pPr>
         <w:pStyle w:val="SPBodyText"/>
-      </w:pPr>
-      <w:r>
-        <w:t>I</w:t>
-      </w:r>
-      <w:r>
-        <w:t>n the Hands of Mercy</w:t>
+        <w:rPr>
+          <w:b/>
+          <w:bCs/>
+        </w:rPr>
+      </w:pPr>
+      <w:r>
+        <w:rPr>
+          <w:b/>
+          <w:bCs/>
+        </w:rPr>
+        <w:t>In the Hands of Mercy</w:t>
       </w:r>
     </w:p>
     <w:p>
@@ -17615,8 +17772,16 @@
     <w:p>
       <w:pPr>
         <w:pStyle w:val="SPBodyText"/>
-      </w:pPr>
-      <w:r>
+        <w:rPr>
+          <w:i/>
+          <w:iCs/>
+        </w:rPr>
+      </w:pPr>
+      <w:r>
+        <w:rPr>
+          <w:i/>
+          <w:iCs/>
+        </w:rPr>
         <w:t>“Eternal rest grant unto them, O Lord.”</w:t>
       </w:r>
     </w:p>
@@ -17672,8 +17837,8 @@
       </w:r>
       <w:r>
         <w:rPr>
-          <w:b/>
-          <w:bCs/>
+          <w:i/>
+          <w:iCs/>
         </w:rPr>
         <w:t>“May perpetual light shine upon them”</w:t>
       </w:r>
@@ -17773,6 +17938,7 @@
     <w:p>
       <w:pPr>
         <w:pStyle w:val="SPBodyText"/>
+        <w:jc w:val="center"/>
       </w:pPr>
       <w:r>
         <w:rPr>
@@ -17828,8 +17994,8 @@
       </w:r>
       <w:r>
         <w:rPr>
-          <w:b/>
-          <w:bCs/>
+          <w:i/>
+          <w:iCs/>
         </w:rPr>
         <w:t>“Blessed be...”</w:t>
       </w:r>
@@ -18112,7 +18278,13 @@
         <w:pStyle w:val="SPScripture"/>
       </w:pPr>
       <w:r>
-        <w:t>Praise the Lord! Praise, O servants of the Lord, praise the name of the Lord! Blessed be the name of the Lord for this time forth and for evermore! From the rising of the sun to its setting the name of the Lord is to be praised!</w:t>
+        <w:t>Praise the Lord! Praise, O servants of the Lord, praise the name of the Lord! Blessed be the name of the Lord f</w:t>
+      </w:r>
+      <w:r>
+        <w:t>rom</w:t>
+      </w:r>
+      <w:r>
+        <w:t xml:space="preserve"> this time forth and for evermore! From the rising of the sun to its setting the name of the Lord is to be praised!</w:t>
       </w:r>
     </w:p>
     <w:p>
@@ -18144,7 +18316,13 @@
         <w:pStyle w:val="SPScripture"/>
       </w:pPr>
       <w:r>
-        <w:t>And all the angels stood round the throne and round the elders and the four living creatures, and they fell on their faces before the throne and worshiped God, saying, “Amen! Blessing and glory and wisdom and thanksgiving and honor and power and might be to our God for ever and ever! Amen!”</w:t>
+        <w:t>And all the angels stood round the throne and round the elders and the four living creatures, and they fell on their faces before the throne and worshiped God, saying, “Amen! Blessing and glory and wisdom and thanksgiving and honor and power and might be to our God for ever and ever! Amen</w:t>
+      </w:r>
+      <w:r>
+        <w:t>.</w:t>
+      </w:r>
+      <w:r>
+        <w:t>”</w:t>
       </w:r>
     </w:p>
     <w:p>
@@ -18194,35 +18372,36 @@
     <w:p>
       <w:pPr>
         <w:pStyle w:val="SPBodyText"/>
-      </w:pPr>
-      <w:r>
-        <w:t>A Heart That Gives Thanks</w:t>
-      </w:r>
-    </w:p>
-    <w:p>
-      <w:pPr>
-        <w:pStyle w:val="SPBodyText"/>
-      </w:pPr>
-      <w:r>
-        <w:t>Praise is one of the simplest forms of prayer, and yet it can be one of the hardest for us to practise.</w:t>
-      </w:r>
-    </w:p>
-    <w:p>
-      <w:pPr>
-        <w:pStyle w:val="SPBodyText"/>
-      </w:pPr>
-      <w:r>
-        <w:t xml:space="preserve">We are naturally inclined to come before God with our needs: asking for help, forgiveness, healing, protection, guidance, and strength. These are good and necessary prayers. But the Divine Praises reminds us that prayer is also an act of simply </w:t>
-      </w:r>
-      <w:r>
         <w:rPr>
           <w:b/>
           <w:bCs/>
         </w:rPr>
-        <w:t>adoring God for who He is</w:t>
-      </w:r>
-      <w:r>
-        <w:t>.</w:t>
+      </w:pPr>
+      <w:r>
+        <w:rPr>
+          <w:b/>
+          <w:bCs/>
+        </w:rPr>
+        <w:t>A Heart That Gives Thanks</w:t>
+      </w:r>
+    </w:p>
+    <w:p>
+      <w:pPr>
+        <w:pStyle w:val="SPBodyText"/>
+      </w:pPr>
+      <w:r>
+        <w:t>Praise is one of the simplest forms of prayer, and yet it can be one of the hardest for us to practise.</w:t>
+      </w:r>
+    </w:p>
+    <w:p>
+      <w:pPr>
+        <w:pStyle w:val="SPBodyText"/>
+      </w:pPr>
+      <w:r>
+        <w:t xml:space="preserve">We are naturally inclined to come before God with our needs: asking for help, forgiveness, healing, protection, guidance, and strength. These are good and necessary prayers. But the Divine Praises reminds us that prayer is also an act of </w:t>
+      </w:r>
+      <w:r>
+        <w:t>simply adoring God for who He is.</w:t>
       </w:r>
     </w:p>
     <w:p>
@@ -18241,8 +18420,16 @@
     <w:p>
       <w:pPr>
         <w:pStyle w:val="SPBodyText"/>
-      </w:pPr>
-      <w:r>
+        <w:rPr>
+          <w:i/>
+          <w:iCs/>
+        </w:rPr>
+      </w:pPr>
+      <w:r>
+        <w:rPr>
+          <w:i/>
+          <w:iCs/>
+        </w:rPr>
         <w:t>Blessed be...</w:t>
       </w:r>
     </w:p>
@@ -18345,8 +18532,16 @@
     <w:p>
       <w:pPr>
         <w:pStyle w:val="SPBodyText"/>
-      </w:pPr>
-      <w:r>
+        <w:rPr>
+          <w:i/>
+          <w:iCs/>
+        </w:rPr>
+      </w:pPr>
+      <w:r>
+        <w:rPr>
+          <w:i/>
+          <w:iCs/>
+        </w:rPr>
         <w:t>Blessed be God.</w:t>
       </w:r>
     </w:p>
@@ -18368,17 +18563,10 @@
         <w:pStyle w:val="SPBodyText"/>
       </w:pPr>
       <w:r>
-        <w:t xml:space="preserve">It simply requires that we remember </w:t>
-      </w:r>
-      <w:r>
-        <w:rPr>
-          <w:b/>
-          <w:bCs/>
-        </w:rPr>
-        <w:t>who God is</w:t>
-      </w:r>
-      <w:r>
-        <w:t>.</w:t>
+        <w:t xml:space="preserve">It simply requires that we </w:t>
+      </w:r>
+      <w:r>
+        <w:t>remember who God is.</w:t>
       </w:r>
     </w:p>
     <w:p>
@@ -18405,6 +18593,7 @@
     <w:p>
       <w:pPr>
         <w:pStyle w:val="SPBodyText"/>
+        <w:jc w:val="center"/>
       </w:pPr>
       <w:r>
         <w:rPr>
@@ -18438,8 +18627,16 @@
     <w:p>
       <w:pPr>
         <w:pStyle w:val="SPBodyText"/>
-      </w:pPr>
-      <w:r>
+        <w:rPr>
+          <w:b/>
+          <w:bCs/>
+        </w:rPr>
+      </w:pPr>
+      <w:r>
+        <w:rPr>
+          <w:b/>
+          <w:bCs/>
+        </w:rPr>
         <w:t>Resting in His Peace</w:t>
       </w:r>
     </w:p>
@@ -18713,73 +18910,89 @@
     <w:p>
       <w:pPr>
         <w:pStyle w:val="SPBodyText"/>
-      </w:pPr>
-      <w:r>
-        <w:t>Resting in God's Care</w:t>
-      </w:r>
-    </w:p>
-    <w:p>
-      <w:pPr>
-        <w:pStyle w:val="SPBodyText"/>
-      </w:pPr>
-      <w:r>
-        <w:t>There is something deeply human about the end of the day.</w:t>
-      </w:r>
-      <w:r>
-        <w:br/>
-        <w:t>The work is finished, the noise begins to fade, and we are left with our thoughts. Some days end peacefully. Others leave us carrying worries, regrets, unfinished tasks, or questions for tomorrow.</w:t>
-      </w:r>
-    </w:p>
-    <w:p>
-      <w:pPr>
-        <w:pStyle w:val="SPBodyText"/>
-      </w:pPr>
-      <w:r>
-        <w:t>The Night Prayer teaches us that we do not have to carry everything into the darkness.</w:t>
-      </w:r>
-    </w:p>
-    <w:p>
-      <w:pPr>
-        <w:pStyle w:val="SPBodyText"/>
-      </w:pPr>
-    </w:p>
-    <w:p>
-      <w:pPr>
-        <w:pStyle w:val="SPBodyText"/>
-      </w:pPr>
-      <w:r>
-        <w:t>Protect us, Lord, as we stay awake;</w:t>
-      </w:r>
-      <w:r>
-        <w:br/>
-        <w:t>watch over us as we sleep.</w:t>
-      </w:r>
-    </w:p>
-    <w:p>
-      <w:pPr>
-        <w:pStyle w:val="SPBodyText"/>
-      </w:pPr>
-    </w:p>
-    <w:p>
-      <w:pPr>
-        <w:pStyle w:val="SPBodyText"/>
-      </w:pPr>
-      <w:r>
-        <w:t>These words are simple, but they express a profound act of trust. We place ourselves, our loved ones, and all that concerns us into the hands of God. We cannot control what tomorrow will bring. We cannot solve every problem before we sleep. But we can surrender the day we have been given.</w:t>
-      </w:r>
-    </w:p>
-    <w:p>
-      <w:pPr>
-        <w:pStyle w:val="SPBodyText"/>
-      </w:pPr>
-      <w:r>
-        <w:t xml:space="preserve">The prayer also reminds us that </w:t>
-      </w:r>
-      <w:r>
         <w:rPr>
           <w:b/>
           <w:bCs/>
         </w:rPr>
+      </w:pPr>
+      <w:r>
+        <w:rPr>
+          <w:b/>
+          <w:bCs/>
+        </w:rPr>
+        <w:t>Resting in God's Care</w:t>
+      </w:r>
+    </w:p>
+    <w:p>
+      <w:pPr>
+        <w:pStyle w:val="SPBodyText"/>
+      </w:pPr>
+      <w:r>
+        <w:t>There is something deeply human about the end of the day.</w:t>
+      </w:r>
+      <w:r>
+        <w:br/>
+        <w:t>The work is finished, the noise begins to fade, and we are left with our thoughts. Some days end peacefully. Others leave us carrying worries, regrets, unfinished tasks, or questions for tomorrow.</w:t>
+      </w:r>
+    </w:p>
+    <w:p>
+      <w:pPr>
+        <w:pStyle w:val="SPBodyText"/>
+      </w:pPr>
+      <w:r>
+        <w:t>The Night Prayer teaches us that we do not have to carry everything into the darkness.</w:t>
+      </w:r>
+    </w:p>
+    <w:p>
+      <w:pPr>
+        <w:pStyle w:val="SPBodyText"/>
+      </w:pPr>
+    </w:p>
+    <w:p>
+      <w:pPr>
+        <w:pStyle w:val="SPBodyText"/>
+        <w:rPr>
+          <w:i/>
+          <w:iCs/>
+        </w:rPr>
+      </w:pPr>
+      <w:r>
+        <w:rPr>
+          <w:i/>
+          <w:iCs/>
+        </w:rPr>
+        <w:t>Protect us, Lord, as we stay awake;</w:t>
+      </w:r>
+      <w:r>
+        <w:rPr>
+          <w:i/>
+          <w:iCs/>
+        </w:rPr>
+        <w:br/>
+        <w:t>watch over us as we sleep.</w:t>
+      </w:r>
+    </w:p>
+    <w:p>
+      <w:pPr>
+        <w:pStyle w:val="SPBodyText"/>
+      </w:pPr>
+    </w:p>
+    <w:p>
+      <w:pPr>
+        <w:pStyle w:val="SPBodyText"/>
+      </w:pPr>
+      <w:r>
+        <w:t>These words are simple, but they express a profound act of trust. We place ourselves, our loved ones, and all that concerns us into the hands of God. We cannot control what tomorrow will bring. We cannot solve every problem before we sleep. But we can surrender the day we have been given.</w:t>
+      </w:r>
+    </w:p>
+    <w:p>
+      <w:pPr>
+        <w:pStyle w:val="SPBodyText"/>
+      </w:pPr>
+      <w:r>
+        <w:t xml:space="preserve">The prayer also reminds us that </w:t>
+      </w:r>
+      <w:r>
         <w:t>God does not cease to watch over us when we cease to watch over ourselves</w:t>
       </w:r>
       <w:r>
@@ -18964,121 +19177,91 @@
     <w:p>
       <w:pPr>
         <w:pStyle w:val="SPBodyText"/>
-      </w:pPr>
-      <w:r>
-        <w:t>Prayer in the Ordinary</w:t>
-      </w:r>
-    </w:p>
-    <w:p>
-      <w:pPr>
-        <w:pStyle w:val="SPBodyText"/>
-      </w:pPr>
-      <w:r>
-        <w:t>The prayers of this section remind us that prayer does not belong only to quiet churches or special moments.</w:t>
-      </w:r>
-    </w:p>
-    <w:p>
-      <w:pPr>
-        <w:pStyle w:val="SPBodyText"/>
-      </w:pPr>
-      <w:r>
-        <w:t>It belongs to the ordinary hours of the day.</w:t>
-      </w:r>
-    </w:p>
-    <w:p>
-      <w:pPr>
-        <w:pStyle w:val="SPBodyText"/>
-      </w:pPr>
-      <w:r>
-        <w:t>A morning offering places the day into God's hands before it has begun.</w:t>
-      </w:r>
-    </w:p>
-    <w:p>
-      <w:pPr>
-        <w:pStyle w:val="SPBodyText"/>
-      </w:pPr>
-      <w:r>
-        <w:t>The Angelus invites us to pause and remember the mystery of the Incarnation.</w:t>
-      </w:r>
-    </w:p>
-    <w:p>
-      <w:pPr>
-        <w:pStyle w:val="SPBodyText"/>
-      </w:pPr>
-      <w:r>
-        <w:t>The Guardian Angel Prayer reminds us that we do not walk alone.</w:t>
-      </w:r>
-    </w:p>
-    <w:p>
-      <w:pPr>
-        <w:pStyle w:val="SPBodyText"/>
-      </w:pPr>
-      <w:r>
-        <w:t>The Jesus Prayer gives us a simple prayer that can be carried quietly through the day.</w:t>
-      </w:r>
-    </w:p>
-    <w:p>
-      <w:pPr>
-        <w:pStyle w:val="SPBodyText"/>
-      </w:pPr>
-      <w:r>
-        <w:t>And the prayers for the faithful departed remind us that love does not end when earthly life does.</w:t>
-      </w:r>
-    </w:p>
-    <w:p>
-      <w:pPr>
-        <w:pStyle w:val="SPBodyText"/>
-      </w:pPr>
-      <w:r>
-        <w:t>Each prayer is simple. Yet each turns the heart towards God.</w:t>
-      </w:r>
-    </w:p>
-    <w:p>
-      <w:pPr>
-        <w:pStyle w:val="SPBodyText"/>
-      </w:pPr>
-      <w:r>
-        <w:t>We do not need perfect circumstances to pray.</w:t>
-      </w:r>
-    </w:p>
-    <w:p>
-      <w:pPr>
-        <w:pStyle w:val="SPBodyText"/>
-      </w:pPr>
-      <w:r>
-        <w:t>We can pray while beginning our work, walking through the day, resting in the evening, or remembering someone we love.</w:t>
-      </w:r>
-    </w:p>
-    <w:p>
-      <w:pPr>
-        <w:pStyle w:val="SPBodyText"/>
-      </w:pPr>
-      <w:r>
-        <w:t>The ordinary day can become a place of prayer.</w:t>
-      </w:r>
-    </w:p>
-    <w:p>
-      <w:pPr>
-        <w:pStyle w:val="SPBodyText"/>
-      </w:pPr>
-      <w:r>
-        <w:t>The Church gives us these prayers not as burdens, but as companions — words that help us return to God again and again.</w:t>
-      </w:r>
-    </w:p>
-    <w:p>
-      <w:pPr>
-        <w:pStyle w:val="SPBodyText"/>
-      </w:pPr>
-      <w:r>
-        <w:lastRenderedPageBreak/>
-        <w:t xml:space="preserve">And so, as we continue, we turn toward prayers of </w:t>
-      </w:r>
-      <w:r>
         <w:rPr>
           <w:b/>
           <w:bCs/>
         </w:rPr>
-        <w:t>protection and intercession</w:t>
+      </w:pPr>
+      <w:r>
+        <w:rPr>
+          <w:b/>
+          <w:bCs/>
+        </w:rPr>
+        <w:t>Prayer in the Ordinary</w:t>
+      </w:r>
+    </w:p>
+    <w:p>
+      <w:pPr>
+        <w:pStyle w:val="SPBodyText"/>
+      </w:pPr>
+      <w:r>
+        <w:t>The prayers of this section remind us that prayer does not belong only to quiet churches or special moments.</w:t>
+      </w:r>
+    </w:p>
+    <w:p>
+      <w:pPr>
+        <w:pStyle w:val="SPBodyText"/>
+      </w:pPr>
+      <w:r>
+        <w:t>It belongs to the ordinary hours of the day.</w:t>
+      </w:r>
+    </w:p>
+    <w:p>
+      <w:pPr>
+        <w:pStyle w:val="SPBodyText"/>
+      </w:pPr>
+      <w:r>
+        <w:t>Each prayer is simple. Yet each turns the heart towards God.</w:t>
+      </w:r>
+    </w:p>
+    <w:p>
+      <w:pPr>
+        <w:pStyle w:val="SPBodyText"/>
+      </w:pPr>
+      <w:r>
+        <w:t>We do not need perfect circumstances to pray.</w:t>
+      </w:r>
+    </w:p>
+    <w:p>
+      <w:pPr>
+        <w:pStyle w:val="SPBodyText"/>
+      </w:pPr>
+      <w:r>
+        <w:t>We can pray while beginning our work, walking through the day, resting in the evening, or remembering someone we love.</w:t>
+      </w:r>
+    </w:p>
+    <w:p>
+      <w:pPr>
+        <w:pStyle w:val="SPBodyText"/>
+      </w:pPr>
+      <w:r>
+        <w:t>The ordinary day can become a place of prayer.</w:t>
+      </w:r>
+    </w:p>
+    <w:p>
+      <w:pPr>
+        <w:pStyle w:val="SPBodyText"/>
+      </w:pPr>
+      <w:r>
+        <w:t>The Church gives us these prayers not as burdens, but as companions — words that help us return to God again and again.</w:t>
+      </w:r>
+    </w:p>
+    <w:p>
+      <w:pPr>
+        <w:pStyle w:val="SPBodyText"/>
+      </w:pPr>
+      <w:r>
+        <w:t xml:space="preserve">And so, as we continue, we turn toward prayers of </w:t>
+      </w:r>
+      <w:r>
+        <w:t>protection and intercessio</w:t>
+      </w:r>
+      <w:r>
+        <w:rPr>
+          <w:b/>
+          <w:bCs/>
+        </w:rPr>
+        <w:t>n</w:t>
       </w:r>
       <w:r>
         <w:t>: prayers in which we place ourselves, our loved ones, and those who need our prayers into the care of God.</w:t>
@@ -19087,6 +19270,7 @@
     <w:p>
       <w:pPr>
         <w:pStyle w:val="SPBodyText"/>
+        <w:jc w:val="center"/>
       </w:pPr>
       <w:r>
         <w:rPr>
@@ -19177,6 +19361,7 @@
     <w:p>
       <w:pPr>
         <w:pStyle w:val="SPBodyText"/>
+        <w:jc w:val="center"/>
       </w:pPr>
       <w:r>
         <w:rPr>
@@ -19495,35 +19680,36 @@
     <w:p>
       <w:pPr>
         <w:pStyle w:val="SPBodyText"/>
-      </w:pPr>
-      <w:r>
-        <w:t>The Battle Belongs to God</w:t>
-      </w:r>
-    </w:p>
-    <w:p>
-      <w:pPr>
-        <w:pStyle w:val="SPBodyText"/>
-      </w:pPr>
-      <w:r>
-        <w:t xml:space="preserve">The prayer to Saint Michael can initially seem very different from the quiet prayers that surround it. Its language is strong: protection, battle, evil, and the defence of souls. </w:t>
-      </w:r>
-    </w:p>
-    <w:p>
-      <w:pPr>
-        <w:pStyle w:val="SPBodyText"/>
-      </w:pPr>
-      <w:r>
-        <w:t xml:space="preserve">Yet at its heart is not fear, but </w:t>
-      </w:r>
-      <w:r>
         <w:rPr>
           <w:b/>
           <w:bCs/>
         </w:rPr>
-        <w:t>trust</w:t>
-      </w:r>
-      <w:r>
-        <w:t>.</w:t>
+      </w:pPr>
+      <w:r>
+        <w:rPr>
+          <w:b/>
+          <w:bCs/>
+        </w:rPr>
+        <w:t>The Battle Belongs to God</w:t>
+      </w:r>
+    </w:p>
+    <w:p>
+      <w:pPr>
+        <w:pStyle w:val="SPBodyText"/>
+      </w:pPr>
+      <w:r>
+        <w:t xml:space="preserve">The prayer to Saint Michael can initially seem very different from the quiet prayers that surround it. Its language is strong: protection, battle, evil, and the defence of souls. </w:t>
+      </w:r>
+    </w:p>
+    <w:p>
+      <w:pPr>
+        <w:pStyle w:val="SPBodyText"/>
+      </w:pPr>
+      <w:r>
+        <w:t xml:space="preserve">Yet at its heart is not fear, but </w:t>
+      </w:r>
+      <w:r>
+        <w:t>trust.</w:t>
       </w:r>
     </w:p>
     <w:p>
@@ -19547,8 +19733,16 @@
     <w:p>
       <w:pPr>
         <w:pStyle w:val="SPBodyText"/>
-      </w:pPr>
-      <w:r>
+        <w:rPr>
+          <w:i/>
+          <w:iCs/>
+        </w:rPr>
+      </w:pPr>
+      <w:r>
+        <w:rPr>
+          <w:i/>
+          <w:iCs/>
+        </w:rPr>
         <w:t>“The Lord rebuke you.”</w:t>
       </w:r>
     </w:p>
@@ -19664,14 +19858,10 @@
         <w:t xml:space="preserve">Saint Michael's example therefore teaches us both </w:t>
       </w:r>
       <w:r>
-        <w:rPr>
-          <w:b/>
-          <w:bCs/>
-        </w:rPr>
-        <w:t>courage and humility</w:t>
-      </w:r>
-      <w:r>
-        <w:t>: courage to stand firm, and humility to know that the victory belongs to God.</w:t>
+        <w:t>courage and humility:</w:t>
+      </w:r>
+      <w:r>
+        <w:t xml:space="preserve"> courage to stand firm, and humility to know that the victory belongs to God.</w:t>
       </w:r>
     </w:p>
     <w:p>
@@ -19691,8 +19881,16 @@
     <w:p>
       <w:pPr>
         <w:pStyle w:val="SPBodyText"/>
-      </w:pPr>
-      <w:r>
+        <w:rPr>
+          <w:i/>
+          <w:iCs/>
+        </w:rPr>
+      </w:pPr>
+      <w:r>
+        <w:rPr>
+          <w:i/>
+          <w:iCs/>
+        </w:rPr>
         <w:t>Saint Michael the Archangel, be our protection...</w:t>
       </w:r>
     </w:p>
@@ -19762,6 +19960,7 @@
     <w:p>
       <w:pPr>
         <w:pStyle w:val="SPBodyText"/>
+        <w:jc w:val="center"/>
       </w:pPr>
       <w:r>
         <w:rPr>
@@ -19816,15 +20015,25 @@
     <w:p>
       <w:pPr>
         <w:pStyle w:val="SPBodyText"/>
+        <w:rPr>
+          <w:i/>
+          <w:iCs/>
+        </w:rPr>
       </w:pPr>
       <w:r>
         <w:rPr>
           <w:b/>
           <w:bCs/>
+          <w:i/>
+          <w:iCs/>
         </w:rPr>
         <w:t>Crux sacra sit mihi lux.</w:t>
       </w:r>
       <w:r>
+        <w:rPr>
+          <w:i/>
+          <w:iCs/>
+        </w:rPr>
         <w:br/>
         <w:t>May the Holy Cross be my light.</w:t>
       </w:r>
@@ -21439,15 +21648,15 @@
         <w:pStyle w:val="SPBodyText"/>
       </w:pPr>
       <w:r>
+        <w:t>Saint Joseph therefore becomes a companion for all who carry responsibilities, provide for others, work with their hands and minds, care for their families, or quietly bear burdens known only to God.</w:t>
+      </w:r>
+    </w:p>
+    <w:p>
+      <w:pPr>
+        <w:pStyle w:val="SPBodyText"/>
+      </w:pPr>
+      <w:r>
         <w:lastRenderedPageBreak/>
-        <w:t>Saint Joseph therefore becomes a companion for all who carry responsibilities, provide for others, work with their hands and minds, care for their families, or quietly bear burdens known only to God.</w:t>
-      </w:r>
-    </w:p>
-    <w:p>
-      <w:pPr>
-        <w:pStyle w:val="SPBodyText"/>
-      </w:pPr>
-      <w:r>
         <w:t>We can ask him to teach us his quiet strength: to listen when God calls, to obey when the way is difficult, to work faithfully, and to trust that no act of love offered to God is ever insignificant.</w:t>
       </w:r>
     </w:p>
@@ -22032,23 +22241,23 @@
         <w:pStyle w:val="SPBodyText"/>
       </w:pPr>
       <w:r>
+        <w:t>Yet the parable of the lost sheep reveals something even more beautiful.</w:t>
+      </w:r>
+    </w:p>
+    <w:p>
+      <w:pPr>
+        <w:pStyle w:val="SPBodyText"/>
+      </w:pPr>
+      <w:r>
+        <w:t>The shepherd does not simply wait for the sheep to return.</w:t>
+      </w:r>
+    </w:p>
+    <w:p>
+      <w:pPr>
+        <w:pStyle w:val="SPBodyText"/>
+      </w:pPr>
+      <w:r>
         <w:lastRenderedPageBreak/>
-        <w:t>Yet the parable of the lost sheep reveals something even more beautiful.</w:t>
-      </w:r>
-    </w:p>
-    <w:p>
-      <w:pPr>
-        <w:pStyle w:val="SPBodyText"/>
-      </w:pPr>
-      <w:r>
-        <w:t>The shepherd does not simply wait for the sheep to return.</w:t>
-      </w:r>
-    </w:p>
-    <w:p>
-      <w:pPr>
-        <w:pStyle w:val="SPBodyText"/>
-      </w:pPr>
-      <w:r>
         <w:t>He goes looking for it.</w:t>
       </w:r>
     </w:p>
@@ -22159,28 +22368,28 @@
         <w:pStyle w:val="SPBodyText"/>
       </w:pPr>
       <w:r>
+        <w:t>We may ask for help with a difficult decision and discover that what we need is trust.</w:t>
+      </w:r>
+    </w:p>
+    <w:p>
+      <w:pPr>
+        <w:pStyle w:val="SPBodyText"/>
+      </w:pPr>
+      <w:r>
+        <w:t>We may pray because we feel lost and discover that God has been quietly leading us all along.</w:t>
+      </w:r>
+    </w:p>
+    <w:p>
+      <w:pPr>
+        <w:pStyle w:val="SPBodyText"/>
+      </w:pPr>
+    </w:p>
+    <w:p>
+      <w:pPr>
+        <w:pStyle w:val="SPBodyText"/>
+      </w:pPr>
+      <w:r>
         <w:lastRenderedPageBreak/>
-        <w:t>We may ask for help with a difficult decision and discover that what we need is trust.</w:t>
-      </w:r>
-    </w:p>
-    <w:p>
-      <w:pPr>
-        <w:pStyle w:val="SPBodyText"/>
-      </w:pPr>
-      <w:r>
-        <w:t>We may pray because we feel lost and discover that God has been quietly leading us all along.</w:t>
-      </w:r>
-    </w:p>
-    <w:p>
-      <w:pPr>
-        <w:pStyle w:val="SPBodyText"/>
-      </w:pPr>
-    </w:p>
-    <w:p>
-      <w:pPr>
-        <w:pStyle w:val="SPBodyText"/>
-      </w:pPr>
-      <w:r>
         <w:t>There are times when we may not know exactly where we are going.</w:t>
       </w:r>
     </w:p>
@@ -22291,33 +22500,33 @@
         <w:pStyle w:val="SPBodyText"/>
       </w:pPr>
       <w:r>
+        <w:t>And when we have lost our way, He is always ready to lead us home.</w:t>
+      </w:r>
+    </w:p>
+    <w:p>
+      <w:pPr>
+        <w:pStyle w:val="SPBodyText"/>
+      </w:pPr>
+    </w:p>
+    <w:p>
+      <w:pPr>
+        <w:pStyle w:val="SPBodyText"/>
+      </w:pPr>
+      <w:r>
+        <w:t>A Prayer to End</w:t>
+      </w:r>
+    </w:p>
+    <w:p>
+      <w:pPr>
+        <w:pStyle w:val="SPBodyText"/>
+      </w:pPr>
+    </w:p>
+    <w:p>
+      <w:pPr>
+        <w:pStyle w:val="SPBodyText"/>
+      </w:pPr>
+      <w:r>
         <w:lastRenderedPageBreak/>
-        <w:t>And when we have lost our way, He is always ready to lead us home.</w:t>
-      </w:r>
-    </w:p>
-    <w:p>
-      <w:pPr>
-        <w:pStyle w:val="SPBodyText"/>
-      </w:pPr>
-    </w:p>
-    <w:p>
-      <w:pPr>
-        <w:pStyle w:val="SPBodyText"/>
-      </w:pPr>
-      <w:r>
-        <w:t>A Prayer to End</w:t>
-      </w:r>
-    </w:p>
-    <w:p>
-      <w:pPr>
-        <w:pStyle w:val="SPBodyText"/>
-      </w:pPr>
-    </w:p>
-    <w:p>
-      <w:pPr>
-        <w:pStyle w:val="SPBodyText"/>
-      </w:pPr>
-      <w:r>
         <w:t>Saint Anthony, faithful servant of Christ,</w:t>
       </w:r>
       <w:r>
@@ -22985,7 +23194,6 @@
         <w:pStyle w:val="SPBodyText"/>
       </w:pPr>
       <w:r>
-        <w:lastRenderedPageBreak/>
         <w:t xml:space="preserve">Saint Christopher therefore reminds us that the most important question is not simply </w:t>
       </w:r>
       <w:r>
@@ -23011,6 +23219,7 @@
         <w:pStyle w:val="SPBodyText"/>
       </w:pPr>
       <w:r>
+        <w:lastRenderedPageBreak/>
         <w:t>When we carry Christ into our work, our families, our friendships, our responsibilities, and even our difficulties, ordinary journeys become opportunities for holiness.</w:t>
       </w:r>
     </w:p>
@@ -23090,7 +23299,6 @@
         <w:pStyle w:val="SPBodyText"/>
       </w:pPr>
       <w:r>
-        <w:lastRenderedPageBreak/>
         <w:t xml:space="preserve">Our earthly journeys therefore point beyond themselves toward the journey's true end: </w:t>
       </w:r>
       <w:r>
@@ -23136,6 +23344,7 @@
         <w:pStyle w:val="SPBodyText"/>
       </w:pPr>
       <w:r>
+        <w:lastRenderedPageBreak/>
         <w:t>May we learn to place every road before God.</w:t>
       </w:r>
     </w:p>
@@ -23391,36 +23600,36 @@
         <w:pStyle w:val="SPBodyText"/>
       </w:pPr>
       <w:r>
+        <w:t>Protection.</w:t>
+      </w:r>
+      <w:r>
+        <w:br/>
+        <w:t>Faithfulness.</w:t>
+      </w:r>
+      <w:r>
+        <w:br/>
+        <w:t>Service.</w:t>
+      </w:r>
+      <w:r>
+        <w:br/>
+        <w:t>Guidance.</w:t>
+      </w:r>
+      <w:r>
+        <w:br/>
+        <w:t>Perseverance.</w:t>
+      </w:r>
+    </w:p>
+    <w:p>
+      <w:pPr>
+        <w:pStyle w:val="SPBodyText"/>
+      </w:pPr>
+    </w:p>
+    <w:p>
+      <w:pPr>
+        <w:pStyle w:val="SPBodyText"/>
+      </w:pPr>
+      <w:r>
         <w:lastRenderedPageBreak/>
-        <w:t>Protection.</w:t>
-      </w:r>
-      <w:r>
-        <w:br/>
-        <w:t>Faithfulness.</w:t>
-      </w:r>
-      <w:r>
-        <w:br/>
-        <w:t>Service.</w:t>
-      </w:r>
-      <w:r>
-        <w:br/>
-        <w:t>Guidance.</w:t>
-      </w:r>
-      <w:r>
-        <w:br/>
-        <w:t>Perseverance.</w:t>
-      </w:r>
-    </w:p>
-    <w:p>
-      <w:pPr>
-        <w:pStyle w:val="SPBodyText"/>
-      </w:pPr>
-    </w:p>
-    <w:p>
-      <w:pPr>
-        <w:pStyle w:val="SPBodyText"/>
-      </w:pPr>
-      <w:r>
         <w:t>These are not only things we ask for.</w:t>
       </w:r>
     </w:p>
@@ -23734,28 +23943,28 @@
         <w:pStyle w:val="SPBodyText"/>
       </w:pPr>
       <w:r>
+        <w:t>Their absence here is therefore not an omission, but an invitation to continue the journey.</w:t>
+      </w:r>
+    </w:p>
+    <w:p>
+      <w:pPr>
+        <w:pStyle w:val="SPBodyText"/>
+      </w:pPr>
+      <w:r>
+        <w:t>There is more prayer still to discover.</w:t>
+      </w:r>
+    </w:p>
+    <w:p>
+      <w:pPr>
+        <w:pStyle w:val="SPBodyText"/>
+      </w:pPr>
+    </w:p>
+    <w:p>
+      <w:pPr>
+        <w:pStyle w:val="SPBodyText"/>
+      </w:pPr>
+      <w:r>
         <w:lastRenderedPageBreak/>
-        <w:t>Their absence here is therefore not an omission, but an invitation to continue the journey.</w:t>
-      </w:r>
-    </w:p>
-    <w:p>
-      <w:pPr>
-        <w:pStyle w:val="SPBodyText"/>
-      </w:pPr>
-      <w:r>
-        <w:t>There is more prayer still to discover.</w:t>
-      </w:r>
-    </w:p>
-    <w:p>
-      <w:pPr>
-        <w:pStyle w:val="SPBodyText"/>
-      </w:pPr>
-    </w:p>
-    <w:p>
-      <w:pPr>
-        <w:pStyle w:val="SPBodyText"/>
-      </w:pPr>
-      <w:r>
         <w:t>The saints remind us that holiness is not reserved for extraordinary lives.</w:t>
       </w:r>
     </w:p>

</xml_diff>

<commit_message>
St Joseph prayer review
</commit_message>
<xml_diff>
--- a/manuscript/volume-1/sacrae-preces-volume-1.docx
+++ b/manuscript/volume-1/sacrae-preces-volume-1.docx
@@ -4398,7 +4398,7 @@
       </w:pPr>
       <w:r>
         <w:pict w14:anchorId="249FE732">
-          <v:rect id="_x0000_i16075" style="width:0;height:1.5pt" o:hralign="center" o:hrstd="t" o:hr="t" fillcolor="#a0a0a0" stroked="f"/>
+          <v:rect id="_x0000_i18225" style="width:0;height:1.5pt" o:hralign="center" o:hrstd="t" o:hr="t" fillcolor="#a0a0a0" stroked="f"/>
         </w:pict>
       </w:r>
     </w:p>
@@ -4654,7 +4654,7 @@
       </w:pPr>
       <w:r>
         <w:pict w14:anchorId="25751FDD">
-          <v:rect id="_x0000_i16076" style="width:0;height:1.5pt" o:hralign="center" o:hrstd="t" o:hr="t" fillcolor="#a0a0a0" stroked="f"/>
+          <v:rect id="_x0000_i18226" style="width:0;height:1.5pt" o:hralign="center" o:hrstd="t" o:hr="t" fillcolor="#a0a0a0" stroked="f"/>
         </w:pict>
       </w:r>
     </w:p>
@@ -4726,7 +4726,7 @@
       </w:pPr>
       <w:r>
         <w:pict w14:anchorId="19542BB1">
-          <v:rect id="_x0000_i16077" style="width:0;height:1.5pt" o:hralign="center" o:hrstd="t" o:hr="t" fillcolor="#a0a0a0" stroked="f"/>
+          <v:rect id="_x0000_i18227" style="width:0;height:1.5pt" o:hralign="center" o:hrstd="t" o:hr="t" fillcolor="#a0a0a0" stroked="f"/>
         </w:pict>
       </w:r>
     </w:p>
@@ -4964,7 +4964,7 @@
       </w:pPr>
       <w:r>
         <w:pict w14:anchorId="68D46385">
-          <v:rect id="_x0000_i16078" style="width:0;height:1.5pt" o:hralign="center" o:hrstd="t" o:hr="t" fillcolor="#a0a0a0" stroked="f"/>
+          <v:rect id="_x0000_i18228" style="width:0;height:1.5pt" o:hralign="center" o:hrstd="t" o:hr="t" fillcolor="#a0a0a0" stroked="f"/>
         </w:pict>
       </w:r>
     </w:p>
@@ -5665,16 +5665,58 @@
         <w:rPr>
           <w:rStyle w:val="Emphasis"/>
         </w:rPr>
-        <w:t>in NOH-mee-neh PAH-tris,</w:t>
-      </w:r>
-      <w:r>
-        <w:br/>
-      </w:r>
+        <w:t>in NOH-mee-</w:t>
+      </w:r>
+      <w:proofErr w:type="spellStart"/>
       <w:r>
         <w:rPr>
           <w:rStyle w:val="Emphasis"/>
         </w:rPr>
-        <w:t>et FEE-lee-ee, et SPEE-ree-toos SAHNK-tee.</w:t>
+        <w:t>neh</w:t>
+      </w:r>
+      <w:proofErr w:type="spellEnd"/>
+      <w:r>
+        <w:rPr>
+          <w:rStyle w:val="Emphasis"/>
+        </w:rPr>
+        <w:t xml:space="preserve"> PAH-tris,</w:t>
+      </w:r>
+      <w:r>
+        <w:br/>
+      </w:r>
+      <w:r>
+        <w:rPr>
+          <w:rStyle w:val="Emphasis"/>
+        </w:rPr>
+        <w:t>et FEE-lee-ee, et SPEE-</w:t>
+      </w:r>
+      <w:proofErr w:type="spellStart"/>
+      <w:r>
+        <w:rPr>
+          <w:rStyle w:val="Emphasis"/>
+        </w:rPr>
+        <w:t>ree</w:t>
+      </w:r>
+      <w:proofErr w:type="spellEnd"/>
+      <w:r>
+        <w:rPr>
+          <w:rStyle w:val="Emphasis"/>
+        </w:rPr>
+        <w:t>-</w:t>
+      </w:r>
+      <w:proofErr w:type="spellStart"/>
+      <w:r>
+        <w:rPr>
+          <w:rStyle w:val="Emphasis"/>
+        </w:rPr>
+        <w:t>toos</w:t>
+      </w:r>
+      <w:proofErr w:type="spellEnd"/>
+      <w:r>
+        <w:rPr>
+          <w:rStyle w:val="Emphasis"/>
+        </w:rPr>
+        <w:t xml:space="preserve"> SAHNK-tee.</w:t>
       </w:r>
       <w:r>
         <w:br/>
@@ -6230,7 +6272,15 @@
         <w:t>Your</w:t>
       </w:r>
       <w:r>
-        <w:t xml:space="preserve"> kingdom come. Give us each day our daily bread; and forgive us our sins, for we ourselves forgive every one who is indebted to us; and lead us not into temptation.</w:t>
+        <w:t xml:space="preserve"> kingdom come. Give us each day our daily bread; and forgive us our sins, for we ourselves forgive </w:t>
+      </w:r>
+      <w:proofErr w:type="spellStart"/>
+      <w:r>
+        <w:t>every one</w:t>
+      </w:r>
+      <w:proofErr w:type="spellEnd"/>
+      <w:r>
+        <w:t xml:space="preserve"> who is indebted to us; and lead us not into temptation.</w:t>
       </w:r>
       <w:r>
         <w:t>”</w:t>
@@ -6304,6 +6354,7 @@
       <w:r>
         <w:t xml:space="preserve">. It is </w:t>
       </w:r>
+      <w:proofErr w:type="spellStart"/>
       <w:r>
         <w:rPr>
           <w:i/>
@@ -6311,6 +6362,7 @@
         </w:rPr>
         <w:t>our</w:t>
       </w:r>
+      <w:proofErr w:type="spellEnd"/>
       <w:r>
         <w:t>.</w:t>
       </w:r>
@@ -11161,7 +11213,15 @@
         <w:pStyle w:val="SPPrayerEnglish"/>
       </w:pPr>
       <w:r>
-        <w:t>for he has looked with favor on his lowly servant.</w:t>
+        <w:t xml:space="preserve">for he has looked with </w:t>
+      </w:r>
+      <w:proofErr w:type="spellStart"/>
+      <w:r>
+        <w:t>favor</w:t>
+      </w:r>
+      <w:proofErr w:type="spellEnd"/>
+      <w:r>
+        <w:t xml:space="preserve"> on his lowly servant.</w:t>
       </w:r>
       <w:r>
         <w:br/>
@@ -15162,13 +15222,21 @@
         <w:t>;</w:t>
       </w:r>
       <w:r>
-        <w:t xml:space="preserve"> we have beheld his glory, glory as the only</w:t>
+        <w:t xml:space="preserve"> we have beheld his glory, glory as the </w:t>
+      </w:r>
+      <w:proofErr w:type="gramStart"/>
+      <w:r>
+        <w:t>only</w:t>
       </w:r>
       <w:r>
         <w:t>-</w:t>
       </w:r>
       <w:r>
-        <w:t>begotten Son from the Father.</w:t>
+        <w:t>begotten</w:t>
+      </w:r>
+      <w:proofErr w:type="gramEnd"/>
+      <w:r>
+        <w:t xml:space="preserve"> Son from the Father.</w:t>
       </w:r>
     </w:p>
     <w:p>
@@ -20449,6 +20517,11 @@
       <w:pPr>
         <w:pStyle w:val="SPScriptureReference"/>
       </w:pPr>
+    </w:p>
+    <w:p>
+      <w:pPr>
+        <w:pStyle w:val="SPScriptureReference"/>
+      </w:pPr>
       <w:r>
         <w:t>Matthew 4:10</w:t>
       </w:r>
@@ -20490,7 +20563,21 @@
         <w:pStyle w:val="SPScripture"/>
       </w:pPr>
       <w:r>
-        <w:t>Be sober, be watchful. Your adversary the devil prowls around like a roaring lion, seeking someone to devour. Resist him, firm in your faith, knowing that the same experience of suffering is required of your brotherhood throughout the world.</w:t>
+        <w:t xml:space="preserve">Be sober, be watchful. Your adversary the devil prowls around like a roaring lion, seeking </w:t>
+      </w:r>
+      <w:proofErr w:type="spellStart"/>
+      <w:r>
+        <w:t>some</w:t>
+      </w:r>
+      <w:r>
+        <w:t xml:space="preserve"> </w:t>
+      </w:r>
+      <w:r>
+        <w:t>one</w:t>
+      </w:r>
+      <w:proofErr w:type="spellEnd"/>
+      <w:r>
+        <w:t xml:space="preserve"> to devour. Resist him, firm in your faith, knowing that the same experience of suffering is required of your brotherhood throughout the world.</w:t>
       </w:r>
     </w:p>
     <w:p>
@@ -20568,72 +20655,83 @@
     <w:p>
       <w:pPr>
         <w:pStyle w:val="SPBodyText"/>
-      </w:pPr>
-      <w:r>
-        <w:t xml:space="preserve"> </w:t>
-      </w:r>
-      <w:r>
-        <w:t>The Cross as Our Light</w:t>
-      </w:r>
-    </w:p>
-    <w:p>
-      <w:pPr>
-        <w:pStyle w:val="SPBodyText"/>
-      </w:pPr>
-      <w:r>
-        <w:t>There is something striking about the traditional words associated with Saint Benedict:</w:t>
-      </w:r>
-    </w:p>
-    <w:p>
-      <w:pPr>
-        <w:pStyle w:val="SPBodyText"/>
-      </w:pPr>
-    </w:p>
-    <w:p>
-      <w:pPr>
-        <w:pStyle w:val="SPBodyText"/>
-      </w:pPr>
-      <w:r>
         <w:rPr>
           <w:b/>
           <w:bCs/>
         </w:rPr>
-        <w:t>Crux sacra sit mihi lux.</w:t>
-      </w:r>
-      <w:r>
-        <w:br/>
-        <w:t>May the Holy Cross be my light.</w:t>
-      </w:r>
-    </w:p>
-    <w:p>
-      <w:pPr>
-        <w:pStyle w:val="SPBodyText"/>
-      </w:pPr>
-    </w:p>
-    <w:p>
-      <w:pPr>
-        <w:pStyle w:val="SPBodyText"/>
-      </w:pPr>
-      <w:r>
-        <w:t>We often think of protection as being kept safe from everything that might harm us. But the Christian life does not promise that we will never encounter temptation, suffering, uncertainty, or difficulty. Instead, Christ promises to remain with us through them.</w:t>
-      </w:r>
-    </w:p>
-    <w:p>
-      <w:pPr>
-        <w:pStyle w:val="SPBodyText"/>
-      </w:pPr>
-      <w:r>
-        <w:t xml:space="preserve">The Cross therefore becomes more than a symbol of protection. It becomes a </w:t>
+      </w:pPr>
+      <w:r>
+        <w:t xml:space="preserve"> </w:t>
       </w:r>
       <w:r>
         <w:rPr>
           <w:b/>
           <w:bCs/>
         </w:rPr>
-        <w:t>light by which we learn how to walk</w:t>
-      </w:r>
-      <w:r>
-        <w:t>.</w:t>
+        <w:t>The Cross as Our Light</w:t>
+      </w:r>
+    </w:p>
+    <w:p>
+      <w:pPr>
+        <w:pStyle w:val="SPBodyText"/>
+      </w:pPr>
+      <w:r>
+        <w:t>There is something striking about the traditional words associated with Saint Benedict:</w:t>
+      </w:r>
+    </w:p>
+    <w:p>
+      <w:pPr>
+        <w:pStyle w:val="SPBodyText"/>
+      </w:pPr>
+    </w:p>
+    <w:p>
+      <w:pPr>
+        <w:pStyle w:val="SPBodyText"/>
+        <w:rPr>
+          <w:i/>
+          <w:iCs/>
+        </w:rPr>
+      </w:pPr>
+      <w:r>
+        <w:rPr>
+          <w:b/>
+          <w:bCs/>
+          <w:i/>
+          <w:iCs/>
+        </w:rPr>
+        <w:t>Crux sacra sit mihi lux.</w:t>
+      </w:r>
+      <w:r>
+        <w:rPr>
+          <w:i/>
+          <w:iCs/>
+        </w:rPr>
+        <w:br/>
+        <w:t>May the Holy Cross be my light.</w:t>
+      </w:r>
+    </w:p>
+    <w:p>
+      <w:pPr>
+        <w:pStyle w:val="SPBodyText"/>
+      </w:pPr>
+    </w:p>
+    <w:p>
+      <w:pPr>
+        <w:pStyle w:val="SPBodyText"/>
+      </w:pPr>
+      <w:r>
+        <w:t>We often think of protection as being kept safe from everything that might harm us. But the Christian life does not promise that we will never encounter temptation, suffering, uncertainty, or difficulty. Instead, Christ promises to remain with us through them.</w:t>
+      </w:r>
+    </w:p>
+    <w:p>
+      <w:pPr>
+        <w:pStyle w:val="SPBodyText"/>
+      </w:pPr>
+      <w:r>
+        <w:t xml:space="preserve">The Cross therefore becomes more than a symbol of protection. It becomes a </w:t>
+      </w:r>
+      <w:r>
+        <w:t>light by which we learn how to walk.</w:t>
       </w:r>
     </w:p>
     <w:p>
@@ -20661,49 +20759,55 @@
         <w:t xml:space="preserve">The words of Scripture remind us that we are called to resist evil, but also to </w:t>
       </w:r>
       <w:r>
+        <w:t>submit ourselves to God</w:t>
+      </w:r>
+      <w:r>
+        <w:t>. Our strength does not come from ourselves. We remain steadfast because God gives us the grace to persevere.</w:t>
+      </w:r>
+    </w:p>
+    <w:p>
+      <w:pPr>
+        <w:pStyle w:val="SPBodyText"/>
+      </w:pPr>
+      <w:r>
+        <w:t>There will be times when the path ahead is unclear. There will be moments when temptation is strong, when fear unsettles us, or when we simply grow weary of doing what is good.</w:t>
+      </w:r>
+    </w:p>
+    <w:p>
+      <w:pPr>
+        <w:pStyle w:val="SPBodyText"/>
+      </w:pPr>
+      <w:r>
+        <w:t>In those moments, we can return to the Cross.</w:t>
+      </w:r>
+    </w:p>
+    <w:p>
+      <w:pPr>
+        <w:pStyle w:val="SPBodyText"/>
+      </w:pPr>
+    </w:p>
+    <w:p>
+      <w:pPr>
+        <w:pStyle w:val="SPBodyText"/>
+        <w:rPr>
+          <w:i/>
+          <w:iCs/>
+        </w:rPr>
+      </w:pPr>
+      <w:r>
         <w:rPr>
           <w:b/>
           <w:bCs/>
-        </w:rPr>
-        <w:t>submit ourselves to God</w:t>
-      </w:r>
-      <w:r>
-        <w:t>. Our strength does not come from ourselves. We remain steadfast because God gives us the grace to persevere.</w:t>
-      </w:r>
-    </w:p>
-    <w:p>
-      <w:pPr>
-        <w:pStyle w:val="SPBodyText"/>
-      </w:pPr>
-      <w:r>
-        <w:t>There will be times when the path ahead is unclear. There will be moments when temptation is strong, when fear unsettles us, or when we simply grow weary of doing what is good.</w:t>
-      </w:r>
-    </w:p>
-    <w:p>
-      <w:pPr>
-        <w:pStyle w:val="SPBodyText"/>
-      </w:pPr>
-      <w:r>
-        <w:t>In those moments, we can return to the Cross.</w:t>
-      </w:r>
-    </w:p>
-    <w:p>
-      <w:pPr>
-        <w:pStyle w:val="SPBodyText"/>
-      </w:pPr>
-    </w:p>
-    <w:p>
-      <w:pPr>
-        <w:pStyle w:val="SPBodyText"/>
-      </w:pPr>
-      <w:r>
-        <w:rPr>
-          <w:b/>
-          <w:bCs/>
+          <w:i/>
+          <w:iCs/>
         </w:rPr>
         <w:t>Crux sacra sit mihi lux.</w:t>
       </w:r>
       <w:r>
+        <w:rPr>
+          <w:i/>
+          <w:iCs/>
+        </w:rPr>
         <w:br/>
         <w:t>May the Holy Cross be my light.</w:t>
       </w:r>
@@ -20721,14 +20825,7 @@
         <w:t xml:space="preserve">Not merely to show me what lies ahead, but to remind me </w:t>
       </w:r>
       <w:r>
-        <w:rPr>
-          <w:b/>
-          <w:bCs/>
-        </w:rPr>
-        <w:t>who walks with me</w:t>
-      </w:r>
-      <w:r>
-        <w:t>.</w:t>
+        <w:t>who walks with me.</w:t>
       </w:r>
     </w:p>
     <w:p>
@@ -20795,6 +20892,7 @@
     <w:p>
       <w:pPr>
         <w:pStyle w:val="SPBodyText"/>
+        <w:jc w:val="center"/>
       </w:pPr>
       <w:r>
         <w:rPr>
@@ -21459,8 +21557,16 @@
     <w:p>
       <w:pPr>
         <w:pStyle w:val="SPBodyText"/>
-      </w:pPr>
-      <w:r>
+        <w:rPr>
+          <w:b/>
+          <w:bCs/>
+        </w:rPr>
+      </w:pPr>
+      <w:r>
+        <w:rPr>
+          <w:b/>
+          <w:bCs/>
+        </w:rPr>
         <w:t>The Quiet Strength of Saint Joseph</w:t>
       </w:r>
     </w:p>
@@ -21622,6 +21728,7 @@
         <w:pStyle w:val="SPBodyText"/>
       </w:pPr>
       <w:r>
+        <w:lastRenderedPageBreak/>
         <w:t>Sometimes it is continuing faithfully when the path is uncertain.</w:t>
       </w:r>
     </w:p>
@@ -21633,21 +21740,18 @@
         <w:t xml:space="preserve">And sometimes it is trusting God enough to say </w:t>
       </w:r>
       <w:r>
-        <w:rPr>
-          <w:b/>
-          <w:bCs/>
-        </w:rPr>
-        <w:t>yes</w:t>
-      </w:r>
-      <w:r>
-        <w:t>, even when we cannot yet see where that yes will lead.</w:t>
-      </w:r>
-    </w:p>
-    <w:p>
-      <w:pPr>
-        <w:pStyle w:val="SPBodyText"/>
-      </w:pPr>
-      <w:r>
+        <w:t>yes,</w:t>
+      </w:r>
+      <w:r>
+        <w:t xml:space="preserve"> even when we cannot yet see where that yes will lead.</w:t>
+      </w:r>
+    </w:p>
+    <w:p>
+      <w:pPr>
+        <w:pStyle w:val="SPBodyText"/>
+      </w:pPr>
+      <w:r>
+        <w:lastRenderedPageBreak/>
         <w:t>Saint Joseph therefore becomes a companion for all who carry responsibilities, provide for others, work with their hands and minds, care for their families, or quietly bear burdens known only to God.</w:t>
       </w:r>
     </w:p>
@@ -21656,7 +21760,6 @@
         <w:pStyle w:val="SPBodyText"/>
       </w:pPr>
       <w:r>
-        <w:lastRenderedPageBreak/>
         <w:t>We can ask him to teach us his quiet strength: to listen when God calls, to obey when the way is difficult, to work faithfully, and to trust that no act of love offered to God is ever insignificant.</w:t>
       </w:r>
     </w:p>
@@ -22093,7 +22196,15 @@
         <w:pStyle w:val="SPScripture"/>
       </w:pPr>
       <w:r>
-        <w:t>“What man of you, having a hundred sheep, if he has lost one of them,  does not leave the ninety-nine in the wilderness, and go after the one which is lost, until he finds it? And when he has found it, he lays it on his shoulders, rejoicing. And when he comes home, he calls together his friends and his neighbors, saying to them, ‘Rejoice with me, for I have found my sheep which was lost.’ Just so, I tell you, there will be more joy in heaven over one sinner who repents than over ninety-nine righteous persons who need no repentance.”</w:t>
+        <w:t xml:space="preserve">“What man of you, having a hundred sheep, if he has lost one of them,  does not leave the ninety-nine in the wilderness, and go after the one which is lost, until he finds it? And when he has found it, he lays it on his shoulders, rejoicing. And when he comes home, he calls together his friends and his </w:t>
+      </w:r>
+      <w:proofErr w:type="spellStart"/>
+      <w:r>
+        <w:t>neighbors</w:t>
+      </w:r>
+      <w:proofErr w:type="spellEnd"/>
+      <w:r>
+        <w:t>, saying to them, ‘Rejoice with me, for I have found my sheep which was lost.’ Just so, I tell you, there will be more joy in heaven over one sinner who repents than over ninety-nine righteous persons who need no repentance.”</w:t>
       </w:r>
     </w:p>
     <w:p>
@@ -22223,6 +22334,7 @@
         <w:pStyle w:val="SPBodyText"/>
       </w:pPr>
       <w:r>
+        <w:lastRenderedPageBreak/>
         <w:t xml:space="preserve">The Gospel tells us to </w:t>
       </w:r>
       <w:r>
@@ -22241,6 +22353,7 @@
         <w:pStyle w:val="SPBodyText"/>
       </w:pPr>
       <w:r>
+        <w:lastRenderedPageBreak/>
         <w:t>Yet the parable of the lost sheep reveals something even more beautiful.</w:t>
       </w:r>
     </w:p>
@@ -22257,7 +22370,6 @@
         <w:pStyle w:val="SPBodyText"/>
       </w:pPr>
       <w:r>
-        <w:lastRenderedPageBreak/>
         <w:t>He goes looking for it.</w:t>
       </w:r>
     </w:p>
@@ -22336,6 +22448,7 @@
         <w:pStyle w:val="SPBodyText"/>
       </w:pPr>
       <w:r>
+        <w:lastRenderedPageBreak/>
         <w:t>It reminds us to ask for help.</w:t>
       </w:r>
     </w:p>
@@ -22368,6 +22481,7 @@
         <w:pStyle w:val="SPBodyText"/>
       </w:pPr>
       <w:r>
+        <w:lastRenderedPageBreak/>
         <w:t>We may ask for help with a difficult decision and discover that what we need is trust.</w:t>
       </w:r>
     </w:p>
@@ -22389,69 +22503,69 @@
         <w:pStyle w:val="SPBodyText"/>
       </w:pPr>
       <w:r>
+        <w:t>There are times when we may not know exactly where we are going.</w:t>
+      </w:r>
+    </w:p>
+    <w:p>
+      <w:pPr>
+        <w:pStyle w:val="SPBodyText"/>
+      </w:pPr>
+      <w:r>
+        <w:t>We may not know which path to take, what the future will bring, or how a particular difficulty will be resolved.</w:t>
+      </w:r>
+    </w:p>
+    <w:p>
+      <w:pPr>
+        <w:pStyle w:val="SPBodyText"/>
+      </w:pPr>
+      <w:r>
+        <w:t>But we can still take the next faithful step.</w:t>
+      </w:r>
+    </w:p>
+    <w:p>
+      <w:pPr>
+        <w:pStyle w:val="SPBodyText"/>
+      </w:pPr>
+    </w:p>
+    <w:p>
+      <w:pPr>
+        <w:pStyle w:val="SPBodyText"/>
+      </w:pPr>
+      <w:r>
+        <w:t>Seek what is true.</w:t>
+      </w:r>
+      <w:r>
+        <w:br/>
+        <w:t>Love what is good.</w:t>
+      </w:r>
+      <w:r>
+        <w:br/>
+        <w:t>Ask for what you need.</w:t>
+      </w:r>
+      <w:r>
+        <w:br/>
+        <w:t>And keep turning towards Christ.</w:t>
+      </w:r>
+    </w:p>
+    <w:p>
+      <w:pPr>
+        <w:pStyle w:val="SPBodyText"/>
+      </w:pPr>
+    </w:p>
+    <w:p>
+      <w:pPr>
+        <w:pStyle w:val="SPBodyText"/>
+      </w:pPr>
+      <w:r>
+        <w:t>Saint Anthony's example reminds us that seeking is itself an act of faith.</w:t>
+      </w:r>
+    </w:p>
+    <w:p>
+      <w:pPr>
+        <w:pStyle w:val="SPBodyText"/>
+      </w:pPr>
+      <w:r>
         <w:lastRenderedPageBreak/>
-        <w:t>There are times when we may not know exactly where we are going.</w:t>
-      </w:r>
-    </w:p>
-    <w:p>
-      <w:pPr>
-        <w:pStyle w:val="SPBodyText"/>
-      </w:pPr>
-      <w:r>
-        <w:t>We may not know which path to take, what the future will bring, or how a particular difficulty will be resolved.</w:t>
-      </w:r>
-    </w:p>
-    <w:p>
-      <w:pPr>
-        <w:pStyle w:val="SPBodyText"/>
-      </w:pPr>
-      <w:r>
-        <w:t>But we can still take the next faithful step.</w:t>
-      </w:r>
-    </w:p>
-    <w:p>
-      <w:pPr>
-        <w:pStyle w:val="SPBodyText"/>
-      </w:pPr>
-    </w:p>
-    <w:p>
-      <w:pPr>
-        <w:pStyle w:val="SPBodyText"/>
-      </w:pPr>
-      <w:r>
-        <w:t>Seek what is true.</w:t>
-      </w:r>
-      <w:r>
-        <w:br/>
-        <w:t>Love what is good.</w:t>
-      </w:r>
-      <w:r>
-        <w:br/>
-        <w:t>Ask for what you need.</w:t>
-      </w:r>
-      <w:r>
-        <w:br/>
-        <w:t>And keep turning towards Christ.</w:t>
-      </w:r>
-    </w:p>
-    <w:p>
-      <w:pPr>
-        <w:pStyle w:val="SPBodyText"/>
-      </w:pPr>
-    </w:p>
-    <w:p>
-      <w:pPr>
-        <w:pStyle w:val="SPBodyText"/>
-      </w:pPr>
-      <w:r>
-        <w:t>Saint Anthony's example reminds us that seeking is itself an act of faith.</w:t>
-      </w:r>
-    </w:p>
-    <w:p>
-      <w:pPr>
-        <w:pStyle w:val="SPBodyText"/>
-      </w:pPr>
-      <w:r>
         <w:t>We do not always seek because we already know where something is.</w:t>
       </w:r>
     </w:p>
@@ -22500,6 +22614,7 @@
         <w:pStyle w:val="SPBodyText"/>
       </w:pPr>
       <w:r>
+        <w:lastRenderedPageBreak/>
         <w:t>And when we have lost our way, He is always ready to lead us home.</w:t>
       </w:r>
     </w:p>
@@ -22526,7 +22641,6 @@
         <w:pStyle w:val="SPBodyText"/>
       </w:pPr>
       <w:r>
-        <w:lastRenderedPageBreak/>
         <w:t>Saint Anthony, faithful servant of Christ,</w:t>
       </w:r>
       <w:r>
@@ -23194,6 +23308,7 @@
         <w:pStyle w:val="SPBodyText"/>
       </w:pPr>
       <w:r>
+        <w:lastRenderedPageBreak/>
         <w:t xml:space="preserve">Saint Christopher therefore reminds us that the most important question is not simply </w:t>
       </w:r>
       <w:r>
@@ -23219,86 +23334,86 @@
         <w:pStyle w:val="SPBodyText"/>
       </w:pPr>
       <w:r>
+        <w:t>When we carry Christ into our work, our families, our friendships, our responsibilities, and even our difficulties, ordinary journeys become opportunities for holiness.</w:t>
+      </w:r>
+    </w:p>
+    <w:p>
+      <w:pPr>
+        <w:pStyle w:val="SPBodyText"/>
+      </w:pPr>
+    </w:p>
+    <w:p>
+      <w:pPr>
+        <w:pStyle w:val="SPBodyText"/>
+      </w:pPr>
+      <w:r>
+        <w:t>Sometimes we carry Christ by serving others.</w:t>
+      </w:r>
+    </w:p>
+    <w:p>
+      <w:pPr>
+        <w:pStyle w:val="SPBodyText"/>
+      </w:pPr>
+      <w:r>
+        <w:t>Sometimes we carry Him by remaining faithful when life becomes difficult.</w:t>
+      </w:r>
+    </w:p>
+    <w:p>
+      <w:pPr>
+        <w:pStyle w:val="SPBodyText"/>
+      </w:pPr>
+      <w:r>
+        <w:t>Sometimes we carry Him by choosing patience instead of anger, forgiveness instead of resentment, courage instead of fear.</w:t>
+      </w:r>
+    </w:p>
+    <w:p>
+      <w:pPr>
+        <w:pStyle w:val="SPBodyText"/>
+      </w:pPr>
+    </w:p>
+    <w:p>
+      <w:pPr>
+        <w:pStyle w:val="SPBodyText"/>
+      </w:pPr>
+      <w:r>
+        <w:t>And sometimes we simply carry Him by continuing faithfully along the road when we cannot yet see where it leads.</w:t>
+      </w:r>
+    </w:p>
+    <w:p>
+      <w:pPr>
+        <w:pStyle w:val="SPBodyText"/>
+      </w:pPr>
+      <w:r>
+        <w:t>The journey will contain moments when we feel strong and moments when we feel weary. There will be roads we choose and roads we never expected to travel. There will be places where we must stop, turn back, begin again, or place our trust entirely in God.</w:t>
+      </w:r>
+    </w:p>
+    <w:p>
+      <w:pPr>
+        <w:pStyle w:val="SPBodyText"/>
+      </w:pPr>
+      <w:r>
+        <w:t>Yet the Christian does not journey without a destination.</w:t>
+      </w:r>
+    </w:p>
+    <w:p>
+      <w:pPr>
+        <w:pStyle w:val="SPBodyText"/>
+      </w:pPr>
+      <w:r>
+        <w:t xml:space="preserve">Christ tells us that He goes before us to prepare a place for us. </w:t>
+      </w:r>
+    </w:p>
+    <w:p>
+      <w:pPr>
+        <w:pStyle w:val="SPBodyText"/>
+      </w:pPr>
+    </w:p>
+    <w:p>
+      <w:pPr>
+        <w:pStyle w:val="SPBodyText"/>
+      </w:pPr>
+      <w:r>
         <w:lastRenderedPageBreak/>
-        <w:t>When we carry Christ into our work, our families, our friendships, our responsibilities, and even our difficulties, ordinary journeys become opportunities for holiness.</w:t>
-      </w:r>
-    </w:p>
-    <w:p>
-      <w:pPr>
-        <w:pStyle w:val="SPBodyText"/>
-      </w:pPr>
-    </w:p>
-    <w:p>
-      <w:pPr>
-        <w:pStyle w:val="SPBodyText"/>
-      </w:pPr>
-      <w:r>
-        <w:t>Sometimes we carry Christ by serving others.</w:t>
-      </w:r>
-    </w:p>
-    <w:p>
-      <w:pPr>
-        <w:pStyle w:val="SPBodyText"/>
-      </w:pPr>
-      <w:r>
-        <w:t>Sometimes we carry Him by remaining faithful when life becomes difficult.</w:t>
-      </w:r>
-    </w:p>
-    <w:p>
-      <w:pPr>
-        <w:pStyle w:val="SPBodyText"/>
-      </w:pPr>
-      <w:r>
-        <w:t>Sometimes we carry Him by choosing patience instead of anger, forgiveness instead of resentment, courage instead of fear.</w:t>
-      </w:r>
-    </w:p>
-    <w:p>
-      <w:pPr>
-        <w:pStyle w:val="SPBodyText"/>
-      </w:pPr>
-    </w:p>
-    <w:p>
-      <w:pPr>
-        <w:pStyle w:val="SPBodyText"/>
-      </w:pPr>
-      <w:r>
-        <w:t>And sometimes we simply carry Him by continuing faithfully along the road when we cannot yet see where it leads.</w:t>
-      </w:r>
-    </w:p>
-    <w:p>
-      <w:pPr>
-        <w:pStyle w:val="SPBodyText"/>
-      </w:pPr>
-      <w:r>
-        <w:t>The journey will contain moments when we feel strong and moments when we feel weary. There will be roads we choose and roads we never expected to travel. There will be places where we must stop, turn back, begin again, or place our trust entirely in God.</w:t>
-      </w:r>
-    </w:p>
-    <w:p>
-      <w:pPr>
-        <w:pStyle w:val="SPBodyText"/>
-      </w:pPr>
-      <w:r>
-        <w:t>Yet the Christian does not journey without a destination.</w:t>
-      </w:r>
-    </w:p>
-    <w:p>
-      <w:pPr>
-        <w:pStyle w:val="SPBodyText"/>
-      </w:pPr>
-      <w:r>
-        <w:t xml:space="preserve">Christ tells us that He goes before us to prepare a place for us. </w:t>
-      </w:r>
-    </w:p>
-    <w:p>
-      <w:pPr>
-        <w:pStyle w:val="SPBodyText"/>
-      </w:pPr>
-    </w:p>
-    <w:p>
-      <w:pPr>
-        <w:pStyle w:val="SPBodyText"/>
-      </w:pPr>
-      <w:r>
         <w:t xml:space="preserve">Our earthly journeys therefore point beyond themselves toward the journey's true end: </w:t>
       </w:r>
       <w:r>
@@ -23344,7 +23459,6 @@
         <w:pStyle w:val="SPBodyText"/>
       </w:pPr>
       <w:r>
-        <w:lastRenderedPageBreak/>
         <w:t>May we learn to place every road before God.</w:t>
       </w:r>
     </w:p>
@@ -23431,6 +23545,7 @@
         </w:sectPr>
       </w:pPr>
       <w:r>
+        <w:lastRenderedPageBreak/>
         <w:t>Amen.</w:t>
       </w:r>
     </w:p>
@@ -23600,6 +23715,7 @@
         <w:pStyle w:val="SPBodyText"/>
       </w:pPr>
       <w:r>
+        <w:lastRenderedPageBreak/>
         <w:t>Protection.</w:t>
       </w:r>
       <w:r>
@@ -23629,7 +23745,6 @@
         <w:pStyle w:val="SPBodyText"/>
       </w:pPr>
       <w:r>
-        <w:lastRenderedPageBreak/>
         <w:t>These are not only things we ask for.</w:t>
       </w:r>
     </w:p>
@@ -23826,6 +23941,7 @@
         <w:pStyle w:val="SPBodyText"/>
       </w:pPr>
       <w:r>
+        <w:lastRenderedPageBreak/>
         <w:t>But prayer remains.</w:t>
       </w:r>
     </w:p>
@@ -23842,7 +23958,6 @@
         <w:pStyle w:val="SPBodyText"/>
       </w:pPr>
       <w:r>
-        <w:lastRenderedPageBreak/>
         <w:t>The rhythm of prayer slowly changes the way we see the world. Ordinary things begin to become opportunities for grace. Work can become an offering. Difficulties can become occasions for trust. Moments of silence can become moments of encounter. Even suffering can be placed into the hands of God.</w:t>
       </w:r>
     </w:p>
@@ -23900,6 +24015,7 @@
         <w:pStyle w:val="SPBodyText"/>
       </w:pPr>
       <w:r>
+        <w:lastRenderedPageBreak/>
         <w:t xml:space="preserve">The </w:t>
       </w:r>
       <w:r>
@@ -23964,7 +24080,6 @@
         <w:pStyle w:val="SPBodyText"/>
       </w:pPr>
       <w:r>
-        <w:lastRenderedPageBreak/>
         <w:t>The saints remind us that holiness is not reserved for extraordinary lives.</w:t>
       </w:r>
     </w:p>
@@ -24012,6 +24127,7 @@
         <w:pStyle w:val="SPBodyText"/>
       </w:pPr>
       <w:r>
+        <w:lastRenderedPageBreak/>
         <w:t>He calls us to trust Him, to seek Him, and to remain faithful even when we cannot yet see where the road will lead.</w:t>
       </w:r>
     </w:p>
@@ -24279,6 +24395,7 @@
         <w:rPr>
           <w:rFonts w:ascii="Segoe UI Symbol" w:hAnsi="Segoe UI Symbol" w:cs="Segoe UI Symbol"/>
         </w:rPr>
+        <w:lastRenderedPageBreak/>
         <w:t>✠</w:t>
       </w:r>
     </w:p>
@@ -24410,18 +24527,36 @@
           <w:i/>
           <w:iCs/>
         </w:rPr>
-        <w:t>e, i, ae,</w:t>
-      </w:r>
-      <w:r>
-        <w:t xml:space="preserve"> or </w:t>
-      </w:r>
+        <w:t xml:space="preserve">e, </w:t>
+      </w:r>
+      <w:proofErr w:type="spellStart"/>
       <w:r>
         <w:rPr>
           <w:i/>
           <w:iCs/>
         </w:rPr>
+        <w:t>i</w:t>
+      </w:r>
+      <w:proofErr w:type="spellEnd"/>
+      <w:r>
+        <w:rPr>
+          <w:i/>
+          <w:iCs/>
+        </w:rPr>
+        <w:t>, ae,</w:t>
+      </w:r>
+      <w:r>
+        <w:t xml:space="preserve"> or </w:t>
+      </w:r>
+      <w:proofErr w:type="spellStart"/>
+      <w:r>
+        <w:rPr>
+          <w:i/>
+          <w:iCs/>
+        </w:rPr>
         <w:t>oe</w:t>
       </w:r>
+      <w:proofErr w:type="spellEnd"/>
       <w:r>
         <w:t xml:space="preserve"> is generally pronounced like </w:t>
       </w:r>
@@ -24478,18 +24613,36 @@
           <w:i/>
           <w:iCs/>
         </w:rPr>
-        <w:t>e, i, ae,</w:t>
-      </w:r>
-      <w:r>
-        <w:t xml:space="preserve"> or </w:t>
-      </w:r>
+        <w:t xml:space="preserve">e, </w:t>
+      </w:r>
+      <w:proofErr w:type="spellStart"/>
       <w:r>
         <w:rPr>
           <w:i/>
           <w:iCs/>
         </w:rPr>
+        <w:t>i</w:t>
+      </w:r>
+      <w:proofErr w:type="spellEnd"/>
+      <w:r>
+        <w:rPr>
+          <w:i/>
+          <w:iCs/>
+        </w:rPr>
+        <w:t>, ae,</w:t>
+      </w:r>
+      <w:r>
+        <w:t xml:space="preserve"> or </w:t>
+      </w:r>
+      <w:proofErr w:type="spellStart"/>
+      <w:r>
+        <w:rPr>
+          <w:i/>
+          <w:iCs/>
+        </w:rPr>
         <w:t>oe</w:t>
       </w:r>
+      <w:proofErr w:type="spellEnd"/>
       <w:r>
         <w:t xml:space="preserve"> is generally pronounced like the </w:t>
       </w:r>
@@ -24561,6 +24714,7 @@
       <w:r>
         <w:t xml:space="preserve"> and </w:t>
       </w:r>
+      <w:proofErr w:type="spellStart"/>
       <w:r>
         <w:rPr>
           <w:b/>
@@ -24568,6 +24722,7 @@
         </w:rPr>
         <w:t>oe</w:t>
       </w:r>
+      <w:proofErr w:type="spellEnd"/>
       <w:r>
         <w:t xml:space="preserve"> are generally pronounced like </w:t>
       </w:r>
@@ -24786,8 +24941,13 @@
         <w:pStyle w:val="SPPrayerEnglish"/>
       </w:pPr>
       <w:r>
-        <w:t>qui es in caelis</w:t>
-      </w:r>
+        <w:t xml:space="preserve">qui es in </w:t>
+      </w:r>
+      <w:proofErr w:type="spellStart"/>
+      <w:r>
+        <w:t>caelis</w:t>
+      </w:r>
+      <w:proofErr w:type="spellEnd"/>
       <w:r>
         <w:br/>
         <w:t>who art in heaven</w:t>

</xml_diff>

<commit_message>
St Joseph prayer review completed
</commit_message>
<xml_diff>
--- a/manuscript/volume-1/sacrae-preces-volume-1.docx
+++ b/manuscript/volume-1/sacrae-preces-volume-1.docx
@@ -4398,7 +4398,7 @@
       </w:pPr>
       <w:r>
         <w:pict w14:anchorId="249FE732">
-          <v:rect id="_x0000_i18225" style="width:0;height:1.5pt" o:hralign="center" o:hrstd="t" o:hr="t" fillcolor="#a0a0a0" stroked="f"/>
+          <v:rect id="_x0000_i19945" style="width:0;height:1.5pt" o:hralign="center" o:hrstd="t" o:hr="t" fillcolor="#a0a0a0" stroked="f"/>
         </w:pict>
       </w:r>
     </w:p>
@@ -4654,7 +4654,7 @@
       </w:pPr>
       <w:r>
         <w:pict w14:anchorId="25751FDD">
-          <v:rect id="_x0000_i18226" style="width:0;height:1.5pt" o:hralign="center" o:hrstd="t" o:hr="t" fillcolor="#a0a0a0" stroked="f"/>
+          <v:rect id="_x0000_i19946" style="width:0;height:1.5pt" o:hralign="center" o:hrstd="t" o:hr="t" fillcolor="#a0a0a0" stroked="f"/>
         </w:pict>
       </w:r>
     </w:p>
@@ -4726,7 +4726,7 @@
       </w:pPr>
       <w:r>
         <w:pict w14:anchorId="19542BB1">
-          <v:rect id="_x0000_i18227" style="width:0;height:1.5pt" o:hralign="center" o:hrstd="t" o:hr="t" fillcolor="#a0a0a0" stroked="f"/>
+          <v:rect id="_x0000_i19947" style="width:0;height:1.5pt" o:hralign="center" o:hrstd="t" o:hr="t" fillcolor="#a0a0a0" stroked="f"/>
         </w:pict>
       </w:r>
     </w:p>
@@ -4964,7 +4964,7 @@
       </w:pPr>
       <w:r>
         <w:pict w14:anchorId="68D46385">
-          <v:rect id="_x0000_i18228" style="width:0;height:1.5pt" o:hralign="center" o:hrstd="t" o:hr="t" fillcolor="#a0a0a0" stroked="f"/>
+          <v:rect id="_x0000_i19948" style="width:0;height:1.5pt" o:hralign="center" o:hrstd="t" o:hr="t" fillcolor="#a0a0a0" stroked="f"/>
         </w:pict>
       </w:r>
     </w:p>
@@ -5665,58 +5665,16 @@
         <w:rPr>
           <w:rStyle w:val="Emphasis"/>
         </w:rPr>
-        <w:t>in NOH-mee-</w:t>
-      </w:r>
-      <w:proofErr w:type="spellStart"/>
+        <w:t>in NOH-mee-neh PAH-tris,</w:t>
+      </w:r>
+      <w:r>
+        <w:br/>
+      </w:r>
       <w:r>
         <w:rPr>
           <w:rStyle w:val="Emphasis"/>
         </w:rPr>
-        <w:t>neh</w:t>
-      </w:r>
-      <w:proofErr w:type="spellEnd"/>
-      <w:r>
-        <w:rPr>
-          <w:rStyle w:val="Emphasis"/>
-        </w:rPr>
-        <w:t xml:space="preserve"> PAH-tris,</w:t>
-      </w:r>
-      <w:r>
-        <w:br/>
-      </w:r>
-      <w:r>
-        <w:rPr>
-          <w:rStyle w:val="Emphasis"/>
-        </w:rPr>
-        <w:t>et FEE-lee-ee, et SPEE-</w:t>
-      </w:r>
-      <w:proofErr w:type="spellStart"/>
-      <w:r>
-        <w:rPr>
-          <w:rStyle w:val="Emphasis"/>
-        </w:rPr>
-        <w:t>ree</w:t>
-      </w:r>
-      <w:proofErr w:type="spellEnd"/>
-      <w:r>
-        <w:rPr>
-          <w:rStyle w:val="Emphasis"/>
-        </w:rPr>
-        <w:t>-</w:t>
-      </w:r>
-      <w:proofErr w:type="spellStart"/>
-      <w:r>
-        <w:rPr>
-          <w:rStyle w:val="Emphasis"/>
-        </w:rPr>
-        <w:t>toos</w:t>
-      </w:r>
-      <w:proofErr w:type="spellEnd"/>
-      <w:r>
-        <w:rPr>
-          <w:rStyle w:val="Emphasis"/>
-        </w:rPr>
-        <w:t xml:space="preserve"> SAHNK-tee.</w:t>
+        <w:t>et FEE-lee-ee, et SPEE-ree-toos SAHNK-tee.</w:t>
       </w:r>
       <w:r>
         <w:br/>
@@ -6272,15 +6230,7 @@
         <w:t>Your</w:t>
       </w:r>
       <w:r>
-        <w:t xml:space="preserve"> kingdom come. Give us each day our daily bread; and forgive us our sins, for we ourselves forgive </w:t>
-      </w:r>
-      <w:proofErr w:type="spellStart"/>
-      <w:r>
-        <w:t>every one</w:t>
-      </w:r>
-      <w:proofErr w:type="spellEnd"/>
-      <w:r>
-        <w:t xml:space="preserve"> who is indebted to us; and lead us not into temptation.</w:t>
+        <w:t xml:space="preserve"> kingdom come. Give us each day our daily bread; and forgive us our sins, for we ourselves forgive every one who is indebted to us; and lead us not into temptation.</w:t>
       </w:r>
       <w:r>
         <w:t>”</w:t>
@@ -6354,7 +6304,6 @@
       <w:r>
         <w:t xml:space="preserve">. It is </w:t>
       </w:r>
-      <w:proofErr w:type="spellStart"/>
       <w:r>
         <w:rPr>
           <w:i/>
@@ -6362,7 +6311,6 @@
         </w:rPr>
         <w:t>our</w:t>
       </w:r>
-      <w:proofErr w:type="spellEnd"/>
       <w:r>
         <w:t>.</w:t>
       </w:r>
@@ -11213,15 +11161,7 @@
         <w:pStyle w:val="SPPrayerEnglish"/>
       </w:pPr>
       <w:r>
-        <w:t xml:space="preserve">for he has looked with </w:t>
-      </w:r>
-      <w:proofErr w:type="spellStart"/>
-      <w:r>
-        <w:t>favor</w:t>
-      </w:r>
-      <w:proofErr w:type="spellEnd"/>
-      <w:r>
-        <w:t xml:space="preserve"> on his lowly servant.</w:t>
+        <w:t>for he has looked with favor on his lowly servant.</w:t>
       </w:r>
       <w:r>
         <w:br/>
@@ -15222,21 +15162,13 @@
         <w:t>;</w:t>
       </w:r>
       <w:r>
-        <w:t xml:space="preserve"> we have beheld his glory, glory as the </w:t>
-      </w:r>
-      <w:proofErr w:type="gramStart"/>
-      <w:r>
-        <w:t>only</w:t>
+        <w:t xml:space="preserve"> we have beheld his glory, glory as the only</w:t>
       </w:r>
       <w:r>
         <w:t>-</w:t>
       </w:r>
       <w:r>
-        <w:t>begotten</w:t>
-      </w:r>
-      <w:proofErr w:type="gramEnd"/>
-      <w:r>
-        <w:t xml:space="preserve"> Son from the Father.</w:t>
+        <w:t>begotten Son from the Father.</w:t>
       </w:r>
     </w:p>
     <w:p>
@@ -20563,21 +20495,13 @@
         <w:pStyle w:val="SPScripture"/>
       </w:pPr>
       <w:r>
-        <w:t xml:space="preserve">Be sober, be watchful. Your adversary the devil prowls around like a roaring lion, seeking </w:t>
-      </w:r>
-      <w:proofErr w:type="spellStart"/>
-      <w:r>
-        <w:t>some</w:t>
+        <w:t>Be sober, be watchful. Your adversary the devil prowls around like a roaring lion, seeking some</w:t>
       </w:r>
       <w:r>
         <w:t xml:space="preserve"> </w:t>
       </w:r>
       <w:r>
-        <w:t>one</w:t>
-      </w:r>
-      <w:proofErr w:type="spellEnd"/>
-      <w:r>
-        <w:t xml:space="preserve"> to devour. Resist him, firm in your faith, knowing that the same experience of suffering is required of your brotherhood throughout the world.</w:t>
+        <w:t>one to devour. Resist him, firm in your faith, knowing that the same experience of suffering is required of your brotherhood throughout the world.</w:t>
       </w:r>
     </w:p>
     <w:p>
@@ -21728,7 +21652,6 @@
         <w:pStyle w:val="SPBodyText"/>
       </w:pPr>
       <w:r>
-        <w:lastRenderedPageBreak/>
         <w:t>Sometimes it is continuing faithfully when the path is uncertain.</w:t>
       </w:r>
     </w:p>
@@ -21835,6 +21758,7 @@
     <w:p>
       <w:pPr>
         <w:pStyle w:val="SPBodyText"/>
+        <w:jc w:val="center"/>
       </w:pPr>
       <w:r>
         <w:rPr>
@@ -22196,15 +22120,7 @@
         <w:pStyle w:val="SPScripture"/>
       </w:pPr>
       <w:r>
-        <w:t xml:space="preserve">“What man of you, having a hundred sheep, if he has lost one of them,  does not leave the ninety-nine in the wilderness, and go after the one which is lost, until he finds it? And when he has found it, he lays it on his shoulders, rejoicing. And when he comes home, he calls together his friends and his </w:t>
-      </w:r>
-      <w:proofErr w:type="spellStart"/>
-      <w:r>
-        <w:t>neighbors</w:t>
-      </w:r>
-      <w:proofErr w:type="spellEnd"/>
-      <w:r>
-        <w:t>, saying to them, ‘Rejoice with me, for I have found my sheep which was lost.’ Just so, I tell you, there will be more joy in heaven over one sinner who repents than over ninety-nine righteous persons who need no repentance.”</w:t>
+        <w:t>“What man of you, having a hundred sheep, if he has lost one of them,  does not leave the ninety-nine in the wilderness, and go after the one which is lost, until he finds it? And when he has found it, he lays it on his shoulders, rejoicing. And when he comes home, he calls together his friends and his neighbors, saying to them, ‘Rejoice with me, for I have found my sheep which was lost.’ Just so, I tell you, there will be more joy in heaven over one sinner who repents than over ninety-nine righteous persons who need no repentance.”</w:t>
       </w:r>
     </w:p>
     <w:p>
@@ -22263,85 +22179,92 @@
     <w:p>
       <w:pPr>
         <w:pStyle w:val="SPBodyText"/>
-      </w:pPr>
-      <w:r>
-        <w:t>When We Lose Our Way</w:t>
-      </w:r>
-    </w:p>
-    <w:p>
-      <w:pPr>
-        <w:pStyle w:val="SPBodyText"/>
-      </w:pPr>
-      <w:r>
-        <w:t>There are many things we lose throughout our lives.</w:t>
-      </w:r>
-    </w:p>
-    <w:p>
-      <w:pPr>
-        <w:pStyle w:val="SPBodyText"/>
-      </w:pPr>
-      <w:r>
-        <w:t>Some are small: keys, documents, possessions we were certain we had put somewhere safe. Others matter far more — friendships, opportunities, confidence, peace, or a sense of direction.</w:t>
-      </w:r>
-    </w:p>
-    <w:p>
-      <w:pPr>
-        <w:pStyle w:val="SPBodyText"/>
-      </w:pPr>
-      <w:r>
-        <w:t>And sometimes, without even realising it, we can lose our way with God.</w:t>
-      </w:r>
-    </w:p>
-    <w:p>
-      <w:pPr>
-        <w:pStyle w:val="SPBodyText"/>
-      </w:pPr>
-      <w:r>
-        <w:t>Not necessarily through some great rejection of faith, but simply through the gradual distractions of life. Prayer becomes less frequent. We become consumed by work and responsibilities. Disappointment weighs upon us. We become tired, discouraged, or uncertain. Before long, we may discover that something which once seemed close has begun to feel distant.</w:t>
-      </w:r>
-    </w:p>
-    <w:p>
-      <w:pPr>
-        <w:pStyle w:val="SPBodyText"/>
-      </w:pPr>
-      <w:r>
-        <w:t>Saint Anthony reminds us to seek what has been lost.</w:t>
-      </w:r>
-    </w:p>
-    <w:p>
-      <w:pPr>
-        <w:pStyle w:val="SPBodyText"/>
-      </w:pPr>
-      <w:r>
-        <w:t>But the deepest thing we can seek is not an object.</w:t>
-      </w:r>
-    </w:p>
-    <w:p>
-      <w:pPr>
-        <w:pStyle w:val="SPBodyText"/>
-      </w:pPr>
-      <w:r>
-        <w:t>It is Christ.</w:t>
-      </w:r>
-    </w:p>
-    <w:p>
-      <w:pPr>
-        <w:pStyle w:val="SPBodyText"/>
-      </w:pPr>
-    </w:p>
-    <w:p>
-      <w:pPr>
-        <w:pStyle w:val="SPBodyText"/>
-      </w:pPr>
-      <w:r>
-        <w:lastRenderedPageBreak/>
-        <w:t xml:space="preserve">The Gospel tells us to </w:t>
-      </w:r>
-      <w:r>
         <w:rPr>
           <w:b/>
           <w:bCs/>
         </w:rPr>
+      </w:pPr>
+      <w:r>
+        <w:rPr>
+          <w:b/>
+          <w:bCs/>
+        </w:rPr>
+        <w:t>When We Lose Our Way</w:t>
+      </w:r>
+    </w:p>
+    <w:p>
+      <w:pPr>
+        <w:pStyle w:val="SPBodyText"/>
+      </w:pPr>
+      <w:r>
+        <w:t>There are many things we lose throughout our lives.</w:t>
+      </w:r>
+    </w:p>
+    <w:p>
+      <w:pPr>
+        <w:pStyle w:val="SPBodyText"/>
+      </w:pPr>
+      <w:r>
+        <w:t>Some are small: keys, documents, possessions we were certain we had put somewhere safe. Others matter far more — friendships, opportunities, confidence, peace, or a sense of direction.</w:t>
+      </w:r>
+    </w:p>
+    <w:p>
+      <w:pPr>
+        <w:pStyle w:val="SPBodyText"/>
+      </w:pPr>
+      <w:r>
+        <w:t>And sometimes, without even realising it, we can lose our way with God.</w:t>
+      </w:r>
+    </w:p>
+    <w:p>
+      <w:pPr>
+        <w:pStyle w:val="SPBodyText"/>
+      </w:pPr>
+      <w:r>
+        <w:t>Not necessarily through some great rejection of faith, but simply through the gradual distractions of life. Prayer becomes less frequent. We become consumed by work and responsibilities. Disappointment weighs upon us. We become tired, discouraged, or uncertain. Before long, we may discover that something which once seemed close has begun to feel distant.</w:t>
+      </w:r>
+    </w:p>
+    <w:p>
+      <w:pPr>
+        <w:pStyle w:val="SPBodyText"/>
+      </w:pPr>
+      <w:r>
+        <w:t>Saint Anthony reminds us to seek what has been lost.</w:t>
+      </w:r>
+    </w:p>
+    <w:p>
+      <w:pPr>
+        <w:pStyle w:val="SPBodyText"/>
+      </w:pPr>
+      <w:r>
+        <w:t>But the deepest thing we can seek is not an object.</w:t>
+      </w:r>
+    </w:p>
+    <w:p>
+      <w:pPr>
+        <w:pStyle w:val="SPBodyText"/>
+      </w:pPr>
+      <w:r>
+        <w:t>It is Christ.</w:t>
+      </w:r>
+    </w:p>
+    <w:p>
+      <w:pPr>
+        <w:pStyle w:val="SPBodyText"/>
+      </w:pPr>
+    </w:p>
+    <w:p>
+      <w:pPr>
+        <w:pStyle w:val="SPBodyText"/>
+      </w:pPr>
+      <w:r>
+        <w:t xml:space="preserve">The Gospel tells us to </w:t>
+      </w:r>
+      <w:r>
+        <w:rPr>
+          <w:b/>
+          <w:bCs/>
+        </w:rPr>
         <w:t>ask, seek, and knock</w:t>
       </w:r>
       <w:r>
@@ -22383,14 +22306,10 @@
         <w:pStyle w:val="SPBodyText"/>
       </w:pPr>
       <w:r>
-        <w:t xml:space="preserve">This is the mystery at the heart of Christian hope: </w:t>
-      </w:r>
-      <w:r>
-        <w:rPr>
-          <w:b/>
-          <w:bCs/>
-        </w:rPr>
-        <w:t>we seek God because God has already sought us.</w:t>
+        <w:t>This is the mystery at the heart of Christian hope</w:t>
+      </w:r>
+      <w:r>
+        <w:t>: we seek God because God has already sought us.</w:t>
       </w:r>
     </w:p>
     <w:p>
@@ -22448,7 +22367,6 @@
         <w:pStyle w:val="SPBodyText"/>
       </w:pPr>
       <w:r>
-        <w:lastRenderedPageBreak/>
         <w:t>It reminds us to ask for help.</w:t>
       </w:r>
     </w:p>
@@ -22565,7 +22483,6 @@
         <w:pStyle w:val="SPBodyText"/>
       </w:pPr>
       <w:r>
-        <w:lastRenderedPageBreak/>
         <w:t>We do not always seek because we already know where something is.</w:t>
       </w:r>
     </w:p>
@@ -22616,19 +22533,6 @@
       <w:r>
         <w:lastRenderedPageBreak/>
         <w:t>And when we have lost our way, He is always ready to lead us home.</w:t>
-      </w:r>
-    </w:p>
-    <w:p>
-      <w:pPr>
-        <w:pStyle w:val="SPBodyText"/>
-      </w:pPr>
-    </w:p>
-    <w:p>
-      <w:pPr>
-        <w:pStyle w:val="SPBodyText"/>
-      </w:pPr>
-      <w:r>
-        <w:t>A Prayer to End</w:t>
       </w:r>
     </w:p>
     <w:p>
@@ -22720,6 +22624,7 @@
     <w:p>
       <w:pPr>
         <w:pStyle w:val="SPBodyText"/>
+        <w:jc w:val="center"/>
       </w:pPr>
       <w:r>
         <w:rPr>
@@ -23545,7 +23450,6 @@
         </w:sectPr>
       </w:pPr>
       <w:r>
-        <w:lastRenderedPageBreak/>
         <w:t>Amen.</w:t>
       </w:r>
     </w:p>
@@ -23715,12 +23619,15 @@
         <w:pStyle w:val="SPBodyText"/>
       </w:pPr>
       <w:r>
+        <w:t>Protection.</w:t>
+      </w:r>
+      <w:r>
+        <w:br/>
+        <w:t>Faith</w:t>
+      </w:r>
+      <w:r>
         <w:lastRenderedPageBreak/>
-        <w:t>Protection.</w:t>
-      </w:r>
-      <w:r>
-        <w:br/>
-        <w:t>Faithfulness.</w:t>
+        <w:t>fulness.</w:t>
       </w:r>
       <w:r>
         <w:br/>
@@ -23828,20 +23735,23 @@
       </w:pPr>
       <w:bookmarkStart w:id="39" w:name="_Toc238808965"/>
       <w:r>
+        <w:t>Conclusion</w:t>
+      </w:r>
+      <w:bookmarkEnd w:id="39"/>
+    </w:p>
+    <w:p>
+      <w:pPr>
+        <w:pStyle w:val="SPBodyText"/>
+      </w:pPr>
+      <w:r>
+        <w:t xml:space="preserve"> </w:t>
+      </w:r>
+      <w:r>
+        <w:t>A Lif</w:t>
+      </w:r>
+      <w:r>
         <w:lastRenderedPageBreak/>
-        <w:t>Conclusion</w:t>
-      </w:r>
-      <w:bookmarkEnd w:id="39"/>
-    </w:p>
-    <w:p>
-      <w:pPr>
-        <w:pStyle w:val="SPBodyText"/>
-      </w:pPr>
-      <w:r>
-        <w:t xml:space="preserve"> </w:t>
-      </w:r>
-      <w:r>
-        <w:t>A Life of Prayer</w:t>
+        <w:t>e of Prayer</w:t>
       </w:r>
     </w:p>
     <w:p>
@@ -23941,24 +23851,27 @@
         <w:pStyle w:val="SPBodyText"/>
       </w:pPr>
       <w:r>
+        <w:t>But prayer remains.</w:t>
+      </w:r>
+    </w:p>
+    <w:p>
+      <w:pPr>
+        <w:pStyle w:val="SPBodyText"/>
+      </w:pPr>
+      <w:r>
+        <w:t>It teaches us to return.</w:t>
+      </w:r>
+    </w:p>
+    <w:p>
+      <w:pPr>
+        <w:pStyle w:val="SPBodyText"/>
+      </w:pPr>
+      <w:r>
+        <w:t>The rhythm of pra</w:t>
+      </w:r>
+      <w:r>
         <w:lastRenderedPageBreak/>
-        <w:t>But prayer remains.</w:t>
-      </w:r>
-    </w:p>
-    <w:p>
-      <w:pPr>
-        <w:pStyle w:val="SPBodyText"/>
-      </w:pPr>
-      <w:r>
-        <w:t>It teaches us to return.</w:t>
-      </w:r>
-    </w:p>
-    <w:p>
-      <w:pPr>
-        <w:pStyle w:val="SPBodyText"/>
-      </w:pPr>
-      <w:r>
-        <w:t>The rhythm of prayer slowly changes the way we see the world. Ordinary things begin to become opportunities for grace. Work can become an offering. Difficulties can become occasions for trust. Moments of silence can become moments of encounter. Even suffering can be placed into the hands of God.</w:t>
+        <w:t>yer slowly changes the way we see the world. Ordinary things begin to become opportunities for grace. Work can become an offering. Difficulties can become occasions for trust. Moments of silence can become moments of encounter. Even suffering can be placed into the hands of God.</w:t>
       </w:r>
     </w:p>
     <w:p>
@@ -24015,7 +23928,6 @@
         <w:pStyle w:val="SPBodyText"/>
       </w:pPr>
       <w:r>
-        <w:lastRenderedPageBreak/>
         <w:t xml:space="preserve">The </w:t>
       </w:r>
       <w:r>
@@ -24059,7 +23971,11 @@
         <w:pStyle w:val="SPBodyText"/>
       </w:pPr>
       <w:r>
-        <w:t>Their absence here is therefore not an omission, but an invitation to continue the journey.</w:t>
+        <w:t>Their absence her</w:t>
+      </w:r>
+      <w:r>
+        <w:lastRenderedPageBreak/>
+        <w:t>e is therefore not an omission, but an invitation to continue the journey.</w:t>
       </w:r>
     </w:p>
     <w:p>
@@ -24127,7 +24043,6 @@
         <w:pStyle w:val="SPBodyText"/>
       </w:pPr>
       <w:r>
-        <w:lastRenderedPageBreak/>
         <w:t>He calls us to trust Him, to seek Him, and to remain faithful even when we cannot yet see where the road will lead.</w:t>
       </w:r>
     </w:p>
@@ -24170,8 +24085,11 @@
         <w:pStyle w:val="SPBodyText"/>
       </w:pPr>
       <w:r>
+        <w:t xml:space="preserve">A Prayer for the </w:t>
+      </w:r>
+      <w:r>
         <w:lastRenderedPageBreak/>
-        <w:t>A Prayer for the Journey</w:t>
+        <w:t>Journey</w:t>
       </w:r>
     </w:p>
     <w:p>
@@ -24395,27 +24313,29 @@
         <w:rPr>
           <w:rFonts w:ascii="Segoe UI Symbol" w:hAnsi="Segoe UI Symbol" w:cs="Segoe UI Symbol"/>
         </w:rPr>
+        <w:t>✠</w:t>
+      </w:r>
+    </w:p>
+    <w:p>
+      <w:pPr>
+        <w:pStyle w:val="SPSectionTitle"/>
+      </w:pPr>
+      <w:bookmarkStart w:id="40" w:name="_Toc238808966"/>
+      <w:r>
+        <w:t>Latin Guide</w:t>
+      </w:r>
+      <w:bookmarkEnd w:id="40"/>
+    </w:p>
+    <w:p>
+      <w:pPr>
+        <w:pStyle w:val="SPBodyText"/>
+      </w:pPr>
+      <w:r>
+        <w:t>Prayi</w:t>
+      </w:r>
+      <w:r>
         <w:lastRenderedPageBreak/>
-        <w:t>✠</w:t>
-      </w:r>
-    </w:p>
-    <w:p>
-      <w:pPr>
-        <w:pStyle w:val="SPSectionTitle"/>
-      </w:pPr>
-      <w:bookmarkStart w:id="40" w:name="_Toc238808966"/>
-      <w:r>
-        <w:lastRenderedPageBreak/>
-        <w:t>Latin Guide</w:t>
-      </w:r>
-      <w:bookmarkEnd w:id="40"/>
-    </w:p>
-    <w:p>
-      <w:pPr>
-        <w:pStyle w:val="SPBodyText"/>
-      </w:pPr>
-      <w:r>
-        <w:t>Praying in Latin</w:t>
+        <w:t>ng in Latin</w:t>
       </w:r>
     </w:p>
     <w:p>
@@ -24504,8 +24424,11 @@
         <w:pStyle w:val="SPBodyText"/>
       </w:pPr>
       <w:r>
+        <w:t>A few simple prin</w:t>
+      </w:r>
+      <w:r>
         <w:lastRenderedPageBreak/>
-        <w:t>A few simple principles will help:</w:t>
+        <w:t>ciples will help:</w:t>
       </w:r>
     </w:p>
     <w:p>
@@ -24527,28 +24450,79 @@
           <w:i/>
           <w:iCs/>
         </w:rPr>
-        <w:t xml:space="preserve">e, </w:t>
-      </w:r>
-      <w:proofErr w:type="spellStart"/>
+        <w:t>e, i, ae,</w:t>
+      </w:r>
+      <w:r>
+        <w:t xml:space="preserve"> or </w:t>
+      </w:r>
       <w:r>
         <w:rPr>
           <w:i/>
           <w:iCs/>
         </w:rPr>
-        <w:t>i</w:t>
-      </w:r>
-      <w:proofErr w:type="spellEnd"/>
+        <w:t>oe</w:t>
+      </w:r>
+      <w:r>
+        <w:t xml:space="preserve"> is generally pronounced like </w:t>
+      </w:r>
+      <w:r>
+        <w:rPr>
+          <w:b/>
+          <w:bCs/>
+        </w:rPr>
+        <w:t>ch</w:t>
+      </w:r>
+      <w:r>
+        <w:t>.</w:t>
+      </w:r>
+      <w:r>
+        <w:br/>
+      </w:r>
+      <w:r>
+        <w:rPr>
+          <w:b/>
+          <w:bCs/>
+        </w:rPr>
+        <w:t>c</w:t>
+      </w:r>
+      <w:r>
+        <w:t xml:space="preserve"> elsewhere is generally pronounced like </w:t>
+      </w:r>
+      <w:r>
+        <w:rPr>
+          <w:b/>
+          <w:bCs/>
+        </w:rPr>
+        <w:t>k</w:t>
+      </w:r>
+      <w:r>
+        <w:t>.</w:t>
+      </w:r>
+    </w:p>
+    <w:p>
+      <w:pPr>
+        <w:pStyle w:val="SPBodyText"/>
+      </w:pPr>
+      <w:r>
+        <w:rPr>
+          <w:b/>
+          <w:bCs/>
+        </w:rPr>
+        <w:t>g</w:t>
+      </w:r>
+      <w:r>
+        <w:t xml:space="preserve"> before </w:t>
+      </w:r>
       <w:r>
         <w:rPr>
           <w:i/>
           <w:iCs/>
         </w:rPr>
-        <w:t>, ae,</w:t>
+        <w:t>e, i, ae,</w:t>
       </w:r>
       <w:r>
         <w:t xml:space="preserve"> or </w:t>
       </w:r>
-      <w:proofErr w:type="spellStart"/>
       <w:r>
         <w:rPr>
           <w:i/>
@@ -24556,16 +24530,25 @@
         </w:rPr>
         <w:t>oe</w:t>
       </w:r>
-      <w:proofErr w:type="spellEnd"/>
-      <w:r>
-        <w:t xml:space="preserve"> is generally pronounced like </w:t>
+      <w:r>
+        <w:t xml:space="preserve"> is generally pronounced like the </w:t>
       </w:r>
       <w:r>
         <w:rPr>
           <w:b/>
           <w:bCs/>
         </w:rPr>
-        <w:t>ch</w:t>
+        <w:t>g</w:t>
+      </w:r>
+      <w:r>
+        <w:t xml:space="preserve"> in </w:t>
+      </w:r>
+      <w:r>
+        <w:rPr>
+          <w:i/>
+          <w:iCs/>
+        </w:rPr>
+        <w:t>gentle</w:t>
       </w:r>
       <w:r>
         <w:t>.</w:t>
@@ -24578,17 +24561,27 @@
           <w:b/>
           <w:bCs/>
         </w:rPr>
-        <w:t>c</w:t>
-      </w:r>
-      <w:r>
-        <w:t xml:space="preserve"> elsewhere is generally pronounced like </w:t>
+        <w:t>g</w:t>
+      </w:r>
+      <w:r>
+        <w:t xml:space="preserve"> elsewhere is generally pronounced like the </w:t>
       </w:r>
       <w:r>
         <w:rPr>
           <w:b/>
           <w:bCs/>
         </w:rPr>
-        <w:t>k</w:t>
+        <w:t>g</w:t>
+      </w:r>
+      <w:r>
+        <w:t xml:space="preserve"> in </w:t>
+      </w:r>
+      <w:r>
+        <w:rPr>
+          <w:i/>
+          <w:iCs/>
+        </w:rPr>
+        <w:t>go</w:t>
       </w:r>
       <w:r>
         <w:t>.</w:t>
@@ -24603,126 +24596,18 @@
           <w:b/>
           <w:bCs/>
         </w:rPr>
-        <w:t>g</w:t>
-      </w:r>
-      <w:r>
-        <w:t xml:space="preserve"> before </w:t>
-      </w:r>
-      <w:r>
-        <w:rPr>
-          <w:i/>
-          <w:iCs/>
-        </w:rPr>
-        <w:t xml:space="preserve">e, </w:t>
-      </w:r>
-      <w:proofErr w:type="spellStart"/>
-      <w:r>
-        <w:rPr>
-          <w:i/>
-          <w:iCs/>
-        </w:rPr>
-        <w:t>i</w:t>
-      </w:r>
-      <w:proofErr w:type="spellEnd"/>
-      <w:r>
-        <w:rPr>
-          <w:i/>
-          <w:iCs/>
-        </w:rPr>
-        <w:t>, ae,</w:t>
-      </w:r>
-      <w:r>
-        <w:t xml:space="preserve"> or </w:t>
-      </w:r>
-      <w:proofErr w:type="spellStart"/>
-      <w:r>
-        <w:rPr>
-          <w:i/>
-          <w:iCs/>
-        </w:rPr>
-        <w:t>oe</w:t>
-      </w:r>
-      <w:proofErr w:type="spellEnd"/>
-      <w:r>
-        <w:t xml:space="preserve"> is generally pronounced like the </w:t>
+        <w:t>ae</w:t>
+      </w:r>
+      <w:r>
+        <w:t xml:space="preserve"> and </w:t>
       </w:r>
       <w:r>
         <w:rPr>
           <w:b/>
           <w:bCs/>
         </w:rPr>
-        <w:t>g</w:t>
-      </w:r>
-      <w:r>
-        <w:t xml:space="preserve"> in </w:t>
-      </w:r>
-      <w:r>
-        <w:rPr>
-          <w:i/>
-          <w:iCs/>
-        </w:rPr>
-        <w:t>gentle</w:t>
-      </w:r>
-      <w:r>
-        <w:t>.</w:t>
-      </w:r>
-      <w:r>
-        <w:br/>
-      </w:r>
-      <w:r>
-        <w:rPr>
-          <w:b/>
-          <w:bCs/>
-        </w:rPr>
-        <w:t>g</w:t>
-      </w:r>
-      <w:r>
-        <w:t xml:space="preserve"> elsewhere is generally pronounced like the </w:t>
-      </w:r>
-      <w:r>
-        <w:rPr>
-          <w:b/>
-          <w:bCs/>
-        </w:rPr>
-        <w:t>g</w:t>
-      </w:r>
-      <w:r>
-        <w:t xml:space="preserve"> in </w:t>
-      </w:r>
-      <w:r>
-        <w:rPr>
-          <w:i/>
-          <w:iCs/>
-        </w:rPr>
-        <w:t>go</w:t>
-      </w:r>
-      <w:r>
-        <w:t>.</w:t>
-      </w:r>
-    </w:p>
-    <w:p>
-      <w:pPr>
-        <w:pStyle w:val="SPBodyText"/>
-      </w:pPr>
-      <w:r>
-        <w:rPr>
-          <w:b/>
-          <w:bCs/>
-        </w:rPr>
-        <w:t>ae</w:t>
-      </w:r>
-      <w:r>
-        <w:t xml:space="preserve"> and </w:t>
-      </w:r>
-      <w:proofErr w:type="spellStart"/>
-      <w:r>
-        <w:rPr>
-          <w:b/>
-          <w:bCs/>
-        </w:rPr>
         <w:t>oe</w:t>
       </w:r>
-      <w:proofErr w:type="spellEnd"/>
       <w:r>
         <w:t xml:space="preserve"> are generally pronounced like </w:t>
       </w:r>
@@ -24856,22 +24741,25 @@
       </w:pPr>
       <w:bookmarkStart w:id="41" w:name="_Toc238808967"/>
       <w:r>
+        <w:t>Common Prayers</w:t>
+      </w:r>
+      <w:bookmarkEnd w:id="41"/>
+    </w:p>
+    <w:p>
+      <w:pPr>
+        <w:pStyle w:val="SPSubheading"/>
+      </w:pPr>
+    </w:p>
+    <w:p>
+      <w:pPr>
+        <w:pStyle w:val="SPBodyText"/>
+      </w:pPr>
+      <w:r>
+        <w:t>T</w:t>
+      </w:r>
+      <w:r>
         <w:lastRenderedPageBreak/>
-        <w:t>Common Prayers</w:t>
-      </w:r>
-      <w:bookmarkEnd w:id="41"/>
-    </w:p>
-    <w:p>
-      <w:pPr>
-        <w:pStyle w:val="SPSubheading"/>
-      </w:pPr>
-    </w:p>
-    <w:p>
-      <w:pPr>
-        <w:pStyle w:val="SPBodyText"/>
-      </w:pPr>
-      <w:r>
-        <w:t xml:space="preserve">The following phrases are drawn from some of the most familiar prayers of the Catholic tradition. They are included not to repeat the prayers found elsewhere in </w:t>
+        <w:t xml:space="preserve">he following phrases are drawn from some of the most familiar prayers of the Catholic tradition. They are included not to repeat the prayers found elsewhere in </w:t>
       </w:r>
       <w:r>
         <w:rPr>
@@ -24920,7 +24808,11 @@
         <w:pStyle w:val="SPPrayerEnglish"/>
       </w:pPr>
       <w:r>
-        <w:t>Our Father</w:t>
+        <w:t>Our</w:t>
+      </w:r>
+      <w:r>
+        <w:lastRenderedPageBreak/>
+        <w:t xml:space="preserve"> Father</w:t>
       </w:r>
     </w:p>
     <w:p>
@@ -24941,13 +24833,8 @@
         <w:pStyle w:val="SPPrayerEnglish"/>
       </w:pPr>
       <w:r>
-        <w:t xml:space="preserve">qui es in </w:t>
-      </w:r>
-      <w:proofErr w:type="spellStart"/>
-      <w:r>
-        <w:t>caelis</w:t>
-      </w:r>
-      <w:proofErr w:type="spellEnd"/>
+        <w:t>qui es in caelis</w:t>
+      </w:r>
       <w:r>
         <w:br/>
         <w:t>who art in heaven</w:t>
@@ -25055,7 +24942,11 @@
         <w:pStyle w:val="SPPrayerEnglish"/>
       </w:pPr>
       <w:r>
-        <w:t>Hail Mary</w:t>
+        <w:t>Hail M</w:t>
+      </w:r>
+      <w:r>
+        <w:lastRenderedPageBreak/>
+        <w:t>ary</w:t>
       </w:r>
     </w:p>
     <w:p>
@@ -25174,16 +25065,19 @@
         <w:pStyle w:val="SPPrayerLatin"/>
       </w:pPr>
       <w:r>
+        <w:t>Gloria Patri</w:t>
+      </w:r>
+    </w:p>
+    <w:p>
+      <w:pPr>
+        <w:pStyle w:val="SPPrayerEnglish"/>
+      </w:pPr>
+      <w:r>
+        <w:t>Glor</w:t>
+      </w:r>
+      <w:r>
         <w:lastRenderedPageBreak/>
-        <w:t>Gloria Patri</w:t>
-      </w:r>
-    </w:p>
-    <w:p>
-      <w:pPr>
-        <w:pStyle w:val="SPPrayerEnglish"/>
-      </w:pPr>
-      <w:r>
-        <w:t>Glory be to the Father</w:t>
+        <w:t>y be to the Father</w:t>
       </w:r>
     </w:p>
     <w:p>
@@ -25294,16 +25188,19 @@
         <w:pStyle w:val="SPPrayerLatin"/>
       </w:pPr>
       <w:r>
+        <w:t>Salve, Regina</w:t>
+      </w:r>
+    </w:p>
+    <w:p>
+      <w:pPr>
+        <w:pStyle w:val="SPPrayerEnglish"/>
+      </w:pPr>
+      <w:r>
+        <w:t>Hai</w:t>
+      </w:r>
+      <w:r>
         <w:lastRenderedPageBreak/>
-        <w:t>Salve, Regina</w:t>
-      </w:r>
-    </w:p>
-    <w:p>
-      <w:pPr>
-        <w:pStyle w:val="SPPrayerEnglish"/>
-      </w:pPr>
-      <w:r>
-        <w:t>Hail, Holy Queen</w:t>
+        <w:t>l, Holy Queen</w:t>
       </w:r>
     </w:p>
     <w:p>
@@ -25425,8 +25322,11 @@
       </w:pPr>
       <w:bookmarkStart w:id="42" w:name="_Toc238808968"/>
       <w:r>
+        <w:t>Common Catholic E</w:t>
+      </w:r>
+      <w:r>
         <w:lastRenderedPageBreak/>
-        <w:t>Common Catholic Expressions</w:t>
+        <w:t>xpressions</w:t>
       </w:r>
       <w:bookmarkEnd w:id="42"/>
     </w:p>
@@ -25469,8 +25369,11 @@
         <w:pStyle w:val="SPPrayerLatin"/>
       </w:pPr>
       <w:r>
+        <w:t>Ad maiorem Dei gl</w:t>
+      </w:r>
+      <w:r>
         <w:lastRenderedPageBreak/>
-        <w:t>Ad maiorem Dei gloriam</w:t>
+        <w:t>oriam</w:t>
       </w:r>
     </w:p>
     <w:p>
@@ -25632,16 +25535,19 @@
         <w:pStyle w:val="SPPrayerLatin"/>
       </w:pPr>
       <w:r>
+        <w:t>Christe eleison</w:t>
+      </w:r>
+    </w:p>
+    <w:p>
+      <w:pPr>
+        <w:pStyle w:val="SPPrayerEnglish"/>
+      </w:pPr>
+      <w:r>
+        <w:t>C</w:t>
+      </w:r>
+      <w:r>
         <w:lastRenderedPageBreak/>
-        <w:t>Christe eleison</w:t>
-      </w:r>
-    </w:p>
-    <w:p>
-      <w:pPr>
-        <w:pStyle w:val="SPPrayerEnglish"/>
-      </w:pPr>
-      <w:r>
-        <w:t>Christ, have mercy</w:t>
+        <w:t>hrist, have mercy</w:t>
       </w:r>
     </w:p>
     <w:p>
@@ -25777,8 +25683,11 @@
         <w:pStyle w:val="SPPrayerLatin"/>
       </w:pPr>
       <w:r>
+        <w:t>Et cum spiritu tu</w:t>
+      </w:r>
+      <w:r>
         <w:lastRenderedPageBreak/>
-        <w:t>Et cum spiritu tuo</w:t>
+        <w:t>o</w:t>
       </w:r>
     </w:p>
     <w:p>
@@ -25905,8 +25814,11 @@
         <w:pStyle w:val="SPPrayerLatin"/>
       </w:pPr>
       <w:r>
+        <w:t>Laudetur Iesus Ch</w:t>
+      </w:r>
+      <w:r>
         <w:lastRenderedPageBreak/>
-        <w:t>Laudetur Iesus Christus</w:t>
+        <w:t>ristus</w:t>
       </w:r>
     </w:p>
     <w:p>
@@ -26030,16 +25942,19 @@
         <w:pStyle w:val="SPPrayerLatin"/>
       </w:pPr>
       <w:r>
+        <w:t>Sursum corda</w:t>
+      </w:r>
+    </w:p>
+    <w:p>
+      <w:pPr>
+        <w:pStyle w:val="SPPrayerEnglish"/>
+      </w:pPr>
+      <w:r>
+        <w:t>Lift</w:t>
+      </w:r>
+      <w:r>
         <w:lastRenderedPageBreak/>
-        <w:t>Sursum corda</w:t>
-      </w:r>
-    </w:p>
-    <w:p>
-      <w:pPr>
-        <w:pStyle w:val="SPPrayerEnglish"/>
-      </w:pPr>
-      <w:r>
-        <w:t>Lift up your hearts</w:t>
+        <w:t xml:space="preserve"> up your hearts</w:t>
       </w:r>
     </w:p>
     <w:p>

</xml_diff>

<commit_message>
Quality check - style pass through document
</commit_message>
<xml_diff>
--- a/manuscript/volume-1/sacrae-preces-volume-1.docx
+++ b/manuscript/volume-1/sacrae-preces-volume-1.docx
@@ -82,25 +82,7 @@
           <w:sz w:val="48"/>
           <w:szCs w:val="18"/>
         </w:rPr>
-        <w:t>Sacr</w:t>
-      </w:r>
-      <w:r>
-        <w:rPr>
-          <w:rStyle w:val="SPPrayerResponseCS"/>
-          <w:i w:val="0"/>
-          <w:sz w:val="48"/>
-          <w:szCs w:val="18"/>
-        </w:rPr>
-        <w:t>Ae</w:t>
-      </w:r>
-      <w:r>
-        <w:rPr>
-          <w:rStyle w:val="SPPrayerResponseCS"/>
-          <w:i w:val="0"/>
-          <w:sz w:val="48"/>
-          <w:szCs w:val="18"/>
-        </w:rPr>
-        <w:t xml:space="preserve"> preces</w:t>
+        <w:t>SACRAE PRECES</w:t>
       </w:r>
     </w:p>
     <w:p>
@@ -269,10 +251,10 @@
         <w:t>[</w:t>
       </w:r>
       <w:r>
-        <w:t xml:space="preserve">Scripture </w:t>
-      </w:r>
-      <w:r>
-        <w:t>translation and permission statement]</w:t>
+        <w:t>RSV-2CE Scripture permission statement — pending confirmation from Ignatius Press</w:t>
+      </w:r>
+      <w:r>
+        <w:t>]</w:t>
       </w:r>
     </w:p>
     <w:p>
@@ -433,7 +415,7 @@
           <w:r>
             <w:fldChar w:fldCharType="separate"/>
           </w:r>
-          <w:hyperlink w:anchor="_Toc238808927" w:history="1">
+          <w:hyperlink w:anchor="_Toc240260230" w:history="1">
             <w:r>
               <w:rPr>
                 <w:rStyle w:val="Hyperlink"/>
@@ -460,7 +442,7 @@
                 <w:noProof/>
                 <w:webHidden/>
               </w:rPr>
-              <w:instrText xml:space="preserve"> PAGEREF _Toc238808927 \h </w:instrText>
+              <w:instrText xml:space="preserve"> PAGEREF _Toc240260230 \h </w:instrText>
             </w:r>
             <w:r>
               <w:rPr>
@@ -505,7 +487,7 @@
               <w:lang w:eastAsia="en-ZA"/>
             </w:rPr>
           </w:pPr>
-          <w:hyperlink w:anchor="_Toc238808928" w:history="1">
+          <w:hyperlink w:anchor="_Toc240260231" w:history="1">
             <w:r>
               <w:rPr>
                 <w:rStyle w:val="Hyperlink"/>
@@ -532,7 +514,7 @@
                 <w:noProof/>
                 <w:webHidden/>
               </w:rPr>
-              <w:instrText xml:space="preserve"> PAGEREF _Toc238808928 \h </w:instrText>
+              <w:instrText xml:space="preserve"> PAGEREF _Toc240260231 \h </w:instrText>
             </w:r>
             <w:r>
               <w:rPr>
@@ -577,7 +559,7 @@
               <w:lang w:eastAsia="en-ZA"/>
             </w:rPr>
           </w:pPr>
-          <w:hyperlink w:anchor="_Toc238808929" w:history="1">
+          <w:hyperlink w:anchor="_Toc240260232" w:history="1">
             <w:r>
               <w:rPr>
                 <w:rStyle w:val="Hyperlink"/>
@@ -604,7 +586,7 @@
                 <w:noProof/>
                 <w:webHidden/>
               </w:rPr>
-              <w:instrText xml:space="preserve"> PAGEREF _Toc238808929 \h </w:instrText>
+              <w:instrText xml:space="preserve"> PAGEREF _Toc240260232 \h </w:instrText>
             </w:r>
             <w:r>
               <w:rPr>
@@ -649,7 +631,7 @@
               <w:lang w:eastAsia="en-ZA"/>
             </w:rPr>
           </w:pPr>
-          <w:hyperlink w:anchor="_Toc238808930" w:history="1">
+          <w:hyperlink w:anchor="_Toc240260233" w:history="1">
             <w:r>
               <w:rPr>
                 <w:rStyle w:val="Hyperlink"/>
@@ -676,7 +658,7 @@
                 <w:noProof/>
                 <w:webHidden/>
               </w:rPr>
-              <w:instrText xml:space="preserve"> PAGEREF _Toc238808930 \h </w:instrText>
+              <w:instrText xml:space="preserve"> PAGEREF _Toc240260233 \h </w:instrText>
             </w:r>
             <w:r>
               <w:rPr>
@@ -696,7 +678,7 @@
                 <w:noProof/>
                 <w:webHidden/>
               </w:rPr>
-              <w:t>11</w:t>
+              <w:t>12</w:t>
             </w:r>
             <w:r>
               <w:rPr>
@@ -721,7 +703,7 @@
               <w:lang w:eastAsia="en-ZA"/>
             </w:rPr>
           </w:pPr>
-          <w:hyperlink w:anchor="_Toc238808931" w:history="1">
+          <w:hyperlink w:anchor="_Toc240260234" w:history="1">
             <w:r>
               <w:rPr>
                 <w:rStyle w:val="Hyperlink"/>
@@ -748,7 +730,7 @@
                 <w:noProof/>
                 <w:webHidden/>
               </w:rPr>
-              <w:instrText xml:space="preserve"> PAGEREF _Toc238808931 \h </w:instrText>
+              <w:instrText xml:space="preserve"> PAGEREF _Toc240260234 \h </w:instrText>
             </w:r>
             <w:r>
               <w:rPr>
@@ -768,7 +750,7 @@
                 <w:noProof/>
                 <w:webHidden/>
               </w:rPr>
-              <w:t>12</w:t>
+              <w:t>13</w:t>
             </w:r>
             <w:r>
               <w:rPr>
@@ -793,7 +775,7 @@
               <w:lang w:eastAsia="en-ZA"/>
             </w:rPr>
           </w:pPr>
-          <w:hyperlink w:anchor="_Toc238808932" w:history="1">
+          <w:hyperlink w:anchor="_Toc240260235" w:history="1">
             <w:r>
               <w:rPr>
                 <w:rStyle w:val="Hyperlink"/>
@@ -820,7 +802,7 @@
                 <w:noProof/>
                 <w:webHidden/>
               </w:rPr>
-              <w:instrText xml:space="preserve"> PAGEREF _Toc238808932 \h </w:instrText>
+              <w:instrText xml:space="preserve"> PAGEREF _Toc240260235 \h </w:instrText>
             </w:r>
             <w:r>
               <w:rPr>
@@ -840,7 +822,7 @@
                 <w:noProof/>
                 <w:webHidden/>
               </w:rPr>
-              <w:t>12</w:t>
+              <w:t>13</w:t>
             </w:r>
             <w:r>
               <w:rPr>
@@ -865,7 +847,7 @@
               <w:lang w:eastAsia="en-ZA"/>
             </w:rPr>
           </w:pPr>
-          <w:hyperlink w:anchor="_Toc238808933" w:history="1">
+          <w:hyperlink w:anchor="_Toc240260236" w:history="1">
             <w:r>
               <w:rPr>
                 <w:rStyle w:val="Hyperlink"/>
@@ -892,7 +874,7 @@
                 <w:noProof/>
                 <w:webHidden/>
               </w:rPr>
-              <w:instrText xml:space="preserve"> PAGEREF _Toc238808933 \h </w:instrText>
+              <w:instrText xml:space="preserve"> PAGEREF _Toc240260236 \h </w:instrText>
             </w:r>
             <w:r>
               <w:rPr>
@@ -912,7 +894,7 @@
                 <w:noProof/>
                 <w:webHidden/>
               </w:rPr>
-              <w:t>13</w:t>
+              <w:t>14</w:t>
             </w:r>
             <w:r>
               <w:rPr>
@@ -937,7 +919,7 @@
               <w:lang w:eastAsia="en-ZA"/>
             </w:rPr>
           </w:pPr>
-          <w:hyperlink w:anchor="_Toc238808934" w:history="1">
+          <w:hyperlink w:anchor="_Toc240260237" w:history="1">
             <w:r>
               <w:rPr>
                 <w:rStyle w:val="Hyperlink"/>
@@ -964,7 +946,7 @@
                 <w:noProof/>
                 <w:webHidden/>
               </w:rPr>
-              <w:instrText xml:space="preserve"> PAGEREF _Toc238808934 \h </w:instrText>
+              <w:instrText xml:space="preserve"> PAGEREF _Toc240260237 \h </w:instrText>
             </w:r>
             <w:r>
               <w:rPr>
@@ -984,7 +966,7 @@
                 <w:noProof/>
                 <w:webHidden/>
               </w:rPr>
-              <w:t>14</w:t>
+              <w:t>15</w:t>
             </w:r>
             <w:r>
               <w:rPr>
@@ -1009,7 +991,7 @@
               <w:lang w:eastAsia="en-ZA"/>
             </w:rPr>
           </w:pPr>
-          <w:hyperlink w:anchor="_Toc238808935" w:history="1">
+          <w:hyperlink w:anchor="_Toc240260238" w:history="1">
             <w:r>
               <w:rPr>
                 <w:rStyle w:val="Hyperlink"/>
@@ -1036,7 +1018,7 @@
                 <w:noProof/>
                 <w:webHidden/>
               </w:rPr>
-              <w:instrText xml:space="preserve"> PAGEREF _Toc238808935 \h </w:instrText>
+              <w:instrText xml:space="preserve"> PAGEREF _Toc240260238 \h </w:instrText>
             </w:r>
             <w:r>
               <w:rPr>
@@ -1056,7 +1038,7 @@
                 <w:noProof/>
                 <w:webHidden/>
               </w:rPr>
-              <w:t>14</w:t>
+              <w:t>16</w:t>
             </w:r>
             <w:r>
               <w:rPr>
@@ -1081,7 +1063,7 @@
               <w:lang w:eastAsia="en-ZA"/>
             </w:rPr>
           </w:pPr>
-          <w:hyperlink w:anchor="_Toc238808936" w:history="1">
+          <w:hyperlink w:anchor="_Toc240260239" w:history="1">
             <w:r>
               <w:rPr>
                 <w:rStyle w:val="Hyperlink"/>
@@ -1108,7 +1090,7 @@
                 <w:noProof/>
                 <w:webHidden/>
               </w:rPr>
-              <w:instrText xml:space="preserve"> PAGEREF _Toc238808936 \h </w:instrText>
+              <w:instrText xml:space="preserve"> PAGEREF _Toc240260239 \h </w:instrText>
             </w:r>
             <w:r>
               <w:rPr>
@@ -1128,7 +1110,7 @@
                 <w:noProof/>
                 <w:webHidden/>
               </w:rPr>
-              <w:t>15</w:t>
+              <w:t>17</w:t>
             </w:r>
             <w:r>
               <w:rPr>
@@ -1153,7 +1135,7 @@
               <w:lang w:eastAsia="en-ZA"/>
             </w:rPr>
           </w:pPr>
-          <w:hyperlink w:anchor="_Toc238808937" w:history="1">
+          <w:hyperlink w:anchor="_Toc240260240" w:history="1">
             <w:r>
               <w:rPr>
                 <w:rStyle w:val="Hyperlink"/>
@@ -1180,7 +1162,7 @@
                 <w:noProof/>
                 <w:webHidden/>
               </w:rPr>
-              <w:instrText xml:space="preserve"> PAGEREF _Toc238808937 \h </w:instrText>
+              <w:instrText xml:space="preserve"> PAGEREF _Toc240260240 \h </w:instrText>
             </w:r>
             <w:r>
               <w:rPr>
@@ -1200,7 +1182,7 @@
                 <w:noProof/>
                 <w:webHidden/>
               </w:rPr>
-              <w:t>17</w:t>
+              <w:t>19</w:t>
             </w:r>
             <w:r>
               <w:rPr>
@@ -1225,7 +1207,7 @@
               <w:lang w:eastAsia="en-ZA"/>
             </w:rPr>
           </w:pPr>
-          <w:hyperlink w:anchor="_Toc238808938" w:history="1">
+          <w:hyperlink w:anchor="_Toc240260241" w:history="1">
             <w:r>
               <w:rPr>
                 <w:rStyle w:val="Hyperlink"/>
@@ -1252,7 +1234,7 @@
                 <w:noProof/>
                 <w:webHidden/>
               </w:rPr>
-              <w:instrText xml:space="preserve"> PAGEREF _Toc238808938 \h </w:instrText>
+              <w:instrText xml:space="preserve"> PAGEREF _Toc240260241 \h </w:instrText>
             </w:r>
             <w:r>
               <w:rPr>
@@ -1272,7 +1254,7 @@
                 <w:noProof/>
                 <w:webHidden/>
               </w:rPr>
-              <w:t>19</w:t>
+              <w:t>21</w:t>
             </w:r>
             <w:r>
               <w:rPr>
@@ -1297,7 +1279,7 @@
               <w:lang w:eastAsia="en-ZA"/>
             </w:rPr>
           </w:pPr>
-          <w:hyperlink w:anchor="_Toc238808939" w:history="1">
+          <w:hyperlink w:anchor="_Toc240260242" w:history="1">
             <w:r>
               <w:rPr>
                 <w:rStyle w:val="Hyperlink"/>
@@ -1324,7 +1306,7 @@
                 <w:noProof/>
                 <w:webHidden/>
               </w:rPr>
-              <w:instrText xml:space="preserve"> PAGEREF _Toc238808939 \h </w:instrText>
+              <w:instrText xml:space="preserve"> PAGEREF _Toc240260242 \h </w:instrText>
             </w:r>
             <w:r>
               <w:rPr>
@@ -1344,7 +1326,7 @@
                 <w:noProof/>
                 <w:webHidden/>
               </w:rPr>
-              <w:t>25</w:t>
+              <w:t>27</w:t>
             </w:r>
             <w:r>
               <w:rPr>
@@ -1369,7 +1351,7 @@
               <w:lang w:eastAsia="en-ZA"/>
             </w:rPr>
           </w:pPr>
-          <w:hyperlink w:anchor="_Toc238808940" w:history="1">
+          <w:hyperlink w:anchor="_Toc240260243" w:history="1">
             <w:r>
               <w:rPr>
                 <w:rStyle w:val="Hyperlink"/>
@@ -1396,7 +1378,7 @@
                 <w:noProof/>
                 <w:webHidden/>
               </w:rPr>
-              <w:instrText xml:space="preserve"> PAGEREF _Toc238808940 \h </w:instrText>
+              <w:instrText xml:space="preserve"> PAGEREF _Toc240260243 \h </w:instrText>
             </w:r>
             <w:r>
               <w:rPr>
@@ -1416,7 +1398,7 @@
                 <w:noProof/>
                 <w:webHidden/>
               </w:rPr>
-              <w:t>31</w:t>
+              <w:t>33</w:t>
             </w:r>
             <w:r>
               <w:rPr>
@@ -1441,7 +1423,7 @@
               <w:lang w:eastAsia="en-ZA"/>
             </w:rPr>
           </w:pPr>
-          <w:hyperlink w:anchor="_Toc238808941" w:history="1">
+          <w:hyperlink w:anchor="_Toc240260244" w:history="1">
             <w:r>
               <w:rPr>
                 <w:rStyle w:val="Hyperlink"/>
@@ -1468,7 +1450,7 @@
                 <w:noProof/>
                 <w:webHidden/>
               </w:rPr>
-              <w:instrText xml:space="preserve"> PAGEREF _Toc238808941 \h </w:instrText>
+              <w:instrText xml:space="preserve"> PAGEREF _Toc240260244 \h </w:instrText>
             </w:r>
             <w:r>
               <w:rPr>
@@ -1488,7 +1470,7 @@
                 <w:noProof/>
                 <w:webHidden/>
               </w:rPr>
-              <w:t>39</w:t>
+              <w:t>41</w:t>
             </w:r>
             <w:r>
               <w:rPr>
@@ -1513,7 +1495,7 @@
               <w:lang w:eastAsia="en-ZA"/>
             </w:rPr>
           </w:pPr>
-          <w:hyperlink w:anchor="_Toc238808942" w:history="1">
+          <w:hyperlink w:anchor="_Toc240260245" w:history="1">
             <w:r>
               <w:rPr>
                 <w:rStyle w:val="Hyperlink"/>
@@ -1540,7 +1522,7 @@
                 <w:noProof/>
                 <w:webHidden/>
               </w:rPr>
-              <w:instrText xml:space="preserve"> PAGEREF _Toc238808942 \h </w:instrText>
+              <w:instrText xml:space="preserve"> PAGEREF _Toc240260245 \h </w:instrText>
             </w:r>
             <w:r>
               <w:rPr>
@@ -1560,7 +1542,7 @@
                 <w:noProof/>
                 <w:webHidden/>
               </w:rPr>
-              <w:t>47</w:t>
+              <w:t>49</w:t>
             </w:r>
             <w:r>
               <w:rPr>
@@ -1585,7 +1567,7 @@
               <w:lang w:eastAsia="en-ZA"/>
             </w:rPr>
           </w:pPr>
-          <w:hyperlink w:anchor="_Toc238808943" w:history="1">
+          <w:hyperlink w:anchor="_Toc240260246" w:history="1">
             <w:r>
               <w:rPr>
                 <w:rStyle w:val="Hyperlink"/>
@@ -1612,7 +1594,7 @@
                 <w:noProof/>
                 <w:webHidden/>
               </w:rPr>
-              <w:instrText xml:space="preserve"> PAGEREF _Toc238808943 \h </w:instrText>
+              <w:instrText xml:space="preserve"> PAGEREF _Toc240260246 \h </w:instrText>
             </w:r>
             <w:r>
               <w:rPr>
@@ -1632,7 +1614,7 @@
                 <w:noProof/>
                 <w:webHidden/>
               </w:rPr>
-              <w:t>54</w:t>
+              <w:t>56</w:t>
             </w:r>
             <w:r>
               <w:rPr>
@@ -1657,13 +1639,13 @@
               <w:lang w:eastAsia="en-ZA"/>
             </w:rPr>
           </w:pPr>
-          <w:hyperlink w:anchor="_Toc238808944" w:history="1">
+          <w:hyperlink w:anchor="_Toc240260247" w:history="1">
             <w:r>
               <w:rPr>
                 <w:rStyle w:val="Hyperlink"/>
                 <w:noProof/>
               </w:rPr>
-              <w:t>Part II - Gospel canticles</w:t>
+              <w:t>Part II - Gospel Canticles</w:t>
             </w:r>
             <w:r>
               <w:rPr>
@@ -1684,7 +1666,7 @@
                 <w:noProof/>
                 <w:webHidden/>
               </w:rPr>
-              <w:instrText xml:space="preserve"> PAGEREF _Toc238808944 \h </w:instrText>
+              <w:instrText xml:space="preserve"> PAGEREF _Toc240260247 \h </w:instrText>
             </w:r>
             <w:r>
               <w:rPr>
@@ -1704,7 +1686,7 @@
                 <w:noProof/>
                 <w:webHidden/>
               </w:rPr>
-              <w:t>57</w:t>
+              <w:t>59</w:t>
             </w:r>
             <w:r>
               <w:rPr>
@@ -1729,7 +1711,7 @@
               <w:lang w:eastAsia="en-ZA"/>
             </w:rPr>
           </w:pPr>
-          <w:hyperlink w:anchor="_Toc238808945" w:history="1">
+          <w:hyperlink w:anchor="_Toc240260248" w:history="1">
             <w:r>
               <w:rPr>
                 <w:rStyle w:val="Hyperlink"/>
@@ -1756,7 +1738,7 @@
                 <w:noProof/>
                 <w:webHidden/>
               </w:rPr>
-              <w:instrText xml:space="preserve"> PAGEREF _Toc238808945 \h </w:instrText>
+              <w:instrText xml:space="preserve"> PAGEREF _Toc240260248 \h </w:instrText>
             </w:r>
             <w:r>
               <w:rPr>
@@ -1776,7 +1758,7 @@
                 <w:noProof/>
                 <w:webHidden/>
               </w:rPr>
-              <w:t>59</w:t>
+              <w:t>61</w:t>
             </w:r>
             <w:r>
               <w:rPr>
@@ -1801,7 +1783,7 @@
               <w:lang w:eastAsia="en-ZA"/>
             </w:rPr>
           </w:pPr>
-          <w:hyperlink w:anchor="_Toc238808946" w:history="1">
+          <w:hyperlink w:anchor="_Toc240260249" w:history="1">
             <w:r>
               <w:rPr>
                 <w:rStyle w:val="Hyperlink"/>
@@ -1828,7 +1810,7 @@
                 <w:noProof/>
                 <w:webHidden/>
               </w:rPr>
-              <w:instrText xml:space="preserve"> PAGEREF _Toc238808946 \h </w:instrText>
+              <w:instrText xml:space="preserve"> PAGEREF _Toc240260249 \h </w:instrText>
             </w:r>
             <w:r>
               <w:rPr>
@@ -1848,7 +1830,7 @@
                 <w:noProof/>
                 <w:webHidden/>
               </w:rPr>
-              <w:t>71</w:t>
+              <w:t>73</w:t>
             </w:r>
             <w:r>
               <w:rPr>
@@ -1873,7 +1855,7 @@
               <w:lang w:eastAsia="en-ZA"/>
             </w:rPr>
           </w:pPr>
-          <w:hyperlink w:anchor="_Toc238808947" w:history="1">
+          <w:hyperlink w:anchor="_Toc240260250" w:history="1">
             <w:r>
               <w:rPr>
                 <w:rStyle w:val="Hyperlink"/>
@@ -1900,7 +1882,7 @@
                 <w:noProof/>
                 <w:webHidden/>
               </w:rPr>
-              <w:instrText xml:space="preserve"> PAGEREF _Toc238808947 \h </w:instrText>
+              <w:instrText xml:space="preserve"> PAGEREF _Toc240260250 \h </w:instrText>
             </w:r>
             <w:r>
               <w:rPr>
@@ -1920,7 +1902,7 @@
                 <w:noProof/>
                 <w:webHidden/>
               </w:rPr>
-              <w:t>83</w:t>
+              <w:t>85</w:t>
             </w:r>
             <w:r>
               <w:rPr>
@@ -1945,7 +1927,7 @@
               <w:lang w:eastAsia="en-ZA"/>
             </w:rPr>
           </w:pPr>
-          <w:hyperlink w:anchor="_Toc238808948" w:history="1">
+          <w:hyperlink w:anchor="_Toc240260251" w:history="1">
             <w:r>
               <w:rPr>
                 <w:rStyle w:val="Hyperlink"/>
@@ -1972,7 +1954,7 @@
                 <w:noProof/>
                 <w:webHidden/>
               </w:rPr>
-              <w:instrText xml:space="preserve"> PAGEREF _Toc238808948 \h </w:instrText>
+              <w:instrText xml:space="preserve"> PAGEREF _Toc240260251 \h </w:instrText>
             </w:r>
             <w:r>
               <w:rPr>
@@ -1992,7 +1974,7 @@
                 <w:noProof/>
                 <w:webHidden/>
               </w:rPr>
-              <w:t>89</w:t>
+              <w:t>91</w:t>
             </w:r>
             <w:r>
               <w:rPr>
@@ -2017,7 +1999,7 @@
               <w:lang w:eastAsia="en-ZA"/>
             </w:rPr>
           </w:pPr>
-          <w:hyperlink w:anchor="_Toc238808949" w:history="1">
+          <w:hyperlink w:anchor="_Toc240260252" w:history="1">
             <w:r>
               <w:rPr>
                 <w:rStyle w:val="Hyperlink"/>
@@ -2044,7 +2026,7 @@
                 <w:noProof/>
                 <w:webHidden/>
               </w:rPr>
-              <w:instrText xml:space="preserve"> PAGEREF _Toc238808949 \h </w:instrText>
+              <w:instrText xml:space="preserve"> PAGEREF _Toc240260252 \h </w:instrText>
             </w:r>
             <w:r>
               <w:rPr>
@@ -2064,7 +2046,7 @@
                 <w:noProof/>
                 <w:webHidden/>
               </w:rPr>
-              <w:t>91</w:t>
+              <w:t>93</w:t>
             </w:r>
             <w:r>
               <w:rPr>
@@ -2089,7 +2071,7 @@
               <w:lang w:eastAsia="en-ZA"/>
             </w:rPr>
           </w:pPr>
-          <w:hyperlink w:anchor="_Toc238808950" w:history="1">
+          <w:hyperlink w:anchor="_Toc240260253" w:history="1">
             <w:r>
               <w:rPr>
                 <w:rStyle w:val="Hyperlink"/>
@@ -2116,7 +2098,7 @@
                 <w:noProof/>
                 <w:webHidden/>
               </w:rPr>
-              <w:instrText xml:space="preserve"> PAGEREF _Toc238808950 \h </w:instrText>
+              <w:instrText xml:space="preserve"> PAGEREF _Toc240260253 \h </w:instrText>
             </w:r>
             <w:r>
               <w:rPr>
@@ -2136,7 +2118,7 @@
                 <w:noProof/>
                 <w:webHidden/>
               </w:rPr>
-              <w:t>93</w:t>
+              <w:t>95</w:t>
             </w:r>
             <w:r>
               <w:rPr>
@@ -2161,7 +2143,7 @@
               <w:lang w:eastAsia="en-ZA"/>
             </w:rPr>
           </w:pPr>
-          <w:hyperlink w:anchor="_Toc238808951" w:history="1">
+          <w:hyperlink w:anchor="_Toc240260254" w:history="1">
             <w:r>
               <w:rPr>
                 <w:rStyle w:val="Hyperlink"/>
@@ -2188,7 +2170,7 @@
                 <w:noProof/>
                 <w:webHidden/>
               </w:rPr>
-              <w:instrText xml:space="preserve"> PAGEREF _Toc238808951 \h </w:instrText>
+              <w:instrText xml:space="preserve"> PAGEREF _Toc240260254 \h </w:instrText>
             </w:r>
             <w:r>
               <w:rPr>
@@ -2208,7 +2190,7 @@
                 <w:noProof/>
                 <w:webHidden/>
               </w:rPr>
-              <w:t>103</w:t>
+              <w:t>105</w:t>
             </w:r>
             <w:r>
               <w:rPr>
@@ -2233,7 +2215,7 @@
               <w:lang w:eastAsia="en-ZA"/>
             </w:rPr>
           </w:pPr>
-          <w:hyperlink w:anchor="_Toc238808952" w:history="1">
+          <w:hyperlink w:anchor="_Toc240260255" w:history="1">
             <w:r>
               <w:rPr>
                 <w:rStyle w:val="Hyperlink"/>
@@ -2260,7 +2242,7 @@
                 <w:noProof/>
                 <w:webHidden/>
               </w:rPr>
-              <w:instrText xml:space="preserve"> PAGEREF _Toc238808952 \h </w:instrText>
+              <w:instrText xml:space="preserve"> PAGEREF _Toc240260255 \h </w:instrText>
             </w:r>
             <w:r>
               <w:rPr>
@@ -2280,7 +2262,7 @@
                 <w:noProof/>
                 <w:webHidden/>
               </w:rPr>
-              <w:t>113</w:t>
+              <w:t>115</w:t>
             </w:r>
             <w:r>
               <w:rPr>
@@ -2305,7 +2287,7 @@
               <w:lang w:eastAsia="en-ZA"/>
             </w:rPr>
           </w:pPr>
-          <w:hyperlink w:anchor="_Toc238808953" w:history="1">
+          <w:hyperlink w:anchor="_Toc240260256" w:history="1">
             <w:r>
               <w:rPr>
                 <w:rStyle w:val="Hyperlink"/>
@@ -2332,7 +2314,7 @@
                 <w:noProof/>
                 <w:webHidden/>
               </w:rPr>
-              <w:instrText xml:space="preserve"> PAGEREF _Toc238808953 \h </w:instrText>
+              <w:instrText xml:space="preserve"> PAGEREF _Toc240260256 \h </w:instrText>
             </w:r>
             <w:r>
               <w:rPr>
@@ -2352,7 +2334,7 @@
                 <w:noProof/>
                 <w:webHidden/>
               </w:rPr>
-              <w:t>119</w:t>
+              <w:t>121</w:t>
             </w:r>
             <w:r>
               <w:rPr>
@@ -2377,7 +2359,7 @@
               <w:lang w:eastAsia="en-ZA"/>
             </w:rPr>
           </w:pPr>
-          <w:hyperlink w:anchor="_Toc238808954" w:history="1">
+          <w:hyperlink w:anchor="_Toc240260257" w:history="1">
             <w:r>
               <w:rPr>
                 <w:rStyle w:val="Hyperlink"/>
@@ -2404,7 +2386,7 @@
                 <w:noProof/>
                 <w:webHidden/>
               </w:rPr>
-              <w:instrText xml:space="preserve"> PAGEREF _Toc238808954 \h </w:instrText>
+              <w:instrText xml:space="preserve"> PAGEREF _Toc240260257 \h </w:instrText>
             </w:r>
             <w:r>
               <w:rPr>
@@ -2424,7 +2406,7 @@
                 <w:noProof/>
                 <w:webHidden/>
               </w:rPr>
-              <w:t>127</w:t>
+              <w:t>129</w:t>
             </w:r>
             <w:r>
               <w:rPr>
@@ -2449,7 +2431,7 @@
               <w:lang w:eastAsia="en-ZA"/>
             </w:rPr>
           </w:pPr>
-          <w:hyperlink w:anchor="_Toc238808955" w:history="1">
+          <w:hyperlink w:anchor="_Toc240260258" w:history="1">
             <w:r>
               <w:rPr>
                 <w:rStyle w:val="Hyperlink"/>
@@ -2476,7 +2458,7 @@
                 <w:noProof/>
                 <w:webHidden/>
               </w:rPr>
-              <w:instrText xml:space="preserve"> PAGEREF _Toc238808955 \h </w:instrText>
+              <w:instrText xml:space="preserve"> PAGEREF _Toc240260258 \h </w:instrText>
             </w:r>
             <w:r>
               <w:rPr>
@@ -2496,7 +2478,7 @@
                 <w:noProof/>
                 <w:webHidden/>
               </w:rPr>
-              <w:t>133</w:t>
+              <w:t>135</w:t>
             </w:r>
             <w:r>
               <w:rPr>
@@ -2521,7 +2503,7 @@
               <w:lang w:eastAsia="en-ZA"/>
             </w:rPr>
           </w:pPr>
-          <w:hyperlink w:anchor="_Toc238808956" w:history="1">
+          <w:hyperlink w:anchor="_Toc240260259" w:history="1">
             <w:r>
               <w:rPr>
                 <w:rStyle w:val="Hyperlink"/>
@@ -2548,7 +2530,7 @@
                 <w:noProof/>
                 <w:webHidden/>
               </w:rPr>
-              <w:instrText xml:space="preserve"> PAGEREF _Toc238808956 \h </w:instrText>
+              <w:instrText xml:space="preserve"> PAGEREF _Toc240260259 \h </w:instrText>
             </w:r>
             <w:r>
               <w:rPr>
@@ -2568,7 +2550,7 @@
                 <w:noProof/>
                 <w:webHidden/>
               </w:rPr>
-              <w:t>139</w:t>
+              <w:t>141</w:t>
             </w:r>
             <w:r>
               <w:rPr>
@@ -2593,7 +2575,7 @@
               <w:lang w:eastAsia="en-ZA"/>
             </w:rPr>
           </w:pPr>
-          <w:hyperlink w:anchor="_Toc238808957" w:history="1">
+          <w:hyperlink w:anchor="_Toc240260260" w:history="1">
             <w:r>
               <w:rPr>
                 <w:rStyle w:val="Hyperlink"/>
@@ -2620,7 +2602,7 @@
                 <w:noProof/>
                 <w:webHidden/>
               </w:rPr>
-              <w:instrText xml:space="preserve"> PAGEREF _Toc238808957 \h </w:instrText>
+              <w:instrText xml:space="preserve"> PAGEREF _Toc240260260 \h </w:instrText>
             </w:r>
             <w:r>
               <w:rPr>
@@ -2640,7 +2622,7 @@
                 <w:noProof/>
                 <w:webHidden/>
               </w:rPr>
-              <w:t>146</w:t>
+              <w:t>148</w:t>
             </w:r>
             <w:r>
               <w:rPr>
@@ -2665,13 +2647,13 @@
               <w:lang w:eastAsia="en-ZA"/>
             </w:rPr>
           </w:pPr>
-          <w:hyperlink w:anchor="_Toc238808958" w:history="1">
+          <w:hyperlink w:anchor="_Toc240260261" w:history="1">
             <w:r>
               <w:rPr>
                 <w:rStyle w:val="Hyperlink"/>
                 <w:noProof/>
               </w:rPr>
-              <w:t>Part IV – Prayers of Protection and intercession</w:t>
+              <w:t>Part IV – Prayers of Protection and Intercession</w:t>
             </w:r>
             <w:r>
               <w:rPr>
@@ -2692,7 +2674,7 @@
                 <w:noProof/>
                 <w:webHidden/>
               </w:rPr>
-              <w:instrText xml:space="preserve"> PAGEREF _Toc238808958 \h </w:instrText>
+              <w:instrText xml:space="preserve"> PAGEREF _Toc240260261 \h </w:instrText>
             </w:r>
             <w:r>
               <w:rPr>
@@ -2737,7 +2719,7 @@
               <w:lang w:eastAsia="en-ZA"/>
             </w:rPr>
           </w:pPr>
-          <w:hyperlink w:anchor="_Toc238808959" w:history="1">
+          <w:hyperlink w:anchor="_Toc240260262" w:history="1">
             <w:r>
               <w:rPr>
                 <w:rStyle w:val="Hyperlink"/>
@@ -2764,7 +2746,7 @@
                 <w:noProof/>
                 <w:webHidden/>
               </w:rPr>
-              <w:instrText xml:space="preserve"> PAGEREF _Toc238808959 \h </w:instrText>
+              <w:instrText xml:space="preserve"> PAGEREF _Toc240260262 \h </w:instrText>
             </w:r>
             <w:r>
               <w:rPr>
@@ -2809,7 +2791,7 @@
               <w:lang w:eastAsia="en-ZA"/>
             </w:rPr>
           </w:pPr>
-          <w:hyperlink w:anchor="_Toc238808960" w:history="1">
+          <w:hyperlink w:anchor="_Toc240260263" w:history="1">
             <w:r>
               <w:rPr>
                 <w:rStyle w:val="Hyperlink"/>
@@ -2836,7 +2818,7 @@
                 <w:noProof/>
                 <w:webHidden/>
               </w:rPr>
-              <w:instrText xml:space="preserve"> PAGEREF _Toc238808960 \h </w:instrText>
+              <w:instrText xml:space="preserve"> PAGEREF _Toc240260263 \h </w:instrText>
             </w:r>
             <w:r>
               <w:rPr>
@@ -2881,7 +2863,7 @@
               <w:lang w:eastAsia="en-ZA"/>
             </w:rPr>
           </w:pPr>
-          <w:hyperlink w:anchor="_Toc238808961" w:history="1">
+          <w:hyperlink w:anchor="_Toc240260264" w:history="1">
             <w:r>
               <w:rPr>
                 <w:rStyle w:val="Hyperlink"/>
@@ -2908,7 +2890,7 @@
                 <w:noProof/>
                 <w:webHidden/>
               </w:rPr>
-              <w:instrText xml:space="preserve"> PAGEREF _Toc238808961 \h </w:instrText>
+              <w:instrText xml:space="preserve"> PAGEREF _Toc240260264 \h </w:instrText>
             </w:r>
             <w:r>
               <w:rPr>
@@ -2953,7 +2935,7 @@
               <w:lang w:eastAsia="en-ZA"/>
             </w:rPr>
           </w:pPr>
-          <w:hyperlink w:anchor="_Toc238808962" w:history="1">
+          <w:hyperlink w:anchor="_Toc240260265" w:history="1">
             <w:r>
               <w:rPr>
                 <w:rStyle w:val="Hyperlink"/>
@@ -2980,7 +2962,7 @@
                 <w:noProof/>
                 <w:webHidden/>
               </w:rPr>
-              <w:instrText xml:space="preserve"> PAGEREF _Toc238808962 \h </w:instrText>
+              <w:instrText xml:space="preserve"> PAGEREF _Toc240260265 \h </w:instrText>
             </w:r>
             <w:r>
               <w:rPr>
@@ -3025,7 +3007,7 @@
               <w:lang w:eastAsia="en-ZA"/>
             </w:rPr>
           </w:pPr>
-          <w:hyperlink w:anchor="_Toc238808963" w:history="1">
+          <w:hyperlink w:anchor="_Toc240260266" w:history="1">
             <w:r>
               <w:rPr>
                 <w:rStyle w:val="Hyperlink"/>
@@ -3052,7 +3034,7 @@
                 <w:noProof/>
                 <w:webHidden/>
               </w:rPr>
-              <w:instrText xml:space="preserve"> PAGEREF _Toc238808963 \h </w:instrText>
+              <w:instrText xml:space="preserve"> PAGEREF _Toc240260266 \h </w:instrText>
             </w:r>
             <w:r>
               <w:rPr>
@@ -3097,7 +3079,7 @@
               <w:lang w:eastAsia="en-ZA"/>
             </w:rPr>
           </w:pPr>
-          <w:hyperlink w:anchor="_Toc238808964" w:history="1">
+          <w:hyperlink w:anchor="_Toc240260267" w:history="1">
             <w:r>
               <w:rPr>
                 <w:rStyle w:val="Hyperlink"/>
@@ -3124,7 +3106,7 @@
                 <w:noProof/>
                 <w:webHidden/>
               </w:rPr>
-              <w:instrText xml:space="preserve"> PAGEREF _Toc238808964 \h </w:instrText>
+              <w:instrText xml:space="preserve"> PAGEREF _Toc240260267 \h </w:instrText>
             </w:r>
             <w:r>
               <w:rPr>
@@ -3169,7 +3151,7 @@
               <w:lang w:eastAsia="en-ZA"/>
             </w:rPr>
           </w:pPr>
-          <w:hyperlink w:anchor="_Toc238808965" w:history="1">
+          <w:hyperlink w:anchor="_Toc240260268" w:history="1">
             <w:r>
               <w:rPr>
                 <w:rStyle w:val="Hyperlink"/>
@@ -3196,7 +3178,7 @@
                 <w:noProof/>
                 <w:webHidden/>
               </w:rPr>
-              <w:instrText xml:space="preserve"> PAGEREF _Toc238808965 \h </w:instrText>
+              <w:instrText xml:space="preserve"> PAGEREF _Toc240260268 \h </w:instrText>
             </w:r>
             <w:r>
               <w:rPr>
@@ -3241,7 +3223,7 @@
               <w:lang w:eastAsia="en-ZA"/>
             </w:rPr>
           </w:pPr>
-          <w:hyperlink w:anchor="_Toc238808966" w:history="1">
+          <w:hyperlink w:anchor="_Toc240260269" w:history="1">
             <w:r>
               <w:rPr>
                 <w:rStyle w:val="Hyperlink"/>
@@ -3268,7 +3250,7 @@
                 <w:noProof/>
                 <w:webHidden/>
               </w:rPr>
-              <w:instrText xml:space="preserve"> PAGEREF _Toc238808966 \h </w:instrText>
+              <w:instrText xml:space="preserve"> PAGEREF _Toc240260269 \h </w:instrText>
             </w:r>
             <w:r>
               <w:rPr>
@@ -3313,7 +3295,7 @@
               <w:lang w:eastAsia="en-ZA"/>
             </w:rPr>
           </w:pPr>
-          <w:hyperlink w:anchor="_Toc238808967" w:history="1">
+          <w:hyperlink w:anchor="_Toc240260270" w:history="1">
             <w:r>
               <w:rPr>
                 <w:rStyle w:val="Hyperlink"/>
@@ -3340,7 +3322,7 @@
                 <w:noProof/>
                 <w:webHidden/>
               </w:rPr>
-              <w:instrText xml:space="preserve"> PAGEREF _Toc238808967 \h </w:instrText>
+              <w:instrText xml:space="preserve"> PAGEREF _Toc240260270 \h </w:instrText>
             </w:r>
             <w:r>
               <w:rPr>
@@ -3385,7 +3367,7 @@
               <w:lang w:eastAsia="en-ZA"/>
             </w:rPr>
           </w:pPr>
-          <w:hyperlink w:anchor="_Toc238808968" w:history="1">
+          <w:hyperlink w:anchor="_Toc240260271" w:history="1">
             <w:r>
               <w:rPr>
                 <w:rStyle w:val="Hyperlink"/>
@@ -3412,7 +3394,7 @@
                 <w:noProof/>
                 <w:webHidden/>
               </w:rPr>
-              <w:instrText xml:space="preserve"> PAGEREF _Toc238808968 \h </w:instrText>
+              <w:instrText xml:space="preserve"> PAGEREF _Toc240260271 \h </w:instrText>
             </w:r>
             <w:r>
               <w:rPr>
@@ -3495,7 +3477,7 @@
           <w:i w:val="0"/>
         </w:rPr>
       </w:pPr>
-      <w:bookmarkStart w:id="0" w:name="_Toc238808927"/>
+      <w:bookmarkStart w:id="0" w:name="_Toc240260230"/>
       <w:r>
         <w:rPr>
           <w:rStyle w:val="SPPrayerResponseCS"/>
@@ -3507,7 +3489,7 @@
     </w:p>
     <w:p>
       <w:pPr>
-        <w:pStyle w:val="SPSectionTitle"/>
+        <w:pStyle w:val="SPBodyText"/>
         <w:rPr>
           <w:rStyle w:val="SPPrayerResponseCS"/>
           <w:i w:val="0"/>
@@ -3516,16 +3498,16 @@
     </w:p>
     <w:p>
       <w:pPr>
-        <w:pStyle w:val="SPEpigraph"/>
+        <w:pStyle w:val="SPBodyText"/>
         <w:rPr>
           <w:rStyle w:val="SPPrayerResponseCS"/>
-          <w:i/>
+          <w:i w:val="0"/>
         </w:rPr>
       </w:pPr>
       <w:r>
         <w:rPr>
           <w:rStyle w:val="SPPrayerResponseCS"/>
-          <w:i/>
+          <w:i w:val="0"/>
         </w:rPr>
         <w:t>A Prayer Book for Daily Life</w:t>
       </w:r>
@@ -3575,77 +3557,40 @@
         <w:pStyle w:val="SPBodyText"/>
       </w:pPr>
       <w:r>
+        <w:t>An invitation to remember who God is.</w:t>
+      </w:r>
+      <w:r>
+        <w:br/>
+        <w:t>An invitation to remember who we are.</w:t>
+      </w:r>
+      <w:r>
+        <w:br/>
+        <w:t>An invitation to give thanks, to ask forgiveness, to seek guidance, to praise, and simply to remain in God's presence.</w:t>
+      </w:r>
+    </w:p>
+    <w:p>
+      <w:pPr>
+        <w:pStyle w:val="SPBodyText"/>
+      </w:pPr>
+      <w:r>
+        <w:t>Sacrae Preces was created from a desire to make some of these prayers accessible not only as words on a page, but as prayers that can be understood, contemplated, and lived.</w:t>
+      </w:r>
+    </w:p>
+    <w:p>
+      <w:pPr>
+        <w:pStyle w:val="SPBodyText"/>
+      </w:pPr>
+      <w:r>
         <w:lastRenderedPageBreak/>
-        <w:t>An invitation to remember who God is.</w:t>
-      </w:r>
-      <w:r>
-        <w:br/>
-        <w:t>An invitation to remember who we are.</w:t>
-      </w:r>
-      <w:r>
-        <w:br/>
-        <w:t>An invitation to give thanks, to ask forgiveness, to seek guidance, to praise, and simply to remain in God's presence.</w:t>
-      </w:r>
-    </w:p>
-    <w:p>
-      <w:pPr>
-        <w:pStyle w:val="SPBodyText"/>
-      </w:pPr>
-      <w:r>
-        <w:rPr>
-          <w:i/>
-          <w:iCs/>
-        </w:rPr>
-        <w:t>Sacrae Preces</w:t>
-      </w:r>
-      <w:r>
-        <w:t xml:space="preserve"> was created from a desire to make some of these prayers accessible not only as words on a page, but as prayers that can be understood, contemplated, and lived.</w:t>
-      </w:r>
-    </w:p>
-    <w:p>
-      <w:pPr>
-        <w:pStyle w:val="SPBodyText"/>
-      </w:pPr>
-      <w:r>
-        <w:t xml:space="preserve">The title </w:t>
-      </w:r>
-      <w:r>
-        <w:rPr>
-          <w:i/>
-          <w:iCs/>
-        </w:rPr>
-        <w:t>Sacrae Preces</w:t>
-      </w:r>
-      <w:r>
-        <w:t xml:space="preserve"> means </w:t>
-      </w:r>
-      <w:r>
-        <w:rPr>
-          <w:b/>
-          <w:bCs/>
-        </w:rPr>
-        <w:t>"Sacred Prayers."</w:t>
-      </w:r>
-      <w:r>
-        <w:t xml:space="preserve"> The name reflects something simple: these prayers are part of a rich inheritance that has been handed down through the life of the Church. They belong not merely to one generation, one country, or one language. They have crossed centuries and borders, carried by ordinary people who have sought God in the midst of ordinary lives.</w:t>
-      </w:r>
-    </w:p>
-    <w:p>
-      <w:pPr>
-        <w:pStyle w:val="SPBodyText"/>
-      </w:pPr>
-      <w:r>
-        <w:t xml:space="preserve">This book brings the prayers together in </w:t>
-      </w:r>
-      <w:r>
-        <w:rPr>
-          <w:b/>
-          <w:bCs/>
-        </w:rPr>
-        <w:t>English and Latin</w:t>
-      </w:r>
-      <w:r>
-        <w:t>.</w:t>
+        <w:t>The title Sacrae Preces means "Sacred Prayers." The name reflects something simple: these prayers are part of a rich inheritance that has been handed down through the life of the Church. They belong not merely to one generation, one country, or one language. They have crossed centuries and borders, carried by ordinary people who have sought God in the midst of ordinary lives.</w:t>
+      </w:r>
+    </w:p>
+    <w:p>
+      <w:pPr>
+        <w:pStyle w:val="SPBodyText"/>
+      </w:pPr>
+      <w:r>
+        <w:t>This book brings the prayers together in English and Latin.</w:t>
       </w:r>
     </w:p>
     <w:p>
@@ -3685,31 +3630,31 @@
         <w:pStyle w:val="SPBodyText"/>
       </w:pPr>
       <w:r>
+        <w:t>A reader may begin by praying entirely in English. Another may wish to compare the English and Latin side by side. Someone else may learn a single Latin word each day. Over time, those individual words begin to become familiar, and the language that once seemed distant becomes something recognisable.</w:t>
+      </w:r>
+    </w:p>
+    <w:p>
+      <w:pPr>
+        <w:pStyle w:val="SPBodyText"/>
+      </w:pPr>
+      <w:r>
+        <w:t>The prayers themselves are the heart of this book. Everything else is intended to help us enter them more deeply.</w:t>
+      </w:r>
+    </w:p>
+    <w:p>
+      <w:pPr>
+        <w:pStyle w:val="SPBodyText"/>
+      </w:pPr>
+      <w:r>
+        <w:t>For this reason, each prayer is accompanied by material intended for reflection and study. We look at its place in Scripture, consider why Christians have prayed it, explore the meaning of its petitions, and examine some of the Latin words that give the prayer its particular character.</w:t>
+      </w:r>
+    </w:p>
+    <w:p>
+      <w:pPr>
+        <w:pStyle w:val="SPBodyText"/>
+      </w:pPr>
+      <w:r>
         <w:lastRenderedPageBreak/>
-        <w:t>A reader may begin by praying entirely in English. Another may wish to compare the English and Latin side by side. Someone else may learn a single Latin word each day. Over time, those individual words begin to become familiar, and the language that once seemed distant becomes something recognisable.</w:t>
-      </w:r>
-    </w:p>
-    <w:p>
-      <w:pPr>
-        <w:pStyle w:val="SPBodyText"/>
-      </w:pPr>
-      <w:r>
-        <w:t>The prayers themselves are the heart of this book. Everything else is intended to help us enter them more deeply.</w:t>
-      </w:r>
-    </w:p>
-    <w:p>
-      <w:pPr>
-        <w:pStyle w:val="SPBodyText"/>
-      </w:pPr>
-      <w:r>
-        <w:t>For this reason, each prayer is accompanied by material intended for reflection and study. We look at its place in Scripture, consider why Christians have prayed it, explore the meaning of its petitions, and examine some of the Latin words that give the prayer its particular character.</w:t>
-      </w:r>
-    </w:p>
-    <w:p>
-      <w:pPr>
-        <w:pStyle w:val="SPBodyText"/>
-      </w:pPr>
-      <w:r>
         <w:t>There are also reflections and suggestions for incorporating the prayers into daily life.</w:t>
       </w:r>
     </w:p>
@@ -3770,66 +3715,56 @@
         <w:pStyle w:val="SPBodyText"/>
       </w:pPr>
       <w:r>
+        <w:t>Pray it in the morning before the day's demands begin. Pray it at night when the house is quiet. Keep it beside your bed, on a desk, or somewhere the family naturally gathers. Teach a prayer to a child. Pray with someone who is struggling. Give a prayer to someone who needs encouragement.</w:t>
+      </w:r>
+    </w:p>
+    <w:p>
+      <w:pPr>
+        <w:pStyle w:val="SPBodyText"/>
+      </w:pPr>
+      <w:r>
+        <w:t>Let the prayers become familiar.</w:t>
+      </w:r>
+    </w:p>
+    <w:p>
+      <w:pPr>
+        <w:pStyle w:val="SPBodyText"/>
+      </w:pPr>
+      <w:r>
+        <w:t>The great prayers of the Church have survived because people prayed them.</w:t>
+      </w:r>
+    </w:p>
+    <w:p>
+      <w:pPr>
+        <w:pStyle w:val="SPBodyText"/>
+      </w:pPr>
+      <w:r>
+        <w:t>They were not preserved merely because they were printed in books. They were preserved because parents taught them to their children, grandparents taught them to grandchildren, teachers taught their pupils, priests taught their communities, and ordinary Christians carried them in their hearts.</w:t>
+      </w:r>
+    </w:p>
+    <w:p>
+      <w:pPr>
+        <w:pStyle w:val="SPBodyText"/>
+      </w:pPr>
+      <w:r>
+        <w:t>That inheritance is worth passing on.</w:t>
+      </w:r>
+    </w:p>
+    <w:p>
+      <w:pPr>
+        <w:pStyle w:val="SPBodyText"/>
+      </w:pPr>
+      <w:r>
+        <w:t>Perhaps this is one of the greatest gifts a family can give its children—not simply an explanation of faith, but the knowledge of how to pray.</w:t>
+      </w:r>
+    </w:p>
+    <w:p>
+      <w:pPr>
+        <w:pStyle w:val="SPBodyText"/>
+      </w:pPr>
+      <w:r>
         <w:lastRenderedPageBreak/>
-        <w:t>Pray it in the morning before the day's demands begin. Pray it at night when the house is quiet. Keep it beside your bed, on a desk, or somewhere the family naturally gathers. Teach a prayer to a child. Pray with someone who is struggling. Give a prayer to someone who needs encouragement.</w:t>
-      </w:r>
-    </w:p>
-    <w:p>
-      <w:pPr>
-        <w:pStyle w:val="SPBodyText"/>
-      </w:pPr>
-      <w:r>
-        <w:t>Let the prayers become familiar.</w:t>
-      </w:r>
-    </w:p>
-    <w:p>
-      <w:pPr>
-        <w:pStyle w:val="SPBodyText"/>
-      </w:pPr>
-      <w:r>
-        <w:t>The great prayers of the Church have survived because people prayed them.</w:t>
-      </w:r>
-    </w:p>
-    <w:p>
-      <w:pPr>
-        <w:pStyle w:val="SPBodyText"/>
-      </w:pPr>
-      <w:r>
-        <w:t>They were not preserved merely because they were printed in books. They were preserved because parents taught them to their children, grandparents taught them to grandchildren, teachers taught their pupils, priests taught their communities, and ordinary Christians carried them in their hearts.</w:t>
-      </w:r>
-    </w:p>
-    <w:p>
-      <w:pPr>
-        <w:pStyle w:val="SPBodyText"/>
-      </w:pPr>
-      <w:r>
-        <w:t>That inheritance is worth passing on.</w:t>
-      </w:r>
-    </w:p>
-    <w:p>
-      <w:pPr>
-        <w:pStyle w:val="SPBodyText"/>
-      </w:pPr>
-      <w:r>
-        <w:t>Perhaps this is one of the greatest gifts a family can give its children—not simply an explanation of faith, but the knowledge of how to pray.</w:t>
-      </w:r>
-    </w:p>
-    <w:p>
-      <w:pPr>
-        <w:pStyle w:val="SPBodyText"/>
-      </w:pPr>
-      <w:r>
-        <w:t xml:space="preserve">A child who learns to say </w:t>
-      </w:r>
-      <w:r>
-        <w:rPr>
-          <w:i/>
-          <w:iCs/>
-        </w:rPr>
-        <w:t>Our Father</w:t>
-      </w:r>
-      <w:r>
-        <w:t xml:space="preserve"> has received more than a collection of words.</w:t>
+        <w:t>A child who learns to say Our Father has received more than a collection of words.</w:t>
       </w:r>
     </w:p>
     <w:p>
@@ -3861,94 +3796,87 @@
         <w:pStyle w:val="SPBodyText"/>
       </w:pPr>
       <w:r>
+        <w:t>And someone who learns to pray may eventually discover that prayer is not something we merely do at particular times.</w:t>
+      </w:r>
+    </w:p>
+    <w:p>
+      <w:pPr>
+        <w:pStyle w:val="SPBodyText"/>
+      </w:pPr>
+      <w:r>
+        <w:t>It can become a way of living.</w:t>
+      </w:r>
+    </w:p>
+    <w:p>
+      <w:pPr>
+        <w:pStyle w:val="SPBodyText"/>
+      </w:pPr>
+      <w:r>
+        <w:t>That is the hope behind these pages.</w:t>
+      </w:r>
+    </w:p>
+    <w:p>
+      <w:pPr>
+        <w:pStyle w:val="SPBodyText"/>
+      </w:pPr>
+      <w:r>
+        <w:t>Sacrae Preces is not intended to replace the life of prayer, the teaching of the Church, Scripture, the Sacraments, or the guidance of those entrusted with pastoral care. It is simply a companion—a collection of prayers, reflections, and explanations that may help the reader pause and turn towards God.</w:t>
+      </w:r>
+    </w:p>
+    <w:p>
+      <w:pPr>
+        <w:pStyle w:val="SPBodyText"/>
+      </w:pPr>
+      <w:r>
+        <w:t>There is no requirement to read this book from beginning to end.</w:t>
+      </w:r>
+    </w:p>
+    <w:p>
+      <w:pPr>
+        <w:pStyle w:val="SPBodyText"/>
+      </w:pPr>
+      <w:r>
+        <w:t>Begin with a prayer you already know.</w:t>
+      </w:r>
+    </w:p>
+    <w:p>
+      <w:pPr>
+        <w:pStyle w:val="SPBodyText"/>
+      </w:pPr>
+      <w:r>
+        <w:t>Or begin with one you do not.</w:t>
+      </w:r>
+    </w:p>
+    <w:p>
+      <w:pPr>
+        <w:pStyle w:val="SPBodyText"/>
+      </w:pPr>
+      <w:r>
+        <w:t>Read the English. Look at the Latin. Consider a single word. Read the Scripture references. Sit quietly with the reflection.</w:t>
+      </w:r>
+    </w:p>
+    <w:p>
+      <w:pPr>
+        <w:pStyle w:val="SPBodyText"/>
+      </w:pPr>
+      <w:r>
+        <w:t>Then pray.</w:t>
+      </w:r>
+    </w:p>
+    <w:p>
+      <w:pPr>
+        <w:pStyle w:val="SPBodyText"/>
+      </w:pPr>
+      <w:r>
+        <w:t>And tomorrow, return.</w:t>
+      </w:r>
+    </w:p>
+    <w:p>
+      <w:pPr>
+        <w:pStyle w:val="SPBodyText"/>
+      </w:pPr>
+      <w:r>
         <w:lastRenderedPageBreak/>
-        <w:t>And someone who learns to pray may eventually discover that prayer is not something we merely do at particular times.</w:t>
-      </w:r>
-    </w:p>
-    <w:p>
-      <w:pPr>
-        <w:pStyle w:val="SPBodyText"/>
-      </w:pPr>
-      <w:r>
-        <w:t>It can become a way of living.</w:t>
-      </w:r>
-    </w:p>
-    <w:p>
-      <w:pPr>
-        <w:pStyle w:val="SPBodyText"/>
-      </w:pPr>
-      <w:r>
-        <w:t>That is the hope behind these pages.</w:t>
-      </w:r>
-    </w:p>
-    <w:p>
-      <w:pPr>
-        <w:pStyle w:val="SPBodyText"/>
-      </w:pPr>
-      <w:r>
-        <w:rPr>
-          <w:i/>
-          <w:iCs/>
-        </w:rPr>
-        <w:t>Sacrae Preces</w:t>
-      </w:r>
-      <w:r>
-        <w:t xml:space="preserve"> is not intended to replace the life of prayer, the teaching of the Church, Scripture, the Sacraments, or the guidance of those entrusted with pastoral care. It is simply a companion—a collection of prayers, reflections, and explanations that may help the reader pause and turn towards God.</w:t>
-      </w:r>
-    </w:p>
-    <w:p>
-      <w:pPr>
-        <w:pStyle w:val="SPBodyText"/>
-      </w:pPr>
-      <w:r>
-        <w:t>There is no requirement to read this book from beginning to end.</w:t>
-      </w:r>
-    </w:p>
-    <w:p>
-      <w:pPr>
-        <w:pStyle w:val="SPBodyText"/>
-      </w:pPr>
-      <w:r>
-        <w:t>Begin with a prayer you already know.</w:t>
-      </w:r>
-    </w:p>
-    <w:p>
-      <w:pPr>
-        <w:pStyle w:val="SPBodyText"/>
-      </w:pPr>
-      <w:r>
-        <w:t>Or begin with one you do not.</w:t>
-      </w:r>
-    </w:p>
-    <w:p>
-      <w:pPr>
-        <w:pStyle w:val="SPBodyText"/>
-      </w:pPr>
-      <w:r>
-        <w:t>Read the English. Look at the Latin. Consider a single word. Read the Scripture references. Sit quietly with the reflection.</w:t>
-      </w:r>
-    </w:p>
-    <w:p>
-      <w:pPr>
-        <w:pStyle w:val="SPBodyText"/>
-      </w:pPr>
-      <w:r>
-        <w:t>Then pray.</w:t>
-      </w:r>
-    </w:p>
-    <w:p>
-      <w:pPr>
-        <w:pStyle w:val="SPBodyText"/>
-      </w:pPr>
-      <w:r>
-        <w:t>And tomorrow, return.</w:t>
-      </w:r>
-    </w:p>
-    <w:p>
-      <w:pPr>
-        <w:pStyle w:val="SPBodyText"/>
-      </w:pPr>
-      <w:r>
         <w:t>The Church has given us a treasury of prayers that is far greater than any single volume can contain. This book is only a small doorway into that treasury.</w:t>
       </w:r>
     </w:p>
@@ -3965,7 +3893,6 @@
         <w:pStyle w:val="SPBodyText"/>
       </w:pPr>
       <w:r>
-        <w:lastRenderedPageBreak/>
         <w:t>May they be found beside the beds of children and adults, in homes where faith is well established and in homes where someone is only beginning to search.</w:t>
       </w:r>
     </w:p>
@@ -4043,10 +3970,15 @@
     </w:p>
     <w:p>
       <w:pPr>
-        <w:pStyle w:val="SPContentsTitle"/>
+        <w:jc w:val="center"/>
         <w:rPr>
           <w:rFonts w:ascii="Segoe UI Symbol" w:hAnsi="Segoe UI Symbol" w:cs="Segoe UI Symbol"/>
         </w:rPr>
+      </w:pPr>
+    </w:p>
+    <w:p>
+      <w:pPr>
+        <w:jc w:val="center"/>
         <w:sectPr>
           <w:footerReference w:type="first" r:id="rId10"/>
           <w:type w:val="oddPage"/>
@@ -4069,7 +4001,7 @@
       <w:pPr>
         <w:pStyle w:val="SPSectionTitle"/>
       </w:pPr>
-      <w:bookmarkStart w:id="1" w:name="_Toc238808928"/>
+      <w:bookmarkStart w:id="1" w:name="_Toc240260231"/>
       <w:r>
         <w:lastRenderedPageBreak/>
         <w:t>Introduction</w:t>
@@ -4312,7 +4244,7 @@
       <w:pPr>
         <w:pStyle w:val="SPSectionSubTitle"/>
       </w:pPr>
-      <w:bookmarkStart w:id="2" w:name="_Toc238808929"/>
+      <w:bookmarkStart w:id="2" w:name="_Toc240260232"/>
       <w:r>
         <w:lastRenderedPageBreak/>
         <w:t>English and Latin</w:t>
@@ -4398,7 +4330,7 @@
       </w:pPr>
       <w:r>
         <w:pict w14:anchorId="249FE732">
-          <v:rect id="_x0000_i23803" style="width:0;height:1.5pt" o:hralign="center" o:hrstd="t" o:hr="t" fillcolor="#a0a0a0" stroked="f"/>
+          <v:rect id="_x0000_i24229" style="width:0;height:1.5pt" o:hralign="center" o:hrstd="t" o:hr="t" fillcolor="#a0a0a0" stroked="f"/>
         </w:pict>
       </w:r>
     </w:p>
@@ -4419,7 +4351,7 @@
       <w:pPr>
         <w:pStyle w:val="SPSectionSubTitle"/>
       </w:pPr>
-      <w:bookmarkStart w:id="3" w:name="_Toc238808930"/>
+      <w:bookmarkStart w:id="3" w:name="_Toc240260233"/>
       <w:r>
         <w:lastRenderedPageBreak/>
         <w:t>The Prayer</w:t>
@@ -4576,7 +4508,7 @@
       <w:pPr>
         <w:pStyle w:val="SPSectionSubTitle"/>
       </w:pPr>
-      <w:bookmarkStart w:id="4" w:name="_Toc238808931"/>
+      <w:bookmarkStart w:id="4" w:name="_Toc240260234"/>
       <w:r>
         <w:lastRenderedPageBreak/>
         <w:t>Scripture</w:t>
@@ -4654,7 +4586,7 @@
       </w:pPr>
       <w:r>
         <w:pict w14:anchorId="25751FDD">
-          <v:rect id="_x0000_i23804" style="width:0;height:1.5pt" o:hralign="center" o:hrstd="t" o:hr="t" fillcolor="#a0a0a0" stroked="f"/>
+          <v:rect id="_x0000_i24230" style="width:0;height:1.5pt" o:hralign="center" o:hrstd="t" o:hr="t" fillcolor="#a0a0a0" stroked="f"/>
         </w:pict>
       </w:r>
     </w:p>
@@ -4662,7 +4594,7 @@
       <w:pPr>
         <w:pStyle w:val="SPSectionSubTitle"/>
       </w:pPr>
-      <w:bookmarkStart w:id="5" w:name="_Toc238808932"/>
+      <w:bookmarkStart w:id="5" w:name="_Toc240260235"/>
       <w:r>
         <w:t>Reflection</w:t>
       </w:r>
@@ -4726,7 +4658,7 @@
       </w:pPr>
       <w:r>
         <w:pict w14:anchorId="19542BB1">
-          <v:rect id="_x0000_i23805" style="width:0;height:1.5pt" o:hralign="center" o:hrstd="t" o:hr="t" fillcolor="#a0a0a0" stroked="f"/>
+          <v:rect id="_x0000_i24231" style="width:0;height:1.5pt" o:hralign="center" o:hrstd="t" o:hr="t" fillcolor="#a0a0a0" stroked="f"/>
         </w:pict>
       </w:r>
     </w:p>
@@ -4734,7 +4666,7 @@
       <w:pPr>
         <w:pStyle w:val="SPSectionSubTitle"/>
       </w:pPr>
-      <w:bookmarkStart w:id="6" w:name="_Toc238808933"/>
+      <w:bookmarkStart w:id="6" w:name="_Toc240260236"/>
       <w:r>
         <w:t>Latin Vocabulary</w:t>
       </w:r>
@@ -4846,7 +4778,7 @@
       <w:pPr>
         <w:pStyle w:val="SPSectionSubTitle"/>
       </w:pPr>
-      <w:bookmarkStart w:id="7" w:name="_Toc238808934"/>
+      <w:bookmarkStart w:id="7" w:name="_Toc240260237"/>
       <w:r>
         <w:lastRenderedPageBreak/>
         <w:t>Prayer Through the Day</w:t>
@@ -4865,16 +4797,6 @@
       <w:r>
         <w:t xml:space="preserve">The suggested prayer times are exactly that: </w:t>
       </w:r>
-    </w:p>
-    <w:p>
-      <w:pPr>
-        <w:pStyle w:val="SPBodyText"/>
-      </w:pPr>
-    </w:p>
-    <w:p>
-      <w:pPr>
-        <w:pStyle w:val="SPBodyText"/>
-      </w:pPr>
       <w:r>
         <w:t>S</w:t>
       </w:r>
@@ -4964,7 +4886,7 @@
       </w:pPr>
       <w:r>
         <w:pict w14:anchorId="68D46385">
-          <v:rect id="_x0000_i23806" style="width:0;height:1.5pt" o:hralign="center" o:hrstd="t" o:hr="t" fillcolor="#a0a0a0" stroked="f"/>
+          <v:rect id="_x0000_i24232" style="width:0;height:1.5pt" o:hralign="center" o:hrstd="t" o:hr="t" fillcolor="#a0a0a0" stroked="f"/>
         </w:pict>
       </w:r>
     </w:p>
@@ -4972,7 +4894,6 @@
       <w:pPr>
         <w:pStyle w:val="SPSectionSubTitle"/>
       </w:pPr>
-      <w:bookmarkStart w:id="8" w:name="_Toc238808935"/>
     </w:p>
     <w:p>
       <w:pPr>
@@ -4991,6 +4912,7 @@
       <w:pPr>
         <w:pStyle w:val="SPSectionSubTitle"/>
       </w:pPr>
+      <w:bookmarkStart w:id="8" w:name="_Toc240260238"/>
       <w:r>
         <w:lastRenderedPageBreak/>
         <w:t>A Simple Way to Begin</w:t>
@@ -5116,9 +5038,8 @@
       <w:pPr>
         <w:pStyle w:val="SPSectionSubTitle"/>
       </w:pPr>
-      <w:bookmarkStart w:id="9" w:name="_Toc238808936"/>
-      <w:r>
-        <w:lastRenderedPageBreak/>
+      <w:bookmarkStart w:id="9" w:name="_Toc240260239"/>
+      <w:r>
         <w:t>Return</w:t>
       </w:r>
       <w:bookmarkEnd w:id="9"/>
@@ -5137,6 +5058,7 @@
           <w:i/>
           <w:iCs/>
         </w:rPr>
+        <w:lastRenderedPageBreak/>
         <w:t>Sacrae Preces</w:t>
       </w:r>
       <w:r>
@@ -5294,9 +5216,6 @@
     <w:p>
       <w:pPr>
         <w:jc w:val="center"/>
-        <w:rPr>
-          <w:rFonts w:ascii="Segoe UI Symbol" w:hAnsi="Segoe UI Symbol" w:cs="Segoe UI Symbol"/>
-        </w:rPr>
         <w:sectPr>
           <w:type w:val="evenPage"/>
           <w:pgSz w:w="7920" w:h="12240" w:code="6"/>
@@ -5321,7 +5240,7 @@
         <w:lastRenderedPageBreak/>
         <w:tab/>
       </w:r>
-      <w:bookmarkStart w:id="10" w:name="_Toc238808937"/>
+      <w:bookmarkStart w:id="10" w:name="_Toc240260240"/>
       <w:r>
         <w:t>Part I — Basic Prayers</w:t>
       </w:r>
@@ -5479,7 +5398,7 @@
     </w:p>
     <w:p>
       <w:pPr>
-        <w:pStyle w:val="SPBodyText"/>
+        <w:jc w:val="center"/>
       </w:pPr>
       <w:r>
         <w:rPr>
@@ -5498,7 +5417,7 @@
       <w:pPr>
         <w:pStyle w:val="SPPrayerTitle"/>
       </w:pPr>
-      <w:bookmarkStart w:id="11" w:name="_Toc238808938"/>
+      <w:bookmarkStart w:id="11" w:name="_Toc240260241"/>
       <w:r>
         <w:t xml:space="preserve">Sign of the </w:t>
       </w:r>
@@ -5665,58 +5584,16 @@
         <w:rPr>
           <w:rStyle w:val="Emphasis"/>
         </w:rPr>
-        <w:t>in NOH-mee-</w:t>
-      </w:r>
-      <w:proofErr w:type="spellStart"/>
+        <w:t>in NOH-mee-neh PAH-tris,</w:t>
+      </w:r>
+      <w:r>
+        <w:br/>
+      </w:r>
       <w:r>
         <w:rPr>
           <w:rStyle w:val="Emphasis"/>
         </w:rPr>
-        <w:t>neh</w:t>
-      </w:r>
-      <w:proofErr w:type="spellEnd"/>
-      <w:r>
-        <w:rPr>
-          <w:rStyle w:val="Emphasis"/>
-        </w:rPr>
-        <w:t xml:space="preserve"> PAH-tris,</w:t>
-      </w:r>
-      <w:r>
-        <w:br/>
-      </w:r>
-      <w:r>
-        <w:rPr>
-          <w:rStyle w:val="Emphasis"/>
-        </w:rPr>
-        <w:t>et FEE-lee-ee, et SPEE-</w:t>
-      </w:r>
-      <w:proofErr w:type="spellStart"/>
-      <w:r>
-        <w:rPr>
-          <w:rStyle w:val="Emphasis"/>
-        </w:rPr>
-        <w:t>ree</w:t>
-      </w:r>
-      <w:proofErr w:type="spellEnd"/>
-      <w:r>
-        <w:rPr>
-          <w:rStyle w:val="Emphasis"/>
-        </w:rPr>
-        <w:t>-</w:t>
-      </w:r>
-      <w:proofErr w:type="spellStart"/>
-      <w:r>
-        <w:rPr>
-          <w:rStyle w:val="Emphasis"/>
-        </w:rPr>
-        <w:t>toos</w:t>
-      </w:r>
-      <w:proofErr w:type="spellEnd"/>
-      <w:r>
-        <w:rPr>
-          <w:rStyle w:val="Emphasis"/>
-        </w:rPr>
-        <w:t xml:space="preserve"> SAHNK-tee.</w:t>
+        <w:t>et FEE-lee-ee, et SPEE-ree-toos SAHNK-tee.</w:t>
       </w:r>
       <w:r>
         <w:br/>
@@ -5854,7 +5731,7 @@
     </w:p>
     <w:p>
       <w:pPr>
-        <w:pStyle w:val="SPBodyText"/>
+        <w:jc w:val="center"/>
       </w:pPr>
       <w:r>
         <w:rPr>
@@ -5873,7 +5750,7 @@
       <w:pPr>
         <w:pStyle w:val="SPPrayerTitle"/>
       </w:pPr>
-      <w:bookmarkStart w:id="12" w:name="_Toc238808939"/>
+      <w:bookmarkStart w:id="12" w:name="_Toc240260242"/>
       <w:r>
         <w:t>The Our Father</w:t>
       </w:r>
@@ -6316,19 +6193,22 @@
         <w:t>Reflection</w:t>
       </w:r>
     </w:p>
-    <w:p>
-      <w:pPr>
-        <w:pStyle w:val="SPBodyText"/>
-      </w:pPr>
-    </w:p>
-    <w:p>
-      <w:pPr>
-        <w:pStyle w:val="SPBodyText"/>
+    <w:p/>
+    <w:p>
+      <w:pPr>
+        <w:rPr>
+          <w:b/>
+          <w:bCs/>
+        </w:rPr>
       </w:pPr>
       <w:r>
         <w:t xml:space="preserve"> </w:t>
       </w:r>
       <w:r>
+        <w:rPr>
+          <w:b/>
+          <w:bCs/>
+        </w:rPr>
         <w:t>The Father We Share</w:t>
       </w:r>
     </w:p>
@@ -6354,7 +6234,6 @@
       <w:r>
         <w:t xml:space="preserve">. It is </w:t>
       </w:r>
-      <w:proofErr w:type="spellStart"/>
       <w:r>
         <w:rPr>
           <w:i/>
@@ -6362,7 +6241,6 @@
         </w:rPr>
         <w:t>our</w:t>
       </w:r>
-      <w:proofErr w:type="spellEnd"/>
       <w:r>
         <w:t>.</w:t>
       </w:r>
@@ -6555,7 +6433,7 @@
     </w:p>
     <w:p>
       <w:pPr>
-        <w:pStyle w:val="SPBodyText"/>
+        <w:jc w:val="center"/>
       </w:pPr>
       <w:r>
         <w:rPr>
@@ -6574,7 +6452,7 @@
       <w:pPr>
         <w:pStyle w:val="SPPrayerTitle"/>
       </w:pPr>
-      <w:bookmarkStart w:id="13" w:name="_Toc238808940"/>
+      <w:bookmarkStart w:id="13" w:name="_Toc240260243"/>
       <w:r>
         <w:t xml:space="preserve">The Hail </w:t>
       </w:r>
@@ -7052,9 +6930,16 @@
     </w:p>
     <w:p>
       <w:pPr>
-        <w:pStyle w:val="SPBodyText"/>
-      </w:pPr>
-      <w:r>
+        <w:rPr>
+          <w:b/>
+          <w:bCs/>
+        </w:rPr>
+      </w:pPr>
+      <w:r>
+        <w:rPr>
+          <w:b/>
+          <w:bCs/>
+        </w:rPr>
         <w:t>The Words We Receive</w:t>
       </w:r>
     </w:p>
@@ -7071,17 +6956,7 @@
         <w:pStyle w:val="SPBodyText"/>
       </w:pPr>
       <w:r>
-        <w:t xml:space="preserve">The angel Gabriel greets Mary with words of grace: </w:t>
-      </w:r>
-      <w:r>
-        <w:rPr>
-          <w:i/>
-          <w:iCs/>
-        </w:rPr>
-        <w:t>Hail, Mary, full of grace, the Lord is with thee.</w:t>
-      </w:r>
-      <w:r>
-        <w:t xml:space="preserve"> Elizabeth then greets her as blessed among women and blesses the fruit of her womb. Before we ask for anything, we are invited to remember what God has already done.</w:t>
+        <w:t>The angel Gabriel greets Mary with words of grace: Hail, Mary, full of grace, the Lord is with thee. Elizabeth then greets her as blessed among women and blesses the fruit of her womb. Before we ask for anything, we are invited to remember what God has already done.</w:t>
       </w:r>
     </w:p>
     <w:p>
@@ -7097,17 +6972,7 @@
         <w:pStyle w:val="SPBodyText"/>
       </w:pPr>
       <w:r>
-        <w:t xml:space="preserve">Mary has received a call from God, and through her </w:t>
-      </w:r>
-      <w:r>
-        <w:rPr>
-          <w:i/>
-          <w:iCs/>
-        </w:rPr>
-        <w:t>yes</w:t>
-      </w:r>
-      <w:r>
-        <w:t>, the mystery of the Incarnation unfolds. The fruit of her womb is not simply a blessing for Mary alone. It is Jesus Christ, the Son of God, given for the salvation of the world.</w:t>
+        <w:t>Mary has received a call from God, and through her yes, the mystery of the Incarnation unfolds. The fruit of her womb is not simply a blessing for Mary alone. It is Jesus Christ, the Son of God, given for the salvation of the world.</w:t>
       </w:r>
     </w:p>
     <w:p>
@@ -7161,17 +7026,7 @@
       </w:pPr>
       <w:r>
         <w:lastRenderedPageBreak/>
-        <w:t xml:space="preserve">The title </w:t>
-      </w:r>
-      <w:r>
-        <w:rPr>
-          <w:i/>
-          <w:iCs/>
-        </w:rPr>
-        <w:t>Mother of God</w:t>
-      </w:r>
-      <w:r>
-        <w:t xml:space="preserve"> points us beyond Mary herself to the mystery of her Son. The child she bore is Jesus Christ, truly God and truly man. In honouring His Mother, we proclaim something about Him.</w:t>
+        <w:t>The title Mother of God points us beyond Mary herself to the mystery of her Son. The child she bore is Jesus Christ, truly God and truly man. In honouring His Mother, we proclaim something about Him.</w:t>
       </w:r>
     </w:p>
     <w:p>
@@ -7298,14 +7153,31 @@
         <w:pStyle w:val="SPBodyText"/>
       </w:pPr>
       <w:r>
-        <w:t xml:space="preserve">We need grace </w:t>
-      </w:r>
-      <w:r>
-        <w:rPr>
-          <w:b/>
-          <w:bCs/>
-        </w:rPr>
-        <w:t>now</w:t>
+        <w:t>We need grace now.</w:t>
+      </w:r>
+    </w:p>
+    <w:p>
+      <w:pPr>
+        <w:pStyle w:val="SPBodyText"/>
+      </w:pPr>
+      <w:r>
+        <w:t>We will need grace at the end.</w:t>
+      </w:r>
+    </w:p>
+    <w:p>
+      <w:pPr>
+        <w:pStyle w:val="SPBodyText"/>
+      </w:pPr>
+      <w:r>
+        <w:t>And throughout that journey, we are never beyond the reach of God's mercy.</w:t>
+      </w:r>
+    </w:p>
+    <w:p>
+      <w:pPr>
+        <w:pStyle w:val="SPBodyText"/>
+      </w:pPr>
+      <w:r>
+        <w:t>The prayer begins with the words of Scripture and ends with our humble request for intercession. Between the two stands the mystery of Christ: God who comes among us, takes flesh, and enters into our human story</w:t>
       </w:r>
       <w:r>
         <w:t>.</w:t>
@@ -7316,45 +7188,6 @@
         <w:pStyle w:val="SPBodyText"/>
       </w:pPr>
       <w:r>
-        <w:t xml:space="preserve">We will need grace </w:t>
-      </w:r>
-      <w:r>
-        <w:rPr>
-          <w:b/>
-          <w:bCs/>
-        </w:rPr>
-        <w:t>at the end</w:t>
-      </w:r>
-      <w:r>
-        <w:t>.</w:t>
-      </w:r>
-    </w:p>
-    <w:p>
-      <w:pPr>
-        <w:pStyle w:val="SPBodyText"/>
-      </w:pPr>
-      <w:r>
-        <w:t>And throughout that journey, we are never beyond the reach of God's mercy.</w:t>
-      </w:r>
-    </w:p>
-    <w:p>
-      <w:pPr>
-        <w:pStyle w:val="SPBodyText"/>
-      </w:pPr>
-      <w:r>
-        <w:t>The prayer begins with the words of Scripture and ends with our humble request for intercession. Between the two stands the mystery of Christ: God who comes among us, takes flesh, and enters into our human story.</w:t>
-      </w:r>
-    </w:p>
-    <w:p>
-      <w:pPr>
-        <w:pStyle w:val="SPBodyText"/>
-      </w:pPr>
-    </w:p>
-    <w:p>
-      <w:pPr>
-        <w:pStyle w:val="SPBodyText"/>
-      </w:pPr>
-      <w:r>
         <w:t>So,</w:t>
       </w:r>
       <w:r>
@@ -7397,35 +7230,41 @@
       <w:pPr>
         <w:pStyle w:val="SPBodyText"/>
       </w:pPr>
-    </w:p>
-    <w:p>
-      <w:pPr>
-        <w:pStyle w:val="SPBodyText"/>
-      </w:pPr>
       <w:r>
         <w:t>Your joys.</w:t>
       </w:r>
-      <w:r>
-        <w:br/>
+    </w:p>
+    <w:p>
+      <w:pPr>
+        <w:pStyle w:val="SPBodyText"/>
+      </w:pPr>
+      <w:r>
         <w:t>Your failures.</w:t>
       </w:r>
-      <w:r>
-        <w:br/>
+    </w:p>
+    <w:p>
+      <w:pPr>
+        <w:pStyle w:val="SPBodyText"/>
+      </w:pPr>
+      <w:r>
         <w:t>Your loved ones.</w:t>
       </w:r>
-      <w:r>
-        <w:br/>
+    </w:p>
+    <w:p>
+      <w:pPr>
+        <w:pStyle w:val="SPBodyText"/>
+      </w:pPr>
+      <w:r>
         <w:t>Those who need your prayers.</w:t>
       </w:r>
-      <w:r>
-        <w:br/>
+    </w:p>
+    <w:p>
+      <w:pPr>
+        <w:pStyle w:val="SPBodyText"/>
+      </w:pPr>
+      <w:r>
         <w:t>And yourself.</w:t>
       </w:r>
-    </w:p>
-    <w:p>
-      <w:pPr>
-        <w:pStyle w:val="SPBodyText"/>
-      </w:pPr>
     </w:p>
     <w:p>
       <w:pPr>
@@ -7455,7 +7294,7 @@
     </w:p>
     <w:p>
       <w:pPr>
-        <w:pStyle w:val="SPBodyText"/>
+        <w:jc w:val="center"/>
       </w:pPr>
       <w:r>
         <w:rPr>
@@ -7474,7 +7313,7 @@
       <w:pPr>
         <w:pStyle w:val="SPPrayerTitle"/>
       </w:pPr>
-      <w:bookmarkStart w:id="14" w:name="_Toc238808941"/>
+      <w:bookmarkStart w:id="14" w:name="_Toc240260244"/>
       <w:r>
         <w:t>The Glory Be</w:t>
       </w:r>
@@ -7511,7 +7350,7 @@
     </w:p>
     <w:p>
       <w:pPr>
-        <w:pStyle w:val="SPPrayerEnglish"/>
+        <w:pStyle w:val="SPBodyText"/>
         <w:sectPr>
           <w:type w:val="oddPage"/>
           <w:pgSz w:w="7920" w:h="12240" w:code="6"/>
@@ -7827,79 +7666,86 @@
     </w:p>
     <w:p>
       <w:pPr>
-        <w:pStyle w:val="SPBodyText"/>
-      </w:pPr>
-      <w:r>
-        <w:t xml:space="preserve">  </w:t>
-      </w:r>
-      <w:r>
-        <w:t>The Glory We Give</w:t>
-      </w:r>
-    </w:p>
-    <w:p>
-      <w:pPr>
-        <w:pStyle w:val="SPBodyText"/>
-      </w:pPr>
-      <w:r>
-        <w:t>The Glory Be is a short prayer, but it carries within it the heart of our faith.</w:t>
-      </w:r>
-    </w:p>
-    <w:p>
-      <w:pPr>
-        <w:pStyle w:val="SPBodyText"/>
-      </w:pPr>
-      <w:r>
-        <w:t>We begin with the Father, and then we name the Son and the Holy Spirit. We are not speaking of three gods, but of the one God who has revealed Himself to us as Father, Son, and Holy Spirit.</w:t>
-      </w:r>
-    </w:p>
-    <w:p>
-      <w:pPr>
-        <w:pStyle w:val="SPBodyText"/>
-      </w:pPr>
-      <w:r>
-        <w:t xml:space="preserve">When we say </w:t>
-      </w:r>
-      <w:r>
         <w:rPr>
           <w:b/>
           <w:bCs/>
         </w:rPr>
-        <w:t>Glory be to the Father</w:t>
-      </w:r>
-      <w:r>
-        <w:t>, we turn our hearts towards the One from whom all things come.</w:t>
-      </w:r>
-    </w:p>
-    <w:p>
-      <w:pPr>
-        <w:pStyle w:val="SPBodyText"/>
-      </w:pPr>
-      <w:r>
-        <w:t xml:space="preserve">When we say </w:t>
+      </w:pPr>
+      <w:r>
+        <w:t xml:space="preserve">  </w:t>
       </w:r>
       <w:r>
         <w:rPr>
           <w:b/>
           <w:bCs/>
         </w:rPr>
-        <w:t>and to the Son</w:t>
-      </w:r>
-      <w:r>
-        <w:t>, we remember Jesus Christ, through whom God has come among us and through whom we have been brought into the life of God.</w:t>
-      </w:r>
-    </w:p>
-    <w:p>
-      <w:pPr>
-        <w:pStyle w:val="SPBodyText"/>
-      </w:pPr>
-      <w:r>
-        <w:t xml:space="preserve">And when we say </w:t>
+        <w:t>The Glory We Give</w:t>
+      </w:r>
+    </w:p>
+    <w:p>
+      <w:pPr>
+        <w:pStyle w:val="SPBodyText"/>
+      </w:pPr>
+      <w:r>
+        <w:t>The Glory Be is a short prayer, but it carries within it the heart of our faith.</w:t>
+      </w:r>
+    </w:p>
+    <w:p>
+      <w:pPr>
+        <w:pStyle w:val="SPBodyText"/>
+      </w:pPr>
+      <w:r>
+        <w:t>We begin with the Father, and then we name the Son and the Holy Spirit. We are not speaking of three gods, but of the one God who has revealed Himself to us as Father, Son, and Holy Spirit.</w:t>
+      </w:r>
+    </w:p>
+    <w:p>
+      <w:pPr>
+        <w:pStyle w:val="SPBodyText"/>
+      </w:pPr>
+      <w:r>
+        <w:t xml:space="preserve">When we say </w:t>
       </w:r>
       <w:r>
         <w:rPr>
           <w:b/>
           <w:bCs/>
         </w:rPr>
+        <w:t>Glory be to the Father</w:t>
+      </w:r>
+      <w:r>
+        <w:t>, we turn our hearts towards the One from whom all things come.</w:t>
+      </w:r>
+    </w:p>
+    <w:p>
+      <w:pPr>
+        <w:pStyle w:val="SPBodyText"/>
+      </w:pPr>
+      <w:r>
+        <w:t xml:space="preserve">When we say </w:t>
+      </w:r>
+      <w:r>
+        <w:rPr>
+          <w:b/>
+          <w:bCs/>
+        </w:rPr>
+        <w:t>and to the Son</w:t>
+      </w:r>
+      <w:r>
+        <w:t>, we remember Jesus Christ, through whom God has come among us and through whom we have been brought into the life of God.</w:t>
+      </w:r>
+    </w:p>
+    <w:p>
+      <w:pPr>
+        <w:pStyle w:val="SPBodyText"/>
+      </w:pPr>
+      <w:r>
+        <w:t xml:space="preserve">And when we say </w:t>
+      </w:r>
+      <w:r>
+        <w:rPr>
+          <w:b/>
+          <w:bCs/>
+        </w:rPr>
         <w:t>and to the Holy Spirit</w:t>
       </w:r>
       <w:r>
@@ -7916,15 +7762,31 @@
     </w:p>
     <w:p>
       <w:pPr>
-        <w:pStyle w:val="SPBodyText"/>
-      </w:pPr>
-      <w:r>
-        <w:t>As it was in the beginning,</w:t>
-      </w:r>
-      <w:r>
-        <w:br/>
-        <w:t>is now, and ever shall be.</w:t>
-      </w:r>
+        <w:rPr>
+          <w:i/>
+          <w:iCs/>
+        </w:rPr>
+      </w:pPr>
+    </w:p>
+    <w:p>
+      <w:pPr>
+        <w:rPr>
+          <w:i/>
+          <w:iCs/>
+        </w:rPr>
+      </w:pPr>
+      <w:r>
+        <w:rPr>
+          <w:i/>
+          <w:iCs/>
+        </w:rPr>
+        <w:t>As it was in the beginning, is now, and ever shall be.</w:t>
+      </w:r>
+    </w:p>
+    <w:p>
+      <w:pPr>
+        <w:pStyle w:val="SPBodyText"/>
+      </w:pPr>
     </w:p>
     <w:p>
       <w:pPr>
@@ -7947,6 +7809,7 @@
         <w:pStyle w:val="SPBodyText"/>
       </w:pPr>
       <w:r>
+        <w:lastRenderedPageBreak/>
         <w:t>Glory Is Not Ours to Keep</w:t>
       </w:r>
     </w:p>
@@ -7955,7 +7818,6 @@
         <w:pStyle w:val="SPBodyText"/>
       </w:pPr>
       <w:r>
-        <w:lastRenderedPageBreak/>
         <w:t>We live in a world that constantly asks us to seek recognition.</w:t>
       </w:r>
     </w:p>
@@ -7987,11 +7849,6 @@
       <w:pPr>
         <w:pStyle w:val="SPBodyText"/>
       </w:pPr>
-    </w:p>
-    <w:p>
-      <w:pPr>
-        <w:pStyle w:val="SPBodyText"/>
-      </w:pPr>
       <w:r>
         <w:t>Whatever good we possess is received. Whatever strength we have is given. Whatever love we are able to offer has its source in Him.</w:t>
       </w:r>
@@ -8000,11 +7857,6 @@
       <w:pPr>
         <w:pStyle w:val="SPBodyText"/>
       </w:pPr>
-    </w:p>
-    <w:p>
-      <w:pPr>
-        <w:pStyle w:val="SPBodyText"/>
-      </w:pPr>
       <w:r>
         <w:t>As Scripture reminds us:</w:t>
       </w:r>
@@ -8013,9 +7865,26 @@
       <w:pPr>
         <w:pStyle w:val="SPBodyText"/>
       </w:pPr>
-      <w:r>
+    </w:p>
+    <w:p>
+      <w:pPr>
+        <w:rPr>
+          <w:i/>
+          <w:iCs/>
+        </w:rPr>
+      </w:pPr>
+      <w:r>
+        <w:rPr>
+          <w:i/>
+          <w:iCs/>
+        </w:rPr>
         <w:t>“For from him and through him and to him are all things.”</w:t>
       </w:r>
+    </w:p>
+    <w:p>
+      <w:pPr>
+        <w:pStyle w:val="SPBodyText"/>
+      </w:pPr>
     </w:p>
     <w:p>
       <w:pPr>
@@ -8121,10 +7990,31 @@
     <w:p>
       <w:pPr>
         <w:pStyle w:val="SPBodyText"/>
-      </w:pPr>
-      <w:r>
-        <w:t>World without end. Amen.</w:t>
-      </w:r>
+        <w:rPr>
+          <w:i/>
+          <w:iCs/>
+        </w:rPr>
+      </w:pPr>
+    </w:p>
+    <w:p>
+      <w:pPr>
+        <w:pStyle w:val="SPBodyText"/>
+      </w:pPr>
+      <w:r>
+        <w:rPr>
+          <w:i/>
+          <w:iCs/>
+        </w:rPr>
+        <w:t>World without end. Amen</w:t>
+      </w:r>
+      <w:r>
+        <w:t>.</w:t>
+      </w:r>
+    </w:p>
+    <w:p>
+      <w:pPr>
+        <w:pStyle w:val="SPBodyText"/>
+      </w:pPr>
     </w:p>
     <w:p>
       <w:pPr>
@@ -8282,27 +8172,6 @@
         <w:pStyle w:val="SPBodyText"/>
       </w:pPr>
       <w:r>
-        <w:t>As it was in the beginning,</w:t>
-      </w:r>
-      <w:r>
-        <w:br/>
-        <w:t>is now, and ever shall be,</w:t>
-      </w:r>
-      <w:r>
-        <w:br/>
-        <w:t>world without end.</w:t>
-      </w:r>
-    </w:p>
-    <w:p>
-      <w:pPr>
-        <w:pStyle w:val="SPBodyText"/>
-      </w:pPr>
-    </w:p>
-    <w:p>
-      <w:pPr>
-        <w:pStyle w:val="SPBodyText"/>
-      </w:pPr>
-      <w:r>
         <w:t>And then simply say:</w:t>
       </w:r>
     </w:p>
@@ -8337,7 +8206,7 @@
     </w:p>
     <w:p>
       <w:pPr>
-        <w:pStyle w:val="SPBodyText"/>
+        <w:jc w:val="center"/>
       </w:pPr>
       <w:r>
         <w:rPr>
@@ -8356,7 +8225,7 @@
       <w:pPr>
         <w:pStyle w:val="SPPrayerTitle"/>
       </w:pPr>
-      <w:bookmarkStart w:id="15" w:name="_Toc238808942"/>
+      <w:bookmarkStart w:id="15" w:name="_Toc240260245"/>
       <w:r>
         <w:t>Act of Contrition</w:t>
       </w:r>
@@ -8444,22 +8313,6 @@
     <w:p>
       <w:pPr>
         <w:pStyle w:val="SPBodyText"/>
-      </w:pPr>
-      <w:r>
-        <w:t>A prayer of sorrow.</w:t>
-      </w:r>
-      <w:r>
-        <w:br/>
-        <w:t>A prayer of trust.</w:t>
-      </w:r>
-      <w:r>
-        <w:br/>
-        <w:t>A prayer to begin again.</w:t>
-      </w:r>
-    </w:p>
-    <w:p>
-      <w:pPr>
-        <w:pStyle w:val="SPPrayerTitle"/>
       </w:pPr>
     </w:p>
     <w:p>
@@ -8754,12 +8607,23 @@
     </w:p>
     <w:p>
       <w:pPr>
-        <w:pStyle w:val="SPBodyText"/>
-      </w:pPr>
-      <w:r>
+        <w:rPr>
+          <w:b/>
+          <w:bCs/>
+        </w:rPr>
+      </w:pPr>
+      <w:r>
+        <w:rPr>
+          <w:b/>
+          <w:bCs/>
+        </w:rPr>
         <w:t>Returning to the Mercy of God</w:t>
       </w:r>
       <w:r>
+        <w:rPr>
+          <w:b/>
+          <w:bCs/>
+        </w:rPr>
         <w:t>.</w:t>
       </w:r>
     </w:p>
@@ -8783,11 +8647,6 @@
       <w:r>
         <w:t>We come before God without excuses or disguises and acknowledge the ways in which we have fallen short. We recognise our sins, not simply because they have consequences for us, but because they have wounded our relationship with the One who loves us.</w:t>
       </w:r>
-    </w:p>
-    <w:p>
-      <w:pPr>
-        <w:pStyle w:val="SPBodyText"/>
-      </w:pPr>
     </w:p>
     <w:p>
       <w:pPr>
@@ -8811,11 +8670,6 @@
       <w:pPr>
         <w:pStyle w:val="SPBodyText"/>
       </w:pPr>
-    </w:p>
-    <w:p>
-      <w:pPr>
-        <w:pStyle w:val="SPBodyText"/>
-      </w:pPr>
       <w:r>
         <w:t>Yet Christian contrition is not despair.</w:t>
       </w:r>
@@ -8831,6 +8685,97 @@
     <w:p>
       <w:pPr>
         <w:pStyle w:val="SPBodyText"/>
+      </w:pPr>
+      <w:r>
+        <w:t>This is why the Act of Contrition contains both sorrow and resolve.</w:t>
+      </w:r>
+    </w:p>
+    <w:p>
+      <w:pPr>
+        <w:pStyle w:val="SPBodyText"/>
+      </w:pPr>
+      <w:r>
+        <w:t>We say that we are sorry, but we also ask for the grace to change. We resolve to confess our sins, to do penance, to amend our lives, and to avoid those things that lead us towards sin. Our resolution does not rest entirely upon our own strength. We pray for God's grace because we know that conversion is not something we accomplish alone.</w:t>
+      </w:r>
+    </w:p>
+    <w:p>
+      <w:pPr>
+        <w:pStyle w:val="SPBodyText"/>
+      </w:pPr>
+      <w:r>
+        <w:lastRenderedPageBreak/>
+        <w:t>There may be times when we pray this prayer and feel deeply sorry for what we have done. At other times, the words may seem difficult to feel. We may recognise our sin intellectually while our emotions remain quiet.</w:t>
+      </w:r>
+    </w:p>
+    <w:p>
+      <w:pPr>
+        <w:pStyle w:val="SPBodyText"/>
+      </w:pPr>
+      <w:r>
+        <w:t>The prayer is still worth praying.</w:t>
+      </w:r>
+    </w:p>
+    <w:p>
+      <w:pPr>
+        <w:pStyle w:val="SPBodyText"/>
+      </w:pPr>
+      <w:r>
+        <w:t>Contrition is ultimately an act of the will: a turning of the heart towards God and a desire to live differently. Even when our feelings are uncertain, we can choose to return.</w:t>
+      </w:r>
+    </w:p>
+    <w:p>
+      <w:pPr>
+        <w:pStyle w:val="SPBodyText"/>
+      </w:pPr>
+      <w:r>
+        <w:t>And so the Act of Contrition is not merely a prayer about the past.</w:t>
+      </w:r>
+    </w:p>
+    <w:p>
+      <w:pPr>
+        <w:pStyle w:val="SPBodyText"/>
+      </w:pPr>
+      <w:r>
+        <w:t>It is a prayer of beginning again.</w:t>
+      </w:r>
+    </w:p>
+    <w:p>
+      <w:pPr>
+        <w:pStyle w:val="SPBodyText"/>
+      </w:pPr>
+    </w:p>
+    <w:p>
+      <w:pPr>
+        <w:pStyle w:val="SPBodyText"/>
+      </w:pPr>
+      <w:r>
+        <w:t>Godly sorrow, as Saint Paul reminds us, leads towards repentance and salvation. The Christian who falls is not called to remain on the ground. We are called to rise, to receive God's mercy, and to continue the journey.</w:t>
+      </w:r>
+    </w:p>
+    <w:p>
+      <w:pPr>
+        <w:pStyle w:val="SPBodyText"/>
+      </w:pPr>
+      <w:r>
+        <w:t>Whenever we pray these words sincerely, we are reminded of something simple and profound:</w:t>
+      </w:r>
+    </w:p>
+    <w:p>
+      <w:pPr>
+        <w:pStyle w:val="SPBodyText"/>
+      </w:pPr>
+    </w:p>
+    <w:p>
+      <w:pPr>
+        <w:pStyle w:val="SPBodyText"/>
+      </w:pPr>
+      <w:r>
+        <w:t>We may fall, but God's mercy invites us to return.</w:t>
+      </w:r>
+    </w:p>
+    <w:p>
+      <w:pPr>
+        <w:pStyle w:val="SPPrayerTitle"/>
         <w:sectPr>
           <w:type w:val="oddPage"/>
           <w:pgSz w:w="7920" w:h="12240" w:code="6"/>
@@ -8840,103 +8785,12 @@
           <w:docGrid w:linePitch="360"/>
         </w:sectPr>
       </w:pPr>
-    </w:p>
-    <w:p>
-      <w:pPr>
-        <w:pStyle w:val="SPBodyText"/>
-      </w:pPr>
-      <w:r>
-        <w:lastRenderedPageBreak/>
-        <w:t>This is why the Act of Contrition contains both sorrow and resolve.</w:t>
-      </w:r>
-    </w:p>
-    <w:p>
-      <w:pPr>
-        <w:pStyle w:val="SPBodyText"/>
-      </w:pPr>
-      <w:r>
-        <w:t>We say that we are sorry, but we also ask for the grace to change. We resolve to confess our sins, to do penance, to amend our lives, and to avoid those things that lead us towards sin. Our resolution does not rest entirely upon our own strength. We pray for God's grace because we know that conversion is not something we accomplish alone.</w:t>
-      </w:r>
-    </w:p>
-    <w:p>
-      <w:pPr>
-        <w:pStyle w:val="SPBodyText"/>
-      </w:pPr>
-      <w:r>
-        <w:t>There may be times when we pray this prayer and feel deeply sorry for what we have done. At other times, the words may seem difficult to feel. We may recognise our sin intellectually while our emotions remain quiet.</w:t>
-      </w:r>
-    </w:p>
-    <w:p>
-      <w:pPr>
-        <w:pStyle w:val="SPBodyText"/>
-      </w:pPr>
-      <w:r>
-        <w:t>The prayer is still worth praying.</w:t>
-      </w:r>
-    </w:p>
-    <w:p>
-      <w:pPr>
-        <w:pStyle w:val="SPBodyText"/>
-      </w:pPr>
-      <w:r>
-        <w:t>Contrition is ultimately an act of the will: a turning of the heart towards God and a desire to live differently. Even when our feelings are uncertain, we can choose to return.</w:t>
-      </w:r>
-    </w:p>
-    <w:p>
-      <w:pPr>
-        <w:pStyle w:val="SPBodyText"/>
-      </w:pPr>
-      <w:r>
-        <w:t>And so the Act of Contrition is not merely a prayer about the past.</w:t>
-      </w:r>
-    </w:p>
-    <w:p>
-      <w:pPr>
-        <w:pStyle w:val="SPBodyText"/>
-      </w:pPr>
-      <w:r>
-        <w:t>It is a prayer of beginning again.</w:t>
-      </w:r>
-    </w:p>
-    <w:p>
-      <w:pPr>
-        <w:pStyle w:val="SPBodyText"/>
-      </w:pPr>
-    </w:p>
-    <w:p>
-      <w:pPr>
-        <w:pStyle w:val="SPBodyText"/>
-      </w:pPr>
-      <w:r>
-        <w:t>Godly sorrow, as Saint Paul reminds us, leads towards repentance and salvation. The Christian who falls is not called to remain on the ground. We are called to rise, to receive God's mercy, and to continue the journey.</w:t>
-      </w:r>
-    </w:p>
-    <w:p>
-      <w:pPr>
-        <w:pStyle w:val="SPBodyText"/>
-      </w:pPr>
-      <w:r>
-        <w:t>Whenever we pray these words sincerely, we are reminded of something simple and profound:</w:t>
-      </w:r>
-    </w:p>
-    <w:p>
-      <w:pPr>
-        <w:pStyle w:val="SPBodyText"/>
-      </w:pPr>
-    </w:p>
-    <w:p>
-      <w:pPr>
-        <w:pStyle w:val="SPBodyText"/>
-      </w:pPr>
-      <w:r>
-        <w:t>We may fall, but God's mercy invites us to return.</w:t>
-      </w:r>
+      <w:bookmarkStart w:id="16" w:name="_Toc240260246"/>
     </w:p>
     <w:p>
       <w:pPr>
         <w:pStyle w:val="SPPrayerTitle"/>
       </w:pPr>
-      <w:bookmarkStart w:id="16" w:name="_Toc238808943"/>
       <w:r>
         <w:lastRenderedPageBreak/>
         <w:t>Closing Thoughts</w:t>
@@ -8945,62 +8799,33 @@
     </w:p>
     <w:p>
       <w:pPr>
-        <w:pStyle w:val="SPBodyText"/>
-      </w:pPr>
-      <w:r>
-        <w:t>One Faith, Many Prayers</w:t>
-      </w:r>
-    </w:p>
-    <w:p>
-      <w:pPr>
-        <w:pStyle w:val="SPBodyText"/>
-      </w:pPr>
-      <w:r>
-        <w:t>We have prayed familiar prayers that have been spoken by Christians for generations.</w:t>
-      </w:r>
-    </w:p>
-    <w:p>
-      <w:pPr>
-        <w:pStyle w:val="SPBodyText"/>
-      </w:pPr>
-      <w:r>
-        <w:t>Each prayer gives voice to a different movement of faith.</w:t>
-      </w:r>
-    </w:p>
-    <w:p>
-      <w:pPr>
-        <w:pStyle w:val="SPBodyText"/>
-      </w:pPr>
-      <w:r>
-        <w:t xml:space="preserve">In the </w:t>
-      </w:r>
-      <w:r>
         <w:rPr>
           <w:b/>
           <w:bCs/>
         </w:rPr>
-        <w:t>Sign of the Cross</w:t>
-      </w:r>
-      <w:r>
-        <w:t>, we begin and end in the name of the Father, and of the Son, and of the Holy Spirit.</w:t>
-      </w:r>
-    </w:p>
-    <w:p>
-      <w:pPr>
-        <w:pStyle w:val="SPBodyText"/>
-      </w:pPr>
-      <w:r>
-        <w:t xml:space="preserve">In the </w:t>
-      </w:r>
+      </w:pPr>
       <w:r>
         <w:rPr>
           <w:b/>
           <w:bCs/>
         </w:rPr>
-        <w:t>Our Father</w:t>
-      </w:r>
-      <w:r>
-        <w:t>, Christ teaches us to approach God as children who belong to Him.</w:t>
+        <w:t>One Faith, Many Prayers</w:t>
+      </w:r>
+    </w:p>
+    <w:p>
+      <w:pPr>
+        <w:pStyle w:val="SPBodyText"/>
+      </w:pPr>
+      <w:r>
+        <w:t>We have prayed familiar prayers that have been spoken by Christians for generations.</w:t>
+      </w:r>
+    </w:p>
+    <w:p>
+      <w:pPr>
+        <w:pStyle w:val="SPBodyText"/>
+      </w:pPr>
+      <w:r>
+        <w:t>Each prayer gives voice to a different movement of faith.</w:t>
       </w:r>
     </w:p>
     <w:p>
@@ -9015,10 +8840,10 @@
           <w:b/>
           <w:bCs/>
         </w:rPr>
-        <w:t>Hail Mary</w:t>
-      </w:r>
-      <w:r>
-        <w:t>, we receive the words of Scripture, remember the mystery of Christ's Incarnation, and ask for the prayers of His Mother.</w:t>
+        <w:t>Sign of the Cross</w:t>
+      </w:r>
+      <w:r>
+        <w:t>, we begin and end in the name of the Father, and of the Son, and of the Holy Spirit.</w:t>
       </w:r>
     </w:p>
     <w:p>
@@ -9033,10 +8858,10 @@
           <w:b/>
           <w:bCs/>
         </w:rPr>
-        <w:t>Glory Be</w:t>
-      </w:r>
-      <w:r>
-        <w:t>, we lift our hearts beyond ourselves and give praise to the Father, the Son, and the Holy Spirit.</w:t>
+        <w:t>Our Father</w:t>
+      </w:r>
+      <w:r>
+        <w:t>, Christ teaches us to approach God as children who belong to Him.</w:t>
       </w:r>
     </w:p>
     <w:p>
@@ -9051,6 +8876,42 @@
           <w:b/>
           <w:bCs/>
         </w:rPr>
+        <w:t>Hail Mary</w:t>
+      </w:r>
+      <w:r>
+        <w:t>, we receive the words of Scripture, remember the mystery of Christ's Incarnation, and ask for the prayers of His Mother.</w:t>
+      </w:r>
+    </w:p>
+    <w:p>
+      <w:pPr>
+        <w:pStyle w:val="SPBodyText"/>
+      </w:pPr>
+      <w:r>
+        <w:t xml:space="preserve">In the </w:t>
+      </w:r>
+      <w:r>
+        <w:rPr>
+          <w:b/>
+          <w:bCs/>
+        </w:rPr>
+        <w:t>Glory Be</w:t>
+      </w:r>
+      <w:r>
+        <w:t>, we lift our hearts beyond ourselves and give praise to the Father, the Son, and the Holy Spirit.</w:t>
+      </w:r>
+    </w:p>
+    <w:p>
+      <w:pPr>
+        <w:pStyle w:val="SPBodyText"/>
+      </w:pPr>
+      <w:r>
+        <w:t xml:space="preserve">In the </w:t>
+      </w:r>
+      <w:r>
+        <w:rPr>
+          <w:b/>
+          <w:bCs/>
+        </w:rPr>
         <w:t>Act of Contrition</w:t>
       </w:r>
       <w:r>
@@ -9200,7 +9061,7 @@
     </w:p>
     <w:p>
       <w:pPr>
-        <w:pStyle w:val="SPBodyText"/>
+        <w:jc w:val="center"/>
       </w:pPr>
       <w:r>
         <w:rPr>
@@ -9226,7 +9087,7 @@
       <w:pPr>
         <w:pStyle w:val="SPSectionTitle"/>
       </w:pPr>
-      <w:bookmarkStart w:id="17" w:name="_Toc238808944"/>
+      <w:bookmarkStart w:id="17" w:name="_Toc240260247"/>
       <w:r>
         <w:lastRenderedPageBreak/>
         <w:t xml:space="preserve">Part </w:t>
@@ -9238,7 +9099,13 @@
         <w:t xml:space="preserve"> </w:t>
       </w:r>
       <w:r>
-        <w:t>- Gospel canticles</w:t>
+        <w:t xml:space="preserve">- Gospel </w:t>
+      </w:r>
+      <w:r>
+        <w:t>C</w:t>
+      </w:r>
+      <w:r>
+        <w:t>anticles</w:t>
       </w:r>
       <w:bookmarkEnd w:id="17"/>
     </w:p>
@@ -9431,7 +9298,7 @@
     </w:p>
     <w:p>
       <w:pPr>
-        <w:pStyle w:val="SPBodyText"/>
+        <w:jc w:val="center"/>
       </w:pPr>
       <w:r>
         <w:rPr>
@@ -9450,7 +9317,7 @@
       <w:pPr>
         <w:pStyle w:val="SPPrayerTitle"/>
       </w:pPr>
-      <w:bookmarkStart w:id="18" w:name="_Toc238808945"/>
+      <w:bookmarkStart w:id="18" w:name="_Toc240260248"/>
       <w:r>
         <w:t>The Benedictus</w:t>
       </w:r>
@@ -10378,6 +10245,7 @@
         <w:pStyle w:val="SPBodyText"/>
       </w:pPr>
       <w:r>
+        <w:lastRenderedPageBreak/>
         <w:t>God has carried His people before.</w:t>
       </w:r>
     </w:p>
@@ -10386,7 +10254,6 @@
         <w:pStyle w:val="SPBodyText"/>
       </w:pPr>
       <w:r>
-        <w:lastRenderedPageBreak/>
         <w:t>God has brought light into darkness before.</w:t>
       </w:r>
     </w:p>
@@ -10706,161 +10573,161 @@
         <w:pStyle w:val="SPBodyText"/>
       </w:pPr>
       <w:r>
+        <w:t>To Guide Our Feet</w:t>
+      </w:r>
+    </w:p>
+    <w:p>
+      <w:pPr>
+        <w:pStyle w:val="SPBodyText"/>
+      </w:pPr>
+      <w:r>
+        <w:t>The final words of the Benedictus are not about giving us a complete map of the future.</w:t>
+      </w:r>
+    </w:p>
+    <w:p>
+      <w:pPr>
+        <w:pStyle w:val="SPBodyText"/>
+      </w:pPr>
+      <w:r>
+        <w:t>They ask for something simpler:</w:t>
+      </w:r>
+    </w:p>
+    <w:p>
+      <w:pPr>
+        <w:pStyle w:val="SPBodyText"/>
+      </w:pPr>
+      <w:r>
+        <w:t>that God may guide our feet into the way of peace.</w:t>
+      </w:r>
+    </w:p>
+    <w:p>
+      <w:pPr>
+        <w:pStyle w:val="SPBodyText"/>
+      </w:pPr>
+      <w:r>
+        <w:t>Not necessarily the whole road.</w:t>
+      </w:r>
+    </w:p>
+    <w:p>
+      <w:pPr>
+        <w:pStyle w:val="SPBodyText"/>
+      </w:pPr>
+      <w:r>
+        <w:t>Just the next step.</w:t>
+      </w:r>
+    </w:p>
+    <w:p>
+      <w:pPr>
+        <w:pStyle w:val="SPBodyText"/>
+      </w:pPr>
+      <w:r>
+        <w:t>That may be all we need.</w:t>
+      </w:r>
+    </w:p>
+    <w:p>
+      <w:pPr>
+        <w:pStyle w:val="SPBodyText"/>
+      </w:pPr>
+      <w:r>
+        <w:t>We do not always need to know where the road will eventually lead.</w:t>
+      </w:r>
+    </w:p>
+    <w:p>
+      <w:pPr>
+        <w:pStyle w:val="SPBodyText"/>
+      </w:pPr>
+      <w:r>
+        <w:t>We need only enough light to take the next faithful step.</w:t>
+      </w:r>
+    </w:p>
+    <w:p>
+      <w:pPr>
+        <w:pStyle w:val="SPBodyText"/>
+      </w:pPr>
+      <w:r>
+        <w:t>The Benedictus therefore becomes a prayer for our own lives.</w:t>
+      </w:r>
+    </w:p>
+    <w:p>
+      <w:pPr>
+        <w:pStyle w:val="SPBodyText"/>
+      </w:pPr>
+    </w:p>
+    <w:p>
+      <w:pPr>
+        <w:pStyle w:val="SPBodyText"/>
+      </w:pPr>
+      <w:r>
+        <w:t>When we are uncertain:</w:t>
+      </w:r>
+    </w:p>
+    <w:p>
+      <w:pPr>
+        <w:pStyle w:val="SPBodyText"/>
+      </w:pPr>
+      <w:r>
+        <w:t>Guide our feet.</w:t>
+      </w:r>
+    </w:p>
+    <w:p>
+      <w:pPr>
+        <w:pStyle w:val="SPBodyText"/>
+      </w:pPr>
+      <w:r>
+        <w:t>When we are afraid:</w:t>
+      </w:r>
+    </w:p>
+    <w:p>
+      <w:pPr>
+        <w:pStyle w:val="SPBodyText"/>
+      </w:pPr>
+      <w:r>
+        <w:t>Guide our feet.</w:t>
+      </w:r>
+    </w:p>
+    <w:p>
+      <w:pPr>
+        <w:pStyle w:val="SPBodyText"/>
+      </w:pPr>
+      <w:r>
+        <w:t>When we have wandered:</w:t>
+      </w:r>
+    </w:p>
+    <w:p>
+      <w:pPr>
+        <w:pStyle w:val="SPBodyText"/>
+      </w:pPr>
+      <w:r>
+        <w:t>Guide our feet.</w:t>
+      </w:r>
+    </w:p>
+    <w:p>
+      <w:pPr>
+        <w:pStyle w:val="SPBodyText"/>
+      </w:pPr>
+      <w:r>
+        <w:t>When we cannot see beyond the darkness:</w:t>
+      </w:r>
+    </w:p>
+    <w:p>
+      <w:pPr>
+        <w:pStyle w:val="SPBodyText"/>
+      </w:pPr>
+      <w:r>
+        <w:t>Guide our feet into the way of peace.</w:t>
+      </w:r>
+    </w:p>
+    <w:p>
+      <w:pPr>
+        <w:pStyle w:val="SPBodyText"/>
+      </w:pPr>
+    </w:p>
+    <w:p>
+      <w:pPr>
+        <w:pStyle w:val="SPBodyText"/>
+      </w:pPr>
+      <w:r>
         <w:lastRenderedPageBreak/>
-        <w:t>To Guide Our Feet</w:t>
-      </w:r>
-    </w:p>
-    <w:p>
-      <w:pPr>
-        <w:pStyle w:val="SPBodyText"/>
-      </w:pPr>
-      <w:r>
-        <w:t>The final words of the Benedictus are not about giving us a complete map of the future.</w:t>
-      </w:r>
-    </w:p>
-    <w:p>
-      <w:pPr>
-        <w:pStyle w:val="SPBodyText"/>
-      </w:pPr>
-      <w:r>
-        <w:t>They ask for something simpler:</w:t>
-      </w:r>
-    </w:p>
-    <w:p>
-      <w:pPr>
-        <w:pStyle w:val="SPBodyText"/>
-      </w:pPr>
-      <w:r>
-        <w:t>that God may guide our feet into the way of peace.</w:t>
-      </w:r>
-    </w:p>
-    <w:p>
-      <w:pPr>
-        <w:pStyle w:val="SPBodyText"/>
-      </w:pPr>
-      <w:r>
-        <w:t>Not necessarily the whole road.</w:t>
-      </w:r>
-    </w:p>
-    <w:p>
-      <w:pPr>
-        <w:pStyle w:val="SPBodyText"/>
-      </w:pPr>
-      <w:r>
-        <w:t>Just the next step.</w:t>
-      </w:r>
-    </w:p>
-    <w:p>
-      <w:pPr>
-        <w:pStyle w:val="SPBodyText"/>
-      </w:pPr>
-      <w:r>
-        <w:t>That may be all we need.</w:t>
-      </w:r>
-    </w:p>
-    <w:p>
-      <w:pPr>
-        <w:pStyle w:val="SPBodyText"/>
-      </w:pPr>
-      <w:r>
-        <w:t>We do not always need to know where the road will eventually lead.</w:t>
-      </w:r>
-    </w:p>
-    <w:p>
-      <w:pPr>
-        <w:pStyle w:val="SPBodyText"/>
-      </w:pPr>
-      <w:r>
-        <w:t>We need only enough light to take the next faithful step.</w:t>
-      </w:r>
-    </w:p>
-    <w:p>
-      <w:pPr>
-        <w:pStyle w:val="SPBodyText"/>
-      </w:pPr>
-      <w:r>
-        <w:t>The Benedictus therefore becomes a prayer for our own lives.</w:t>
-      </w:r>
-    </w:p>
-    <w:p>
-      <w:pPr>
-        <w:pStyle w:val="SPBodyText"/>
-      </w:pPr>
-    </w:p>
-    <w:p>
-      <w:pPr>
-        <w:pStyle w:val="SPBodyText"/>
-      </w:pPr>
-      <w:r>
-        <w:t>When we are uncertain:</w:t>
-      </w:r>
-    </w:p>
-    <w:p>
-      <w:pPr>
-        <w:pStyle w:val="SPBodyText"/>
-      </w:pPr>
-      <w:r>
-        <w:t>Guide our feet.</w:t>
-      </w:r>
-    </w:p>
-    <w:p>
-      <w:pPr>
-        <w:pStyle w:val="SPBodyText"/>
-      </w:pPr>
-      <w:r>
-        <w:t>When we are afraid:</w:t>
-      </w:r>
-    </w:p>
-    <w:p>
-      <w:pPr>
-        <w:pStyle w:val="SPBodyText"/>
-      </w:pPr>
-      <w:r>
-        <w:t>Guide our feet.</w:t>
-      </w:r>
-    </w:p>
-    <w:p>
-      <w:pPr>
-        <w:pStyle w:val="SPBodyText"/>
-      </w:pPr>
-      <w:r>
-        <w:t>When we have wandered:</w:t>
-      </w:r>
-    </w:p>
-    <w:p>
-      <w:pPr>
-        <w:pStyle w:val="SPBodyText"/>
-      </w:pPr>
-      <w:r>
-        <w:t>Guide our feet.</w:t>
-      </w:r>
-    </w:p>
-    <w:p>
-      <w:pPr>
-        <w:pStyle w:val="SPBodyText"/>
-      </w:pPr>
-      <w:r>
-        <w:t>When we cannot see beyond the darkness:</w:t>
-      </w:r>
-    </w:p>
-    <w:p>
-      <w:pPr>
-        <w:pStyle w:val="SPBodyText"/>
-      </w:pPr>
-      <w:r>
-        <w:t>Guide our feet into the way of peace.</w:t>
-      </w:r>
-    </w:p>
-    <w:p>
-      <w:pPr>
-        <w:pStyle w:val="SPBodyText"/>
-      </w:pPr>
-    </w:p>
-    <w:p>
-      <w:pPr>
-        <w:pStyle w:val="SPBodyText"/>
-      </w:pPr>
-      <w:r>
         <w:t>And perhaps this is why the Church gives this canticle to the morning.</w:t>
       </w:r>
     </w:p>
@@ -10869,166 +10736,166 @@
         <w:pStyle w:val="SPBodyText"/>
       </w:pPr>
       <w:r>
+        <w:t>The day is beginning.</w:t>
+      </w:r>
+    </w:p>
+    <w:p>
+      <w:pPr>
+        <w:pStyle w:val="SPBodyText"/>
+      </w:pPr>
+      <w:r>
+        <w:t>We do not know what it will bring.</w:t>
+      </w:r>
+    </w:p>
+    <w:p>
+      <w:pPr>
+        <w:pStyle w:val="SPBodyText"/>
+      </w:pPr>
+    </w:p>
+    <w:p>
+      <w:pPr>
+        <w:pStyle w:val="SPBodyText"/>
+      </w:pPr>
+      <w:r>
+        <w:t>But the dawn has come.</w:t>
+      </w:r>
+    </w:p>
+    <w:p>
+      <w:pPr>
+        <w:pStyle w:val="SPBodyText"/>
+      </w:pPr>
+      <w:r>
+        <w:t>Christ is our light.</w:t>
+      </w:r>
+    </w:p>
+    <w:p>
+      <w:pPr>
+        <w:pStyle w:val="SPBodyText"/>
+      </w:pPr>
+      <w:r>
+        <w:t>And we place our feet upon the road.</w:t>
+      </w:r>
+    </w:p>
+    <w:p>
+      <w:pPr>
+        <w:pStyle w:val="SPBodyText"/>
+      </w:pPr>
+    </w:p>
+    <w:p>
+      <w:pPr>
+        <w:pStyle w:val="SPBodyText"/>
+      </w:pPr>
+      <w:r>
+        <w:t>A Prayer for the Morning</w:t>
+      </w:r>
+    </w:p>
+    <w:p>
+      <w:pPr>
+        <w:pStyle w:val="SPBodyText"/>
+      </w:pPr>
+    </w:p>
+    <w:p>
+      <w:pPr>
+        <w:pStyle w:val="SPBodyText"/>
+      </w:pPr>
+      <w:r>
+        <w:t>When you pray the Benedictus, do not rush through it.</w:t>
+      </w:r>
+    </w:p>
+    <w:p>
+      <w:pPr>
+        <w:pStyle w:val="SPBodyText"/>
+      </w:pPr>
+      <w:r>
+        <w:t>Remember what God has done.</w:t>
+      </w:r>
+    </w:p>
+    <w:p>
+      <w:pPr>
+        <w:pStyle w:val="SPBodyText"/>
+      </w:pPr>
+      <w:r>
+        <w:t>Remember His promises.</w:t>
+      </w:r>
+    </w:p>
+    <w:p>
+      <w:pPr>
+        <w:pStyle w:val="SPBodyText"/>
+      </w:pPr>
+      <w:r>
+        <w:t>Remember that His mercy is still reaching toward you.</w:t>
+      </w:r>
+    </w:p>
+    <w:p>
+      <w:pPr>
+        <w:pStyle w:val="SPBodyText"/>
+      </w:pPr>
+      <w:r>
+        <w:t>Bring before Him the darkness you carry.</w:t>
+      </w:r>
+    </w:p>
+    <w:p>
+      <w:pPr>
+        <w:pStyle w:val="SPBodyText"/>
+      </w:pPr>
+      <w:r>
+        <w:t>Bring Him the people you love.</w:t>
+      </w:r>
+    </w:p>
+    <w:p>
+      <w:pPr>
+        <w:pStyle w:val="SPBodyText"/>
+      </w:pPr>
+      <w:r>
+        <w:t>Bring Him the things you cannot control.</w:t>
+      </w:r>
+    </w:p>
+    <w:p>
+      <w:pPr>
+        <w:pStyle w:val="SPBodyText"/>
+      </w:pPr>
+      <w:r>
+        <w:t>And then ask simply:</w:t>
+      </w:r>
+    </w:p>
+    <w:p>
+      <w:pPr>
+        <w:pStyle w:val="SPBodyText"/>
+      </w:pPr>
+      <w:r>
+        <w:t>Lord, guide my feet today.</w:t>
+      </w:r>
+    </w:p>
+    <w:p>
+      <w:pPr>
+        <w:pStyle w:val="SPBodyText"/>
+      </w:pPr>
+      <w:r>
+        <w:t>Not tomorrow.</w:t>
+      </w:r>
+    </w:p>
+    <w:p>
+      <w:pPr>
+        <w:pStyle w:val="SPBodyText"/>
+      </w:pPr>
+      <w:r>
+        <w:t>Not through the whole of my life.</w:t>
+      </w:r>
+    </w:p>
+    <w:p>
+      <w:pPr>
+        <w:pStyle w:val="SPBodyText"/>
+      </w:pPr>
+      <w:r>
+        <w:t>Today.</w:t>
+      </w:r>
+    </w:p>
+    <w:p>
+      <w:pPr>
+        <w:pStyle w:val="SPBodyText"/>
+      </w:pPr>
+      <w:r>
         <w:lastRenderedPageBreak/>
-        <w:t>The day is beginning.</w:t>
-      </w:r>
-    </w:p>
-    <w:p>
-      <w:pPr>
-        <w:pStyle w:val="SPBodyText"/>
-      </w:pPr>
-      <w:r>
-        <w:t>We do not know what it will bring.</w:t>
-      </w:r>
-    </w:p>
-    <w:p>
-      <w:pPr>
-        <w:pStyle w:val="SPBodyText"/>
-      </w:pPr>
-    </w:p>
-    <w:p>
-      <w:pPr>
-        <w:pStyle w:val="SPBodyText"/>
-      </w:pPr>
-      <w:r>
-        <w:t>But the dawn has come.</w:t>
-      </w:r>
-    </w:p>
-    <w:p>
-      <w:pPr>
-        <w:pStyle w:val="SPBodyText"/>
-      </w:pPr>
-      <w:r>
-        <w:t>Christ is our light.</w:t>
-      </w:r>
-    </w:p>
-    <w:p>
-      <w:pPr>
-        <w:pStyle w:val="SPBodyText"/>
-      </w:pPr>
-      <w:r>
-        <w:t>And we place our feet upon the road.</w:t>
-      </w:r>
-    </w:p>
-    <w:p>
-      <w:pPr>
-        <w:pStyle w:val="SPBodyText"/>
-      </w:pPr>
-    </w:p>
-    <w:p>
-      <w:pPr>
-        <w:pStyle w:val="SPBodyText"/>
-      </w:pPr>
-      <w:r>
-        <w:t>A Prayer for the Morning</w:t>
-      </w:r>
-    </w:p>
-    <w:p>
-      <w:pPr>
-        <w:pStyle w:val="SPBodyText"/>
-      </w:pPr>
-    </w:p>
-    <w:p>
-      <w:pPr>
-        <w:pStyle w:val="SPBodyText"/>
-      </w:pPr>
-      <w:r>
-        <w:t>When you pray the Benedictus, do not rush through it.</w:t>
-      </w:r>
-    </w:p>
-    <w:p>
-      <w:pPr>
-        <w:pStyle w:val="SPBodyText"/>
-      </w:pPr>
-      <w:r>
-        <w:t>Remember what God has done.</w:t>
-      </w:r>
-    </w:p>
-    <w:p>
-      <w:pPr>
-        <w:pStyle w:val="SPBodyText"/>
-      </w:pPr>
-      <w:r>
-        <w:t>Remember His promises.</w:t>
-      </w:r>
-    </w:p>
-    <w:p>
-      <w:pPr>
-        <w:pStyle w:val="SPBodyText"/>
-      </w:pPr>
-      <w:r>
-        <w:t>Remember that His mercy is still reaching toward you.</w:t>
-      </w:r>
-    </w:p>
-    <w:p>
-      <w:pPr>
-        <w:pStyle w:val="SPBodyText"/>
-      </w:pPr>
-      <w:r>
-        <w:t>Bring before Him the darkness you carry.</w:t>
-      </w:r>
-    </w:p>
-    <w:p>
-      <w:pPr>
-        <w:pStyle w:val="SPBodyText"/>
-      </w:pPr>
-      <w:r>
-        <w:t>Bring Him the people you love.</w:t>
-      </w:r>
-    </w:p>
-    <w:p>
-      <w:pPr>
-        <w:pStyle w:val="SPBodyText"/>
-      </w:pPr>
-      <w:r>
-        <w:t>Bring Him the things you cannot control.</w:t>
-      </w:r>
-    </w:p>
-    <w:p>
-      <w:pPr>
-        <w:pStyle w:val="SPBodyText"/>
-      </w:pPr>
-      <w:r>
-        <w:t>And then ask simply:</w:t>
-      </w:r>
-    </w:p>
-    <w:p>
-      <w:pPr>
-        <w:pStyle w:val="SPBodyText"/>
-      </w:pPr>
-      <w:r>
-        <w:t>Lord, guide my feet today.</w:t>
-      </w:r>
-    </w:p>
-    <w:p>
-      <w:pPr>
-        <w:pStyle w:val="SPBodyText"/>
-      </w:pPr>
-      <w:r>
-        <w:t>Not tomorrow.</w:t>
-      </w:r>
-    </w:p>
-    <w:p>
-      <w:pPr>
-        <w:pStyle w:val="SPBodyText"/>
-      </w:pPr>
-      <w:r>
-        <w:t>Not through the whole of my life.</w:t>
-      </w:r>
-    </w:p>
-    <w:p>
-      <w:pPr>
-        <w:pStyle w:val="SPBodyText"/>
-      </w:pPr>
-      <w:r>
-        <w:t>Today.</w:t>
-      </w:r>
-    </w:p>
-    <w:p>
-      <w:pPr>
-        <w:pStyle w:val="SPBodyText"/>
-      </w:pPr>
-      <w:r>
         <w:t>Guide my feet into the way of peace.</w:t>
       </w:r>
     </w:p>
@@ -11077,7 +10944,7 @@
       <w:pPr>
         <w:pStyle w:val="SPPrayerTitle"/>
       </w:pPr>
-      <w:bookmarkStart w:id="19" w:name="_Toc238808946"/>
+      <w:bookmarkStart w:id="19" w:name="_Toc240260249"/>
       <w:r>
         <w:t>The Magnificat</w:t>
       </w:r>
@@ -11755,7 +11622,6 @@
         <w:pStyle w:val="SPBodyText"/>
       </w:pPr>
       <w:r>
-        <w:lastRenderedPageBreak/>
         <w:t xml:space="preserve">To give thanks is not merely to say that we have received something good. It is to recognise </w:t>
       </w:r>
       <w:r>
@@ -11774,6 +11640,7 @@
         <w:pStyle w:val="SPBodyText"/>
       </w:pPr>
       <w:r>
+        <w:lastRenderedPageBreak/>
         <w:t>Mary sees God's hand in her life.</w:t>
       </w:r>
     </w:p>
@@ -11911,15 +11778,15 @@
         <w:pStyle w:val="SPBodyText"/>
       </w:pPr>
       <w:r>
+        <w:t>Her own life is not separate from God's work in history. The promise made to Abraham is now being fulfilled before her eyes.</w:t>
+      </w:r>
+    </w:p>
+    <w:p>
+      <w:pPr>
+        <w:pStyle w:val="SPBodyText"/>
+      </w:pPr>
+      <w:r>
         <w:lastRenderedPageBreak/>
-        <w:t>Her own life is not separate from God's work in history. The promise made to Abraham is now being fulfilled before her eyes.</w:t>
-      </w:r>
-    </w:p>
-    <w:p>
-      <w:pPr>
-        <w:pStyle w:val="SPBodyText"/>
-      </w:pPr>
-      <w:r>
         <w:t>The humble servant from Nazareth has become the mother of the promised Messiah.</w:t>
       </w:r>
     </w:p>
@@ -12065,23 +11932,23 @@
         <w:pStyle w:val="SPBodyText"/>
       </w:pPr>
       <w:r>
+        <w:t>That means the Magnificat is not only Mary's song.</w:t>
+      </w:r>
+    </w:p>
+    <w:p>
+      <w:pPr>
+        <w:pStyle w:val="SPBodyText"/>
+      </w:pPr>
+      <w:r>
+        <w:t>It can become ours.</w:t>
+      </w:r>
+    </w:p>
+    <w:p>
+      <w:pPr>
+        <w:pStyle w:val="SPBodyText"/>
+      </w:pPr>
+      <w:r>
         <w:lastRenderedPageBreak/>
-        <w:t>That means the Magnificat is not only Mary's song.</w:t>
-      </w:r>
-    </w:p>
-    <w:p>
-      <w:pPr>
-        <w:pStyle w:val="SPBodyText"/>
-      </w:pPr>
-      <w:r>
-        <w:t>It can become ours.</w:t>
-      </w:r>
-    </w:p>
-    <w:p>
-      <w:pPr>
-        <w:pStyle w:val="SPBodyText"/>
-      </w:pPr>
-      <w:r>
         <w:t>When we pray these words, we join our voices to hers.</w:t>
       </w:r>
     </w:p>
@@ -12227,15 +12094,15 @@
         <w:pStyle w:val="SPBodyText"/>
       </w:pPr>
       <w:r>
+        <w:t>And that is sometimes enough for us too.</w:t>
+      </w:r>
+    </w:p>
+    <w:p>
+      <w:pPr>
+        <w:pStyle w:val="SPBodyText"/>
+      </w:pPr>
+      <w:r>
         <w:lastRenderedPageBreak/>
-        <w:t>And that is sometimes enough for us too.</w:t>
-      </w:r>
-    </w:p>
-    <w:p>
-      <w:pPr>
-        <w:pStyle w:val="SPBodyText"/>
-      </w:pPr>
-      <w:r>
         <w:t>There will be moments when we cannot see what God is doing.</w:t>
       </w:r>
     </w:p>
@@ -12375,7 +12242,7 @@
       <w:pPr>
         <w:pStyle w:val="SPPrayerTitle"/>
       </w:pPr>
-      <w:bookmarkStart w:id="20" w:name="_Toc238808947"/>
+      <w:bookmarkStart w:id="20" w:name="_Toc240260250"/>
       <w:r>
         <w:t>Nunc Dimit</w:t>
       </w:r>
@@ -13057,7 +12924,7 @@
       <w:pPr>
         <w:pStyle w:val="SPPrayerTitle"/>
       </w:pPr>
-      <w:bookmarkStart w:id="21" w:name="_Toc238808948"/>
+      <w:bookmarkStart w:id="21" w:name="_Toc240260251"/>
       <w:r>
         <w:lastRenderedPageBreak/>
         <w:t>Closing Thoughts</w:t>
@@ -13247,7 +13114,7 @@
       <w:pPr>
         <w:pStyle w:val="SPSectionTitle"/>
       </w:pPr>
-      <w:bookmarkStart w:id="22" w:name="_Toc238808949"/>
+      <w:bookmarkStart w:id="22" w:name="_Toc240260252"/>
       <w:r>
         <w:lastRenderedPageBreak/>
         <w:t xml:space="preserve">Part </w:t>
@@ -13455,7 +13322,7 @@
       <w:pPr>
         <w:pStyle w:val="SPPrayerTitle"/>
       </w:pPr>
-      <w:bookmarkStart w:id="23" w:name="_Toc238808950"/>
+      <w:bookmarkStart w:id="23" w:name="_Toc240260253"/>
       <w:r>
         <w:t xml:space="preserve">Morning </w:t>
       </w:r>
@@ -14250,6 +14117,7 @@
         <w:pStyle w:val="SPBodyText"/>
       </w:pPr>
       <w:r>
+        <w:lastRenderedPageBreak/>
         <w:t>Even our suffering can become an offering when it is united with Christ and entrusted to God.</w:t>
       </w:r>
     </w:p>
@@ -14258,7 +14126,6 @@
         <w:pStyle w:val="SPBodyText"/>
       </w:pPr>
       <w:r>
-        <w:lastRenderedPageBreak/>
         <w:t>This does not mean that every moment will feel holy. There will be distractions, frustrations, mistakes and moments when we forget the prayer we made that morning.</w:t>
       </w:r>
     </w:p>
@@ -14504,7 +14371,7 @@
       <w:pPr>
         <w:pStyle w:val="SPPrayerTitle"/>
       </w:pPr>
-      <w:bookmarkStart w:id="24" w:name="_Toc238808951"/>
+      <w:bookmarkStart w:id="24" w:name="_Toc240260254"/>
       <w:r>
         <w:t>The Angelus</w:t>
       </w:r>
@@ -15345,7 +15212,6 @@
         <w:pStyle w:val="SPBodyText"/>
       </w:pPr>
       <w:r>
-        <w:lastRenderedPageBreak/>
         <w:t>The hours may change.</w:t>
       </w:r>
     </w:p>
@@ -15506,6 +15372,7 @@
         <w:pStyle w:val="SPBodyText"/>
       </w:pPr>
       <w:r>
+        <w:lastRenderedPageBreak/>
         <w:t>And the Angelus does not stop at Bethlehem.</w:t>
       </w:r>
     </w:p>
@@ -15514,7 +15381,6 @@
         <w:pStyle w:val="SPBodyText"/>
       </w:pPr>
       <w:r>
-        <w:lastRenderedPageBreak/>
         <w:t>The prayer leads us from the Incarnation toward the Cross and the Resurrection.</w:t>
       </w:r>
     </w:p>
@@ -15852,7 +15718,7 @@
       <w:pPr>
         <w:pStyle w:val="SPPrayerTitle"/>
       </w:pPr>
-      <w:bookmarkStart w:id="25" w:name="_Toc238808952"/>
+      <w:bookmarkStart w:id="25" w:name="_Toc240260255"/>
       <w:r>
         <w:t>Anima Christi</w:t>
       </w:r>
@@ -16620,7 +16486,7 @@
       <w:pPr>
         <w:pStyle w:val="SPPrayerTitle"/>
       </w:pPr>
-      <w:bookmarkStart w:id="26" w:name="_Toc238808953"/>
+      <w:bookmarkStart w:id="26" w:name="_Toc240260256"/>
       <w:r>
         <w:t>Guardian Angel Prayer</w:t>
       </w:r>
@@ -17062,7 +16928,6 @@
         <w:pStyle w:val="SPBodyText"/>
       </w:pPr>
       <w:r>
-        <w:lastRenderedPageBreak/>
         <w:t>These four words describe a beautiful prayer for the journey of life.</w:t>
       </w:r>
       <w:r>
@@ -17129,6 +16994,7 @@
         <w:pStyle w:val="SPBodyText"/>
       </w:pPr>
       <w:r>
+        <w:lastRenderedPageBreak/>
         <w:t>The presence of a guardian angel does not mean that we will never suffer, make mistakes, or encounter danger. Rather, it reminds us that God's providence remains with us even in those moments. His care is often quiet. Sometimes we may recognise it only afterwards.</w:t>
       </w:r>
     </w:p>
@@ -17184,53 +17050,53 @@
         <w:pStyle w:val="SPBodyText"/>
       </w:pPr>
       <w:r>
+        <w:t>At the beginning of the day, we can entrust ourselves to God's care.</w:t>
+      </w:r>
+      <w:r>
+        <w:br/>
+      </w:r>
+    </w:p>
+    <w:p>
+      <w:pPr>
+        <w:pStyle w:val="SPBodyText"/>
+      </w:pPr>
+      <w:r>
+        <w:t>When we are uncertain, we can ask for guidance.</w:t>
+      </w:r>
+      <w:r>
+        <w:br/>
+      </w:r>
+    </w:p>
+    <w:p>
+      <w:pPr>
+        <w:pStyle w:val="SPBodyText"/>
+      </w:pPr>
+      <w:r>
+        <w:t>When we are afraid, we can remember that we are not abandoned.</w:t>
+      </w:r>
+      <w:r>
+        <w:br/>
+      </w:r>
+    </w:p>
+    <w:p>
+      <w:pPr>
+        <w:pStyle w:val="SPBodyText"/>
+      </w:pPr>
+      <w:r>
+        <w:t>And at the end of the day, we can give thanks for the protection we may never have noticed.</w:t>
+      </w:r>
+    </w:p>
+    <w:p>
+      <w:pPr>
+        <w:pStyle w:val="SPBodyText"/>
+      </w:pPr>
+    </w:p>
+    <w:p>
+      <w:pPr>
+        <w:pStyle w:val="SPBodyText"/>
+      </w:pPr>
+      <w:r>
         <w:lastRenderedPageBreak/>
-        <w:t>At the beginning of the day, we can entrust ourselves to God's care.</w:t>
-      </w:r>
-      <w:r>
-        <w:br/>
-      </w:r>
-    </w:p>
-    <w:p>
-      <w:pPr>
-        <w:pStyle w:val="SPBodyText"/>
-      </w:pPr>
-      <w:r>
-        <w:t>When we are uncertain, we can ask for guidance.</w:t>
-      </w:r>
-      <w:r>
-        <w:br/>
-      </w:r>
-    </w:p>
-    <w:p>
-      <w:pPr>
-        <w:pStyle w:val="SPBodyText"/>
-      </w:pPr>
-      <w:r>
-        <w:t>When we are afraid, we can remember that we are not abandoned.</w:t>
-      </w:r>
-      <w:r>
-        <w:br/>
-      </w:r>
-    </w:p>
-    <w:p>
-      <w:pPr>
-        <w:pStyle w:val="SPBodyText"/>
-      </w:pPr>
-      <w:r>
-        <w:t>And at the end of the day, we can give thanks for the protection we may never have noticed.</w:t>
-      </w:r>
-    </w:p>
-    <w:p>
-      <w:pPr>
-        <w:pStyle w:val="SPBodyText"/>
-      </w:pPr>
-    </w:p>
-    <w:p>
-      <w:pPr>
-        <w:pStyle w:val="SPBodyText"/>
-      </w:pPr>
-      <w:r>
         <w:t>The prayer is short enough to say in a moment.</w:t>
       </w:r>
     </w:p>
@@ -17298,7 +17164,7 @@
       <w:pPr>
         <w:pStyle w:val="SPPrayerTitle"/>
       </w:pPr>
-      <w:bookmarkStart w:id="27" w:name="_Toc238808954"/>
+      <w:bookmarkStart w:id="27" w:name="_Toc240260257"/>
       <w:r>
         <w:t xml:space="preserve">Prayer for the </w:t>
       </w:r>
@@ -17727,15 +17593,15 @@
         <w:pStyle w:val="SPBodyText"/>
       </w:pPr>
       <w:r>
+        <w:t>We ask Him to forgive, to purify, to receive, and to grant eternal rest. In this prayer, our grief becomes an offering of love.</w:t>
+      </w:r>
+    </w:p>
+    <w:p>
+      <w:pPr>
+        <w:pStyle w:val="SPBodyText"/>
+      </w:pPr>
+      <w:r>
         <w:lastRenderedPageBreak/>
-        <w:t>We ask Him to forgive, to purify, to receive, and to grant eternal rest. In this prayer, our grief becomes an offering of love.</w:t>
-      </w:r>
-    </w:p>
-    <w:p>
-      <w:pPr>
-        <w:pStyle w:val="SPBodyText"/>
-      </w:pPr>
-      <w:r>
         <w:t xml:space="preserve">The words </w:t>
       </w:r>
       <w:r>
@@ -17859,7 +17725,7 @@
       <w:pPr>
         <w:pStyle w:val="SPPrayerTitle"/>
       </w:pPr>
-      <w:bookmarkStart w:id="28" w:name="_Toc238808955"/>
+      <w:bookmarkStart w:id="28" w:name="_Toc240260258"/>
       <w:r>
         <w:t xml:space="preserve">Divine  </w:t>
       </w:r>
@@ -18489,7 +18355,7 @@
       <w:pPr>
         <w:pStyle w:val="SPPrayerTitle"/>
       </w:pPr>
-      <w:bookmarkStart w:id="29" w:name="_Toc238808956"/>
+      <w:bookmarkStart w:id="29" w:name="_Toc240260259"/>
       <w:r>
         <w:t xml:space="preserve">Night </w:t>
       </w:r>
@@ -19015,7 +18881,7 @@
         <w:pStyle w:val="SPPrayerTitle"/>
       </w:pPr>
       <w:bookmarkStart w:id="30" w:name="_Toc238726594"/>
-      <w:bookmarkStart w:id="31" w:name="_Toc238808957"/>
+      <w:bookmarkStart w:id="31" w:name="_Toc240260260"/>
       <w:r>
         <w:lastRenderedPageBreak/>
         <w:t>Closing Thoughts</w:t>
@@ -19136,7 +19002,7 @@
       <w:pPr>
         <w:pStyle w:val="SPSectionTitle"/>
       </w:pPr>
-      <w:bookmarkStart w:id="32" w:name="_Toc238808958"/>
+      <w:bookmarkStart w:id="32" w:name="_Toc240260261"/>
       <w:r>
         <w:lastRenderedPageBreak/>
         <w:t xml:space="preserve">Part </w:t>
@@ -19151,7 +19017,13 @@
         <w:t xml:space="preserve"> </w:t>
       </w:r>
       <w:r>
-        <w:t>– Prayers of Protection and intercession</w:t>
+        <w:t xml:space="preserve">– Prayers of Protection and </w:t>
+      </w:r>
+      <w:r>
+        <w:t>I</w:t>
+      </w:r>
+      <w:r>
+        <w:t>ntercession</w:t>
       </w:r>
       <w:bookmarkEnd w:id="32"/>
     </w:p>
@@ -19214,7 +19086,7 @@
       <w:pPr>
         <w:pStyle w:val="SPPrayerTitle"/>
       </w:pPr>
-      <w:bookmarkStart w:id="33" w:name="_Toc238808959"/>
+      <w:bookmarkStart w:id="33" w:name="_Toc240260262"/>
       <w:r>
         <w:t>Saint Michael the Archangel</w:t>
       </w:r>
@@ -19595,15 +19467,15 @@
         <w:pStyle w:val="SPBodyText"/>
       </w:pPr>
       <w:r>
+        <w:t>This is an important lesson for us. There are battles in life that cannot be overcome by our own strength. We encounter temptation, fear, discouragement, anger, doubt, and those things that draw our hearts away from God. Sometimes the battle is obvious; sometimes it is hidden even from us.</w:t>
+      </w:r>
+    </w:p>
+    <w:p>
+      <w:pPr>
+        <w:pStyle w:val="SPBodyText"/>
+      </w:pPr>
+      <w:r>
         <w:lastRenderedPageBreak/>
-        <w:t>This is an important lesson for us. There are battles in life that cannot be overcome by our own strength. We encounter temptation, fear, discouragement, anger, doubt, and those things that draw our hearts away from God. Sometimes the battle is obvious; sometimes it is hidden even from us.</w:t>
-      </w:r>
-    </w:p>
-    <w:p>
-      <w:pPr>
-        <w:pStyle w:val="SPBodyText"/>
-      </w:pPr>
-      <w:r>
         <w:t>The prayer to Saint Michael reminds us that we are not expected to fight every battle alone.</w:t>
       </w:r>
     </w:p>
@@ -19692,41 +19564,41 @@
         <w:pStyle w:val="SPBodyText"/>
       </w:pPr>
       <w:r>
+        <w:t>When we pray:</w:t>
+      </w:r>
+    </w:p>
+    <w:p>
+      <w:pPr>
+        <w:pStyle w:val="SPBodyText"/>
+      </w:pPr>
+    </w:p>
+    <w:p>
+      <w:pPr>
+        <w:pStyle w:val="SPBodyText"/>
+      </w:pPr>
+      <w:r>
+        <w:t>Saint Michael the Archangel, be our protection...</w:t>
+      </w:r>
+    </w:p>
+    <w:p>
+      <w:pPr>
+        <w:pStyle w:val="SPBodyText"/>
+      </w:pPr>
+    </w:p>
+    <w:p>
+      <w:pPr>
+        <w:pStyle w:val="SPBodyText"/>
+      </w:pPr>
+      <w:r>
+        <w:t>we can place our fears, our struggles, and our weaknesses before God.</w:t>
+      </w:r>
+    </w:p>
+    <w:p>
+      <w:pPr>
+        <w:pStyle w:val="SPBodyText"/>
+      </w:pPr>
+      <w:r>
         <w:lastRenderedPageBreak/>
-        <w:t>When we pray:</w:t>
-      </w:r>
-    </w:p>
-    <w:p>
-      <w:pPr>
-        <w:pStyle w:val="SPBodyText"/>
-      </w:pPr>
-    </w:p>
-    <w:p>
-      <w:pPr>
-        <w:pStyle w:val="SPBodyText"/>
-      </w:pPr>
-      <w:r>
-        <w:t>Saint Michael the Archangel, be our protection...</w:t>
-      </w:r>
-    </w:p>
-    <w:p>
-      <w:pPr>
-        <w:pStyle w:val="SPBodyText"/>
-      </w:pPr>
-    </w:p>
-    <w:p>
-      <w:pPr>
-        <w:pStyle w:val="SPBodyText"/>
-      </w:pPr>
-      <w:r>
-        <w:t>we can place our fears, our struggles, and our weaknesses before God.</w:t>
-      </w:r>
-    </w:p>
-    <w:p>
-      <w:pPr>
-        <w:pStyle w:val="SPBodyText"/>
-      </w:pPr>
-      <w:r>
         <w:t>We do not need to be afraid.</w:t>
       </w:r>
     </w:p>
@@ -19788,7 +19660,7 @@
       <w:pPr>
         <w:pStyle w:val="SPPrayerTitle"/>
       </w:pPr>
-      <w:bookmarkStart w:id="34" w:name="_Toc238808960"/>
+      <w:bookmarkStart w:id="34" w:name="_Toc240260263"/>
       <w:r>
         <w:t xml:space="preserve">Saint </w:t>
       </w:r>
@@ -20613,7 +20485,7 @@
       <w:pPr>
         <w:pStyle w:val="SPPrayerTitle"/>
       </w:pPr>
-      <w:bookmarkStart w:id="35" w:name="_Toc238808961"/>
+      <w:bookmarkStart w:id="35" w:name="_Toc240260264"/>
       <w:r>
         <w:t xml:space="preserve">Saint </w:t>
       </w:r>
@@ -21562,7 +21434,7 @@
       <w:pPr>
         <w:pStyle w:val="SPPrayerTitle"/>
       </w:pPr>
-      <w:bookmarkStart w:id="36" w:name="_Toc238808962"/>
+      <w:bookmarkStart w:id="36" w:name="_Toc240260265"/>
       <w:r>
         <w:t xml:space="preserve">Saint </w:t>
       </w:r>
@@ -22051,21 +21923,21 @@
         <w:pStyle w:val="SPBodyText"/>
       </w:pPr>
       <w:r>
+        <w:t xml:space="preserve">The Gospel tells us to </w:t>
+      </w:r>
+      <w:r>
+        <w:t>ask, seek, and knock</w:t>
+      </w:r>
+      <w:r>
+        <w:t>. These are active words. They remind us that faith is not merely waiting for God to find us while we remain still. We are invited to turn towards Him, to ask for His help, to seek His truth, and to continue knocking even when the door does not immediately open.</w:t>
+      </w:r>
+    </w:p>
+    <w:p>
+      <w:pPr>
+        <w:pStyle w:val="SPBodyText"/>
+      </w:pPr>
+      <w:r>
         <w:lastRenderedPageBreak/>
-        <w:t xml:space="preserve">The Gospel tells us to </w:t>
-      </w:r>
-      <w:r>
-        <w:t>ask, seek, and knock</w:t>
-      </w:r>
-      <w:r>
-        <w:t>. These are active words. They remind us that faith is not merely waiting for God to find us while we remain still. We are invited to turn towards Him, to ask for His help, to seek His truth, and to continue knocking even when the door does not immediately open.</w:t>
-      </w:r>
-    </w:p>
-    <w:p>
-      <w:pPr>
-        <w:pStyle w:val="SPBodyText"/>
-      </w:pPr>
-      <w:r>
         <w:t>Yet the parable of the lost sheep reveals something even more beautiful.</w:t>
       </w:r>
     </w:p>
@@ -22164,31 +22036,31 @@
         <w:pStyle w:val="SPBodyText"/>
       </w:pPr>
       <w:r>
+        <w:t>It reminds us that we do not have to face every difficulty alone.</w:t>
+      </w:r>
+    </w:p>
+    <w:p>
+      <w:pPr>
+        <w:pStyle w:val="SPBodyText"/>
+      </w:pPr>
+      <w:r>
+        <w:t>And perhaps, sometimes, the thing we most need to find is not what we were originally looking for.</w:t>
+      </w:r>
+    </w:p>
+    <w:p>
+      <w:pPr>
+        <w:pStyle w:val="SPBodyText"/>
+      </w:pPr>
+      <w:r>
+        <w:t>We may begin by searching for a lost possession and discover that what we really need is patience.</w:t>
+      </w:r>
+    </w:p>
+    <w:p>
+      <w:pPr>
+        <w:pStyle w:val="SPBodyText"/>
+      </w:pPr>
+      <w:r>
         <w:lastRenderedPageBreak/>
-        <w:t>It reminds us that we do not have to face every difficulty alone.</w:t>
-      </w:r>
-    </w:p>
-    <w:p>
-      <w:pPr>
-        <w:pStyle w:val="SPBodyText"/>
-      </w:pPr>
-      <w:r>
-        <w:t>And perhaps, sometimes, the thing we most need to find is not what we were originally looking for.</w:t>
-      </w:r>
-    </w:p>
-    <w:p>
-      <w:pPr>
-        <w:pStyle w:val="SPBodyText"/>
-      </w:pPr>
-      <w:r>
-        <w:t>We may begin by searching for a lost possession and discover that what we really need is patience.</w:t>
-      </w:r>
-    </w:p>
-    <w:p>
-      <w:pPr>
-        <w:pStyle w:val="SPBodyText"/>
-      </w:pPr>
-      <w:r>
         <w:t>We may ask for help with a difficult decision and discover that what we need is trust.</w:t>
       </w:r>
     </w:p>
@@ -22288,39 +22160,39 @@
         <w:pStyle w:val="SPBodyText"/>
       </w:pPr>
       <w:r>
+        <w:t>And when what we are seeking is Christ, we can have an even greater confidence:</w:t>
+      </w:r>
+    </w:p>
+    <w:p>
+      <w:pPr>
+        <w:pStyle w:val="SPBodyText"/>
+      </w:pPr>
+      <w:r>
+        <w:t>He is not waiting for us to find Him before He comes near.</w:t>
+      </w:r>
+    </w:p>
+    <w:p>
+      <w:pPr>
+        <w:pStyle w:val="SPBodyText"/>
+      </w:pPr>
+      <w:r>
+        <w:t>He is already near.</w:t>
+      </w:r>
+    </w:p>
+    <w:p>
+      <w:pPr>
+        <w:pStyle w:val="SPBodyText"/>
+      </w:pPr>
+      <w:r>
+        <w:t>He is already calling.</w:t>
+      </w:r>
+    </w:p>
+    <w:p>
+      <w:pPr>
+        <w:pStyle w:val="SPBodyText"/>
+      </w:pPr>
+      <w:r>
         <w:lastRenderedPageBreak/>
-        <w:t>And when what we are seeking is Christ, we can have an even greater confidence:</w:t>
-      </w:r>
-    </w:p>
-    <w:p>
-      <w:pPr>
-        <w:pStyle w:val="SPBodyText"/>
-      </w:pPr>
-      <w:r>
-        <w:t>He is not waiting for us to find Him before He comes near.</w:t>
-      </w:r>
-    </w:p>
-    <w:p>
-      <w:pPr>
-        <w:pStyle w:val="SPBodyText"/>
-      </w:pPr>
-      <w:r>
-        <w:t>He is already near.</w:t>
-      </w:r>
-    </w:p>
-    <w:p>
-      <w:pPr>
-        <w:pStyle w:val="SPBodyText"/>
-      </w:pPr>
-      <w:r>
-        <w:t>He is already calling.</w:t>
-      </w:r>
-    </w:p>
-    <w:p>
-      <w:pPr>
-        <w:pStyle w:val="SPBodyText"/>
-      </w:pPr>
-      <w:r>
         <w:t>And when we have lost our way, He is always ready to lead us home.</w:t>
       </w:r>
     </w:p>
@@ -22426,7 +22298,7 @@
       <w:pPr>
         <w:pStyle w:val="SPPrayerTitle"/>
       </w:pPr>
-      <w:bookmarkStart w:id="37" w:name="_Toc238808963"/>
+      <w:bookmarkStart w:id="37" w:name="_Toc240260266"/>
       <w:r>
         <w:t xml:space="preserve">Saint </w:t>
       </w:r>
@@ -23004,7 +22876,6 @@
         <w:pStyle w:val="SPBodyText"/>
       </w:pPr>
       <w:r>
-        <w:lastRenderedPageBreak/>
         <w:t xml:space="preserve">Saint Christopher therefore reminds us that the most important question is not simply </w:t>
       </w:r>
       <w:r>
@@ -23030,6 +22901,7 @@
         <w:pStyle w:val="SPBodyText"/>
       </w:pPr>
       <w:r>
+        <w:lastRenderedPageBreak/>
         <w:t>When we carry Christ into our work, our families, our friendships, our responsibilities, and even our difficulties, ordinary journeys become opportunities for holiness.</w:t>
       </w:r>
     </w:p>
@@ -23109,32 +22981,32 @@
         <w:pStyle w:val="SPBodyText"/>
       </w:pPr>
       <w:r>
+        <w:t xml:space="preserve">Our earthly journeys therefore point beyond themselves toward the journey's true end: </w:t>
+      </w:r>
+      <w:r>
+        <w:t>the presence of God.</w:t>
+      </w:r>
+    </w:p>
+    <w:p>
+      <w:pPr>
+        <w:pStyle w:val="SPBodyText"/>
+      </w:pPr>
+      <w:r>
+        <w:t>This is why the image of Saint Christopher carrying Christ is so powerful. The traveller discovers that the One he thought he was carrying was, in reality, the One who sustains him.</w:t>
+      </w:r>
+      <w:r>
+        <w:t xml:space="preserve"> </w:t>
+      </w:r>
+      <w:r>
+        <w:t>So too with us.</w:t>
+      </w:r>
+    </w:p>
+    <w:p>
+      <w:pPr>
+        <w:pStyle w:val="SPBodyText"/>
+      </w:pPr>
+      <w:r>
         <w:lastRenderedPageBreak/>
-        <w:t xml:space="preserve">Our earthly journeys therefore point beyond themselves toward the journey's true end: </w:t>
-      </w:r>
-      <w:r>
-        <w:t>the presence of God.</w:t>
-      </w:r>
-    </w:p>
-    <w:p>
-      <w:pPr>
-        <w:pStyle w:val="SPBodyText"/>
-      </w:pPr>
-      <w:r>
-        <w:t>This is why the image of Saint Christopher carrying Christ is so powerful. The traveller discovers that the One he thought he was carrying was, in reality, the One who sustains him.</w:t>
-      </w:r>
-      <w:r>
-        <w:t xml:space="preserve"> </w:t>
-      </w:r>
-      <w:r>
-        <w:t>So too with us.</w:t>
-      </w:r>
-    </w:p>
-    <w:p>
-      <w:pPr>
-        <w:pStyle w:val="SPBodyText"/>
-      </w:pPr>
-      <w:r>
         <w:t>We may think that we are carrying our faith through the difficulties of life, but ultimately it is Christ who carries us.</w:t>
       </w:r>
     </w:p>
@@ -23241,7 +23113,7 @@
       <w:pPr>
         <w:pStyle w:val="SPPrayerTitle"/>
       </w:pPr>
-      <w:bookmarkStart w:id="38" w:name="_Toc238808964"/>
+      <w:bookmarkStart w:id="38" w:name="_Toc240260267"/>
       <w:r>
         <w:lastRenderedPageBreak/>
         <w:t>Closing Thoughts</w:t>
@@ -23531,7 +23403,7 @@
       <w:pPr>
         <w:pStyle w:val="SPSectionTitle"/>
       </w:pPr>
-      <w:bookmarkStart w:id="39" w:name="_Toc238808965"/>
+      <w:bookmarkStart w:id="39" w:name="_Toc240260268"/>
       <w:r>
         <w:lastRenderedPageBreak/>
         <w:t>Conclusion</w:t>
@@ -24131,7 +24003,7 @@
       <w:pPr>
         <w:pStyle w:val="SPSectionTitle"/>
       </w:pPr>
-      <w:bookmarkStart w:id="40" w:name="_Toc238808966"/>
+      <w:bookmarkStart w:id="40" w:name="_Toc240260269"/>
       <w:r>
         <w:lastRenderedPageBreak/>
         <w:t>Latin Guide</w:t>
@@ -24611,7 +24483,7 @@
       <w:pPr>
         <w:pStyle w:val="SPSectionTitle"/>
       </w:pPr>
-      <w:bookmarkStart w:id="41" w:name="_Toc238808967"/>
+      <w:bookmarkStart w:id="41" w:name="_Toc240260270"/>
       <w:r>
         <w:lastRenderedPageBreak/>
         <w:t>Common Prayers</w:t>
@@ -25180,7 +25052,7 @@
       <w:pPr>
         <w:pStyle w:val="SPSectionTitle"/>
       </w:pPr>
-      <w:bookmarkStart w:id="42" w:name="_Toc238808968"/>
+      <w:bookmarkStart w:id="42" w:name="_Toc240260271"/>
       <w:r>
         <w:lastRenderedPageBreak/>
         <w:t>Common Catholic Expressions</w:t>
@@ -27590,7 +27462,6 @@
   <w:style w:type="character" w:default="1" w:styleId="DefaultParagraphFont">
     <w:name w:val="Default Paragraph Font"/>
     <w:uiPriority w:val="1"/>
-    <w:semiHidden/>
     <w:unhideWhenUsed/>
   </w:style>
   <w:style w:type="table" w:default="1" w:styleId="TableNormal">
@@ -27910,12 +27781,11 @@
     <w:basedOn w:val="Normal"/>
     <w:autoRedefine/>
     <w:qFormat/>
-    <w:rsid w:val="002E6E31"/>
+    <w:rsid w:val="00143D43"/>
     <w:pPr>
       <w:keepLines/>
-      <w:spacing w:after="80" w:line="288" w:lineRule="auto"/>
-      <w:ind w:firstLine="317"/>
-      <w:jc w:val="center"/>
+      <w:spacing w:line="276" w:lineRule="auto"/>
+      <w:ind w:left="0" w:firstLine="288"/>
     </w:pPr>
     <w:rPr>
       <w:color w:val="333333"/>
@@ -27951,9 +27821,8 @@
     <w:qFormat/>
     <w:rsid w:val="00090FFF"/>
     <w:pPr>
-      <w:spacing w:before="120" w:after="120"/>
+      <w:spacing w:before="120"/>
       <w:ind w:right="360" w:firstLine="0"/>
-      <w:jc w:val="both"/>
     </w:pPr>
     <w:rPr>
       <w:i/>
@@ -27967,7 +27836,6 @@
     <w:rsid w:val="00225384"/>
     <w:pPr>
       <w:spacing w:before="120"/>
-      <w:ind w:firstLine="288"/>
     </w:pPr>
     <w:rPr>
       <w:i/>
@@ -28008,6 +27876,7 @@
     <w:pPr>
       <w:spacing w:before="60" w:line="240" w:lineRule="auto"/>
       <w:ind w:firstLine="0"/>
+      <w:jc w:val="center"/>
     </w:pPr>
     <w:rPr>
       <w:i/>
@@ -28075,6 +27944,7 @@
     <w:pPr>
       <w:spacing w:before="240" w:after="240"/>
       <w:ind w:firstLine="0"/>
+      <w:jc w:val="center"/>
     </w:pPr>
     <w:rPr>
       <w:i/>
@@ -28267,6 +28137,7 @@
     <w:pPr>
       <w:spacing w:after="360" w:line="312" w:lineRule="auto"/>
       <w:ind w:firstLine="0"/>
+      <w:jc w:val="center"/>
     </w:pPr>
     <w:rPr>
       <w:i/>
@@ -28328,8 +28199,8 @@
     <w:qFormat/>
     <w:rsid w:val="007F56B3"/>
     <w:pPr>
-      <w:spacing w:before="240" w:after="120" w:line="240" w:lineRule="auto"/>
-      <w:ind w:left="0" w:firstLine="0"/>
+      <w:spacing w:before="240" w:line="240" w:lineRule="auto"/>
+      <w:ind w:firstLine="0"/>
       <w:outlineLvl w:val="1"/>
     </w:pPr>
     <w:rPr>
@@ -28364,9 +28235,6 @@
     <w:pPr>
       <w:keepNext/>
       <w:keepLines w:val="0"/>
-      <w:spacing w:after="120"/>
-      <w:ind w:left="0"/>
-      <w:jc w:val="both"/>
     </w:pPr>
     <w:rPr>
       <w:sz w:val="23"/>
@@ -28391,8 +28259,9 @@
     <w:rsid w:val="00B74AAA"/>
     <w:pPr>
       <w:keepNext/>
-      <w:spacing w:before="240" w:after="120" w:line="264" w:lineRule="auto"/>
-      <w:ind w:left="0" w:firstLine="0"/>
+      <w:spacing w:before="240" w:line="264" w:lineRule="auto"/>
+      <w:ind w:firstLine="0"/>
+      <w:jc w:val="center"/>
     </w:pPr>
     <w:rPr>
       <w:i/>
@@ -28476,7 +28345,7 @@
     <w:rsid w:val="00090FFF"/>
     <w:pPr>
       <w:spacing w:before="240" w:line="240" w:lineRule="auto"/>
-      <w:ind w:left="0" w:right="0"/>
+      <w:ind w:right="0"/>
     </w:pPr>
     <w:rPr>
       <w:b/>

</xml_diff>

<commit_message>
Quality check - style pass through Starting Part III
</commit_message>
<xml_diff>
--- a/manuscript/volume-1/sacrae-preces-volume-1.docx
+++ b/manuscript/volume-1/sacrae-preces-volume-1.docx
@@ -4330,7 +4330,7 @@
       </w:pPr>
       <w:r>
         <w:pict w14:anchorId="249FE732">
-          <v:rect id="_x0000_i24229" style="width:0;height:1.5pt" o:hralign="center" o:hrstd="t" o:hr="t" fillcolor="#a0a0a0" stroked="f"/>
+          <v:rect id="_x0000_i24647" style="width:0;height:1.5pt" o:hralign="center" o:hrstd="t" o:hr="t" fillcolor="#a0a0a0" stroked="f"/>
         </w:pict>
       </w:r>
     </w:p>
@@ -4586,7 +4586,7 @@
       </w:pPr>
       <w:r>
         <w:pict w14:anchorId="25751FDD">
-          <v:rect id="_x0000_i24230" style="width:0;height:1.5pt" o:hralign="center" o:hrstd="t" o:hr="t" fillcolor="#a0a0a0" stroked="f"/>
+          <v:rect id="_x0000_i24648" style="width:0;height:1.5pt" o:hralign="center" o:hrstd="t" o:hr="t" fillcolor="#a0a0a0" stroked="f"/>
         </w:pict>
       </w:r>
     </w:p>
@@ -4658,7 +4658,7 @@
       </w:pPr>
       <w:r>
         <w:pict w14:anchorId="19542BB1">
-          <v:rect id="_x0000_i24231" style="width:0;height:1.5pt" o:hralign="center" o:hrstd="t" o:hr="t" fillcolor="#a0a0a0" stroked="f"/>
+          <v:rect id="_x0000_i24649" style="width:0;height:1.5pt" o:hralign="center" o:hrstd="t" o:hr="t" fillcolor="#a0a0a0" stroked="f"/>
         </w:pict>
       </w:r>
     </w:p>
@@ -4886,7 +4886,7 @@
       </w:pPr>
       <w:r>
         <w:pict w14:anchorId="68D46385">
-          <v:rect id="_x0000_i24232" style="width:0;height:1.5pt" o:hralign="center" o:hrstd="t" o:hr="t" fillcolor="#a0a0a0" stroked="f"/>
+          <v:rect id="_x0000_i24650" style="width:0;height:1.5pt" o:hralign="center" o:hrstd="t" o:hr="t" fillcolor="#a0a0a0" stroked="f"/>
         </w:pict>
       </w:r>
     </w:p>
@@ -5242,7 +5242,13 @@
       </w:r>
       <w:bookmarkStart w:id="10" w:name="_Toc240260240"/>
       <w:r>
-        <w:t>Part I — Basic Prayers</w:t>
+        <w:t xml:space="preserve">Part I </w:t>
+      </w:r>
+      <w:r>
+        <w:t>-</w:t>
+      </w:r>
+      <w:r>
+        <w:t xml:space="preserve"> Basic Prayers</w:t>
       </w:r>
       <w:bookmarkEnd w:id="10"/>
     </w:p>
@@ -6234,6 +6240,7 @@
       <w:r>
         <w:t xml:space="preserve">. It is </w:t>
       </w:r>
+      <w:proofErr w:type="spellStart"/>
       <w:r>
         <w:rPr>
           <w:i/>
@@ -6241,6 +6248,7 @@
         </w:rPr>
         <w:t>our</w:t>
       </w:r>
+      <w:proofErr w:type="spellEnd"/>
       <w:r>
         <w:t>.</w:t>
       </w:r>
@@ -9366,6 +9374,25 @@
     <w:p>
       <w:pPr>
         <w:pStyle w:val="SPBodyText"/>
+      </w:pPr>
+      <w:r>
+        <w:t>I</w:t>
+      </w:r>
+      <w:r>
+        <w:t>t celebrates God's faithfulness and the fulfilment of His promises, while looking toward John the Baptist, who will prepare the way for the Messiah.</w:t>
+      </w:r>
+      <w:r>
+        <w:t xml:space="preserve">  </w:t>
+      </w:r>
+    </w:p>
+    <w:p>
+      <w:pPr>
+        <w:pStyle w:val="SPBodyText"/>
+      </w:pPr>
+    </w:p>
+    <w:p>
+      <w:pPr>
+        <w:pStyle w:val="SPBodyText"/>
         <w:sectPr>
           <w:type w:val="oddPage"/>
           <w:pgSz w:w="7920" w:h="12240" w:code="6"/>
@@ -9376,13 +9403,27 @@
         </w:sectPr>
       </w:pPr>
       <w:r>
-        <w:t>I</w:t>
-      </w:r>
-      <w:r>
-        <w:t>t celebrates God's faithfulness and the fulfilment of His promises, while looking toward John the Baptist, who will prepare the way for the Messiah.</w:t>
-      </w:r>
-      <w:r>
-        <w:t xml:space="preserve">  </w:t>
+        <w:t xml:space="preserve">Traditionally, the </w:t>
+      </w:r>
+      <w:r>
+        <w:rPr>
+          <w:b/>
+          <w:bCs/>
+        </w:rPr>
+        <w:t>Benedictus</w:t>
+      </w:r>
+      <w:r>
+        <w:t xml:space="preserve"> is prayed as part of </w:t>
+      </w:r>
+      <w:r>
+        <w:rPr>
+          <w:b/>
+          <w:bCs/>
+        </w:rPr>
+        <w:t>Lauds (Morning Prayer)</w:t>
+      </w:r>
+      <w:r>
+        <w:t xml:space="preserve"> in the Liturgy of the Hours.</w:t>
       </w:r>
     </w:p>
     <w:p>
@@ -9396,6 +9437,11 @@
       <w:r>
         <w:t xml:space="preserve"> </w:t>
       </w:r>
+    </w:p>
+    <w:p>
+      <w:pPr>
+        <w:pStyle w:val="SPPrayerEnglish"/>
+      </w:pPr>
     </w:p>
     <w:p>
       <w:pPr>
@@ -9509,6 +9555,11 @@
       <w:pPr>
         <w:pStyle w:val="SPPrayerLatin"/>
       </w:pPr>
+    </w:p>
+    <w:p>
+      <w:pPr>
+        <w:pStyle w:val="SPPrayerLatin"/>
+      </w:pPr>
       <w:r>
         <w:t>Benedictus Dominus Deus Israel,</w:t>
       </w:r>
@@ -9622,6 +9673,11 @@
     <w:p>
       <w:pPr>
         <w:pStyle w:val="SPPrayerEnglish"/>
+      </w:pPr>
+    </w:p>
+    <w:p>
+      <w:pPr>
+        <w:pStyle w:val="SPPrayerEnglish"/>
         <w:rPr>
           <w:b/>
           <w:bCs/>
@@ -9736,6 +9792,11 @@
       <w:pPr>
         <w:pStyle w:val="SPPrayerLatin"/>
       </w:pPr>
+    </w:p>
+    <w:p>
+      <w:pPr>
+        <w:pStyle w:val="SPPrayerLatin"/>
+      </w:pPr>
       <w:r>
         <w:t>Et tu, puer, propheta Altissimi vocaberis</w:t>
       </w:r>
@@ -9953,950 +10014,132 @@
     </w:p>
     <w:p>
       <w:pPr>
-        <w:pStyle w:val="SPBodyText"/>
-      </w:pPr>
-      <w:r>
-        <w:t xml:space="preserve">A Song at </w:t>
-      </w:r>
-      <w:r>
-        <w:t>D</w:t>
-      </w:r>
-      <w:r>
-        <w:t>awn</w:t>
-      </w:r>
-    </w:p>
-    <w:p>
-      <w:pPr>
-        <w:pStyle w:val="SPBodyText"/>
-      </w:pPr>
-      <w:r>
-        <w:t>The Benedictus is the song of a man who has waited.</w:t>
-      </w:r>
-    </w:p>
-    <w:p>
-      <w:pPr>
-        <w:pStyle w:val="SPBodyText"/>
-      </w:pPr>
-      <w:r>
-        <w:t>Zechariah had known silence. He had known uncertainty. He had known the long years in which God's promises seemed distant and the hopes of Israel seemed to remain unanswered.</w:t>
-      </w:r>
-    </w:p>
-    <w:p>
-      <w:pPr>
-        <w:pStyle w:val="SPBodyText"/>
-      </w:pPr>
-      <w:r>
-        <w:t>And then God acted.</w:t>
-      </w:r>
-    </w:p>
-    <w:p>
-      <w:pPr>
-        <w:pStyle w:val="SPBodyText"/>
-      </w:pPr>
-      <w:r>
-        <w:t>A child was born.</w:t>
-      </w:r>
-    </w:p>
-    <w:p>
-      <w:pPr>
-        <w:pStyle w:val="SPBodyText"/>
-      </w:pPr>
-      <w:r>
-        <w:t>The silence was broken.</w:t>
-      </w:r>
-    </w:p>
-    <w:p>
-      <w:pPr>
-        <w:pStyle w:val="SPBodyText"/>
-      </w:pPr>
-      <w:r>
-        <w:t>And Zechariah's first great words were not words about himself.</w:t>
-      </w:r>
-    </w:p>
-    <w:p>
-      <w:pPr>
-        <w:pStyle w:val="SPBodyText"/>
-      </w:pPr>
-      <w:r>
-        <w:t>They were words of praise.</w:t>
-      </w:r>
-    </w:p>
-    <w:p>
-      <w:pPr>
-        <w:pStyle w:val="SPBodyText"/>
-      </w:pPr>
-      <w:r>
-        <w:t>Blessed be the Lord, the God of Israel.</w:t>
-      </w:r>
-    </w:p>
-    <w:p>
-      <w:pPr>
-        <w:pStyle w:val="SPBodyText"/>
-      </w:pPr>
-      <w:r>
-        <w:t>The Benedictus begins by looking upward. Before Zechariah speaks about his son, his people, their enemies, or the future, he speaks about God.</w:t>
-      </w:r>
-    </w:p>
-    <w:p>
-      <w:pPr>
-        <w:pStyle w:val="SPBodyText"/>
-      </w:pPr>
-    </w:p>
-    <w:p>
-      <w:pPr>
-        <w:pStyle w:val="SPBodyText"/>
-      </w:pPr>
-      <w:r>
-        <w:t>God has visited His people.</w:t>
-      </w:r>
-    </w:p>
-    <w:p>
-      <w:pPr>
-        <w:pStyle w:val="SPBodyText"/>
-      </w:pPr>
-      <w:r>
-        <w:t>God has remembered His covenant.</w:t>
-      </w:r>
-    </w:p>
-    <w:p>
-      <w:pPr>
-        <w:pStyle w:val="SPBodyText"/>
-      </w:pPr>
-      <w:r>
-        <w:t>God has raised up salvation.</w:t>
-      </w:r>
-    </w:p>
-    <w:p>
-      <w:pPr>
-        <w:pStyle w:val="SPBodyText"/>
-      </w:pPr>
-    </w:p>
-    <w:p>
-      <w:pPr>
-        <w:pStyle w:val="SPBodyText"/>
-      </w:pPr>
-      <w:r>
-        <w:t>The prayer teaches us something easily forgotten: God has not abandoned His people simply because we cannot yet see what He is doing.</w:t>
-      </w:r>
-    </w:p>
-    <w:p>
-      <w:pPr>
-        <w:pStyle w:val="SPBodyText"/>
-      </w:pPr>
-    </w:p>
-    <w:p>
-      <w:pPr>
-        <w:pStyle w:val="SPBodyText"/>
-      </w:pPr>
-      <w:r>
-        <w:t>Sometimes faith is lived in the space between promise and fulfilment.</w:t>
-      </w:r>
-    </w:p>
-    <w:p>
-      <w:pPr>
-        <w:pStyle w:val="SPBodyText"/>
-      </w:pPr>
-    </w:p>
-    <w:p>
-      <w:pPr>
-        <w:pStyle w:val="SPBodyText"/>
-      </w:pPr>
-      <w:r>
-        <w:t>We wait.</w:t>
-      </w:r>
-    </w:p>
-    <w:p>
-      <w:pPr>
-        <w:pStyle w:val="SPBodyText"/>
-      </w:pPr>
-      <w:r>
-        <w:t>We wonder.</w:t>
-      </w:r>
-    </w:p>
-    <w:p>
-      <w:pPr>
-        <w:pStyle w:val="SPBodyText"/>
-      </w:pPr>
-      <w:r>
-        <w:t>We become tired.</w:t>
-      </w:r>
-    </w:p>
-    <w:p>
-      <w:pPr>
-        <w:pStyle w:val="SPBodyText"/>
-      </w:pPr>
-      <w:r>
-        <w:t>And yet God remains faithful.</w:t>
-      </w:r>
-    </w:p>
-    <w:p>
-      <w:pPr>
-        <w:pStyle w:val="SPBodyText"/>
-      </w:pPr>
-      <w:r>
-        <w:t>God Remembers</w:t>
-      </w:r>
-    </w:p>
-    <w:p>
-      <w:pPr>
-        <w:pStyle w:val="SPBodyText"/>
-      </w:pPr>
-    </w:p>
-    <w:p>
-      <w:pPr>
-        <w:pStyle w:val="SPBodyText"/>
-      </w:pPr>
-      <w:r>
-        <w:t>Zechariah remembers the promises made to Abraham and the covenant God made with His people.</w:t>
-      </w:r>
-    </w:p>
-    <w:p>
-      <w:pPr>
-        <w:pStyle w:val="SPBodyText"/>
-      </w:pPr>
-      <w:r>
-        <w:t>This is not merely remembering history.</w:t>
-      </w:r>
-    </w:p>
-    <w:p>
-      <w:pPr>
-        <w:pStyle w:val="SPBodyText"/>
-      </w:pPr>
-      <w:r>
-        <w:t xml:space="preserve">It is remembering </w:t>
-      </w:r>
-      <w:r>
         <w:rPr>
           <w:b/>
           <w:bCs/>
         </w:rPr>
-        <w:t>who God is</w:t>
-      </w:r>
-      <w:r>
-        <w:t>.</w:t>
-      </w:r>
-    </w:p>
-    <w:p>
-      <w:pPr>
-        <w:pStyle w:val="SPBodyText"/>
-      </w:pPr>
-      <w:r>
-        <w:t>The God who made the promise is still God.</w:t>
-      </w:r>
-    </w:p>
-    <w:p>
-      <w:pPr>
-        <w:pStyle w:val="SPBodyText"/>
-      </w:pPr>
-      <w:r>
-        <w:t>The God who was faithful to Abraham is faithful now.</w:t>
-      </w:r>
-    </w:p>
-    <w:p>
-      <w:pPr>
-        <w:pStyle w:val="SPBodyText"/>
-      </w:pPr>
-      <w:r>
-        <w:t>The God who worked through generations is still working through ours.</w:t>
-      </w:r>
-    </w:p>
-    <w:p>
-      <w:pPr>
-        <w:pStyle w:val="SPBodyText"/>
-      </w:pPr>
-      <w:r>
-        <w:t>We often measure God's presence by what is happening in front of us.</w:t>
-      </w:r>
-    </w:p>
-    <w:p>
-      <w:pPr>
-        <w:pStyle w:val="SPBodyText"/>
-      </w:pPr>
-      <w:r>
-        <w:t>The Benedictus invites us to measure it differently.</w:t>
-      </w:r>
-    </w:p>
-    <w:p>
-      <w:pPr>
-        <w:pStyle w:val="SPBodyText"/>
-      </w:pPr>
-      <w:r>
-        <w:t>Look back.</w:t>
-      </w:r>
-    </w:p>
-    <w:p>
-      <w:pPr>
-        <w:pStyle w:val="SPBodyText"/>
-      </w:pPr>
-      <w:r>
-        <w:t>Remember.</w:t>
-      </w:r>
-    </w:p>
-    <w:p>
-      <w:pPr>
-        <w:pStyle w:val="SPBodyText"/>
-      </w:pPr>
-      <w:r>
-        <w:t>God has been faithful before.</w:t>
-      </w:r>
-    </w:p>
-    <w:p>
-      <w:pPr>
-        <w:pStyle w:val="SPBodyText"/>
-      </w:pPr>
-      <w:r>
-        <w:lastRenderedPageBreak/>
-        <w:t>God has carried His people before.</w:t>
-      </w:r>
-    </w:p>
-    <w:p>
-      <w:pPr>
-        <w:pStyle w:val="SPBodyText"/>
-      </w:pPr>
-      <w:r>
-        <w:t>God has brought light into darkness before.</w:t>
-      </w:r>
-    </w:p>
-    <w:p>
-      <w:pPr>
-        <w:pStyle w:val="SPBodyText"/>
-      </w:pPr>
-      <w:r>
-        <w:t xml:space="preserve">And </w:t>
-      </w:r>
-      <w:r>
-        <w:t>therefore,</w:t>
-      </w:r>
-      <w:r>
-        <w:t xml:space="preserve"> we can trust Him again.</w:t>
-      </w:r>
-    </w:p>
-    <w:p>
-      <w:pPr>
-        <w:pStyle w:val="SPBodyText"/>
-      </w:pPr>
-    </w:p>
-    <w:p>
-      <w:pPr>
-        <w:pStyle w:val="SPBodyText"/>
-      </w:pPr>
-      <w:r>
-        <w:t>A Child Who Will Prepare the Way</w:t>
-      </w:r>
-    </w:p>
-    <w:p>
-      <w:pPr>
-        <w:pStyle w:val="SPBodyText"/>
-      </w:pPr>
-    </w:p>
-    <w:p>
-      <w:pPr>
-        <w:pStyle w:val="SPBodyText"/>
-      </w:pPr>
-      <w:r>
-        <w:t>Then Zechariah turns toward his son.</w:t>
-      </w:r>
-    </w:p>
-    <w:p>
-      <w:pPr>
-        <w:pStyle w:val="SPBodyText"/>
-      </w:pPr>
-      <w:r>
-        <w:t>John will not be the light.</w:t>
-      </w:r>
-    </w:p>
-    <w:p>
-      <w:pPr>
-        <w:pStyle w:val="SPBodyText"/>
-      </w:pPr>
-      <w:r>
-        <w:t>He will prepare the way for the Light.</w:t>
-      </w:r>
-    </w:p>
-    <w:p>
-      <w:pPr>
-        <w:pStyle w:val="SPBodyText"/>
-      </w:pPr>
-      <w:r>
-        <w:t>His vocation is not to draw attention to himself, but to point beyond himself toward Christ.</w:t>
-      </w:r>
-    </w:p>
-    <w:p>
-      <w:pPr>
-        <w:pStyle w:val="SPBodyText"/>
-      </w:pPr>
-      <w:r>
-        <w:t>There is something deeply Christian in this.</w:t>
-      </w:r>
-    </w:p>
-    <w:p>
-      <w:pPr>
-        <w:pStyle w:val="SPBodyText"/>
-      </w:pPr>
-      <w:r>
-        <w:t>Our lives are not ultimately about making ourselves important.</w:t>
-      </w:r>
-    </w:p>
-    <w:p>
-      <w:pPr>
-        <w:pStyle w:val="SPBodyText"/>
-      </w:pPr>
-      <w:r>
-        <w:t>We are called to prepare the way.</w:t>
-      </w:r>
-    </w:p>
-    <w:p>
-      <w:pPr>
-        <w:pStyle w:val="SPBodyText"/>
-      </w:pPr>
-      <w:r>
-        <w:t>Perhaps that means preparing a way for Christ in our own hearts.</w:t>
-      </w:r>
-    </w:p>
-    <w:p>
-      <w:pPr>
-        <w:pStyle w:val="SPBodyText"/>
-      </w:pPr>
-      <w:r>
-        <w:t>Perhaps it means preparing a way for Him in our families.</w:t>
-      </w:r>
-    </w:p>
-    <w:p>
-      <w:pPr>
-        <w:pStyle w:val="SPBodyText"/>
-      </w:pPr>
-      <w:r>
-        <w:t>Perhaps it means becoming a little more patient, forgiving, truthful, merciful, and courageous so that another person may encounter something of God's love through us.</w:t>
-      </w:r>
-    </w:p>
-    <w:p>
-      <w:pPr>
-        <w:pStyle w:val="SPBodyText"/>
-      </w:pPr>
-    </w:p>
-    <w:p>
-      <w:pPr>
-        <w:pStyle w:val="SPBodyText"/>
-      </w:pPr>
-      <w:r>
-        <w:t>John prepares the way.</w:t>
-      </w:r>
-    </w:p>
-    <w:p>
-      <w:pPr>
-        <w:pStyle w:val="SPBodyText"/>
-      </w:pPr>
-      <w:r>
-        <w:t>And so can we.</w:t>
-      </w:r>
-    </w:p>
-    <w:p>
-      <w:pPr>
-        <w:pStyle w:val="SPBodyText"/>
-      </w:pPr>
-    </w:p>
-    <w:p>
-      <w:pPr>
-        <w:pStyle w:val="SPBodyText"/>
-      </w:pPr>
-      <w:r>
-        <w:lastRenderedPageBreak/>
-        <w:t>The Tender Mercy of God</w:t>
-      </w:r>
-    </w:p>
-    <w:p>
-      <w:pPr>
-        <w:pStyle w:val="SPBodyText"/>
-      </w:pPr>
-      <w:r>
-        <w:t>One of the most beautiful moments in the Benedictus comes near its end.</w:t>
-      </w:r>
-    </w:p>
-    <w:p>
-      <w:pPr>
-        <w:pStyle w:val="SPBodyText"/>
-      </w:pPr>
-      <w:r>
-        <w:t xml:space="preserve">The coming of salvation is described through the </w:t>
-      </w:r>
+      </w:pPr>
       <w:r>
         <w:rPr>
           <w:b/>
           <w:bCs/>
         </w:rPr>
-        <w:t>tender mercy of God</w:t>
-      </w:r>
-      <w:r>
-        <w:t>.</w:t>
-      </w:r>
-    </w:p>
-    <w:p>
-      <w:pPr>
-        <w:pStyle w:val="SPBodyText"/>
-      </w:pPr>
-      <w:r>
-        <w:t>God does not save from a distance.</w:t>
-      </w:r>
-    </w:p>
-    <w:p>
-      <w:pPr>
-        <w:pStyle w:val="SPBodyText"/>
-      </w:pPr>
-      <w:r>
-        <w:t>He draws near.</w:t>
-      </w:r>
-    </w:p>
-    <w:p>
-      <w:pPr>
-        <w:pStyle w:val="SPBodyText"/>
-      </w:pPr>
-      <w:r>
-        <w:t>He visits His people.</w:t>
-      </w:r>
-    </w:p>
-    <w:p>
-      <w:pPr>
-        <w:pStyle w:val="SPBodyText"/>
-      </w:pPr>
-      <w:r>
-        <w:t>He comes into our darkness.</w:t>
-      </w:r>
-    </w:p>
-    <w:p>
-      <w:pPr>
-        <w:pStyle w:val="SPBodyText"/>
-      </w:pPr>
-      <w:r>
-        <w:t>And the image that follows is one of dawn.</w:t>
-      </w:r>
-    </w:p>
-    <w:p>
-      <w:pPr>
-        <w:pStyle w:val="SPBodyText"/>
-      </w:pPr>
-      <w:r>
-        <w:t>The darkness does not overcome the light.</w:t>
-      </w:r>
-    </w:p>
-    <w:p>
-      <w:pPr>
-        <w:pStyle w:val="SPBodyText"/>
-      </w:pPr>
-      <w:r>
-        <w:t>The light comes.</w:t>
-      </w:r>
-    </w:p>
-    <w:p>
-      <w:pPr>
-        <w:pStyle w:val="SPBodyText"/>
-      </w:pPr>
-      <w:r>
-        <w:t>Slowly, perhaps.</w:t>
-      </w:r>
-    </w:p>
-    <w:p>
-      <w:pPr>
-        <w:pStyle w:val="SPBodyText"/>
-      </w:pPr>
-      <w:r>
-        <w:t>Quietly, perhaps.</w:t>
-      </w:r>
-    </w:p>
-    <w:p>
-      <w:pPr>
-        <w:pStyle w:val="SPBodyText"/>
-      </w:pPr>
-      <w:r>
-        <w:t>But it comes.</w:t>
-      </w:r>
-    </w:p>
-    <w:p>
-      <w:pPr>
-        <w:pStyle w:val="SPBodyText"/>
-      </w:pPr>
-      <w:r>
-        <w:t>There are seasons when our own lives can feel like darkness.</w:t>
-      </w:r>
-    </w:p>
-    <w:p>
-      <w:pPr>
-        <w:pStyle w:val="SPBodyText"/>
-      </w:pPr>
-      <w:r>
-        <w:t>We may not know what lies ahead.</w:t>
-      </w:r>
-    </w:p>
-    <w:p>
-      <w:pPr>
-        <w:pStyle w:val="SPBodyText"/>
-      </w:pPr>
-      <w:r>
-        <w:t>We may carry grief, disappointment, fear, temptation, failure, or simply the exhaustion of ordinary life.</w:t>
-      </w:r>
-    </w:p>
-    <w:p>
-      <w:pPr>
-        <w:pStyle w:val="SPBodyText"/>
-      </w:pPr>
-      <w:r>
-        <w:t>The Benedictus does not pretend that darkness does not exist.</w:t>
-      </w:r>
-    </w:p>
-    <w:p>
-      <w:pPr>
-        <w:pStyle w:val="SPBodyText"/>
-      </w:pPr>
-      <w:r>
-        <w:t>Instead, it tells us where to look:</w:t>
-      </w:r>
-    </w:p>
-    <w:p>
-      <w:pPr>
-        <w:pStyle w:val="SPBodyText"/>
-      </w:pPr>
-      <w:r>
-        <w:t>toward the dawn.</w:t>
-      </w:r>
-    </w:p>
-    <w:p>
-      <w:pPr>
-        <w:pStyle w:val="SPBodyText"/>
-      </w:pPr>
-    </w:p>
-    <w:p>
-      <w:pPr>
-        <w:pStyle w:val="SPBodyText"/>
-      </w:pPr>
-    </w:p>
-    <w:p>
-      <w:pPr>
-        <w:pStyle w:val="SPBodyText"/>
-      </w:pPr>
-      <w:r>
-        <w:t>To Guide Our Feet</w:t>
-      </w:r>
-    </w:p>
-    <w:p>
-      <w:pPr>
-        <w:pStyle w:val="SPBodyText"/>
-      </w:pPr>
-      <w:r>
-        <w:t>The final words of the Benedictus are not about giving us a complete map of the future.</w:t>
-      </w:r>
-    </w:p>
-    <w:p>
-      <w:pPr>
-        <w:pStyle w:val="SPBodyText"/>
-      </w:pPr>
-      <w:r>
-        <w:t>They ask for something simpler:</w:t>
-      </w:r>
-    </w:p>
-    <w:p>
-      <w:pPr>
-        <w:pStyle w:val="SPBodyText"/>
-      </w:pPr>
-      <w:r>
-        <w:t>that God may guide our feet into the way of peace.</w:t>
-      </w:r>
-    </w:p>
-    <w:p>
-      <w:pPr>
-        <w:pStyle w:val="SPBodyText"/>
-      </w:pPr>
-      <w:r>
-        <w:t>Not necessarily the whole road.</w:t>
-      </w:r>
-    </w:p>
-    <w:p>
-      <w:pPr>
-        <w:pStyle w:val="SPBodyText"/>
-      </w:pPr>
-      <w:r>
-        <w:t>Just the next step.</w:t>
-      </w:r>
-    </w:p>
-    <w:p>
-      <w:pPr>
-        <w:pStyle w:val="SPBodyText"/>
-      </w:pPr>
-      <w:r>
-        <w:t>That may be all we need.</w:t>
-      </w:r>
-    </w:p>
-    <w:p>
-      <w:pPr>
-        <w:pStyle w:val="SPBodyText"/>
-      </w:pPr>
-      <w:r>
-        <w:t>We do not always need to know where the road will eventually lead.</w:t>
-      </w:r>
-    </w:p>
-    <w:p>
-      <w:pPr>
-        <w:pStyle w:val="SPBodyText"/>
-      </w:pPr>
-      <w:r>
-        <w:t>We need only enough light to take the next faithful step.</w:t>
-      </w:r>
-    </w:p>
-    <w:p>
-      <w:pPr>
-        <w:pStyle w:val="SPBodyText"/>
-      </w:pPr>
-      <w:r>
-        <w:t>The Benedictus therefore becomes a prayer for our own lives.</w:t>
-      </w:r>
-    </w:p>
-    <w:p>
-      <w:pPr>
-        <w:pStyle w:val="SPBodyText"/>
-      </w:pPr>
-    </w:p>
-    <w:p>
-      <w:pPr>
-        <w:pStyle w:val="SPBodyText"/>
-      </w:pPr>
-      <w:r>
-        <w:t>When we are uncertain:</w:t>
-      </w:r>
-    </w:p>
-    <w:p>
-      <w:pPr>
-        <w:pStyle w:val="SPBodyText"/>
-      </w:pPr>
-      <w:r>
-        <w:t>Guide our feet.</w:t>
-      </w:r>
-    </w:p>
-    <w:p>
-      <w:pPr>
-        <w:pStyle w:val="SPBodyText"/>
-      </w:pPr>
-      <w:r>
-        <w:t>When we are afraid:</w:t>
-      </w:r>
-    </w:p>
-    <w:p>
-      <w:pPr>
-        <w:pStyle w:val="SPBodyText"/>
-      </w:pPr>
-      <w:r>
-        <w:t>Guide our feet.</w:t>
-      </w:r>
-    </w:p>
-    <w:p>
-      <w:pPr>
-        <w:pStyle w:val="SPBodyText"/>
-      </w:pPr>
-      <w:r>
-        <w:t>When we have wandered:</w:t>
-      </w:r>
-    </w:p>
-    <w:p>
-      <w:pPr>
-        <w:pStyle w:val="SPBodyText"/>
-      </w:pPr>
-      <w:r>
-        <w:t>Guide our feet.</w:t>
-      </w:r>
-    </w:p>
-    <w:p>
-      <w:pPr>
-        <w:pStyle w:val="SPBodyText"/>
-      </w:pPr>
-      <w:r>
-        <w:t>When we cannot see beyond the darkness:</w:t>
-      </w:r>
-    </w:p>
-    <w:p>
-      <w:pPr>
-        <w:pStyle w:val="SPBodyText"/>
-      </w:pPr>
-      <w:r>
-        <w:t>Guide our feet into the way of peace.</w:t>
-      </w:r>
-    </w:p>
-    <w:p>
-      <w:pPr>
-        <w:pStyle w:val="SPBodyText"/>
-      </w:pPr>
-    </w:p>
-    <w:p>
-      <w:pPr>
-        <w:pStyle w:val="SPBodyText"/>
-      </w:pPr>
-      <w:r>
-        <w:lastRenderedPageBreak/>
-        <w:t>And perhaps this is why the Church gives this canticle to the morning.</w:t>
-      </w:r>
-    </w:p>
-    <w:p>
-      <w:pPr>
-        <w:pStyle w:val="SPBodyText"/>
-      </w:pPr>
-      <w:r>
-        <w:t>The day is beginning.</w:t>
-      </w:r>
-    </w:p>
-    <w:p>
-      <w:pPr>
-        <w:pStyle w:val="SPBodyText"/>
-      </w:pPr>
-      <w:r>
-        <w:t>We do not know what it will bring.</w:t>
-      </w:r>
-    </w:p>
-    <w:p>
-      <w:pPr>
-        <w:pStyle w:val="SPBodyText"/>
-      </w:pPr>
-    </w:p>
-    <w:p>
-      <w:pPr>
-        <w:pStyle w:val="SPBodyText"/>
-      </w:pPr>
-      <w:r>
-        <w:t>But the dawn has come.</w:t>
-      </w:r>
-    </w:p>
-    <w:p>
-      <w:pPr>
-        <w:pStyle w:val="SPBodyText"/>
-      </w:pPr>
-      <w:r>
-        <w:t>Christ is our light.</w:t>
-      </w:r>
-    </w:p>
-    <w:p>
-      <w:pPr>
-        <w:pStyle w:val="SPBodyText"/>
-      </w:pPr>
-      <w:r>
-        <w:t>And we place our feet upon the road.</w:t>
-      </w:r>
-    </w:p>
-    <w:p>
-      <w:pPr>
-        <w:pStyle w:val="SPBodyText"/>
-      </w:pPr>
-    </w:p>
-    <w:p>
-      <w:pPr>
-        <w:pStyle w:val="SPBodyText"/>
-      </w:pPr>
-      <w:r>
-        <w:t>A Prayer for the Morning</w:t>
-      </w:r>
-    </w:p>
-    <w:p>
-      <w:pPr>
-        <w:pStyle w:val="SPBodyText"/>
-      </w:pPr>
-    </w:p>
-    <w:p>
-      <w:pPr>
-        <w:pStyle w:val="SPBodyText"/>
-      </w:pPr>
-      <w:r>
-        <w:t>When you pray the Benedictus, do not rush through it.</w:t>
-      </w:r>
-    </w:p>
-    <w:p>
-      <w:pPr>
-        <w:pStyle w:val="SPBodyText"/>
-      </w:pPr>
-      <w:r>
-        <w:t>Remember what God has done.</w:t>
-      </w:r>
-    </w:p>
-    <w:p>
-      <w:pPr>
-        <w:pStyle w:val="SPBodyText"/>
-      </w:pPr>
-      <w:r>
-        <w:t>Remember His promises.</w:t>
-      </w:r>
-    </w:p>
-    <w:p>
-      <w:pPr>
-        <w:pStyle w:val="SPBodyText"/>
-      </w:pPr>
-      <w:r>
-        <w:t>Remember that His mercy is still reaching toward you.</w:t>
-      </w:r>
-    </w:p>
-    <w:p>
-      <w:pPr>
-        <w:pStyle w:val="SPBodyText"/>
-      </w:pPr>
-      <w:r>
-        <w:t>Bring before Him the darkness you carry.</w:t>
-      </w:r>
-    </w:p>
-    <w:p>
-      <w:pPr>
-        <w:pStyle w:val="SPBodyText"/>
-      </w:pPr>
-      <w:r>
-        <w:t>Bring Him the people you love.</w:t>
-      </w:r>
-    </w:p>
-    <w:p>
-      <w:pPr>
-        <w:pStyle w:val="SPBodyText"/>
-      </w:pPr>
-      <w:r>
-        <w:t>Bring Him the things you cannot control.</w:t>
-      </w:r>
-    </w:p>
-    <w:p>
-      <w:pPr>
-        <w:pStyle w:val="SPBodyText"/>
-      </w:pPr>
-      <w:r>
-        <w:t>And then ask simply:</w:t>
-      </w:r>
-    </w:p>
-    <w:p>
-      <w:pPr>
-        <w:pStyle w:val="SPBodyText"/>
-      </w:pPr>
-      <w:r>
-        <w:t>Lord, guide my feet today.</w:t>
-      </w:r>
-    </w:p>
-    <w:p>
-      <w:pPr>
-        <w:pStyle w:val="SPBodyText"/>
-      </w:pPr>
-      <w:r>
-        <w:t>Not tomorrow.</w:t>
-      </w:r>
-    </w:p>
-    <w:p>
-      <w:pPr>
-        <w:pStyle w:val="SPBodyText"/>
-      </w:pPr>
-      <w:r>
-        <w:t>Not through the whole of my life.</w:t>
-      </w:r>
-    </w:p>
-    <w:p>
-      <w:pPr>
-        <w:pStyle w:val="SPBodyText"/>
-      </w:pPr>
-      <w:r>
-        <w:t>Today.</w:t>
-      </w:r>
-    </w:p>
-    <w:p>
-      <w:pPr>
-        <w:pStyle w:val="SPBodyText"/>
-      </w:pPr>
-      <w:r>
-        <w:lastRenderedPageBreak/>
-        <w:t>Guide my feet into the way of peace.</w:t>
+        <w:t xml:space="preserve">A Song at </w:t>
+      </w:r>
+      <w:r>
+        <w:rPr>
+          <w:b/>
+          <w:bCs/>
+        </w:rPr>
+        <w:t>D</w:t>
+      </w:r>
+      <w:r>
+        <w:rPr>
+          <w:b/>
+          <w:bCs/>
+        </w:rPr>
+        <w:t>awn</w:t>
+      </w:r>
+    </w:p>
+    <w:p>
+      <w:pPr>
+        <w:pStyle w:val="SPBodyText"/>
+      </w:pPr>
+      <w:r>
+        <w:t>The Benedictus is the song of a man who has waited.</w:t>
+      </w:r>
+    </w:p>
+    <w:p>
+      <w:pPr>
+        <w:pStyle w:val="SPBodyText"/>
+      </w:pPr>
+      <w:r>
+        <w:t>Zechariah had known silence. He had known uncertainty. He had known the long years in which God's promises seemed distant and the hopes of Israel seemed to remain unanswered.</w:t>
+      </w:r>
+    </w:p>
+    <w:p>
+      <w:pPr>
+        <w:pStyle w:val="SPBodyText"/>
+      </w:pPr>
+      <w:r>
+        <w:t>And then God acted.</w:t>
+      </w:r>
+    </w:p>
+    <w:p>
+      <w:pPr>
+        <w:pStyle w:val="SPBodyText"/>
+      </w:pPr>
+      <w:r>
+        <w:t>A child was born.</w:t>
+      </w:r>
+    </w:p>
+    <w:p>
+      <w:pPr>
+        <w:pStyle w:val="SPBodyText"/>
+      </w:pPr>
+      <w:r>
+        <w:t>The silence was broken.</w:t>
+      </w:r>
+    </w:p>
+    <w:p>
+      <w:pPr>
+        <w:pStyle w:val="SPBodyText"/>
+      </w:pPr>
+      <w:r>
+        <w:t>And Zechariah's first great words were not words about himself.</w:t>
+      </w:r>
+    </w:p>
+    <w:p>
+      <w:pPr>
+        <w:pStyle w:val="SPBodyText"/>
+      </w:pPr>
+      <w:r>
+        <w:t>They were words of praise.</w:t>
+      </w:r>
+    </w:p>
+    <w:p>
+      <w:pPr>
+        <w:pStyle w:val="SPBodyText"/>
+      </w:pPr>
+      <w:r>
+        <w:t>Blessed be the Lord, the God of Israel.</w:t>
+      </w:r>
+    </w:p>
+    <w:p>
+      <w:pPr>
+        <w:pStyle w:val="SPBodyText"/>
+      </w:pPr>
+      <w:r>
+        <w:t>The Benedictus begins by looking upward. Before Zechariah speaks about his son, his people, their enemies, or the future, he speaks about God.</w:t>
+      </w:r>
+    </w:p>
+    <w:p>
+      <w:pPr>
+        <w:pStyle w:val="SPBodyText"/>
+      </w:pPr>
+    </w:p>
+    <w:p>
+      <w:pPr>
+        <w:pStyle w:val="SPBodyText"/>
+      </w:pPr>
+      <w:r>
+        <w:t>God has visited His people.</w:t>
+      </w:r>
+    </w:p>
+    <w:p>
+      <w:pPr>
+        <w:pStyle w:val="SPBodyText"/>
+      </w:pPr>
+      <w:r>
+        <w:t>God has remembered His covenant.</w:t>
+      </w:r>
+    </w:p>
+    <w:p>
+      <w:pPr>
+        <w:pStyle w:val="SPBodyText"/>
+      </w:pPr>
+      <w:r>
+        <w:t>God has raised up salvation.</w:t>
       </w:r>
     </w:p>
     <w:p>
@@ -10916,6 +10159,850 @@
           <w:docGrid w:linePitch="360"/>
         </w:sectPr>
       </w:pPr>
+    </w:p>
+    <w:p>
+      <w:pPr>
+        <w:pStyle w:val="SPBodyText"/>
+      </w:pPr>
+      <w:r>
+        <w:lastRenderedPageBreak/>
+        <w:t>The prayer teaches us something easily forgotten: God has not abandoned His people simply because we cannot yet see what He is doing.</w:t>
+      </w:r>
+    </w:p>
+    <w:p>
+      <w:pPr>
+        <w:pStyle w:val="SPBodyText"/>
+      </w:pPr>
+    </w:p>
+    <w:p>
+      <w:pPr>
+        <w:pStyle w:val="SPBodyText"/>
+      </w:pPr>
+      <w:r>
+        <w:t>Sometimes faith is lived in the space between promise and fulfilment.</w:t>
+      </w:r>
+    </w:p>
+    <w:p>
+      <w:pPr>
+        <w:pStyle w:val="SPBodyText"/>
+      </w:pPr>
+    </w:p>
+    <w:p>
+      <w:pPr>
+        <w:pStyle w:val="SPBodyText"/>
+      </w:pPr>
+      <w:r>
+        <w:t>We wait.</w:t>
+      </w:r>
+    </w:p>
+    <w:p>
+      <w:pPr>
+        <w:pStyle w:val="SPBodyText"/>
+      </w:pPr>
+      <w:r>
+        <w:t>We wonder.</w:t>
+      </w:r>
+    </w:p>
+    <w:p>
+      <w:pPr>
+        <w:pStyle w:val="SPBodyText"/>
+      </w:pPr>
+      <w:r>
+        <w:t>We become tired.</w:t>
+      </w:r>
+    </w:p>
+    <w:p>
+      <w:pPr>
+        <w:pStyle w:val="SPBodyText"/>
+      </w:pPr>
+      <w:r>
+        <w:t>And yet God remains faithful.</w:t>
+      </w:r>
+    </w:p>
+    <w:p>
+      <w:pPr>
+        <w:pStyle w:val="SPBodyText"/>
+      </w:pPr>
+      <w:r>
+        <w:t>God Remembers</w:t>
+      </w:r>
+    </w:p>
+    <w:p>
+      <w:pPr>
+        <w:pStyle w:val="SPBodyText"/>
+      </w:pPr>
+    </w:p>
+    <w:p>
+      <w:pPr>
+        <w:pStyle w:val="SPBodyText"/>
+      </w:pPr>
+      <w:r>
+        <w:t>Zechariah remembers the promises made to Abraham and the covenant God made with His people.</w:t>
+      </w:r>
+    </w:p>
+    <w:p>
+      <w:pPr>
+        <w:pStyle w:val="SPBodyText"/>
+      </w:pPr>
+      <w:r>
+        <w:t>This is not merely remembering history.</w:t>
+      </w:r>
+    </w:p>
+    <w:p>
+      <w:pPr>
+        <w:pStyle w:val="SPBodyText"/>
+      </w:pPr>
+      <w:r>
+        <w:t xml:space="preserve">It is remembering </w:t>
+      </w:r>
+      <w:r>
+        <w:t>who God is</w:t>
+      </w:r>
+      <w:r>
+        <w:t>.</w:t>
+      </w:r>
+    </w:p>
+    <w:p>
+      <w:pPr>
+        <w:pStyle w:val="SPBodyText"/>
+      </w:pPr>
+      <w:r>
+        <w:t>The God who made the promise is still God.</w:t>
+      </w:r>
+    </w:p>
+    <w:p>
+      <w:pPr>
+        <w:pStyle w:val="SPBodyText"/>
+      </w:pPr>
+      <w:r>
+        <w:t>The God who was faithful to Abraham is faithful now.</w:t>
+      </w:r>
+    </w:p>
+    <w:p>
+      <w:pPr>
+        <w:pStyle w:val="SPBodyText"/>
+      </w:pPr>
+      <w:r>
+        <w:t>The God who worked through generations is still working through ours.</w:t>
+      </w:r>
+    </w:p>
+    <w:p>
+      <w:pPr>
+        <w:pStyle w:val="SPBodyText"/>
+      </w:pPr>
+      <w:r>
+        <w:t>We often measure God's presence by what is happening in front of us.</w:t>
+      </w:r>
+    </w:p>
+    <w:p>
+      <w:pPr>
+        <w:pStyle w:val="SPBodyText"/>
+      </w:pPr>
+      <w:r>
+        <w:t>The Benedictus invites us to measure it differently.</w:t>
+      </w:r>
+    </w:p>
+    <w:p>
+      <w:pPr>
+        <w:pStyle w:val="SPBodyText"/>
+      </w:pPr>
+      <w:r>
+        <w:t>Look back.</w:t>
+      </w:r>
+    </w:p>
+    <w:p>
+      <w:pPr>
+        <w:pStyle w:val="SPBodyText"/>
+      </w:pPr>
+      <w:r>
+        <w:lastRenderedPageBreak/>
+        <w:t>Remember.</w:t>
+      </w:r>
+    </w:p>
+    <w:p>
+      <w:pPr>
+        <w:pStyle w:val="SPBodyText"/>
+      </w:pPr>
+      <w:r>
+        <w:t>God has been faithful before.</w:t>
+      </w:r>
+    </w:p>
+    <w:p>
+      <w:pPr>
+        <w:pStyle w:val="SPBodyText"/>
+      </w:pPr>
+      <w:r>
+        <w:t>God has carried His people before.</w:t>
+      </w:r>
+    </w:p>
+    <w:p>
+      <w:pPr>
+        <w:pStyle w:val="SPBodyText"/>
+      </w:pPr>
+      <w:r>
+        <w:t>God has brought light into darkness before.</w:t>
+      </w:r>
+    </w:p>
+    <w:p>
+      <w:pPr>
+        <w:pStyle w:val="SPBodyText"/>
+      </w:pPr>
+      <w:r>
+        <w:t xml:space="preserve">And </w:t>
+      </w:r>
+      <w:r>
+        <w:t>therefore,</w:t>
+      </w:r>
+      <w:r>
+        <w:t xml:space="preserve"> we can trust Him again.</w:t>
+      </w:r>
+    </w:p>
+    <w:p>
+      <w:pPr>
+        <w:pStyle w:val="SPBodyText"/>
+      </w:pPr>
+    </w:p>
+    <w:p>
+      <w:pPr>
+        <w:pStyle w:val="SPBodyText"/>
+      </w:pPr>
+      <w:r>
+        <w:t>Then Zechariah turns toward his son.</w:t>
+      </w:r>
+    </w:p>
+    <w:p>
+      <w:pPr>
+        <w:pStyle w:val="SPBodyText"/>
+      </w:pPr>
+      <w:r>
+        <w:t>John will not be the light.</w:t>
+      </w:r>
+    </w:p>
+    <w:p>
+      <w:pPr>
+        <w:pStyle w:val="SPBodyText"/>
+      </w:pPr>
+      <w:r>
+        <w:t>He will prepare the way for the Light.</w:t>
+      </w:r>
+    </w:p>
+    <w:p>
+      <w:pPr>
+        <w:pStyle w:val="SPBodyText"/>
+      </w:pPr>
+      <w:r>
+        <w:t>His vocation is not to draw attention to himself, but to point beyond himself toward Christ.</w:t>
+      </w:r>
+    </w:p>
+    <w:p>
+      <w:pPr>
+        <w:pStyle w:val="SPBodyText"/>
+      </w:pPr>
+      <w:r>
+        <w:t>There is something deeply Christian in this.</w:t>
+      </w:r>
+    </w:p>
+    <w:p>
+      <w:pPr>
+        <w:pStyle w:val="SPBodyText"/>
+      </w:pPr>
+      <w:r>
+        <w:t>Our lives are not ultimately about making ourselves important.</w:t>
+      </w:r>
+    </w:p>
+    <w:p>
+      <w:pPr>
+        <w:pStyle w:val="SPBodyText"/>
+      </w:pPr>
+      <w:r>
+        <w:t>We are called to prepare the way.</w:t>
+      </w:r>
+    </w:p>
+    <w:p>
+      <w:pPr>
+        <w:pStyle w:val="SPBodyText"/>
+      </w:pPr>
+      <w:r>
+        <w:t>Perhaps that means preparing a way for Christ in our own hearts.</w:t>
+      </w:r>
+    </w:p>
+    <w:p>
+      <w:pPr>
+        <w:pStyle w:val="SPBodyText"/>
+      </w:pPr>
+      <w:r>
+        <w:t>Perhaps it means preparing a way for Him in our families.</w:t>
+      </w:r>
+    </w:p>
+    <w:p>
+      <w:pPr>
+        <w:pStyle w:val="SPBodyText"/>
+      </w:pPr>
+      <w:r>
+        <w:t>Perhaps it means becoming a little more patient, forgiving, truthful, merciful, and courageous so that another person may encounter something of God's love through us.</w:t>
+      </w:r>
+    </w:p>
+    <w:p>
+      <w:pPr>
+        <w:pStyle w:val="SPBodyText"/>
+      </w:pPr>
+    </w:p>
+    <w:p>
+      <w:pPr>
+        <w:pStyle w:val="SPBodyText"/>
+        <w:sectPr>
+          <w:type w:val="evenPage"/>
+          <w:pgSz w:w="7920" w:h="12240" w:code="6"/>
+          <w:pgMar w:top="1080" w:right="864" w:bottom="1080" w:left="1152" w:header="576" w:footer="576" w:gutter="0"/>
+          <w:cols w:space="720"/>
+          <w:titlePg/>
+          <w:docGrid w:linePitch="360"/>
+        </w:sectPr>
+      </w:pPr>
+    </w:p>
+    <w:p>
+      <w:pPr>
+        <w:pStyle w:val="SPBodyText"/>
+      </w:pPr>
+      <w:r>
+        <w:lastRenderedPageBreak/>
+        <w:t>John prepares the way.</w:t>
+      </w:r>
+    </w:p>
+    <w:p>
+      <w:pPr>
+        <w:pStyle w:val="SPBodyText"/>
+      </w:pPr>
+      <w:r>
+        <w:t>And so can we.</w:t>
+      </w:r>
+    </w:p>
+    <w:p>
+      <w:pPr>
+        <w:pStyle w:val="SPBodyText"/>
+      </w:pPr>
+    </w:p>
+    <w:p>
+      <w:pPr>
+        <w:pStyle w:val="SPBodyText"/>
+      </w:pPr>
+      <w:r>
+        <w:t>One of the most beautiful moments in the Benedictus comes near its end.</w:t>
+      </w:r>
+    </w:p>
+    <w:p>
+      <w:pPr>
+        <w:pStyle w:val="SPBodyText"/>
+      </w:pPr>
+      <w:r>
+        <w:t xml:space="preserve">The coming of salvation is described through </w:t>
+      </w:r>
+      <w:r>
+        <w:t>the tender mercy of God.</w:t>
+      </w:r>
+    </w:p>
+    <w:p>
+      <w:pPr>
+        <w:pStyle w:val="SPBodyText"/>
+      </w:pPr>
+    </w:p>
+    <w:p>
+      <w:pPr>
+        <w:pStyle w:val="SPBodyText"/>
+      </w:pPr>
+      <w:r>
+        <w:t>God does not save from a distance.</w:t>
+      </w:r>
+    </w:p>
+    <w:p>
+      <w:pPr>
+        <w:pStyle w:val="SPBodyText"/>
+      </w:pPr>
+      <w:r>
+        <w:t>He draws near.</w:t>
+      </w:r>
+    </w:p>
+    <w:p>
+      <w:pPr>
+        <w:pStyle w:val="SPBodyText"/>
+      </w:pPr>
+      <w:r>
+        <w:t>He visits His people.</w:t>
+      </w:r>
+    </w:p>
+    <w:p>
+      <w:pPr>
+        <w:pStyle w:val="SPBodyText"/>
+      </w:pPr>
+      <w:r>
+        <w:t>He comes into our darkness.</w:t>
+      </w:r>
+    </w:p>
+    <w:p>
+      <w:pPr>
+        <w:pStyle w:val="SPBodyText"/>
+      </w:pPr>
+      <w:r>
+        <w:t>And the image that follows is one of dawn.</w:t>
+      </w:r>
+    </w:p>
+    <w:p>
+      <w:pPr>
+        <w:pStyle w:val="SPBodyText"/>
+      </w:pPr>
+      <w:r>
+        <w:t>The darkness does not overcome the light.</w:t>
+      </w:r>
+    </w:p>
+    <w:p>
+      <w:pPr>
+        <w:pStyle w:val="SPBodyText"/>
+      </w:pPr>
+      <w:r>
+        <w:t>The light comes.</w:t>
+      </w:r>
+    </w:p>
+    <w:p>
+      <w:pPr>
+        <w:pStyle w:val="SPBodyText"/>
+      </w:pPr>
+      <w:r>
+        <w:t>Slowly, perhaps.</w:t>
+      </w:r>
+    </w:p>
+    <w:p>
+      <w:pPr>
+        <w:pStyle w:val="SPBodyText"/>
+      </w:pPr>
+      <w:r>
+        <w:t>Quietly, perhaps.</w:t>
+      </w:r>
+    </w:p>
+    <w:p>
+      <w:pPr>
+        <w:pStyle w:val="SPBodyText"/>
+      </w:pPr>
+      <w:r>
+        <w:t>But it comes.</w:t>
+      </w:r>
+    </w:p>
+    <w:p>
+      <w:pPr>
+        <w:pStyle w:val="SPBodyText"/>
+        <w:sectPr>
+          <w:type w:val="evenPage"/>
+          <w:pgSz w:w="7920" w:h="12240" w:code="6"/>
+          <w:pgMar w:top="1080" w:right="864" w:bottom="1080" w:left="1152" w:header="576" w:footer="576" w:gutter="0"/>
+          <w:cols w:space="720"/>
+          <w:titlePg/>
+          <w:docGrid w:linePitch="360"/>
+        </w:sectPr>
+      </w:pPr>
+    </w:p>
+    <w:p>
+      <w:pPr>
+        <w:pStyle w:val="SPBodyText"/>
+      </w:pPr>
+      <w:r>
+        <w:lastRenderedPageBreak/>
+        <w:t>There are seasons when our own lives can feel like darkness.</w:t>
+      </w:r>
+    </w:p>
+    <w:p>
+      <w:pPr>
+        <w:pStyle w:val="SPBodyText"/>
+      </w:pPr>
+      <w:r>
+        <w:t>We may not know what lies ahead.</w:t>
+      </w:r>
+    </w:p>
+    <w:p>
+      <w:pPr>
+        <w:pStyle w:val="SPBodyText"/>
+      </w:pPr>
+      <w:r>
+        <w:t>We may carry grief, disappointment, fear, temptation, failure, or simply the exhaustion of ordinary life.</w:t>
+      </w:r>
+    </w:p>
+    <w:p>
+      <w:pPr>
+        <w:pStyle w:val="SPBodyText"/>
+      </w:pPr>
+      <w:r>
+        <w:t>The Benedictus does not pretend that darkness does not exist.</w:t>
+      </w:r>
+    </w:p>
+    <w:p>
+      <w:pPr>
+        <w:pStyle w:val="SPBodyText"/>
+      </w:pPr>
+      <w:r>
+        <w:t>Instead, it tells us where to look:</w:t>
+      </w:r>
+    </w:p>
+    <w:p>
+      <w:pPr>
+        <w:pStyle w:val="SPBodyText"/>
+      </w:pPr>
+      <w:r>
+        <w:t>toward the dawn.</w:t>
+      </w:r>
+    </w:p>
+    <w:p>
+      <w:pPr>
+        <w:pStyle w:val="SPBodyText"/>
+      </w:pPr>
+    </w:p>
+    <w:p>
+      <w:pPr>
+        <w:pStyle w:val="SPBodyText"/>
+      </w:pPr>
+      <w:r>
+        <w:t>The final words of the Benedictus are not about giving us a complete map of the future.</w:t>
+      </w:r>
+    </w:p>
+    <w:p>
+      <w:pPr>
+        <w:pStyle w:val="SPBodyText"/>
+      </w:pPr>
+      <w:r>
+        <w:t>They ask for something simpler:</w:t>
+      </w:r>
+    </w:p>
+    <w:p>
+      <w:pPr>
+        <w:pStyle w:val="SPBodyText"/>
+      </w:pPr>
+      <w:r>
+        <w:t>that God may guide our feet into the way of peace.</w:t>
+      </w:r>
+    </w:p>
+    <w:p>
+      <w:pPr>
+        <w:pStyle w:val="SPBodyText"/>
+      </w:pPr>
+      <w:r>
+        <w:t>Not necessarily the whole road.</w:t>
+      </w:r>
+    </w:p>
+    <w:p>
+      <w:pPr>
+        <w:pStyle w:val="SPBodyText"/>
+      </w:pPr>
+      <w:r>
+        <w:t>Just the next step.</w:t>
+      </w:r>
+    </w:p>
+    <w:p>
+      <w:pPr>
+        <w:pStyle w:val="SPBodyText"/>
+      </w:pPr>
+      <w:r>
+        <w:t>That may be all we need.</w:t>
+      </w:r>
+    </w:p>
+    <w:p>
+      <w:pPr>
+        <w:pStyle w:val="SPBodyText"/>
+      </w:pPr>
+      <w:r>
+        <w:t>We do not always need to know where the road will eventually lead.</w:t>
+      </w:r>
+    </w:p>
+    <w:p>
+      <w:pPr>
+        <w:pStyle w:val="SPBodyText"/>
+      </w:pPr>
+      <w:r>
+        <w:t>We need only enough light to take the next faithful step.</w:t>
+      </w:r>
+    </w:p>
+    <w:p>
+      <w:pPr>
+        <w:pStyle w:val="SPBodyText"/>
+        <w:sectPr>
+          <w:type w:val="oddPage"/>
+          <w:pgSz w:w="7920" w:h="12240" w:code="6"/>
+          <w:pgMar w:top="1080" w:right="864" w:bottom="1080" w:left="1152" w:header="576" w:footer="576" w:gutter="0"/>
+          <w:cols w:space="720"/>
+          <w:titlePg/>
+          <w:docGrid w:linePitch="360"/>
+        </w:sectPr>
+      </w:pPr>
+    </w:p>
+    <w:p>
+      <w:pPr>
+        <w:pStyle w:val="SPBodyText"/>
+      </w:pPr>
+      <w:r>
+        <w:lastRenderedPageBreak/>
+        <w:t>The Benedictus therefore becomes a prayer for our own lives.</w:t>
+      </w:r>
+    </w:p>
+    <w:p>
+      <w:pPr>
+        <w:pStyle w:val="SPBodyText"/>
+      </w:pPr>
+    </w:p>
+    <w:p>
+      <w:pPr>
+        <w:pStyle w:val="SPBodyText"/>
+      </w:pPr>
+      <w:r>
+        <w:t>When we are uncertain:</w:t>
+      </w:r>
+    </w:p>
+    <w:p>
+      <w:pPr>
+        <w:pStyle w:val="SPBodyText"/>
+      </w:pPr>
+      <w:r>
+        <w:t>Guide our feet.</w:t>
+      </w:r>
+    </w:p>
+    <w:p>
+      <w:pPr>
+        <w:pStyle w:val="SPBodyText"/>
+      </w:pPr>
+      <w:r>
+        <w:t>When we are afraid:</w:t>
+      </w:r>
+    </w:p>
+    <w:p>
+      <w:pPr>
+        <w:pStyle w:val="SPBodyText"/>
+      </w:pPr>
+      <w:r>
+        <w:t>Guide our feet.</w:t>
+      </w:r>
+    </w:p>
+    <w:p>
+      <w:pPr>
+        <w:pStyle w:val="SPBodyText"/>
+      </w:pPr>
+      <w:r>
+        <w:t>When we have wandered:</w:t>
+      </w:r>
+    </w:p>
+    <w:p>
+      <w:pPr>
+        <w:pStyle w:val="SPBodyText"/>
+      </w:pPr>
+      <w:r>
+        <w:t>Guide our feet.</w:t>
+      </w:r>
+    </w:p>
+    <w:p>
+      <w:pPr>
+        <w:pStyle w:val="SPBodyText"/>
+      </w:pPr>
+      <w:r>
+        <w:t>When we cannot see beyond the darkness:</w:t>
+      </w:r>
+    </w:p>
+    <w:p>
+      <w:pPr>
+        <w:pStyle w:val="SPBodyText"/>
+      </w:pPr>
+      <w:r>
+        <w:t>Guide our feet into the way of peace.</w:t>
+      </w:r>
+    </w:p>
+    <w:p>
+      <w:pPr>
+        <w:pStyle w:val="SPBodyText"/>
+      </w:pPr>
+    </w:p>
+    <w:p>
+      <w:pPr>
+        <w:pStyle w:val="SPBodyText"/>
+      </w:pPr>
+      <w:r>
+        <w:t>And perhaps this is why the Church gives this canticle to the morning.</w:t>
+      </w:r>
+    </w:p>
+    <w:p>
+      <w:pPr>
+        <w:pStyle w:val="SPBodyText"/>
+      </w:pPr>
+      <w:r>
+        <w:t>The day is beginning.</w:t>
+      </w:r>
+    </w:p>
+    <w:p>
+      <w:pPr>
+        <w:pStyle w:val="SPBodyText"/>
+      </w:pPr>
+      <w:r>
+        <w:t>We do not know what it will bring.</w:t>
+      </w:r>
+    </w:p>
+    <w:p>
+      <w:pPr>
+        <w:pStyle w:val="SPBodyText"/>
+      </w:pPr>
+      <w:r>
+        <w:t>But the dawn has come.</w:t>
+      </w:r>
+    </w:p>
+    <w:p>
+      <w:pPr>
+        <w:pStyle w:val="SPBodyText"/>
+      </w:pPr>
+      <w:r>
+        <w:t>Christ is our light.</w:t>
+      </w:r>
+    </w:p>
+    <w:p>
+      <w:pPr>
+        <w:pStyle w:val="SPBodyText"/>
+      </w:pPr>
+      <w:r>
+        <w:t>And we place our feet upon the road.</w:t>
+      </w:r>
+    </w:p>
+    <w:p>
+      <w:pPr>
+        <w:pStyle w:val="SPBodyText"/>
+      </w:pPr>
+    </w:p>
+    <w:p>
+      <w:pPr>
+        <w:pStyle w:val="SPBodyText"/>
+        <w:sectPr>
+          <w:type w:val="evenPage"/>
+          <w:pgSz w:w="7920" w:h="12240" w:code="6"/>
+          <w:pgMar w:top="1080" w:right="864" w:bottom="1080" w:left="1152" w:header="576" w:footer="576" w:gutter="0"/>
+          <w:cols w:space="720"/>
+          <w:titlePg/>
+          <w:docGrid w:linePitch="360"/>
+        </w:sectPr>
+      </w:pPr>
+    </w:p>
+    <w:p>
+      <w:pPr>
+        <w:pStyle w:val="SPBodyText"/>
+      </w:pPr>
+    </w:p>
+    <w:p>
+      <w:pPr>
+        <w:pStyle w:val="SPBodyText"/>
+      </w:pPr>
+      <w:r>
+        <w:t>When you pray the Benedictus, do not rush through it.</w:t>
+      </w:r>
+    </w:p>
+    <w:p>
+      <w:pPr>
+        <w:pStyle w:val="SPBodyText"/>
+      </w:pPr>
+      <w:r>
+        <w:t>Remember what God has done.</w:t>
+      </w:r>
+    </w:p>
+    <w:p>
+      <w:pPr>
+        <w:pStyle w:val="SPBodyText"/>
+      </w:pPr>
+      <w:r>
+        <w:t>Remember His promises.</w:t>
+      </w:r>
+    </w:p>
+    <w:p>
+      <w:pPr>
+        <w:pStyle w:val="SPBodyText"/>
+      </w:pPr>
+      <w:r>
+        <w:t>Remember that His mercy is still reaching toward you.</w:t>
+      </w:r>
+    </w:p>
+    <w:p>
+      <w:pPr>
+        <w:pStyle w:val="SPBodyText"/>
+      </w:pPr>
+      <w:r>
+        <w:t>Bring before Him the darkness you carry.</w:t>
+      </w:r>
+    </w:p>
+    <w:p>
+      <w:pPr>
+        <w:pStyle w:val="SPBodyText"/>
+      </w:pPr>
+      <w:r>
+        <w:t>Bring Him the people you love.</w:t>
+      </w:r>
+    </w:p>
+    <w:p>
+      <w:pPr>
+        <w:pStyle w:val="SPBodyText"/>
+      </w:pPr>
+      <w:r>
+        <w:t>Bring Him the things you cannot control.</w:t>
+      </w:r>
+    </w:p>
+    <w:p>
+      <w:pPr>
+        <w:pStyle w:val="SPBodyText"/>
+      </w:pPr>
+      <w:r>
+        <w:t>And then ask simply:</w:t>
+      </w:r>
+    </w:p>
+    <w:p>
+      <w:pPr>
+        <w:pStyle w:val="SPBodyText"/>
+      </w:pPr>
+      <w:r>
+        <w:t>Lord, guide my feet today.</w:t>
+      </w:r>
+    </w:p>
+    <w:p>
+      <w:pPr>
+        <w:pStyle w:val="SPBodyText"/>
+      </w:pPr>
+      <w:r>
+        <w:t>Not tomorrow.</w:t>
+      </w:r>
+    </w:p>
+    <w:p>
+      <w:pPr>
+        <w:pStyle w:val="SPBodyText"/>
+      </w:pPr>
+      <w:r>
+        <w:t>Not through the whole of my life.</w:t>
+      </w:r>
+      <w:r>
+        <w:t xml:space="preserve"> </w:t>
+      </w:r>
+      <w:r>
+        <w:t>Today.</w:t>
+      </w:r>
+    </w:p>
+    <w:p>
+      <w:pPr>
+        <w:pStyle w:val="SPBodyText"/>
+      </w:pPr>
+      <w:r>
+        <w:t>Guide my feet into the way of peace.</w:t>
+      </w:r>
+    </w:p>
+    <w:p>
+      <w:pPr>
+        <w:pStyle w:val="SPBodyText"/>
+      </w:pPr>
+    </w:p>
+    <w:p>
+      <w:pPr>
+        <w:jc w:val="center"/>
+        <w:sectPr>
+          <w:type w:val="oddPage"/>
+          <w:pgSz w:w="7920" w:h="12240" w:code="6"/>
+          <w:pgMar w:top="1080" w:right="864" w:bottom="1080" w:left="1152" w:header="576" w:footer="576" w:gutter="0"/>
+          <w:cols w:space="720"/>
+          <w:titlePg/>
+          <w:docGrid w:linePitch="360"/>
+        </w:sectPr>
+      </w:pPr>
       <w:r>
         <w:rPr>
           <w:rFonts w:ascii="Segoe UI Symbol" w:hAnsi="Segoe UI Symbol" w:cs="Segoe UI Symbol"/>
@@ -10925,7 +11012,7 @@
     </w:p>
     <w:p>
       <w:pPr>
-        <w:pStyle w:val="SPBodyText"/>
+        <w:jc w:val="center"/>
       </w:pPr>
       <w:r>
         <w:rPr>
@@ -11019,14 +11106,6 @@
       <w:pPr>
         <w:pStyle w:val="SPBodyText"/>
       </w:pPr>
-    </w:p>
-    <w:p>
-      <w:pPr>
-        <w:pStyle w:val="SPBodyText"/>
-      </w:pPr>
-      <w:r>
-        <w:t>“My soul proclaims the greatness of the Lord.”</w:t>
-      </w:r>
     </w:p>
     <w:p>
       <w:pPr>
@@ -11527,113 +11606,120 @@
     </w:p>
     <w:p>
       <w:pPr>
-        <w:pStyle w:val="SPBodyText"/>
-      </w:pPr>
-      <w:r>
-        <w:t>A Soul That Magnifies God</w:t>
-      </w:r>
-    </w:p>
-    <w:p>
-      <w:pPr>
-        <w:pStyle w:val="SPBodyText"/>
-      </w:pPr>
-    </w:p>
-    <w:p>
-      <w:pPr>
-        <w:pStyle w:val="SPBodyText"/>
-      </w:pPr>
-      <w:r>
-        <w:t>Mary's song begins with a simple declaration:</w:t>
-      </w:r>
-    </w:p>
-    <w:p>
-      <w:pPr>
-        <w:pStyle w:val="SPBodyText"/>
-      </w:pPr>
-      <w:r>
-        <w:t>My soul proclaims the greatness of the Lord.</w:t>
-      </w:r>
-    </w:p>
-    <w:p>
-      <w:pPr>
-        <w:pStyle w:val="SPBodyText"/>
-      </w:pPr>
-    </w:p>
-    <w:p>
-      <w:pPr>
-        <w:pStyle w:val="SPBodyText"/>
-      </w:pPr>
-      <w:r>
-        <w:t>She does not begin by speaking about herself, even though something extraordinary has happened to her. She begins with God.</w:t>
-      </w:r>
-    </w:p>
-    <w:p>
-      <w:pPr>
-        <w:pStyle w:val="SPBodyText"/>
-      </w:pPr>
-    </w:p>
-    <w:p>
-      <w:pPr>
-        <w:pStyle w:val="SPBodyText"/>
-      </w:pPr>
-      <w:r>
-        <w:t>The Magnificat is Mary's response to the mystery she has received. She has been chosen to bear the Son of God, yet she does not speak as though she has earned this honour. She calls herself His lowly servant.</w:t>
-      </w:r>
-    </w:p>
-    <w:p>
-      <w:pPr>
-        <w:pStyle w:val="SPBodyText"/>
-      </w:pPr>
-      <w:r>
-        <w:t>There is a quiet humility in her words.</w:t>
-      </w:r>
-    </w:p>
-    <w:p>
-      <w:pPr>
-        <w:pStyle w:val="SPBodyText"/>
-      </w:pPr>
-    </w:p>
-    <w:p>
-      <w:pPr>
-        <w:pStyle w:val="SPBodyText"/>
-      </w:pPr>
-      <w:r>
-        <w:t>Mary knows that God has looked upon her with mercy, and she knows that what He has done through her is greater than anything she could have accomplished by herself.</w:t>
-      </w:r>
-    </w:p>
-    <w:p>
-      <w:pPr>
-        <w:pStyle w:val="SPBodyText"/>
-      </w:pPr>
-      <w:r>
-        <w:t>He has looked with favour on His lowly servant.</w:t>
-      </w:r>
-    </w:p>
-    <w:p>
-      <w:pPr>
-        <w:pStyle w:val="SPBodyText"/>
-      </w:pPr>
-      <w:r>
-        <w:t>The Magnificat therefore teaches us something important about gratitude.</w:t>
-      </w:r>
-    </w:p>
-    <w:p>
-      <w:pPr>
-        <w:pStyle w:val="SPBodyText"/>
-      </w:pPr>
-      <w:r>
-        <w:t xml:space="preserve">To give thanks is not merely to say that we have received something good. It is to recognise </w:t>
-      </w:r>
-      <w:r>
         <w:rPr>
           <w:b/>
           <w:bCs/>
         </w:rPr>
+      </w:pPr>
+      <w:r>
+        <w:rPr>
+          <w:b/>
+          <w:bCs/>
+        </w:rPr>
+        <w:t>A Soul That Magnifies God</w:t>
+      </w:r>
+    </w:p>
+    <w:p>
+      <w:pPr>
+        <w:pStyle w:val="SPBodyText"/>
+      </w:pPr>
+    </w:p>
+    <w:p>
+      <w:pPr>
+        <w:pStyle w:val="SPBodyText"/>
+      </w:pPr>
+      <w:r>
+        <w:t>Mary's song begins with a simple declaration:</w:t>
+      </w:r>
+    </w:p>
+    <w:p>
+      <w:pPr>
+        <w:pStyle w:val="SPBodyText"/>
+      </w:pPr>
+      <w:r>
+        <w:t>My soul proclaims the greatness of the Lord.</w:t>
+      </w:r>
+    </w:p>
+    <w:p>
+      <w:pPr>
+        <w:pStyle w:val="SPBodyText"/>
+      </w:pPr>
+    </w:p>
+    <w:p>
+      <w:pPr>
+        <w:pStyle w:val="SPBodyText"/>
+      </w:pPr>
+      <w:r>
+        <w:t>She does not begin by speaking about herself, even though something extraordinary has happened to her. She begins with God.</w:t>
+      </w:r>
+    </w:p>
+    <w:p>
+      <w:pPr>
+        <w:pStyle w:val="SPBodyText"/>
+      </w:pPr>
+    </w:p>
+    <w:p>
+      <w:pPr>
+        <w:pStyle w:val="SPBodyText"/>
+      </w:pPr>
+      <w:r>
+        <w:t>The Magnificat is Mary's response to the mystery she has received. She has been chosen to bear the Son of God, yet she does not speak as though she has earned this honour. She calls herself His lowly servant.</w:t>
+      </w:r>
+    </w:p>
+    <w:p>
+      <w:pPr>
+        <w:pStyle w:val="SPBodyText"/>
+      </w:pPr>
+      <w:r>
+        <w:t>There is a quiet humility in her words.</w:t>
+      </w:r>
+    </w:p>
+    <w:p>
+      <w:pPr>
+        <w:pStyle w:val="SPBodyText"/>
+      </w:pPr>
+      <w:r>
+        <w:t>Mary knows that God has looked upon her with mercy, and she knows that what He has done through her is greater than anything she could have accomplished by herself.</w:t>
+      </w:r>
+    </w:p>
+    <w:p>
+      <w:pPr>
+        <w:pStyle w:val="SPBodyText"/>
+      </w:pPr>
+      <w:r>
+        <w:t>He has looked with favour on His lowly servant.</w:t>
+      </w:r>
+    </w:p>
+    <w:p>
+      <w:pPr>
+        <w:pStyle w:val="SPBodyText"/>
+      </w:pPr>
+      <w:r>
+        <w:t>The Magnificat therefore teaches us something important about gratitude.</w:t>
+      </w:r>
+    </w:p>
+    <w:p>
+      <w:pPr>
+        <w:pStyle w:val="SPBodyText"/>
+      </w:pPr>
+      <w:r>
+        <w:t xml:space="preserve">To give thanks is not merely to say that we have received something good. It is to recognise </w:t>
+      </w:r>
+      <w:r>
+        <w:rPr>
+          <w:b/>
+          <w:bCs/>
+        </w:rPr>
         <w:t>the One who gave it</w:t>
       </w:r>
       <w:r>
         <w:t>.</w:t>
       </w:r>
+    </w:p>
+    <w:p>
+      <w:pPr>
+        <w:pStyle w:val="SPBodyText"/>
+      </w:pPr>
     </w:p>
     <w:p>
       <w:pPr>
@@ -11656,19 +11742,6 @@
       <w:pPr>
         <w:pStyle w:val="SPBodyText"/>
       </w:pPr>
-    </w:p>
-    <w:p>
-      <w:pPr>
-        <w:pStyle w:val="SPBodyText"/>
-      </w:pPr>
-      <w:r>
-        <w:t>The God Who Lifts the Lowly</w:t>
-      </w:r>
-    </w:p>
-    <w:p>
-      <w:pPr>
-        <w:pStyle w:val="SPBodyText"/>
-      </w:pPr>
       <w:r>
         <w:t>Mary then speaks of a God who turns the world's expectations upside down.</w:t>
       </w:r>
@@ -11780,6 +11853,11 @@
       <w:r>
         <w:t>Her own life is not separate from God's work in history. The promise made to Abraham is now being fulfilled before her eyes.</w:t>
       </w:r>
+    </w:p>
+    <w:p>
+      <w:pPr>
+        <w:pStyle w:val="SPBodyText"/>
+      </w:pPr>
     </w:p>
     <w:p>
       <w:pPr>
@@ -11797,11 +11875,9 @@
       <w:r>
         <w:t>Yet Mary's response is not pride.</w:t>
       </w:r>
-    </w:p>
-    <w:p>
-      <w:pPr>
-        <w:pStyle w:val="SPBodyText"/>
-      </w:pPr>
+      <w:r>
+        <w:t xml:space="preserve"> </w:t>
+      </w:r>
       <w:r>
         <w:t>It is worship.</w:t>
       </w:r>
@@ -11809,19 +11885,7 @@
     <w:p>
       <w:pPr>
         <w:pStyle w:val="SPBodyText"/>
-      </w:pPr>
-    </w:p>
-    <w:p>
-      <w:pPr>
-        <w:pStyle w:val="SPBodyText"/>
-      </w:pPr>
-      <w:r>
-        <w:t>Mercy From Generation to Generation</w:t>
-      </w:r>
-    </w:p>
-    <w:p>
-      <w:pPr>
-        <w:pStyle w:val="SPBodyText"/>
+        <w:ind w:firstLine="0"/>
       </w:pPr>
       <w:r>
         <w:t>One phrase appears again and again beneath the Magnificat:</w:t>
@@ -11948,15 +12012,15 @@
         <w:pStyle w:val="SPBodyText"/>
       </w:pPr>
       <w:r>
+        <w:t>When we pray these words, we join our voices to hers.</w:t>
+      </w:r>
+    </w:p>
+    <w:p>
+      <w:pPr>
+        <w:pStyle w:val="SPBodyText"/>
+      </w:pPr>
+      <w:r>
         <w:lastRenderedPageBreak/>
-        <w:t>When we pray these words, we join our voices to hers.</w:t>
-      </w:r>
-    </w:p>
-    <w:p>
-      <w:pPr>
-        <w:pStyle w:val="SPBodyText"/>
-      </w:pPr>
-      <w:r>
         <w:t>We bring before God the blessings we have received, the promises we are still waiting to see fulfilled, and the places in our lives where we need His mercy.</w:t>
       </w:r>
     </w:p>
@@ -12044,14 +12108,6 @@
         <w:pStyle w:val="SPBodyText"/>
       </w:pPr>
       <w:r>
-        <w:t>A Prayer of Trust</w:t>
-      </w:r>
-    </w:p>
-    <w:p>
-      <w:pPr>
-        <w:pStyle w:val="SPBodyText"/>
-      </w:pPr>
-      <w:r>
         <w:t>The Magnificat is therefore more than a hymn of praise.</w:t>
       </w:r>
     </w:p>
@@ -12079,14 +12135,7 @@
         <w:t xml:space="preserve">She knows only enough to say </w:t>
       </w:r>
       <w:r>
-        <w:rPr>
-          <w:b/>
-          <w:bCs/>
-        </w:rPr>
-        <w:t>yes</w:t>
-      </w:r>
-      <w:r>
-        <w:t>.</w:t>
+        <w:t>yes.</w:t>
       </w:r>
     </w:p>
     <w:p>
@@ -12095,111 +12144,6 @@
       </w:pPr>
       <w:r>
         <w:t>And that is sometimes enough for us too.</w:t>
-      </w:r>
-    </w:p>
-    <w:p>
-      <w:pPr>
-        <w:pStyle w:val="SPBodyText"/>
-      </w:pPr>
-      <w:r>
-        <w:lastRenderedPageBreak/>
-        <w:t>There will be moments when we cannot see what God is doing.</w:t>
-      </w:r>
-    </w:p>
-    <w:p>
-      <w:pPr>
-        <w:pStyle w:val="SPBodyText"/>
-      </w:pPr>
-      <w:r>
-        <w:t>There will be prayers whose answers seem distant.</w:t>
-      </w:r>
-    </w:p>
-    <w:p>
-      <w:pPr>
-        <w:pStyle w:val="SPBodyText"/>
-      </w:pPr>
-      <w:r>
-        <w:t>There will be roads whose destination we cannot yet see.</w:t>
-      </w:r>
-    </w:p>
-    <w:p>
-      <w:pPr>
-        <w:pStyle w:val="SPBodyText"/>
-      </w:pPr>
-      <w:r>
-        <w:t>The Magnificat teaches us not to wait until everything is understood before giving thanks.</w:t>
-      </w:r>
-    </w:p>
-    <w:p>
-      <w:pPr>
-        <w:pStyle w:val="SPBodyText"/>
-      </w:pPr>
-      <w:r>
-        <w:t>We can praise God in the midst of uncertainty.</w:t>
-      </w:r>
-    </w:p>
-    <w:p>
-      <w:pPr>
-        <w:pStyle w:val="SPBodyText"/>
-      </w:pPr>
-      <w:r>
-        <w:t>We can remember His faithfulness when our own faith feels small.</w:t>
-      </w:r>
-    </w:p>
-    <w:p>
-      <w:pPr>
-        <w:pStyle w:val="SPBodyText"/>
-      </w:pPr>
-      <w:r>
-        <w:t>We can say with Mary:</w:t>
-      </w:r>
-    </w:p>
-    <w:p>
-      <w:pPr>
-        <w:pStyle w:val="SPBodyText"/>
-      </w:pPr>
-      <w:r>
-        <w:t>My soul proclaims the greatness of the Lord.</w:t>
-      </w:r>
-    </w:p>
-    <w:p>
-      <w:pPr>
-        <w:pStyle w:val="SPBodyText"/>
-      </w:pPr>
-      <w:r>
-        <w:t>Not because everything is easy.</w:t>
-      </w:r>
-    </w:p>
-    <w:p>
-      <w:pPr>
-        <w:pStyle w:val="SPBodyText"/>
-      </w:pPr>
-      <w:r>
-        <w:t>Not because everything has been explained.</w:t>
-      </w:r>
-    </w:p>
-    <w:p>
-      <w:pPr>
-        <w:pStyle w:val="SPBodyText"/>
-      </w:pPr>
-      <w:r>
-        <w:t>But because God is faithful.</w:t>
-      </w:r>
-    </w:p>
-    <w:p>
-      <w:pPr>
-        <w:pStyle w:val="SPBodyText"/>
-      </w:pPr>
-      <w:r>
-        <w:t>And the God who remembered His promise to Abraham has not forgotten us.</w:t>
-      </w:r>
-    </w:p>
-    <w:p>
-      <w:pPr>
-        <w:pStyle w:val="SPBodyText"/>
-      </w:pPr>
-      <w:r>
-        <w:t> </w:t>
       </w:r>
     </w:p>
     <w:p>
@@ -12214,87 +12158,123 @@
           <w:docGrid w:linePitch="360"/>
         </w:sectPr>
       </w:pPr>
-      <w:r>
-        <w:rPr>
-          <w:rFonts w:ascii="Segoe UI Symbol" w:hAnsi="Segoe UI Symbol" w:cs="Segoe UI Symbol"/>
-        </w:rPr>
-        <w:t>✠</w:t>
-      </w:r>
-    </w:p>
-    <w:p>
-      <w:pPr>
-        <w:pStyle w:val="SPBodyText"/>
-      </w:pPr>
-      <w:r>
-        <w:rPr>
-          <w:rFonts w:ascii="Segoe UI Symbol" w:hAnsi="Segoe UI Symbol" w:cs="Segoe UI Symbol"/>
-        </w:rPr>
+    </w:p>
+    <w:p>
+      <w:pPr>
+        <w:pStyle w:val="SPBodyText"/>
+      </w:pPr>
+      <w:r>
         <w:lastRenderedPageBreak/>
-        <w:t>✠</w:t>
-      </w:r>
-    </w:p>
-    <w:p>
-      <w:pPr>
-        <w:pStyle w:val="SPBodyText"/>
-      </w:pPr>
-    </w:p>
-    <w:p>
-      <w:pPr>
-        <w:pStyle w:val="SPPrayerTitle"/>
-      </w:pPr>
-      <w:bookmarkStart w:id="20" w:name="_Toc240260250"/>
-      <w:r>
-        <w:t>Nunc Dimit</w:t>
-      </w:r>
-      <w:r>
-        <w:t>t</w:t>
-      </w:r>
-      <w:r>
-        <w:t>is</w:t>
-      </w:r>
-      <w:bookmarkEnd w:id="20"/>
-    </w:p>
-    <w:p>
-      <w:pPr>
-        <w:pStyle w:val="SPLanguage"/>
-      </w:pPr>
-      <w:r>
-        <w:t>(Canticle of Simeon)</w:t>
-      </w:r>
-    </w:p>
-    <w:p>
-      <w:pPr>
-        <w:pStyle w:val="SPBodyText"/>
-      </w:pPr>
-      <w:r>
-        <w:t>The Nunc Dimittis is the song of Simeon, an elderly and faithful man who had been waiting for the fulfilment of God's promise. When Mary and Joseph brought the infant Jesus to the Temple, Simeon recognised Him as the promised salvation of God.</w:t>
-      </w:r>
-      <w:r>
-        <w:t xml:space="preserve"> </w:t>
-      </w:r>
-      <w:r>
-        <w:t>Having seen Christ, Simeon could finally say that he was ready to depart in peace.</w:t>
-      </w:r>
-    </w:p>
-    <w:p>
-      <w:pPr>
-        <w:pStyle w:val="SPBodyText"/>
-      </w:pPr>
-      <w:r>
-        <w:t>The canticle is therefore a prayer of recognition and fulfilment. Simeon had waited, and God had been faithful to His promise. What he had hoped for was now before his eyes.</w:t>
-      </w:r>
-    </w:p>
-    <w:p>
-      <w:pPr>
-        <w:pStyle w:val="SPBodyText"/>
-      </w:pPr>
-      <w:r>
-        <w:t>His words also remind us that God's salvation is not given to one people alone. Christ is proclaimed as a light for the nations and the glory of Israel.</w:t>
-      </w:r>
-    </w:p>
-    <w:p>
-      <w:pPr>
-        <w:pStyle w:val="SPBodyText"/>
+        <w:t>There will be moments when we cannot see what God is doing.</w:t>
+      </w:r>
+    </w:p>
+    <w:p>
+      <w:pPr>
+        <w:pStyle w:val="SPBodyText"/>
+      </w:pPr>
+      <w:r>
+        <w:t>There will be prayers whose answers seem distant.</w:t>
+      </w:r>
+    </w:p>
+    <w:p>
+      <w:pPr>
+        <w:pStyle w:val="SPBodyText"/>
+      </w:pPr>
+      <w:r>
+        <w:t>There will be roads whose destination we cannot yet see.</w:t>
+      </w:r>
+    </w:p>
+    <w:p>
+      <w:pPr>
+        <w:pStyle w:val="SPBodyText"/>
+      </w:pPr>
+      <w:r>
+        <w:t>The Magnificat teaches us not to wait until everything is understood before giving thanks.</w:t>
+      </w:r>
+    </w:p>
+    <w:p>
+      <w:pPr>
+        <w:pStyle w:val="SPBodyText"/>
+      </w:pPr>
+      <w:r>
+        <w:t>We can praise God in the midst of uncertainty.</w:t>
+      </w:r>
+    </w:p>
+    <w:p>
+      <w:pPr>
+        <w:pStyle w:val="SPBodyText"/>
+      </w:pPr>
+      <w:r>
+        <w:t>We can remember His faithfulness when our own faith feels small.</w:t>
+      </w:r>
+    </w:p>
+    <w:p>
+      <w:pPr>
+        <w:pStyle w:val="SPBodyText"/>
+      </w:pPr>
+      <w:r>
+        <w:t>We can say with Mary:</w:t>
+      </w:r>
+    </w:p>
+    <w:p>
+      <w:pPr>
+        <w:pStyle w:val="SPBodyText"/>
+      </w:pPr>
+    </w:p>
+    <w:p>
+      <w:pPr>
+        <w:pStyle w:val="SPBodyText"/>
+      </w:pPr>
+      <w:r>
+        <w:t>My soul proclaims the greatness of the Lord.</w:t>
+      </w:r>
+    </w:p>
+    <w:p>
+      <w:pPr>
+        <w:pStyle w:val="SPBodyText"/>
+      </w:pPr>
+    </w:p>
+    <w:p>
+      <w:pPr>
+        <w:pStyle w:val="SPBodyText"/>
+      </w:pPr>
+      <w:r>
+        <w:t>Not because everything is easy.</w:t>
+      </w:r>
+    </w:p>
+    <w:p>
+      <w:pPr>
+        <w:pStyle w:val="SPBodyText"/>
+      </w:pPr>
+      <w:r>
+        <w:t>Not because everything has been explained.</w:t>
+      </w:r>
+    </w:p>
+    <w:p>
+      <w:pPr>
+        <w:pStyle w:val="SPBodyText"/>
+      </w:pPr>
+      <w:r>
+        <w:t>But because God is faithful</w:t>
+      </w:r>
+      <w:r>
+        <w:t xml:space="preserve"> and He </w:t>
+      </w:r>
+      <w:r>
+        <w:t>has not forgotten us.</w:t>
+      </w:r>
+    </w:p>
+    <w:p>
+      <w:pPr>
+        <w:pStyle w:val="SPBodyText"/>
+      </w:pPr>
+      <w:r>
+        <w:t> </w:t>
+      </w:r>
+    </w:p>
+    <w:p>
+      <w:pPr>
+        <w:jc w:val="center"/>
         <w:sectPr>
           <w:type w:val="oddPage"/>
           <w:pgSz w:w="7920" w:h="12240" w:code="6"/>
@@ -12305,10 +12285,130 @@
         </w:sectPr>
       </w:pPr>
       <w:r>
-        <w:t xml:space="preserve">It is traditionally prayed </w:t>
-      </w:r>
-      <w:r>
-        <w:t>during Night Prayer, making it a fitting prayer at the end of the day. As we prepare for sleep, we can place the day into God's hands and rest in the knowledge that He remains faithful.</w:t>
+        <w:rPr>
+          <w:rFonts w:ascii="Segoe UI Symbol" w:hAnsi="Segoe UI Symbol" w:cs="Segoe UI Symbol"/>
+        </w:rPr>
+        <w:t>✠</w:t>
+      </w:r>
+    </w:p>
+    <w:p>
+      <w:pPr>
+        <w:jc w:val="center"/>
+      </w:pPr>
+      <w:r>
+        <w:rPr>
+          <w:rFonts w:ascii="Segoe UI Symbol" w:hAnsi="Segoe UI Symbol" w:cs="Segoe UI Symbol"/>
+        </w:rPr>
+        <w:lastRenderedPageBreak/>
+        <w:t>✠</w:t>
+      </w:r>
+    </w:p>
+    <w:p>
+      <w:pPr>
+        <w:pStyle w:val="SPBodyText"/>
+      </w:pPr>
+    </w:p>
+    <w:p>
+      <w:pPr>
+        <w:pStyle w:val="SPPrayerTitle"/>
+      </w:pPr>
+      <w:bookmarkStart w:id="20" w:name="_Toc240260250"/>
+      <w:r>
+        <w:t>Nunc Dimit</w:t>
+      </w:r>
+      <w:r>
+        <w:t>t</w:t>
+      </w:r>
+      <w:r>
+        <w:t>is</w:t>
+      </w:r>
+      <w:bookmarkEnd w:id="20"/>
+    </w:p>
+    <w:p>
+      <w:pPr>
+        <w:pStyle w:val="SPLanguage"/>
+      </w:pPr>
+      <w:r>
+        <w:t>(Canticle of Simeon)</w:t>
+      </w:r>
+    </w:p>
+    <w:p>
+      <w:pPr>
+        <w:pStyle w:val="SPBodyText"/>
+      </w:pPr>
+      <w:r>
+        <w:t>The Nunc Dimittis is the song of Simeon, an elderly and faithful man who had been waiting for the fulfilment of God's promise. When Mary and Joseph brought the infant Jesus to the Temple, Simeon recognised Him as the promised salvation of God.</w:t>
+      </w:r>
+      <w:r>
+        <w:t xml:space="preserve"> </w:t>
+      </w:r>
+      <w:r>
+        <w:t>Having seen Christ, Simeon could finally say that he was ready to depart in peace.</w:t>
+      </w:r>
+    </w:p>
+    <w:p>
+      <w:pPr>
+        <w:pStyle w:val="SPBodyText"/>
+      </w:pPr>
+      <w:r>
+        <w:t>The canticle is therefore a prayer of recognition and fulfilment. Simeon had waited, and God had been faithful to His promise. What he had hoped for was now before his eyes.</w:t>
+      </w:r>
+    </w:p>
+    <w:p>
+      <w:pPr>
+        <w:pStyle w:val="SPBodyText"/>
+      </w:pPr>
+      <w:r>
+        <w:t>His words also remind us that God's salvation is not given to one people alone. Christ is proclaimed as a light for the nations and the glory of Israel.</w:t>
+      </w:r>
+    </w:p>
+    <w:p>
+      <w:pPr>
+        <w:pStyle w:val="SPBodyText"/>
+      </w:pPr>
+      <w:r>
+        <w:t>As we prepare for sleep, we can place the day into God's hands and rest in the knowledge that He remains faithful.</w:t>
+      </w:r>
+    </w:p>
+    <w:p>
+      <w:pPr>
+        <w:pStyle w:val="SPBodyText"/>
+      </w:pPr>
+    </w:p>
+    <w:p>
+      <w:pPr>
+        <w:pStyle w:val="SPBodyText"/>
+        <w:sectPr>
+          <w:type w:val="oddPage"/>
+          <w:pgSz w:w="7920" w:h="12240" w:code="6"/>
+          <w:pgMar w:top="1080" w:right="864" w:bottom="1080" w:left="1152" w:header="576" w:footer="576" w:gutter="0"/>
+          <w:cols w:space="720"/>
+          <w:titlePg/>
+          <w:docGrid w:linePitch="360"/>
+        </w:sectPr>
+      </w:pPr>
+      <w:r>
+        <w:t xml:space="preserve">Traditionally, the </w:t>
+      </w:r>
+      <w:r>
+        <w:rPr>
+          <w:b/>
+          <w:bCs/>
+        </w:rPr>
+        <w:t>Nunc Dimittis</w:t>
+      </w:r>
+      <w:r>
+        <w:t xml:space="preserve"> is prayed as part of </w:t>
+      </w:r>
+      <w:r>
+        <w:rPr>
+          <w:b/>
+          <w:bCs/>
+        </w:rPr>
+        <w:t>Compline (Night Prayer)</w:t>
+      </w:r>
+      <w:r>
+        <w:t xml:space="preserve"> in the Liturgy of the Hours.</w:t>
       </w:r>
     </w:p>
     <w:p>
@@ -12518,13 +12618,16 @@
     </w:p>
     <w:p>
       <w:pPr>
-        <w:pStyle w:val="SPBodyText"/>
-        <w:rPr>
+        <w:rPr>
+          <w:b/>
+          <w:bCs/>
           <w:lang w:eastAsia="en-ZA"/>
         </w:rPr>
       </w:pPr>
       <w:r>
         <w:rPr>
+          <w:b/>
+          <w:bCs/>
           <w:lang w:eastAsia="en-ZA"/>
         </w:rPr>
         <w:t>Seeing the Light</w:t>
@@ -12883,11 +12986,15 @@
       <w:pPr>
         <w:pStyle w:val="SPBodyText"/>
         <w:rPr>
+          <w:i/>
+          <w:iCs/>
           <w:lang w:eastAsia="en-ZA"/>
         </w:rPr>
       </w:pPr>
       <w:r>
         <w:rPr>
+          <w:i/>
+          <w:iCs/>
           <w:lang w:eastAsia="en-ZA"/>
         </w:rPr>
         <w:t>“A light for revelation to the nations.”</w:t>
@@ -12933,54 +13040,25 @@
     </w:p>
     <w:p>
       <w:pPr>
-        <w:pStyle w:val="SPBodyText"/>
-      </w:pPr>
-      <w:r>
-        <w:t>Songs of the Waiting Heart</w:t>
-      </w:r>
-    </w:p>
-    <w:p>
-      <w:pPr>
-        <w:pStyle w:val="SPBodyText"/>
-      </w:pPr>
-      <w:r>
-        <w:t>The three canticles we have prayed come from different moments in the story of salvation, yet they share a common movement of faith.</w:t>
-      </w:r>
-    </w:p>
-    <w:p>
-      <w:pPr>
-        <w:pStyle w:val="SPBodyText"/>
-      </w:pPr>
-      <w:r>
-        <w:t xml:space="preserve">In the </w:t>
-      </w:r>
-      <w:r>
         <w:rPr>
           <w:b/>
           <w:bCs/>
         </w:rPr>
-        <w:t>Benedictus</w:t>
-      </w:r>
-      <w:r>
-        <w:t>, Zechariah looks upon the promises of God and gives thanks. After a time of waiting, he sees that God has not forgotten His people.</w:t>
-      </w:r>
-    </w:p>
-    <w:p>
-      <w:pPr>
-        <w:pStyle w:val="SPBodyText"/>
-      </w:pPr>
-      <w:r>
-        <w:t xml:space="preserve">In the </w:t>
-      </w:r>
+      </w:pPr>
       <w:r>
         <w:rPr>
           <w:b/>
           <w:bCs/>
         </w:rPr>
-        <w:t>Magnificat</w:t>
-      </w:r>
-      <w:r>
-        <w:t>, Mary responds to God's work with praise. She rejoices not in herself, but in the greatness and mercy of God.</w:t>
+        <w:t>Songs of the Waiting Heart</w:t>
+      </w:r>
+    </w:p>
+    <w:p>
+      <w:pPr>
+        <w:pStyle w:val="SPBodyText"/>
+      </w:pPr>
+      <w:r>
+        <w:t>The three canticles we have prayed come from different moments in the story of salvation, yet they share a common movement of faith.</w:t>
       </w:r>
     </w:p>
     <w:p>
@@ -12995,6 +13073,42 @@
           <w:b/>
           <w:bCs/>
         </w:rPr>
+        <w:t>Benedictus</w:t>
+      </w:r>
+      <w:r>
+        <w:t>, Zechariah looks upon the promises of God and gives thanks. After a time of waiting, he sees that God has not forgotten His people.</w:t>
+      </w:r>
+    </w:p>
+    <w:p>
+      <w:pPr>
+        <w:pStyle w:val="SPBodyText"/>
+      </w:pPr>
+      <w:r>
+        <w:t xml:space="preserve">In the </w:t>
+      </w:r>
+      <w:r>
+        <w:rPr>
+          <w:b/>
+          <w:bCs/>
+        </w:rPr>
+        <w:t>Magnificat</w:t>
+      </w:r>
+      <w:r>
+        <w:t>, Mary responds to God's work with praise. She rejoices not in herself, but in the greatness and mercy of God.</w:t>
+      </w:r>
+    </w:p>
+    <w:p>
+      <w:pPr>
+        <w:pStyle w:val="SPBodyText"/>
+      </w:pPr>
+      <w:r>
+        <w:t xml:space="preserve">In the </w:t>
+      </w:r>
+      <w:r>
+        <w:rPr>
+          <w:b/>
+          <w:bCs/>
+        </w:rPr>
         <w:t>Nunc Dimittis</w:t>
       </w:r>
       <w:r>
@@ -13047,7 +13161,13 @@
       <w:pPr>
         <w:pStyle w:val="SPBodyText"/>
       </w:pPr>
-      <w:r>
+    </w:p>
+    <w:p>
+      <w:pPr>
+        <w:pStyle w:val="SPBodyText"/>
+      </w:pPr>
+      <w:r>
+        <w:lastRenderedPageBreak/>
         <w:t>The canticles remind us that prayer does not always require many words.</w:t>
       </w:r>
     </w:p>
@@ -13056,7 +13176,6 @@
         <w:pStyle w:val="SPBodyText"/>
       </w:pPr>
       <w:r>
-        <w:lastRenderedPageBreak/>
         <w:t>Sometimes it is enough to remember that God is faithful.</w:t>
       </w:r>
     </w:p>
@@ -13088,7 +13207,7 @@
     </w:p>
     <w:p>
       <w:pPr>
-        <w:pStyle w:val="SPBodyText"/>
+        <w:jc w:val="center"/>
       </w:pPr>
       <w:r>
         <w:rPr>

</xml_diff>

<commit_message>
Add Ignatius Press Our Father and Benedictus samples.
</commit_message>
<xml_diff>
--- a/manuscript/volume-1/sacrae-preces-volume-1.docx
+++ b/manuscript/volume-1/sacrae-preces-volume-1.docx
@@ -420,7 +420,7 @@
           <w:r>
             <w:fldChar w:fldCharType="separate"/>
           </w:r>
-          <w:hyperlink w:anchor="_Toc240351955" w:history="1">
+          <w:hyperlink w:anchor="_Toc240371925" w:history="1">
             <w:r>
               <w:rPr>
                 <w:rStyle w:val="Hyperlink"/>
@@ -447,7 +447,7 @@
                 <w:noProof/>
                 <w:webHidden/>
               </w:rPr>
-              <w:instrText xml:space="preserve"> PAGEREF _Toc240351955 \h </w:instrText>
+              <w:instrText xml:space="preserve"> PAGEREF _Toc240371925 \h </w:instrText>
             </w:r>
             <w:r>
               <w:rPr>
@@ -492,7 +492,7 @@
               <w:lang w:eastAsia="en-ZA"/>
             </w:rPr>
           </w:pPr>
-          <w:hyperlink w:anchor="_Toc240351956" w:history="1">
+          <w:hyperlink w:anchor="_Toc240371926" w:history="1">
             <w:r>
               <w:rPr>
                 <w:rStyle w:val="Hyperlink"/>
@@ -519,7 +519,7 @@
                 <w:noProof/>
                 <w:webHidden/>
               </w:rPr>
-              <w:instrText xml:space="preserve"> PAGEREF _Toc240351956 \h </w:instrText>
+              <w:instrText xml:space="preserve"> PAGEREF _Toc240371926 \h </w:instrText>
             </w:r>
             <w:r>
               <w:rPr>
@@ -564,7 +564,7 @@
               <w:lang w:eastAsia="en-ZA"/>
             </w:rPr>
           </w:pPr>
-          <w:hyperlink w:anchor="_Toc240351957" w:history="1">
+          <w:hyperlink w:anchor="_Toc240371927" w:history="1">
             <w:r>
               <w:rPr>
                 <w:rStyle w:val="Hyperlink"/>
@@ -591,7 +591,7 @@
                 <w:noProof/>
                 <w:webHidden/>
               </w:rPr>
-              <w:instrText xml:space="preserve"> PAGEREF _Toc240351957 \h </w:instrText>
+              <w:instrText xml:space="preserve"> PAGEREF _Toc240371927 \h </w:instrText>
             </w:r>
             <w:r>
               <w:rPr>
@@ -636,7 +636,7 @@
               <w:lang w:eastAsia="en-ZA"/>
             </w:rPr>
           </w:pPr>
-          <w:hyperlink w:anchor="_Toc240351958" w:history="1">
+          <w:hyperlink w:anchor="_Toc240371928" w:history="1">
             <w:r>
               <w:rPr>
                 <w:rStyle w:val="Hyperlink"/>
@@ -663,7 +663,7 @@
                 <w:noProof/>
                 <w:webHidden/>
               </w:rPr>
-              <w:instrText xml:space="preserve"> PAGEREF _Toc240351958 \h </w:instrText>
+              <w:instrText xml:space="preserve"> PAGEREF _Toc240371928 \h </w:instrText>
             </w:r>
             <w:r>
               <w:rPr>
@@ -683,7 +683,7 @@
                 <w:noProof/>
                 <w:webHidden/>
               </w:rPr>
-              <w:t>10</w:t>
+              <w:t>9</w:t>
             </w:r>
             <w:r>
               <w:rPr>
@@ -708,7 +708,7 @@
               <w:lang w:eastAsia="en-ZA"/>
             </w:rPr>
           </w:pPr>
-          <w:hyperlink w:anchor="_Toc240351959" w:history="1">
+          <w:hyperlink w:anchor="_Toc240371929" w:history="1">
             <w:r>
               <w:rPr>
                 <w:rStyle w:val="Hyperlink"/>
@@ -735,7 +735,7 @@
                 <w:noProof/>
                 <w:webHidden/>
               </w:rPr>
-              <w:instrText xml:space="preserve"> PAGEREF _Toc240351959 \h </w:instrText>
+              <w:instrText xml:space="preserve"> PAGEREF _Toc240371929 \h </w:instrText>
             </w:r>
             <w:r>
               <w:rPr>
@@ -755,7 +755,7 @@
                 <w:noProof/>
                 <w:webHidden/>
               </w:rPr>
-              <w:t>11</w:t>
+              <w:t>10</w:t>
             </w:r>
             <w:r>
               <w:rPr>
@@ -780,7 +780,7 @@
               <w:lang w:eastAsia="en-ZA"/>
             </w:rPr>
           </w:pPr>
-          <w:hyperlink w:anchor="_Toc240351960" w:history="1">
+          <w:hyperlink w:anchor="_Toc240371930" w:history="1">
             <w:r>
               <w:rPr>
                 <w:rStyle w:val="Hyperlink"/>
@@ -807,7 +807,7 @@
                 <w:noProof/>
                 <w:webHidden/>
               </w:rPr>
-              <w:instrText xml:space="preserve"> PAGEREF _Toc240351960 \h </w:instrText>
+              <w:instrText xml:space="preserve"> PAGEREF _Toc240371930 \h </w:instrText>
             </w:r>
             <w:r>
               <w:rPr>
@@ -827,7 +827,7 @@
                 <w:noProof/>
                 <w:webHidden/>
               </w:rPr>
-              <w:t>11</w:t>
+              <w:t>10</w:t>
             </w:r>
             <w:r>
               <w:rPr>
@@ -852,7 +852,7 @@
               <w:lang w:eastAsia="en-ZA"/>
             </w:rPr>
           </w:pPr>
-          <w:hyperlink w:anchor="_Toc240351961" w:history="1">
+          <w:hyperlink w:anchor="_Toc240371931" w:history="1">
             <w:r>
               <w:rPr>
                 <w:rStyle w:val="Hyperlink"/>
@@ -879,7 +879,7 @@
                 <w:noProof/>
                 <w:webHidden/>
               </w:rPr>
-              <w:instrText xml:space="preserve"> PAGEREF _Toc240351961 \h </w:instrText>
+              <w:instrText xml:space="preserve"> PAGEREF _Toc240371931 \h </w:instrText>
             </w:r>
             <w:r>
               <w:rPr>
@@ -899,7 +899,7 @@
                 <w:noProof/>
                 <w:webHidden/>
               </w:rPr>
-              <w:t>12</w:t>
+              <w:t>11</w:t>
             </w:r>
             <w:r>
               <w:rPr>
@@ -924,7 +924,7 @@
               <w:lang w:eastAsia="en-ZA"/>
             </w:rPr>
           </w:pPr>
-          <w:hyperlink w:anchor="_Toc240351962" w:history="1">
+          <w:hyperlink w:anchor="_Toc240371932" w:history="1">
             <w:r>
               <w:rPr>
                 <w:rStyle w:val="Hyperlink"/>
@@ -951,7 +951,7 @@
                 <w:noProof/>
                 <w:webHidden/>
               </w:rPr>
-              <w:instrText xml:space="preserve"> PAGEREF _Toc240351962 \h </w:instrText>
+              <w:instrText xml:space="preserve"> PAGEREF _Toc240371932 \h </w:instrText>
             </w:r>
             <w:r>
               <w:rPr>
@@ -971,7 +971,7 @@
                 <w:noProof/>
                 <w:webHidden/>
               </w:rPr>
-              <w:t>13</w:t>
+              <w:t>12</w:t>
             </w:r>
             <w:r>
               <w:rPr>
@@ -996,7 +996,7 @@
               <w:lang w:eastAsia="en-ZA"/>
             </w:rPr>
           </w:pPr>
-          <w:hyperlink w:anchor="_Toc240351963" w:history="1">
+          <w:hyperlink w:anchor="_Toc240371933" w:history="1">
             <w:r>
               <w:rPr>
                 <w:rStyle w:val="Hyperlink"/>
@@ -1023,7 +1023,7 @@
                 <w:noProof/>
                 <w:webHidden/>
               </w:rPr>
-              <w:instrText xml:space="preserve"> PAGEREF _Toc240351963 \h </w:instrText>
+              <w:instrText xml:space="preserve"> PAGEREF _Toc240371933 \h </w:instrText>
             </w:r>
             <w:r>
               <w:rPr>
@@ -1068,7 +1068,7 @@
               <w:lang w:eastAsia="en-ZA"/>
             </w:rPr>
           </w:pPr>
-          <w:hyperlink w:anchor="_Toc240351964" w:history="1">
+          <w:hyperlink w:anchor="_Toc240371934" w:history="1">
             <w:r>
               <w:rPr>
                 <w:rStyle w:val="Hyperlink"/>
@@ -1095,7 +1095,7 @@
                 <w:noProof/>
                 <w:webHidden/>
               </w:rPr>
-              <w:instrText xml:space="preserve"> PAGEREF _Toc240351964 \h </w:instrText>
+              <w:instrText xml:space="preserve"> PAGEREF _Toc240371934 \h </w:instrText>
             </w:r>
             <w:r>
               <w:rPr>
@@ -1115,7 +1115,7 @@
                 <w:noProof/>
                 <w:webHidden/>
               </w:rPr>
-              <w:t>14</w:t>
+              <w:t>15</w:t>
             </w:r>
             <w:r>
               <w:rPr>
@@ -1140,13 +1140,13 @@
               <w:lang w:eastAsia="en-ZA"/>
             </w:rPr>
           </w:pPr>
-          <w:hyperlink w:anchor="_Toc240351965" w:history="1">
+          <w:hyperlink w:anchor="_Toc240371935" w:history="1">
             <w:r>
               <w:rPr>
                 <w:rStyle w:val="Hyperlink"/>
                 <w:noProof/>
               </w:rPr>
-              <w:t>Part I - Basic Prayers</w:t>
+              <w:t>Part I — Basic Prayers</w:t>
             </w:r>
             <w:r>
               <w:rPr>
@@ -1167,7 +1167,7 @@
                 <w:noProof/>
                 <w:webHidden/>
               </w:rPr>
-              <w:instrText xml:space="preserve"> PAGEREF _Toc240351965 \h </w:instrText>
+              <w:instrText xml:space="preserve"> PAGEREF _Toc240371935 \h </w:instrText>
             </w:r>
             <w:r>
               <w:rPr>
@@ -1212,7 +1212,7 @@
               <w:lang w:eastAsia="en-ZA"/>
             </w:rPr>
           </w:pPr>
-          <w:hyperlink w:anchor="_Toc240351966" w:history="1">
+          <w:hyperlink w:anchor="_Toc240371936" w:history="1">
             <w:r>
               <w:rPr>
                 <w:rStyle w:val="Hyperlink"/>
@@ -1239,7 +1239,7 @@
                 <w:noProof/>
                 <w:webHidden/>
               </w:rPr>
-              <w:instrText xml:space="preserve"> PAGEREF _Toc240351966 \h </w:instrText>
+              <w:instrText xml:space="preserve"> PAGEREF _Toc240371936 \h </w:instrText>
             </w:r>
             <w:r>
               <w:rPr>
@@ -1284,7 +1284,7 @@
               <w:lang w:eastAsia="en-ZA"/>
             </w:rPr>
           </w:pPr>
-          <w:hyperlink w:anchor="_Toc240351967" w:history="1">
+          <w:hyperlink w:anchor="_Toc240371937" w:history="1">
             <w:r>
               <w:rPr>
                 <w:rStyle w:val="Hyperlink"/>
@@ -1311,7 +1311,7 @@
                 <w:noProof/>
                 <w:webHidden/>
               </w:rPr>
-              <w:instrText xml:space="preserve"> PAGEREF _Toc240351967 \h </w:instrText>
+              <w:instrText xml:space="preserve"> PAGEREF _Toc240371937 \h </w:instrText>
             </w:r>
             <w:r>
               <w:rPr>
@@ -1356,7 +1356,7 @@
               <w:lang w:eastAsia="en-ZA"/>
             </w:rPr>
           </w:pPr>
-          <w:hyperlink w:anchor="_Toc240351968" w:history="1">
+          <w:hyperlink w:anchor="_Toc240371938" w:history="1">
             <w:r>
               <w:rPr>
                 <w:rStyle w:val="Hyperlink"/>
@@ -1383,7 +1383,7 @@
                 <w:noProof/>
                 <w:webHidden/>
               </w:rPr>
-              <w:instrText xml:space="preserve"> PAGEREF _Toc240351968 \h </w:instrText>
+              <w:instrText xml:space="preserve"> PAGEREF _Toc240371938 \h </w:instrText>
             </w:r>
             <w:r>
               <w:rPr>
@@ -1428,7 +1428,7 @@
               <w:lang w:eastAsia="en-ZA"/>
             </w:rPr>
           </w:pPr>
-          <w:hyperlink w:anchor="_Toc240351969" w:history="1">
+          <w:hyperlink w:anchor="_Toc240371939" w:history="1">
             <w:r>
               <w:rPr>
                 <w:rStyle w:val="Hyperlink"/>
@@ -1455,7 +1455,7 @@
                 <w:noProof/>
                 <w:webHidden/>
               </w:rPr>
-              <w:instrText xml:space="preserve"> PAGEREF _Toc240351969 \h </w:instrText>
+              <w:instrText xml:space="preserve"> PAGEREF _Toc240371939 \h </w:instrText>
             </w:r>
             <w:r>
               <w:rPr>
@@ -1500,7 +1500,7 @@
               <w:lang w:eastAsia="en-ZA"/>
             </w:rPr>
           </w:pPr>
-          <w:hyperlink w:anchor="_Toc240351970" w:history="1">
+          <w:hyperlink w:anchor="_Toc240371940" w:history="1">
             <w:r>
               <w:rPr>
                 <w:rStyle w:val="Hyperlink"/>
@@ -1527,7 +1527,7 @@
                 <w:noProof/>
                 <w:webHidden/>
               </w:rPr>
-              <w:instrText xml:space="preserve"> PAGEREF _Toc240351970 \h </w:instrText>
+              <w:instrText xml:space="preserve"> PAGEREF _Toc240371940 \h </w:instrText>
             </w:r>
             <w:r>
               <w:rPr>
@@ -1572,7 +1572,7 @@
               <w:lang w:eastAsia="en-ZA"/>
             </w:rPr>
           </w:pPr>
-          <w:hyperlink w:anchor="_Toc240351971" w:history="1">
+          <w:hyperlink w:anchor="_Toc240371941" w:history="1">
             <w:r>
               <w:rPr>
                 <w:rStyle w:val="Hyperlink"/>
@@ -1599,7 +1599,7 @@
                 <w:noProof/>
                 <w:webHidden/>
               </w:rPr>
-              <w:instrText xml:space="preserve"> PAGEREF _Toc240351971 \h </w:instrText>
+              <w:instrText xml:space="preserve"> PAGEREF _Toc240371941 \h </w:instrText>
             </w:r>
             <w:r>
               <w:rPr>
@@ -1644,13 +1644,13 @@
               <w:lang w:eastAsia="en-ZA"/>
             </w:rPr>
           </w:pPr>
-          <w:hyperlink w:anchor="_Toc240351972" w:history="1">
+          <w:hyperlink w:anchor="_Toc240371942" w:history="1">
             <w:r>
               <w:rPr>
                 <w:rStyle w:val="Hyperlink"/>
                 <w:noProof/>
               </w:rPr>
-              <w:t>Part II - Gospel Canticles</w:t>
+              <w:t>Part II — Gospel Canticles</w:t>
             </w:r>
             <w:r>
               <w:rPr>
@@ -1671,7 +1671,7 @@
                 <w:noProof/>
                 <w:webHidden/>
               </w:rPr>
-              <w:instrText xml:space="preserve"> PAGEREF _Toc240351972 \h </w:instrText>
+              <w:instrText xml:space="preserve"> PAGEREF _Toc240371942 \h </w:instrText>
             </w:r>
             <w:r>
               <w:rPr>
@@ -1716,7 +1716,7 @@
               <w:lang w:eastAsia="en-ZA"/>
             </w:rPr>
           </w:pPr>
-          <w:hyperlink w:anchor="_Toc240351973" w:history="1">
+          <w:hyperlink w:anchor="_Toc240371943" w:history="1">
             <w:r>
               <w:rPr>
                 <w:rStyle w:val="Hyperlink"/>
@@ -1743,7 +1743,7 @@
                 <w:noProof/>
                 <w:webHidden/>
               </w:rPr>
-              <w:instrText xml:space="preserve"> PAGEREF _Toc240351973 \h </w:instrText>
+              <w:instrText xml:space="preserve"> PAGEREF _Toc240371943 \h </w:instrText>
             </w:r>
             <w:r>
               <w:rPr>
@@ -1788,7 +1788,7 @@
               <w:lang w:eastAsia="en-ZA"/>
             </w:rPr>
           </w:pPr>
-          <w:hyperlink w:anchor="_Toc240351974" w:history="1">
+          <w:hyperlink w:anchor="_Toc240371944" w:history="1">
             <w:r>
               <w:rPr>
                 <w:rStyle w:val="Hyperlink"/>
@@ -1815,7 +1815,7 @@
                 <w:noProof/>
                 <w:webHidden/>
               </w:rPr>
-              <w:instrText xml:space="preserve"> PAGEREF _Toc240351974 \h </w:instrText>
+              <w:instrText xml:space="preserve"> PAGEREF _Toc240371944 \h </w:instrText>
             </w:r>
             <w:r>
               <w:rPr>
@@ -1860,7 +1860,7 @@
               <w:lang w:eastAsia="en-ZA"/>
             </w:rPr>
           </w:pPr>
-          <w:hyperlink w:anchor="_Toc240351975" w:history="1">
+          <w:hyperlink w:anchor="_Toc240371945" w:history="1">
             <w:r>
               <w:rPr>
                 <w:rStyle w:val="Hyperlink"/>
@@ -1887,7 +1887,7 @@
                 <w:noProof/>
                 <w:webHidden/>
               </w:rPr>
-              <w:instrText xml:space="preserve"> PAGEREF _Toc240351975 \h </w:instrText>
+              <w:instrText xml:space="preserve"> PAGEREF _Toc240371945 \h </w:instrText>
             </w:r>
             <w:r>
               <w:rPr>
@@ -1932,7 +1932,7 @@
               <w:lang w:eastAsia="en-ZA"/>
             </w:rPr>
           </w:pPr>
-          <w:hyperlink w:anchor="_Toc240351976" w:history="1">
+          <w:hyperlink w:anchor="_Toc240371946" w:history="1">
             <w:r>
               <w:rPr>
                 <w:rStyle w:val="Hyperlink"/>
@@ -1959,7 +1959,7 @@
                 <w:noProof/>
                 <w:webHidden/>
               </w:rPr>
-              <w:instrText xml:space="preserve"> PAGEREF _Toc240351976 \h </w:instrText>
+              <w:instrText xml:space="preserve"> PAGEREF _Toc240371946 \h </w:instrText>
             </w:r>
             <w:r>
               <w:rPr>
@@ -2004,13 +2004,13 @@
               <w:lang w:eastAsia="en-ZA"/>
             </w:rPr>
           </w:pPr>
-          <w:hyperlink w:anchor="_Toc240351977" w:history="1">
+          <w:hyperlink w:anchor="_Toc240371947" w:history="1">
             <w:r>
               <w:rPr>
                 <w:rStyle w:val="Hyperlink"/>
                 <w:noProof/>
               </w:rPr>
-              <w:t>Part III – Devotional Prayers</w:t>
+              <w:t>Part III — Devotional Prayers</w:t>
             </w:r>
             <w:r>
               <w:rPr>
@@ -2031,7 +2031,7 @@
                 <w:noProof/>
                 <w:webHidden/>
               </w:rPr>
-              <w:instrText xml:space="preserve"> PAGEREF _Toc240351977 \h </w:instrText>
+              <w:instrText xml:space="preserve"> PAGEREF _Toc240371947 \h </w:instrText>
             </w:r>
             <w:r>
               <w:rPr>
@@ -2076,7 +2076,7 @@
               <w:lang w:eastAsia="en-ZA"/>
             </w:rPr>
           </w:pPr>
-          <w:hyperlink w:anchor="_Toc240351978" w:history="1">
+          <w:hyperlink w:anchor="_Toc240371948" w:history="1">
             <w:r>
               <w:rPr>
                 <w:rStyle w:val="Hyperlink"/>
@@ -2103,7 +2103,7 @@
                 <w:noProof/>
                 <w:webHidden/>
               </w:rPr>
-              <w:instrText xml:space="preserve"> PAGEREF _Toc240351978 \h </w:instrText>
+              <w:instrText xml:space="preserve"> PAGEREF _Toc240371948 \h </w:instrText>
             </w:r>
             <w:r>
               <w:rPr>
@@ -2148,7 +2148,7 @@
               <w:lang w:eastAsia="en-ZA"/>
             </w:rPr>
           </w:pPr>
-          <w:hyperlink w:anchor="_Toc240351979" w:history="1">
+          <w:hyperlink w:anchor="_Toc240371949" w:history="1">
             <w:r>
               <w:rPr>
                 <w:rStyle w:val="Hyperlink"/>
@@ -2175,7 +2175,7 @@
                 <w:noProof/>
                 <w:webHidden/>
               </w:rPr>
-              <w:instrText xml:space="preserve"> PAGEREF _Toc240351979 \h </w:instrText>
+              <w:instrText xml:space="preserve"> PAGEREF _Toc240371949 \h </w:instrText>
             </w:r>
             <w:r>
               <w:rPr>
@@ -2195,7 +2195,7 @@
                 <w:noProof/>
                 <w:webHidden/>
               </w:rPr>
-              <w:t>102</w:t>
+              <w:t>101</w:t>
             </w:r>
             <w:r>
               <w:rPr>
@@ -2220,7 +2220,7 @@
               <w:lang w:eastAsia="en-ZA"/>
             </w:rPr>
           </w:pPr>
-          <w:hyperlink w:anchor="_Toc240351980" w:history="1">
+          <w:hyperlink w:anchor="_Toc240371950" w:history="1">
             <w:r>
               <w:rPr>
                 <w:rStyle w:val="Hyperlink"/>
@@ -2247,7 +2247,7 @@
                 <w:noProof/>
                 <w:webHidden/>
               </w:rPr>
-              <w:instrText xml:space="preserve"> PAGEREF _Toc240351980 \h </w:instrText>
+              <w:instrText xml:space="preserve"> PAGEREF _Toc240371950 \h </w:instrText>
             </w:r>
             <w:r>
               <w:rPr>
@@ -2267,7 +2267,7 @@
                 <w:noProof/>
                 <w:webHidden/>
               </w:rPr>
-              <w:t>113</w:t>
+              <w:t>111</w:t>
             </w:r>
             <w:r>
               <w:rPr>
@@ -2292,7 +2292,7 @@
               <w:lang w:eastAsia="en-ZA"/>
             </w:rPr>
           </w:pPr>
-          <w:hyperlink w:anchor="_Toc240351981" w:history="1">
+          <w:hyperlink w:anchor="_Toc240371951" w:history="1">
             <w:r>
               <w:rPr>
                 <w:rStyle w:val="Hyperlink"/>
@@ -2319,7 +2319,7 @@
                 <w:noProof/>
                 <w:webHidden/>
               </w:rPr>
-              <w:instrText xml:space="preserve"> PAGEREF _Toc240351981 \h </w:instrText>
+              <w:instrText xml:space="preserve"> PAGEREF _Toc240371951 \h </w:instrText>
             </w:r>
             <w:r>
               <w:rPr>
@@ -2339,7 +2339,7 @@
                 <w:noProof/>
                 <w:webHidden/>
               </w:rPr>
-              <w:t>119</w:t>
+              <w:t>117</w:t>
             </w:r>
             <w:r>
               <w:rPr>
@@ -2364,7 +2364,7 @@
               <w:lang w:eastAsia="en-ZA"/>
             </w:rPr>
           </w:pPr>
-          <w:hyperlink w:anchor="_Toc240351982" w:history="1">
+          <w:hyperlink w:anchor="_Toc240371952" w:history="1">
             <w:r>
               <w:rPr>
                 <w:rStyle w:val="Hyperlink"/>
@@ -2391,7 +2391,7 @@
                 <w:noProof/>
                 <w:webHidden/>
               </w:rPr>
-              <w:instrText xml:space="preserve"> PAGEREF _Toc240351982 \h </w:instrText>
+              <w:instrText xml:space="preserve"> PAGEREF _Toc240371952 \h </w:instrText>
             </w:r>
             <w:r>
               <w:rPr>
@@ -2411,7 +2411,7 @@
                 <w:noProof/>
                 <w:webHidden/>
               </w:rPr>
-              <w:t>126</w:t>
+              <w:t>123</w:t>
             </w:r>
             <w:r>
               <w:rPr>
@@ -2436,7 +2436,7 @@
               <w:lang w:eastAsia="en-ZA"/>
             </w:rPr>
           </w:pPr>
-          <w:hyperlink w:anchor="_Toc240351983" w:history="1">
+          <w:hyperlink w:anchor="_Toc240371953" w:history="1">
             <w:r>
               <w:rPr>
                 <w:rStyle w:val="Hyperlink"/>
@@ -2463,7 +2463,7 @@
                 <w:noProof/>
                 <w:webHidden/>
               </w:rPr>
-              <w:instrText xml:space="preserve"> PAGEREF _Toc240351983 \h </w:instrText>
+              <w:instrText xml:space="preserve"> PAGEREF _Toc240371953 \h </w:instrText>
             </w:r>
             <w:r>
               <w:rPr>
@@ -2483,7 +2483,7 @@
                 <w:noProof/>
                 <w:webHidden/>
               </w:rPr>
-              <w:t>133</w:t>
+              <w:t>129</w:t>
             </w:r>
             <w:r>
               <w:rPr>
@@ -2508,7 +2508,7 @@
               <w:lang w:eastAsia="en-ZA"/>
             </w:rPr>
           </w:pPr>
-          <w:hyperlink w:anchor="_Toc240351984" w:history="1">
+          <w:hyperlink w:anchor="_Toc240371954" w:history="1">
             <w:r>
               <w:rPr>
                 <w:rStyle w:val="Hyperlink"/>
@@ -2535,7 +2535,7 @@
                 <w:noProof/>
                 <w:webHidden/>
               </w:rPr>
-              <w:instrText xml:space="preserve"> PAGEREF _Toc240351984 \h </w:instrText>
+              <w:instrText xml:space="preserve"> PAGEREF _Toc240371954 \h </w:instrText>
             </w:r>
             <w:r>
               <w:rPr>
@@ -2555,7 +2555,7 @@
                 <w:noProof/>
                 <w:webHidden/>
               </w:rPr>
-              <w:t>139</w:t>
+              <w:t>135</w:t>
             </w:r>
             <w:r>
               <w:rPr>
@@ -2580,7 +2580,7 @@
               <w:lang w:eastAsia="en-ZA"/>
             </w:rPr>
           </w:pPr>
-          <w:hyperlink w:anchor="_Toc240351985" w:history="1">
+          <w:hyperlink w:anchor="_Toc240371955" w:history="1">
             <w:r>
               <w:rPr>
                 <w:rStyle w:val="Hyperlink"/>
@@ -2607,7 +2607,7 @@
                 <w:noProof/>
                 <w:webHidden/>
               </w:rPr>
-              <w:instrText xml:space="preserve"> PAGEREF _Toc240351985 \h </w:instrText>
+              <w:instrText xml:space="preserve"> PAGEREF _Toc240371955 \h </w:instrText>
             </w:r>
             <w:r>
               <w:rPr>
@@ -2627,7 +2627,7 @@
                 <w:noProof/>
                 <w:webHidden/>
               </w:rPr>
-              <w:t>146</w:t>
+              <w:t>141</w:t>
             </w:r>
             <w:r>
               <w:rPr>
@@ -2652,13 +2652,13 @@
               <w:lang w:eastAsia="en-ZA"/>
             </w:rPr>
           </w:pPr>
-          <w:hyperlink w:anchor="_Toc240351986" w:history="1">
+          <w:hyperlink w:anchor="_Toc240371956" w:history="1">
             <w:r>
               <w:rPr>
                 <w:rStyle w:val="Hyperlink"/>
                 <w:noProof/>
               </w:rPr>
-              <w:t>Part IV - Prayers of Protection and Intercession</w:t>
+              <w:t>Part IV — Prayers of Protection and Intercession</w:t>
             </w:r>
             <w:r>
               <w:rPr>
@@ -2679,7 +2679,7 @@
                 <w:noProof/>
                 <w:webHidden/>
               </w:rPr>
-              <w:instrText xml:space="preserve"> PAGEREF _Toc240351986 \h </w:instrText>
+              <w:instrText xml:space="preserve"> PAGEREF _Toc240371956 \h </w:instrText>
             </w:r>
             <w:r>
               <w:rPr>
@@ -2699,7 +2699,7 @@
                 <w:noProof/>
                 <w:webHidden/>
               </w:rPr>
-              <w:t>147</w:t>
+              <w:t>143</w:t>
             </w:r>
             <w:r>
               <w:rPr>
@@ -2724,7 +2724,7 @@
               <w:lang w:eastAsia="en-ZA"/>
             </w:rPr>
           </w:pPr>
-          <w:hyperlink w:anchor="_Toc240351987" w:history="1">
+          <w:hyperlink w:anchor="_Toc240371957" w:history="1">
             <w:r>
               <w:rPr>
                 <w:rStyle w:val="Hyperlink"/>
@@ -2751,7 +2751,7 @@
                 <w:noProof/>
                 <w:webHidden/>
               </w:rPr>
-              <w:instrText xml:space="preserve"> PAGEREF _Toc240351987 \h </w:instrText>
+              <w:instrText xml:space="preserve"> PAGEREF _Toc240371957 \h </w:instrText>
             </w:r>
             <w:r>
               <w:rPr>
@@ -2771,7 +2771,7 @@
                 <w:noProof/>
                 <w:webHidden/>
               </w:rPr>
-              <w:t>149</w:t>
+              <w:t>145</w:t>
             </w:r>
             <w:r>
               <w:rPr>
@@ -2796,7 +2796,7 @@
               <w:lang w:eastAsia="en-ZA"/>
             </w:rPr>
           </w:pPr>
-          <w:hyperlink w:anchor="_Toc240351988" w:history="1">
+          <w:hyperlink w:anchor="_Toc240371958" w:history="1">
             <w:r>
               <w:rPr>
                 <w:rStyle w:val="Hyperlink"/>
@@ -2823,7 +2823,7 @@
                 <w:noProof/>
                 <w:webHidden/>
               </w:rPr>
-              <w:instrText xml:space="preserve"> PAGEREF _Toc240351988 \h </w:instrText>
+              <w:instrText xml:space="preserve"> PAGEREF _Toc240371958 \h </w:instrText>
             </w:r>
             <w:r>
               <w:rPr>
@@ -2843,7 +2843,7 @@
                 <w:noProof/>
                 <w:webHidden/>
               </w:rPr>
-              <w:t>155</w:t>
+              <w:t>151</w:t>
             </w:r>
             <w:r>
               <w:rPr>
@@ -2868,7 +2868,7 @@
               <w:lang w:eastAsia="en-ZA"/>
             </w:rPr>
           </w:pPr>
-          <w:hyperlink w:anchor="_Toc240351989" w:history="1">
+          <w:hyperlink w:anchor="_Toc240371959" w:history="1">
             <w:r>
               <w:rPr>
                 <w:rStyle w:val="Hyperlink"/>
@@ -2895,7 +2895,7 @@
                 <w:noProof/>
                 <w:webHidden/>
               </w:rPr>
-              <w:instrText xml:space="preserve"> PAGEREF _Toc240351989 \h </w:instrText>
+              <w:instrText xml:space="preserve"> PAGEREF _Toc240371959 \h </w:instrText>
             </w:r>
             <w:r>
               <w:rPr>
@@ -2915,7 +2915,7 @@
                 <w:noProof/>
                 <w:webHidden/>
               </w:rPr>
-              <w:t>163</w:t>
+              <w:t>159</w:t>
             </w:r>
             <w:r>
               <w:rPr>
@@ -2940,7 +2940,7 @@
               <w:lang w:eastAsia="en-ZA"/>
             </w:rPr>
           </w:pPr>
-          <w:hyperlink w:anchor="_Toc240351990" w:history="1">
+          <w:hyperlink w:anchor="_Toc240371960" w:history="1">
             <w:r>
               <w:rPr>
                 <w:rStyle w:val="Hyperlink"/>
@@ -2967,7 +2967,7 @@
                 <w:noProof/>
                 <w:webHidden/>
               </w:rPr>
-              <w:instrText xml:space="preserve"> PAGEREF _Toc240351990 \h </w:instrText>
+              <w:instrText xml:space="preserve"> PAGEREF _Toc240371960 \h </w:instrText>
             </w:r>
             <w:r>
               <w:rPr>
@@ -2987,7 +2987,7 @@
                 <w:noProof/>
                 <w:webHidden/>
               </w:rPr>
-              <w:t>173</w:t>
+              <w:t>169</w:t>
             </w:r>
             <w:r>
               <w:rPr>
@@ -3012,7 +3012,7 @@
               <w:lang w:eastAsia="en-ZA"/>
             </w:rPr>
           </w:pPr>
-          <w:hyperlink w:anchor="_Toc240351991" w:history="1">
+          <w:hyperlink w:anchor="_Toc240371961" w:history="1">
             <w:r>
               <w:rPr>
                 <w:rStyle w:val="Hyperlink"/>
@@ -3039,7 +3039,7 @@
                 <w:noProof/>
                 <w:webHidden/>
               </w:rPr>
-              <w:instrText xml:space="preserve"> PAGEREF _Toc240351991 \h </w:instrText>
+              <w:instrText xml:space="preserve"> PAGEREF _Toc240371961 \h </w:instrText>
             </w:r>
             <w:r>
               <w:rPr>
@@ -3059,7 +3059,7 @@
                 <w:noProof/>
                 <w:webHidden/>
               </w:rPr>
-              <w:t>181</w:t>
+              <w:t>177</w:t>
             </w:r>
             <w:r>
               <w:rPr>
@@ -3084,7 +3084,7 @@
               <w:lang w:eastAsia="en-ZA"/>
             </w:rPr>
           </w:pPr>
-          <w:hyperlink w:anchor="_Toc240351992" w:history="1">
+          <w:hyperlink w:anchor="_Toc240371962" w:history="1">
             <w:r>
               <w:rPr>
                 <w:rStyle w:val="Hyperlink"/>
@@ -3111,7 +3111,7 @@
                 <w:noProof/>
                 <w:webHidden/>
               </w:rPr>
-              <w:instrText xml:space="preserve"> PAGEREF _Toc240351992 \h </w:instrText>
+              <w:instrText xml:space="preserve"> PAGEREF _Toc240371962 \h </w:instrText>
             </w:r>
             <w:r>
               <w:rPr>
@@ -3131,7 +3131,7 @@
                 <w:noProof/>
                 <w:webHidden/>
               </w:rPr>
-              <w:t>188</w:t>
+              <w:t>185</w:t>
             </w:r>
             <w:r>
               <w:rPr>
@@ -3156,7 +3156,7 @@
               <w:lang w:eastAsia="en-ZA"/>
             </w:rPr>
           </w:pPr>
-          <w:hyperlink w:anchor="_Toc240351993" w:history="1">
+          <w:hyperlink w:anchor="_Toc240371963" w:history="1">
             <w:r>
               <w:rPr>
                 <w:rStyle w:val="Hyperlink"/>
@@ -3183,7 +3183,7 @@
                 <w:noProof/>
                 <w:webHidden/>
               </w:rPr>
-              <w:instrText xml:space="preserve"> PAGEREF _Toc240351993 \h </w:instrText>
+              <w:instrText xml:space="preserve"> PAGEREF _Toc240371963 \h </w:instrText>
             </w:r>
             <w:r>
               <w:rPr>
@@ -3203,7 +3203,7 @@
                 <w:noProof/>
                 <w:webHidden/>
               </w:rPr>
-              <w:t>191</w:t>
+              <w:t>187</w:t>
             </w:r>
             <w:r>
               <w:rPr>
@@ -3228,7 +3228,7 @@
               <w:lang w:eastAsia="en-ZA"/>
             </w:rPr>
           </w:pPr>
-          <w:hyperlink w:anchor="_Toc240351994" w:history="1">
+          <w:hyperlink w:anchor="_Toc240371964" w:history="1">
             <w:r>
               <w:rPr>
                 <w:rStyle w:val="Hyperlink"/>
@@ -3255,7 +3255,7 @@
                 <w:noProof/>
                 <w:webHidden/>
               </w:rPr>
-              <w:instrText xml:space="preserve"> PAGEREF _Toc240351994 \h </w:instrText>
+              <w:instrText xml:space="preserve"> PAGEREF _Toc240371964 \h </w:instrText>
             </w:r>
             <w:r>
               <w:rPr>
@@ -3275,7 +3275,7 @@
                 <w:noProof/>
                 <w:webHidden/>
               </w:rPr>
-              <w:t>197</w:t>
+              <w:t>191</w:t>
             </w:r>
             <w:r>
               <w:rPr>
@@ -3300,7 +3300,7 @@
               <w:lang w:eastAsia="en-ZA"/>
             </w:rPr>
           </w:pPr>
-          <w:hyperlink w:anchor="_Toc240351995" w:history="1">
+          <w:hyperlink w:anchor="_Toc240371965" w:history="1">
             <w:r>
               <w:rPr>
                 <w:rStyle w:val="Hyperlink"/>
@@ -3327,7 +3327,7 @@
                 <w:noProof/>
                 <w:webHidden/>
               </w:rPr>
-              <w:instrText xml:space="preserve"> PAGEREF _Toc240351995 \h </w:instrText>
+              <w:instrText xml:space="preserve"> PAGEREF _Toc240371965 \h </w:instrText>
             </w:r>
             <w:r>
               <w:rPr>
@@ -3347,7 +3347,7 @@
                 <w:noProof/>
                 <w:webHidden/>
               </w:rPr>
-              <w:t>199</w:t>
+              <w:t>193</w:t>
             </w:r>
             <w:r>
               <w:rPr>
@@ -3372,7 +3372,7 @@
               <w:lang w:eastAsia="en-ZA"/>
             </w:rPr>
           </w:pPr>
-          <w:hyperlink w:anchor="_Toc240351996" w:history="1">
+          <w:hyperlink w:anchor="_Toc240371966" w:history="1">
             <w:r>
               <w:rPr>
                 <w:rStyle w:val="Hyperlink"/>
@@ -3399,7 +3399,7 @@
                 <w:noProof/>
                 <w:webHidden/>
               </w:rPr>
-              <w:instrText xml:space="preserve"> PAGEREF _Toc240351996 \h </w:instrText>
+              <w:instrText xml:space="preserve"> PAGEREF _Toc240371966 \h </w:instrText>
             </w:r>
             <w:r>
               <w:rPr>
@@ -3419,7 +3419,7 @@
                 <w:noProof/>
                 <w:webHidden/>
               </w:rPr>
-              <w:t>205</w:t>
+              <w:t>199</w:t>
             </w:r>
             <w:r>
               <w:rPr>
@@ -3482,7 +3482,7 @@
           <w:i w:val="0"/>
         </w:rPr>
       </w:pPr>
-      <w:bookmarkStart w:id="0" w:name="_Toc240351955"/>
+      <w:bookmarkStart w:id="0" w:name="_Toc240371925"/>
       <w:r>
         <w:rPr>
           <w:rStyle w:val="SPPrayerResponseCS"/>
@@ -4006,7 +4006,7 @@
       <w:pPr>
         <w:pStyle w:val="SPSectionTitle"/>
       </w:pPr>
-      <w:bookmarkStart w:id="1" w:name="_Toc240351956"/>
+      <w:bookmarkStart w:id="1" w:name="_Toc240371926"/>
       <w:r>
         <w:lastRenderedPageBreak/>
         <w:t>Introduction</w:t>
@@ -4285,7 +4285,7 @@
       <w:pPr>
         <w:pStyle w:val="SPSectionSubTitle"/>
       </w:pPr>
-      <w:bookmarkStart w:id="2" w:name="_Toc240351957"/>
+      <w:bookmarkStart w:id="2" w:name="_Toc240371927"/>
       <w:r>
         <w:lastRenderedPageBreak/>
         <w:t>English and Latin</w:t>
@@ -4387,7 +4387,7 @@
       <w:pPr>
         <w:pStyle w:val="SPSectionSubTitle"/>
       </w:pPr>
-      <w:bookmarkStart w:id="3" w:name="_Toc240351958"/>
+      <w:bookmarkStart w:id="3" w:name="_Toc240371928"/>
       <w:r>
         <w:lastRenderedPageBreak/>
         <w:t>The Prayer</w:t>
@@ -4557,7 +4557,7 @@
       <w:pPr>
         <w:pStyle w:val="SPSectionSubTitle"/>
       </w:pPr>
-      <w:bookmarkStart w:id="4" w:name="_Toc240351959"/>
+      <w:bookmarkStart w:id="4" w:name="_Toc240371929"/>
       <w:r>
         <w:lastRenderedPageBreak/>
         <w:t>Scripture</w:t>
@@ -4638,7 +4638,7 @@
       <w:pPr>
         <w:pStyle w:val="SPSectionSubTitle"/>
       </w:pPr>
-      <w:bookmarkStart w:id="5" w:name="_Toc240351960"/>
+      <w:bookmarkStart w:id="5" w:name="_Toc240371930"/>
       <w:r>
         <w:t>Reflection</w:t>
       </w:r>
@@ -4705,7 +4705,7 @@
       <w:pPr>
         <w:pStyle w:val="SPSectionSubTitle"/>
       </w:pPr>
-      <w:bookmarkStart w:id="6" w:name="_Toc240351961"/>
+      <w:bookmarkStart w:id="6" w:name="_Toc240371931"/>
       <w:r>
         <w:t>Latin Vocabulary</w:t>
       </w:r>
@@ -4817,7 +4817,7 @@
       <w:pPr>
         <w:pStyle w:val="SPSectionSubTitle"/>
       </w:pPr>
-      <w:bookmarkStart w:id="7" w:name="_Toc240351962"/>
+      <w:bookmarkStart w:id="7" w:name="_Toc240371932"/>
       <w:r>
         <w:lastRenderedPageBreak/>
         <w:t>Prayer Through the Day</w:t>
@@ -4946,7 +4946,7 @@
       <w:pPr>
         <w:pStyle w:val="SPSectionSubTitle"/>
       </w:pPr>
-      <w:bookmarkStart w:id="8" w:name="_Toc240351963"/>
+      <w:bookmarkStart w:id="8" w:name="_Toc240371933"/>
       <w:r>
         <w:lastRenderedPageBreak/>
         <w:t>A Simple Way to Begin</w:t>
@@ -5080,12 +5080,12 @@
           <w:docGrid w:linePitch="360"/>
         </w:sectPr>
       </w:pPr>
-      <w:bookmarkStart w:id="9" w:name="_Toc240351964"/>
     </w:p>
     <w:p>
       <w:pPr>
         <w:pStyle w:val="SPSectionSubTitle"/>
       </w:pPr>
+      <w:bookmarkStart w:id="9" w:name="_Toc240371934"/>
       <w:r>
         <w:lastRenderedPageBreak/>
         <w:t>Return</w:t>
@@ -5287,12 +5287,12 @@
         <w:lastRenderedPageBreak/>
         <w:tab/>
       </w:r>
-      <w:bookmarkStart w:id="10" w:name="_Toc240351965"/>
+      <w:bookmarkStart w:id="10" w:name="_Toc240371935"/>
       <w:r>
         <w:t xml:space="preserve">Part I </w:t>
       </w:r>
       <w:r>
-        <w:t>-</w:t>
+        <w:t>—</w:t>
       </w:r>
       <w:r>
         <w:t xml:space="preserve"> Basic Prayers</w:t>
@@ -5470,7 +5470,7 @@
       <w:pPr>
         <w:pStyle w:val="SPPrayerTitle"/>
       </w:pPr>
-      <w:bookmarkStart w:id="11" w:name="_Toc240351966"/>
+      <w:bookmarkStart w:id="11" w:name="_Toc240371936"/>
       <w:r>
         <w:t xml:space="preserve">Sign of the </w:t>
       </w:r>
@@ -5803,7 +5803,7 @@
       <w:pPr>
         <w:pStyle w:val="SPPrayerTitle"/>
       </w:pPr>
-      <w:bookmarkStart w:id="12" w:name="_Toc240351967"/>
+      <w:bookmarkStart w:id="12" w:name="_Toc240371937"/>
       <w:r>
         <w:t>The Our Father</w:t>
       </w:r>
@@ -6047,7 +6047,13 @@
         <w:pStyle w:val="SPPrayerLatin"/>
       </w:pPr>
       <w:r>
-        <w:t>Et ne nos inducasin tentationem</w:t>
+        <w:t>Et ne nos inducas</w:t>
+      </w:r>
+      <w:r>
+        <w:t xml:space="preserve"> </w:t>
+      </w:r>
+      <w:r>
+        <w:t>in tentationem</w:t>
       </w:r>
     </w:p>
     <w:p>
@@ -6497,7 +6503,7 @@
       <w:pPr>
         <w:pStyle w:val="SPPrayerTitle"/>
       </w:pPr>
-      <w:bookmarkStart w:id="13" w:name="_Toc240351968"/>
+      <w:bookmarkStart w:id="13" w:name="_Toc240371938"/>
       <w:r>
         <w:t xml:space="preserve">The Hail </w:t>
       </w:r>
@@ -7358,7 +7364,7 @@
       <w:pPr>
         <w:pStyle w:val="SPPrayerTitle"/>
       </w:pPr>
-      <w:bookmarkStart w:id="14" w:name="_Toc240351969"/>
+      <w:bookmarkStart w:id="14" w:name="_Toc240371939"/>
       <w:r>
         <w:t>The Glory Be</w:t>
       </w:r>
@@ -8262,7 +8268,7 @@
       <w:pPr>
         <w:pStyle w:val="SPPrayerTitle"/>
       </w:pPr>
-      <w:bookmarkStart w:id="15" w:name="_Toc240351970"/>
+      <w:bookmarkStart w:id="15" w:name="_Toc240371940"/>
       <w:r>
         <w:t>Act of Contrition</w:t>
       </w:r>
@@ -8827,7 +8833,7 @@
       <w:pPr>
         <w:pStyle w:val="SPPrayerTitle"/>
       </w:pPr>
-      <w:bookmarkStart w:id="16" w:name="_Toc240351971"/>
+      <w:bookmarkStart w:id="16" w:name="_Toc240371941"/>
       <w:r>
         <w:lastRenderedPageBreak/>
         <w:t>Closing Thoughts</w:t>
@@ -9124,7 +9130,7 @@
       <w:pPr>
         <w:pStyle w:val="SPSectionTitle"/>
       </w:pPr>
-      <w:bookmarkStart w:id="17" w:name="_Toc240351972"/>
+      <w:bookmarkStart w:id="17" w:name="_Toc240371942"/>
       <w:r>
         <w:lastRenderedPageBreak/>
         <w:t xml:space="preserve">Part </w:t>
@@ -9136,7 +9142,10 @@
         <w:t xml:space="preserve"> </w:t>
       </w:r>
       <w:r>
-        <w:t xml:space="preserve">- Gospel </w:t>
+        <w:t>—</w:t>
+      </w:r>
+      <w:r>
+        <w:t xml:space="preserve"> Gospel </w:t>
       </w:r>
       <w:r>
         <w:t>C</w:t>
@@ -9354,7 +9363,7 @@
       <w:pPr>
         <w:pStyle w:val="SPPrayerTitle"/>
       </w:pPr>
-      <w:bookmarkStart w:id="18" w:name="_Toc240351973"/>
+      <w:bookmarkStart w:id="18" w:name="_Toc240371943"/>
       <w:r>
         <w:t>The Benedictus</w:t>
       </w:r>
@@ -9374,25 +9383,6 @@
       </w:pPr>
       <w:r>
         <w:t xml:space="preserve">The Benedictus is also known as the Canticle or Song of Zechariah. It is the prayer that Zechariah recited following the birth of John the Baptist. </w:t>
-      </w:r>
-    </w:p>
-    <w:p>
-      <w:pPr>
-        <w:pStyle w:val="SPBodyText"/>
-      </w:pPr>
-    </w:p>
-    <w:p>
-      <w:pPr>
-        <w:pStyle w:val="SPBodyText"/>
-      </w:pPr>
-      <w:r>
-        <w:t>Traditionally it is recited as part of Lauds</w:t>
-      </w:r>
-      <w:r>
-        <w:t xml:space="preserve"> </w:t>
-      </w:r>
-      <w:r>
-        <w:t>(Morning Prayer).</w:t>
       </w:r>
     </w:p>
     <w:p>
@@ -11060,7 +11050,7 @@
       <w:pPr>
         <w:pStyle w:val="SPPrayerTitle"/>
       </w:pPr>
-      <w:bookmarkStart w:id="19" w:name="_Toc240351974"/>
+      <w:bookmarkStart w:id="19" w:name="_Toc240371944"/>
       <w:r>
         <w:t>The Magnificat</w:t>
       </w:r>
@@ -12332,7 +12322,7 @@
       <w:pPr>
         <w:pStyle w:val="SPPrayerTitle"/>
       </w:pPr>
-      <w:bookmarkStart w:id="20" w:name="_Toc240351975"/>
+      <w:bookmarkStart w:id="20" w:name="_Toc240371945"/>
       <w:r>
         <w:t>Nunc Dimit</w:t>
       </w:r>
@@ -13064,7 +13054,7 @@
       <w:pPr>
         <w:pStyle w:val="SPPrayerTitle"/>
       </w:pPr>
-      <w:bookmarkStart w:id="21" w:name="_Toc240351976"/>
+      <w:bookmarkStart w:id="21" w:name="_Toc240371946"/>
       <w:r>
         <w:lastRenderedPageBreak/>
         <w:t>Closing Thoughts</w:t>
@@ -13266,7 +13256,7 @@
       <w:pPr>
         <w:pStyle w:val="SPSectionTitle"/>
       </w:pPr>
-      <w:bookmarkStart w:id="22" w:name="_Toc240351977"/>
+      <w:bookmarkStart w:id="22" w:name="_Toc240371947"/>
       <w:r>
         <w:lastRenderedPageBreak/>
         <w:t xml:space="preserve">Part </w:t>
@@ -13278,7 +13268,10 @@
         <w:t xml:space="preserve"> </w:t>
       </w:r>
       <w:r>
-        <w:t>– Devotional Prayers</w:t>
+        <w:t>—</w:t>
+      </w:r>
+      <w:r>
+        <w:t xml:space="preserve"> Devotional Prayers</w:t>
       </w:r>
       <w:bookmarkEnd w:id="22"/>
     </w:p>
@@ -13510,7 +13503,7 @@
       <w:pPr>
         <w:pStyle w:val="SPPrayerTitle"/>
       </w:pPr>
-      <w:bookmarkStart w:id="23" w:name="_Toc240351978"/>
+      <w:bookmarkStart w:id="23" w:name="_Toc240371948"/>
       <w:r>
         <w:t>Morning Offering</w:t>
       </w:r>
@@ -14384,7 +14377,7 @@
       <w:pPr>
         <w:pStyle w:val="SPPrayerTitle"/>
       </w:pPr>
-      <w:bookmarkStart w:id="24" w:name="_Toc240351979"/>
+      <w:bookmarkStart w:id="24" w:name="_Toc240371949"/>
       <w:r>
         <w:t>The Angelus</w:t>
       </w:r>
@@ -15662,7 +15655,7 @@
       <w:pPr>
         <w:pStyle w:val="SPPrayerTitle"/>
       </w:pPr>
-      <w:bookmarkStart w:id="25" w:name="_Toc240351980"/>
+      <w:bookmarkStart w:id="25" w:name="_Toc240371950"/>
       <w:r>
         <w:t>Anima Christi</w:t>
       </w:r>
@@ -16449,7 +16442,7 @@
       <w:pPr>
         <w:pStyle w:val="SPPrayerTitle"/>
       </w:pPr>
-      <w:bookmarkStart w:id="26" w:name="_Toc240351981"/>
+      <w:bookmarkStart w:id="26" w:name="_Toc240371951"/>
       <w:r>
         <w:t>Guardian Angel Prayer</w:t>
       </w:r>
@@ -17066,7 +17059,7 @@
       <w:pPr>
         <w:pStyle w:val="SPPrayerTitle"/>
       </w:pPr>
-      <w:bookmarkStart w:id="27" w:name="_Toc240351982"/>
+      <w:bookmarkStart w:id="27" w:name="_Toc240371952"/>
       <w:r>
         <w:t>Prayer for the Faithful Departed</w:t>
       </w:r>
@@ -17639,7 +17632,7 @@
       <w:pPr>
         <w:pStyle w:val="SPPrayerTitle"/>
       </w:pPr>
-      <w:bookmarkStart w:id="28" w:name="_Toc240351983"/>
+      <w:bookmarkStart w:id="28" w:name="_Toc240371953"/>
       <w:r>
         <w:t xml:space="preserve">Divine  </w:t>
       </w:r>
@@ -18245,7 +18238,7 @@
       <w:pPr>
         <w:pStyle w:val="SPPrayerTitle"/>
       </w:pPr>
-      <w:bookmarkStart w:id="29" w:name="_Toc240351984"/>
+      <w:bookmarkStart w:id="29" w:name="_Toc240371954"/>
       <w:r>
         <w:t xml:space="preserve">Night </w:t>
       </w:r>
@@ -18729,7 +18722,7 @@
         <w:t xml:space="preserve"> </w:t>
       </w:r>
       <w:bookmarkStart w:id="30" w:name="_Toc238726594"/>
-      <w:bookmarkStart w:id="31" w:name="_Toc240351985"/>
+      <w:bookmarkStart w:id="31" w:name="_Toc240371955"/>
       <w:r>
         <w:t>Closing Thoughts</w:t>
       </w:r>
@@ -18870,7 +18863,7 @@
       <w:pPr>
         <w:pStyle w:val="SPSectionTitle"/>
       </w:pPr>
-      <w:bookmarkStart w:id="32" w:name="_Toc240351986"/>
+      <w:bookmarkStart w:id="32" w:name="_Toc240371956"/>
       <w:r>
         <w:lastRenderedPageBreak/>
         <w:t xml:space="preserve">Part </w:t>
@@ -18885,7 +18878,7 @@
         <w:t xml:space="preserve"> </w:t>
       </w:r>
       <w:r>
-        <w:t>-</w:t>
+        <w:t>—</w:t>
       </w:r>
       <w:r>
         <w:t xml:space="preserve"> Prayers of Protection and </w:t>
@@ -18957,7 +18950,7 @@
       <w:pPr>
         <w:pStyle w:val="SPPrayerTitle"/>
       </w:pPr>
-      <w:bookmarkStart w:id="33" w:name="_Toc240351987"/>
+      <w:bookmarkStart w:id="33" w:name="_Toc240371957"/>
       <w:r>
         <w:t>Saint Michael the Archangel</w:t>
       </w:r>
@@ -19505,7 +19498,7 @@
       <w:pPr>
         <w:pStyle w:val="SPPrayerTitle"/>
       </w:pPr>
-      <w:bookmarkStart w:id="34" w:name="_Toc240351988"/>
+      <w:bookmarkStart w:id="34" w:name="_Toc240371958"/>
       <w:r>
         <w:t xml:space="preserve">Saint </w:t>
       </w:r>
@@ -20307,7 +20300,7 @@
       <w:pPr>
         <w:pStyle w:val="SPPrayerTitle"/>
       </w:pPr>
-      <w:bookmarkStart w:id="35" w:name="_Toc240351989"/>
+      <w:bookmarkStart w:id="35" w:name="_Toc240371959"/>
       <w:r>
         <w:t xml:space="preserve">Saint </w:t>
       </w:r>
@@ -21207,7 +21200,7 @@
       <w:pPr>
         <w:pStyle w:val="SPPrayerTitle"/>
       </w:pPr>
-      <w:bookmarkStart w:id="36" w:name="_Toc240351990"/>
+      <w:bookmarkStart w:id="36" w:name="_Toc240371960"/>
       <w:r>
         <w:t xml:space="preserve">Saint </w:t>
       </w:r>
@@ -21977,7 +21970,7 @@
       <w:pPr>
         <w:pStyle w:val="SPPrayerTitle"/>
       </w:pPr>
-      <w:bookmarkStart w:id="37" w:name="_Toc240351991"/>
+      <w:bookmarkStart w:id="37" w:name="_Toc240371961"/>
       <w:r>
         <w:t xml:space="preserve">Saint </w:t>
       </w:r>
@@ -22754,7 +22747,7 @@
       <w:pPr>
         <w:pStyle w:val="SPPrayerTitle"/>
       </w:pPr>
-      <w:bookmarkStart w:id="38" w:name="_Toc240351992"/>
+      <w:bookmarkStart w:id="38" w:name="_Toc240371962"/>
       <w:r>
         <w:lastRenderedPageBreak/>
         <w:t>Closing Thoughts</w:t>
@@ -23057,7 +23050,7 @@
       <w:pPr>
         <w:pStyle w:val="SPSectionTitle"/>
       </w:pPr>
-      <w:bookmarkStart w:id="39" w:name="_Toc240351993"/>
+      <w:bookmarkStart w:id="39" w:name="_Toc240371963"/>
       <w:r>
         <w:t>Conclusion</w:t>
       </w:r>
@@ -23632,7 +23625,7 @@
       <w:pPr>
         <w:pStyle w:val="SPSectionTitle"/>
       </w:pPr>
-      <w:bookmarkStart w:id="40" w:name="_Toc240351994"/>
+      <w:bookmarkStart w:id="40" w:name="_Toc240371964"/>
       <w:r>
         <w:lastRenderedPageBreak/>
         <w:t>Latin Guide</w:t>
@@ -24058,7 +24051,7 @@
       <w:pPr>
         <w:pStyle w:val="SPPrayerTitle"/>
       </w:pPr>
-      <w:bookmarkStart w:id="41" w:name="_Toc240351995"/>
+      <w:bookmarkStart w:id="41" w:name="_Toc240371965"/>
       <w:r>
         <w:lastRenderedPageBreak/>
         <w:t>Common Prayers</w:t>
@@ -24622,7 +24615,7 @@
       <w:pPr>
         <w:pStyle w:val="SPPrayerTitle"/>
       </w:pPr>
-      <w:bookmarkStart w:id="42" w:name="_Toc240351996"/>
+      <w:bookmarkStart w:id="42" w:name="_Toc240371966"/>
       <w:r>
         <w:lastRenderedPageBreak/>
         <w:t>Common Catholic Expressions</w:t>

</xml_diff>

<commit_message>
Add Ignatius Press supporting docs
</commit_message>
<xml_diff>
--- a/manuscript/volume-1/sacrae-preces-volume-1.docx
+++ b/manuscript/volume-1/sacrae-preces-volume-1.docx
@@ -214,24 +214,6 @@
       </w:pPr>
       <w:r>
         <w:t>No part of this publication may be reproduced, stored in a retrieval system, or transmitted in any form or by any means, electronic or mechanical, including photocopying, recording, or otherwise, without the prior written permission of the copyright holder, except for brief quotations used in reviews or scholarly reference.</w:t>
-      </w:r>
-    </w:p>
-    <w:p>
-      <w:pPr>
-        <w:pStyle w:val="SPCopyright"/>
-        <w:spacing w:after="240"/>
-      </w:pPr>
-      <w:r>
-        <w:t>Published by [publisher/imprint]</w:t>
-      </w:r>
-    </w:p>
-    <w:p>
-      <w:pPr>
-        <w:pStyle w:val="SPCopyright"/>
-        <w:spacing w:after="240"/>
-      </w:pPr>
-      <w:r>
-        <w:t>[ISBN Information]</w:t>
       </w:r>
     </w:p>
     <w:p>

</xml_diff>

<commit_message>
Prayer changes and corrections
</commit_message>
<xml_diff>
--- a/manuscript/volume-1/sacrae-preces-volume-1.docx
+++ b/manuscript/volume-1/sacrae-preces-volume-1.docx
@@ -5619,16 +5619,58 @@
         <w:rPr>
           <w:rStyle w:val="Emphasis"/>
         </w:rPr>
-        <w:t>in NOH-mee-neh PAH-tris,</w:t>
-      </w:r>
-      <w:r>
-        <w:br/>
-      </w:r>
+        <w:t>in NOH-mee-</w:t>
+      </w:r>
+      <w:proofErr w:type="spellStart"/>
       <w:r>
         <w:rPr>
           <w:rStyle w:val="Emphasis"/>
         </w:rPr>
-        <w:t>et FEE-lee-ee, et SPEE-ree-toos SAHNK-tee.</w:t>
+        <w:t>neh</w:t>
+      </w:r>
+      <w:proofErr w:type="spellEnd"/>
+      <w:r>
+        <w:rPr>
+          <w:rStyle w:val="Emphasis"/>
+        </w:rPr>
+        <w:t xml:space="preserve"> PAH-tris,</w:t>
+      </w:r>
+      <w:r>
+        <w:br/>
+      </w:r>
+      <w:r>
+        <w:rPr>
+          <w:rStyle w:val="Emphasis"/>
+        </w:rPr>
+        <w:t>et FEE-lee-ee, et SPEE-</w:t>
+      </w:r>
+      <w:proofErr w:type="spellStart"/>
+      <w:r>
+        <w:rPr>
+          <w:rStyle w:val="Emphasis"/>
+        </w:rPr>
+        <w:t>ree</w:t>
+      </w:r>
+      <w:proofErr w:type="spellEnd"/>
+      <w:r>
+        <w:rPr>
+          <w:rStyle w:val="Emphasis"/>
+        </w:rPr>
+        <w:t>-</w:t>
+      </w:r>
+      <w:proofErr w:type="spellStart"/>
+      <w:r>
+        <w:rPr>
+          <w:rStyle w:val="Emphasis"/>
+        </w:rPr>
+        <w:t>toos</w:t>
+      </w:r>
+      <w:proofErr w:type="spellEnd"/>
+      <w:r>
+        <w:rPr>
+          <w:rStyle w:val="Emphasis"/>
+        </w:rPr>
+        <w:t xml:space="preserve"> SAHNK-tee.</w:t>
       </w:r>
       <w:r>
         <w:br/>
@@ -5873,7 +5915,13 @@
         <w:pStyle w:val="SPPrayerEnglish"/>
       </w:pPr>
       <w:r>
-        <w:t>Hallowed be thy Name.</w:t>
+        <w:t xml:space="preserve">Hallowed be thy </w:t>
+      </w:r>
+      <w:r>
+        <w:t>n</w:t>
+      </w:r>
+      <w:r>
+        <w:t>ame.</w:t>
       </w:r>
     </w:p>
     <w:p>
@@ -5881,7 +5929,19 @@
         <w:pStyle w:val="SPPrayerEnglish"/>
       </w:pPr>
       <w:r>
-        <w:t>Thy Kingdom Come.</w:t>
+        <w:t xml:space="preserve">Thy </w:t>
+      </w:r>
+      <w:r>
+        <w:t>k</w:t>
+      </w:r>
+      <w:r>
+        <w:t xml:space="preserve">ingdom </w:t>
+      </w:r>
+      <w:r>
+        <w:t>c</w:t>
+      </w:r>
+      <w:r>
+        <w:t>ome.</w:t>
       </w:r>
     </w:p>
     <w:p>
@@ -6190,7 +6250,15 @@
         <w:t>Your</w:t>
       </w:r>
       <w:r>
-        <w:t xml:space="preserve"> kingdom come. Give us each day our daily bread; and forgive us our sins, for we ourselves forgive every one who is indebted to us; and lead us not into temptation.</w:t>
+        <w:t xml:space="preserve"> kingdom come. Give us each day our daily bread; and forgive us our sins, for we ourselves forgive </w:t>
+      </w:r>
+      <w:proofErr w:type="spellStart"/>
+      <w:r>
+        <w:t>every one</w:t>
+      </w:r>
+      <w:proofErr w:type="spellEnd"/>
+      <w:r>
+        <w:t xml:space="preserve"> who is indebted to us; and lead us not into temptation.</w:t>
       </w:r>
       <w:r>
         <w:t>”</w:t>
@@ -6267,6 +6335,7 @@
       <w:r>
         <w:t xml:space="preserve">. It is </w:t>
       </w:r>
+      <w:proofErr w:type="spellStart"/>
       <w:r>
         <w:rPr>
           <w:i/>
@@ -6274,6 +6343,7 @@
         </w:rPr>
         <w:t>our</w:t>
       </w:r>
+      <w:proofErr w:type="spellEnd"/>
       <w:r>
         <w:t>.</w:t>
       </w:r>
@@ -6605,7 +6675,7 @@
         <w:pStyle w:val="SPPrayerEnglish"/>
       </w:pPr>
       <w:r>
-        <w:t>Blessed art though amongst women,</w:t>
+        <w:t>Blessed art thou amongst women,</w:t>
       </w:r>
     </w:p>
     <w:p>
@@ -7505,7 +7575,13 @@
         <w:pStyle w:val="SPPrayerLatin"/>
       </w:pPr>
       <w:r>
-        <w:t>Gloria Patre,</w:t>
+        <w:t>Gloria Patr</w:t>
+      </w:r>
+      <w:r>
+        <w:t>i</w:t>
+      </w:r>
+      <w:r>
+        <w:t>,</w:t>
       </w:r>
     </w:p>
     <w:p>
@@ -7540,7 +7616,10 @@
         <w:pStyle w:val="SPPrayerLatin"/>
       </w:pPr>
       <w:r>
-        <w:t>Et nunc, et semper.</w:t>
+        <w:t>Et nunc, et semper</w:t>
+      </w:r>
+      <w:r>
+        <w:t>,</w:t>
       </w:r>
     </w:p>
     <w:p>
@@ -8443,22 +8522,22 @@
         <w:pStyle w:val="SPPrayerLatin"/>
       </w:pPr>
       <w:r>
-        <w:t>O mi Deus, corde poenitet me omnium meorum peccatorum,</w:t>
-      </w:r>
-      <w:r>
-        <w:br/>
-        <w:t>et detestor ea,</w:t>
-      </w:r>
-      <w:r>
-        <w:br/>
-        <w:t>vere poenitet me, quia peccando non solum poenas a te iuste statutas promeritus sum,</w:t>
-      </w:r>
-      <w:r>
-        <w:br/>
-        <w:t>sed praesertim quia offendi te, summum bonum, ac dignum qui super omnia diligeris.</w:t>
-      </w:r>
-      <w:r>
-        <w:br/>
+        <w:t>Deus meus, ex toto corde paenitet me omnium meorum peccatorum, eaque detestor,</w:t>
+      </w:r>
+      <w:r>
+        <w:br/>
+        <w:t>quia peccando, non solum poenas a te iuste statutas promeritus sum,</w:t>
+      </w:r>
+      <w:r>
+        <w:br/>
+        <w:t>sed praesertim quia offendi te, summum bonum, ac dignum qui super omnia diligaris.</w:t>
+      </w:r>
+    </w:p>
+    <w:p>
+      <w:pPr>
+        <w:pStyle w:val="SPPrayerLatin"/>
+      </w:pPr>
+      <w:r>
         <w:t>Ideo firmiter propono, adiuvante gratia tua, de cetero me non peccaturum peccandique occasiones proximas fugiturum.</w:t>
       </w:r>
     </w:p>
@@ -8466,14 +8545,14 @@
       <w:pPr>
         <w:pStyle w:val="SPPrayerLatin"/>
       </w:pPr>
+      <w:r>
+        <w:t>Amen.</w:t>
+      </w:r>
     </w:p>
     <w:p>
       <w:pPr>
         <w:pStyle w:val="SPPrayerLatin"/>
       </w:pPr>
-      <w:r>
-        <w:t>Amen.</w:t>
-      </w:r>
     </w:p>
     <w:p>
       <w:pPr>
@@ -9837,7 +9916,13 @@
       </w:r>
       <w:r>
         <w:br/>
-        <w:t>in quibus visitabit nos oriens ex alto,</w:t>
+        <w:t>in quibus visita</w:t>
+      </w:r>
+      <w:r>
+        <w:t>b</w:t>
+      </w:r>
+      <w:r>
+        <w:t>it nos oriens ex alto,</w:t>
       </w:r>
     </w:p>
     <w:p>
@@ -11160,7 +11245,15 @@
         <w:pStyle w:val="SPPrayerEnglish"/>
       </w:pPr>
       <w:r>
-        <w:t>for he has looked with favor on his lowly servant.</w:t>
+        <w:t xml:space="preserve">for he has looked with </w:t>
+      </w:r>
+      <w:proofErr w:type="spellStart"/>
+      <w:r>
+        <w:t>favor</w:t>
+      </w:r>
+      <w:proofErr w:type="spellEnd"/>
+      <w:r>
+        <w:t xml:space="preserve"> on his lowly servant.</w:t>
       </w:r>
       <w:r>
         <w:br/>
@@ -14559,7 +14652,13 @@
       </w:r>
       <w:r>
         <w:br/>
-        <w:t>Be it done unto me according to your Word.</w:t>
+        <w:t xml:space="preserve">Be it done unto me according to your </w:t>
+      </w:r>
+      <w:r>
+        <w:t>w</w:t>
+      </w:r>
+      <w:r>
+        <w:t>ord.</w:t>
       </w:r>
       <w:r>
         <w:br/>
@@ -14648,7 +14747,10 @@
         <w:pStyle w:val="SPPrayerLatin"/>
       </w:pPr>
       <w:r>
-        <w:t>Angelus Domini nuntiavit Mariae.</w:t>
+        <w:t>Angelus Domini nuntiavit Mariae</w:t>
+      </w:r>
+      <w:r>
+        <w:t>,</w:t>
       </w:r>
       <w:r>
         <w:br/>
@@ -14711,7 +14813,10 @@
         <w:pStyle w:val="SPPrayerLatin"/>
       </w:pPr>
       <w:r>
-        <w:t>Et Verbum caro factum est.</w:t>
+        <w:t>Et Verbum caro factum est</w:t>
+      </w:r>
+      <w:r>
+        <w:t>,</w:t>
       </w:r>
       <w:r>
         <w:br/>
@@ -14888,7 +14993,13 @@
         <w:pStyle w:val="SPPrayerLatin"/>
       </w:pPr>
       <w:r>
-        <w:t xml:space="preserve">Gratiam tuam, quaesumus, Domine, mentibus nostris infunde: ut qui, Angelo nuntiante, Christi Filii tui incarnationem cognovimus, per passionem eius et crucem ad resurrectionis gloriam perducamur. Per eundem Christum Dominum nostrum. </w:t>
+        <w:t>Gratiam tuam, quaesumus, Domine, mentibus nostris infunde: ut qui, Angelo nuntiante, Christi Filii tui incarnationem cognovimus, per passionem eius et crucem</w:t>
+      </w:r>
+      <w:r>
+        <w:t>,</w:t>
+      </w:r>
+      <w:r>
+        <w:t xml:space="preserve"> ad resurrectionis gloriam perducamur. Per eundem Christum Dominum nostrum. </w:t>
       </w:r>
     </w:p>
     <w:p>
@@ -15019,13 +15130,21 @@
         <w:t>;</w:t>
       </w:r>
       <w:r>
-        <w:t xml:space="preserve"> we have beheld his glory, glory as the only</w:t>
+        <w:t xml:space="preserve"> we have beheld his glory, glory as the </w:t>
+      </w:r>
+      <w:proofErr w:type="gramStart"/>
+      <w:r>
+        <w:t>only</w:t>
       </w:r>
       <w:r>
         <w:t>-</w:t>
       </w:r>
       <w:r>
-        <w:t>begotten Son from the Father.</w:t>
+        <w:t>begotten</w:t>
+      </w:r>
+      <w:proofErr w:type="gramEnd"/>
+      <w:r>
+        <w:t xml:space="preserve"> Son from the Father.</w:t>
       </w:r>
     </w:p>
     <w:p>
@@ -16639,7 +16758,21 @@
           <w:iCs/>
           <w:lang w:val="en-ZA"/>
         </w:rPr>
-        <w:t xml:space="preserve">illuminato, custodi, rege et guberna. </w:t>
+        <w:t>illumin</w:t>
+      </w:r>
+      <w:r>
+        <w:rPr>
+          <w:iCs/>
+          <w:lang w:val="en-ZA"/>
+        </w:rPr>
+        <w:t>a</w:t>
+      </w:r>
+      <w:r>
+        <w:rPr>
+          <w:iCs/>
+          <w:lang w:val="en-ZA"/>
+        </w:rPr>
+        <w:t xml:space="preserve">, custodi, rege et guberna. </w:t>
       </w:r>
     </w:p>
     <w:p>
@@ -17200,63 +17333,49 @@
       <w:pPr>
         <w:pStyle w:val="SPPrayerLatin"/>
         <w:rPr>
-          <w:lang w:val="en-ZA"/>
-        </w:rPr>
-      </w:pPr>
-      <w:r>
-        <w:rPr>
           <w:iCs/>
           <w:lang w:val="en-ZA"/>
         </w:rPr>
-        <w:t>Réquiem ætérnam dona eis, Dómine.</w:t>
-      </w:r>
-    </w:p>
-    <w:p>
-      <w:pPr>
-        <w:pStyle w:val="SPPrayerLatin"/>
-        <w:rPr>
-          <w:lang w:val="en-ZA"/>
-        </w:rPr>
       </w:pPr>
       <w:r>
         <w:rPr>
           <w:iCs/>
           <w:lang w:val="en-ZA"/>
         </w:rPr>
-        <w:t>Et lux perpétua lúceat eis.</w:t>
-      </w:r>
-    </w:p>
-    <w:p>
-      <w:pPr>
-        <w:pStyle w:val="SPPrayerLatin"/>
-        <w:rPr>
-          <w:lang w:val="en-ZA"/>
-        </w:rPr>
-      </w:pPr>
+        <w:t>Requiem aeternam dona eis, Domine.</w:t>
+      </w:r>
       <w:r>
         <w:rPr>
           <w:iCs/>
           <w:lang w:val="en-ZA"/>
         </w:rPr>
-        <w:t>Fidélium ánimæ per misericórdiam Dei</w:t>
-      </w:r>
-    </w:p>
-    <w:p>
-      <w:pPr>
-        <w:pStyle w:val="SPPrayerLatin"/>
-      </w:pPr>
+        <w:br/>
+        <w:t>Et lux perpetua luceat eis.</w:t>
+      </w:r>
       <w:r>
         <w:rPr>
           <w:iCs/>
           <w:lang w:val="en-ZA"/>
         </w:rPr>
-        <w:t>requiéscant in pace.</w:t>
-      </w:r>
-    </w:p>
-    <w:p>
-      <w:pPr>
-        <w:pStyle w:val="SPPrayerLatin"/>
-      </w:pPr>
+        <w:br/>
+        <w:t>Fidelium animae per misericordiam Dei</w:t>
+      </w:r>
+      <w:r>
+        <w:rPr>
+          <w:iCs/>
+          <w:lang w:val="en-ZA"/>
+        </w:rPr>
+        <w:br/>
+        <w:t>requiescant in pace.</w:t>
+      </w:r>
+      <w:r>
+        <w:rPr>
+          <w:iCs/>
+          <w:lang w:val="en-ZA"/>
+        </w:rPr>
+        <w:br/>
+        <w:t>Amen.</w:t>
+      </w:r>
     </w:p>
     <w:p>
       <w:pPr>
@@ -17271,7 +17390,11 @@
         </w:sectPr>
       </w:pPr>
       <w:r>
-        <w:t>Amen</w:t>
+        <w:rPr>
+          <w:iCs/>
+          <w:lang w:val="en-ZA"/>
+        </w:rPr>
+        <w:t xml:space="preserve"> </w:t>
       </w:r>
     </w:p>
     <w:p>
@@ -17859,7 +17982,13 @@
       </w:r>
       <w:r>
         <w:br/>
-        <w:t>Benedicta excelsa Dei Mater, Maria sanctissima.</w:t>
+        <w:t>Benedicta excelsa Mater</w:t>
+      </w:r>
+      <w:r>
+        <w:t xml:space="preserve"> Dei</w:t>
+      </w:r>
+      <w:r>
+        <w:t>, Maria sanctissima.</w:t>
       </w:r>
       <w:r>
         <w:br/>
@@ -19355,7 +19484,15 @@
         <w:t>And perhaps that is why this prayer need not be prayed only in moments of fear.</w:t>
       </w:r>
       <w:r>
-        <w:t xml:space="preserve"> Pray it before beginning a difficult day or situation. When temptation rears it’s head or when you feel spiritually weary. </w:t>
+        <w:t xml:space="preserve"> Pray it before beginning a difficult day or situation. When temptation rears </w:t>
+      </w:r>
+      <w:proofErr w:type="spellStart"/>
+      <w:r>
+        <w:t>it’s</w:t>
+      </w:r>
+      <w:proofErr w:type="spellEnd"/>
+      <w:r>
+        <w:t xml:space="preserve"> head or when you feel spiritually weary. </w:t>
       </w:r>
     </w:p>
     <w:p>
@@ -20005,13 +20142,21 @@
         <w:pStyle w:val="SPScripture"/>
       </w:pPr>
       <w:r>
-        <w:t>Be sober, be watchful. Your adversary the devil prowls around like a roaring lion, seeking some</w:t>
+        <w:t xml:space="preserve">Be sober, be watchful. Your adversary the devil prowls around like a roaring lion, seeking </w:t>
+      </w:r>
+      <w:proofErr w:type="spellStart"/>
+      <w:r>
+        <w:t>some</w:t>
       </w:r>
       <w:r>
         <w:t xml:space="preserve"> </w:t>
       </w:r>
       <w:r>
-        <w:t>one to devour. Resist him, firm in your faith, knowing that the same experience of suffering is required of your brotherhood throughout the world.</w:t>
+        <w:t>one</w:t>
+      </w:r>
+      <w:proofErr w:type="spellEnd"/>
+      <w:r>
+        <w:t xml:space="preserve"> to devour. Resist him, firm in your faith, knowing that the same experience of suffering is required of your brotherhood throughout the world.</w:t>
       </w:r>
     </w:p>
     <w:p>
@@ -21530,7 +21675,15 @@
         <w:pStyle w:val="SPScripture"/>
       </w:pPr>
       <w:r>
-        <w:t>“What man of you, having a hundred sheep, if he has lost one of them,  does not leave the ninety-nine in the wilderness, and go after the one which is lost, until he finds it? And when he has found it, he lays it on his shoulders, rejoicing. And when he comes home, he calls together his friends and his neighbors, saying to them, ‘Rejoice with me, for I have found my sheep which was lost.’ Just so, I tell you, there will be more joy in heaven over one sinner who repents than over ninety-nine righteous persons who need no repentance.”</w:t>
+        <w:t xml:space="preserve">“What man of you, having a hundred sheep, if he has lost one of them,  does not leave the ninety-nine in the wilderness, and go after the one which is lost, until he finds it? And when he has found it, he lays it on his shoulders, rejoicing. And when he comes home, he calls together his friends and his </w:t>
+      </w:r>
+      <w:proofErr w:type="spellStart"/>
+      <w:r>
+        <w:t>neighbors</w:t>
+      </w:r>
+      <w:proofErr w:type="spellEnd"/>
+      <w:r>
+        <w:t>, saying to them, ‘Rejoice with me, for I have found my sheep which was lost.’ Just so, I tell you, there will be more joy in heaven over one sinner who repents than over ninety-nine righteous persons who need no repentance.”</w:t>
       </w:r>
     </w:p>
     <w:p>
@@ -23754,18 +23907,36 @@
           <w:i/>
           <w:iCs/>
         </w:rPr>
-        <w:t>e, i, ae,</w:t>
-      </w:r>
-      <w:r>
-        <w:t xml:space="preserve"> or </w:t>
-      </w:r>
+        <w:t xml:space="preserve">e, </w:t>
+      </w:r>
+      <w:proofErr w:type="spellStart"/>
       <w:r>
         <w:rPr>
           <w:i/>
           <w:iCs/>
         </w:rPr>
+        <w:t>i</w:t>
+      </w:r>
+      <w:proofErr w:type="spellEnd"/>
+      <w:r>
+        <w:rPr>
+          <w:i/>
+          <w:iCs/>
+        </w:rPr>
+        <w:t>, ae,</w:t>
+      </w:r>
+      <w:r>
+        <w:t xml:space="preserve"> or </w:t>
+      </w:r>
+      <w:proofErr w:type="spellStart"/>
+      <w:r>
+        <w:rPr>
+          <w:i/>
+          <w:iCs/>
+        </w:rPr>
         <w:t>oe</w:t>
       </w:r>
+      <w:proofErr w:type="spellEnd"/>
       <w:r>
         <w:t xml:space="preserve"> is generally pronounced like </w:t>
       </w:r>
@@ -23822,18 +23993,36 @@
           <w:i/>
           <w:iCs/>
         </w:rPr>
-        <w:t>e, i, ae,</w:t>
-      </w:r>
-      <w:r>
-        <w:t xml:space="preserve"> or </w:t>
-      </w:r>
+        <w:t xml:space="preserve">e, </w:t>
+      </w:r>
+      <w:proofErr w:type="spellStart"/>
       <w:r>
         <w:rPr>
           <w:i/>
           <w:iCs/>
         </w:rPr>
+        <w:t>i</w:t>
+      </w:r>
+      <w:proofErr w:type="spellEnd"/>
+      <w:r>
+        <w:rPr>
+          <w:i/>
+          <w:iCs/>
+        </w:rPr>
+        <w:t>, ae,</w:t>
+      </w:r>
+      <w:r>
+        <w:t xml:space="preserve"> or </w:t>
+      </w:r>
+      <w:proofErr w:type="spellStart"/>
+      <w:r>
+        <w:rPr>
+          <w:i/>
+          <w:iCs/>
+        </w:rPr>
         <w:t>oe</w:t>
       </w:r>
+      <w:proofErr w:type="spellEnd"/>
       <w:r>
         <w:t xml:space="preserve"> is generally pronounced like the </w:t>
       </w:r>
@@ -23905,6 +24094,7 @@
       <w:r>
         <w:t xml:space="preserve"> and </w:t>
       </w:r>
+      <w:proofErr w:type="spellStart"/>
       <w:r>
         <w:rPr>
           <w:b/>
@@ -23912,6 +24102,7 @@
         </w:rPr>
         <w:t>oe</w:t>
       </w:r>
+      <w:proofErr w:type="spellEnd"/>
       <w:r>
         <w:t xml:space="preserve"> are generally pronounced like </w:t>
       </w:r>
@@ -24120,8 +24311,13 @@
         <w:pStyle w:val="SPPrayerEnglish"/>
       </w:pPr>
       <w:r>
-        <w:t>qui es in caelis</w:t>
-      </w:r>
+        <w:t xml:space="preserve">qui es in </w:t>
+      </w:r>
+      <w:proofErr w:type="spellStart"/>
+      <w:r>
+        <w:t>caelis</w:t>
+      </w:r>
+      <w:proofErr w:type="spellEnd"/>
       <w:r>
         <w:br/>
         <w:t>who art in heaven</w:t>

</xml_diff>